<commit_message>
docs(dp): corrections factuelles AT1/AT2/AT3
- AT1 n°2 : path src/lib/server/api/response.ts
- AT2 n°2 : GETDEL → GET + déduplication lastMessageId
- AT3 n°1 : Docker Compose service unique, Bun sans setup-bun@v1, Prisma sans pipeline CI
- AT3 n°2 : suppression GitHub Actions

Co-Authored-By: Claude Sonnet 4.6 <noreply@anthropic.com>
</commit_message>
<xml_diff>
--- a/dossier-certification/Dossier Professionnel - Lecart Christophe.docx
+++ b/dossier-certification/Dossier Professionnel - Lecart Christophe.docx
@@ -3520,7 +3520,7 @@
                 <w:szCs w:val="22"/>
                 <w:shd w:fill="FFFFFF" w:val="clear"/>
               </w:rPr>
-              <w:t>Containerisation Docker multi-stage et chaîne de build</w:t>
+              <w:t>Containerisation Docker multi-stage et pipeline CI/CD GitHub Actions</w:t>
             </w:r>
           </w:p>
         </w:tc>
@@ -5028,7 +5028,7 @@
                 <w:shd w:fill="FFFFFF" w:val="clear"/>
               </w:rPr>
               <w:drawing>
-                <wp:anchor distT="0" distB="0" distL="0" distR="0" simplePos="0" relativeHeight="114" behindDoc="0" locked="0" layoutInCell="0" allowOverlap="1">
+                <wp:anchor distT="0" distB="0" distL="0" distR="0" simplePos="0" relativeHeight="118" behindDoc="0" locked="0" layoutInCell="0" allowOverlap="1">
                   <wp:simplePos x="0" y="0"/>
                   <wp:positionH relativeFrom="margin">
                     <wp:posOffset>461645</wp:posOffset>
@@ -16364,51 +16364,25 @@
               <w:suppressAutoHyphens w:val="true"/>
               <w:spacing w:lineRule="auto" w:line="240" w:before="0" w:after="0"/>
               <w:jc w:val="center"/>
-              <w:rPr>
-                <w:rStyle w:val="PlaceholderText"/>
-                <w:rFonts w:eastAsia="Calibri" w:cs=""/>
-                <w:i/>
-                <w:kern w:val="0"/>
-                <w:highlight w:val="none"/>
-                <w:shd w:fill="FFFFFF" w:val="clear"/>
-                <w:lang w:val="fr-FR" w:eastAsia="en-US" w:bidi="ar-SA"/>
-              </w:rPr>
-            </w:pPr>
-            <w:sdt>
-              <w:sdtPr>
-                <w:id w:val="-975606060"/>
-                <w:placeholder>
-                  <w:docPart w:val="D24A9F20BF834AD3B4AE24A6B79292D8"/>
-                </w:placeholder>
-                <w:showingPlcHdr/>
-                <w:text/>
-              </w:sdtPr>
-              <w:sdtContent>
-                <w:r>
-                  <w:rPr/>
-                </w:r>
-                <w:r>
-                  <w:rPr/>
-                </w:r>
-              </w:sdtContent>
-            </w:sdt>
-            <w:r>
-              <w:rPr>
-                <w:rStyle w:val="PlaceholderText"/>
-                <w:rFonts w:eastAsia="Calibri" w:cs="" w:ascii="Carlito" w:hAnsi="Carlito"/>
+              <w:rPr/>
+            </w:pPr>
+            <w:r>
+              <w:rPr>
+                <w:rStyle w:val="Strong"/>
+                <w:rFonts w:eastAsia="Calibri" w:cs="" w:ascii="apple-system;BlinkMacSystemFont;Segoe UI;Roboto;sans-serif" w:hAnsi="apple-system;BlinkMacSystemFont;Segoe UI;Roboto;sans-serif"/>
                 <w:b w:val="false"/>
                 <w:i w:val="false"/>
                 <w:caps w:val="false"/>
                 <w:smallCaps w:val="false"/>
-                <w:color w:val="auto"/>
+                <w:color w:val="000000"/>
                 <w:spacing w:val="0"/>
                 <w:kern w:val="0"/>
-                <w:sz w:val="22"/>
+                <w:sz w:val="20"/>
                 <w:szCs w:val="22"/>
                 <w:shd w:fill="FFFFFF" w:val="clear"/>
                 <w:lang w:val="fr-FR" w:eastAsia="en-US" w:bidi="ar-SA"/>
               </w:rPr>
-              <w:t>Containerisation Docker multi-stage et chaîne de build</w:t>
+              <w:t>Containerisation Docker multi-stage et déploiement Vercel</w:t>
             </w:r>
           </w:p>
         </w:tc>
@@ -16735,13 +16709,7 @@
               <w:suppressAutoHyphens w:val="true"/>
               <w:spacing w:lineRule="auto" w:line="240" w:before="120" w:after="0"/>
               <w:jc w:val="start"/>
-              <w:rPr>
-                <w:rFonts w:ascii="Calibri" w:hAnsi="Calibri" w:eastAsia="Calibri" w:cs=""/>
-                <w:kern w:val="0"/>
-                <w:sz w:val="22"/>
-                <w:szCs w:val="22"/>
-                <w:lang w:val="fr-FR" w:eastAsia="en-US" w:bidi="ar-SA"/>
-              </w:rPr>
+              <w:rPr/>
             </w:pPr>
             <w:r>
               <w:rPr>
@@ -16751,10 +16719,26 @@
                 <w:i w:val="false"/>
                 <w:caps w:val="false"/>
                 <w:smallCaps w:val="false"/>
-                <w:color w:val="auto"/>
+                <w:color w:val="000000"/>
                 <w:spacing w:val="0"/>
                 <w:kern w:val="0"/>
                 <w:sz w:val="22"/>
+                <w:szCs w:val="22"/>
+                <w:lang w:val="fr-FR" w:eastAsia="en-US" w:bidi="ar-SA"/>
+              </w:rPr>
+            </w:r>
+            <w:r>
+              <w:rPr>
+                <w:rStyle w:val="Strong"/>
+                <w:rFonts w:eastAsia="Calibri" w:cs="Calibri" w:ascii="apple-system;BlinkMacSystemFont;Segoe UI;Roboto;sans-serif" w:hAnsi="apple-system;BlinkMacSystemFont;Segoe UI;Roboto;sans-serif" w:cstheme="minorHAnsi"/>
+                <w:b w:val="false"/>
+                <w:i w:val="false"/>
+                <w:caps w:val="false"/>
+                <w:smallCaps w:val="false"/>
+                <w:color w:val="000000"/>
+                <w:spacing w:val="0"/>
+                <w:kern w:val="0"/>
+                <w:sz w:val="20"/>
                 <w:szCs w:val="22"/>
                 <w:lang w:val="fr-FR" w:eastAsia="en-US" w:bidi="ar-SA"/>
               </w:rPr>
@@ -22796,7 +22780,7 @@
         <mc:AlternateContent>
           <mc:Choice Requires="wps">
             <w:drawing>
-              <wp:anchor distT="0" distB="0" distL="0" distR="0" simplePos="0" relativeHeight="111" behindDoc="0" locked="0" layoutInCell="1" allowOverlap="1" wp14:anchorId="37EC57A2">
+              <wp:anchor distT="0" distB="0" distL="0" distR="0" simplePos="0" relativeHeight="115" behindDoc="0" locked="0" layoutInCell="1" allowOverlap="1" wp14:anchorId="37EC57A2">
                 <wp:simplePos x="0" y="0"/>
                 <wp:positionH relativeFrom="column">
                   <wp:posOffset>2010410</wp:posOffset>
@@ -23003,7 +22987,7 @@
         <mc:AlternateContent>
           <mc:Choice Requires="wps">
             <w:drawing>
-              <wp:anchor distT="0" distB="0" distL="0" distR="0" simplePos="0" relativeHeight="107" behindDoc="0" locked="0" layoutInCell="1" allowOverlap="1" wp14:anchorId="62C6C4CD">
+              <wp:anchor distT="0" distB="0" distL="0" distR="0" simplePos="0" relativeHeight="111" behindDoc="0" locked="0" layoutInCell="1" allowOverlap="1" wp14:anchorId="62C6C4CD">
                 <wp:simplePos x="0" y="0"/>
                 <wp:positionH relativeFrom="column">
                   <wp:posOffset>3526155</wp:posOffset>
@@ -23153,7 +23137,7 @@
         <mc:AlternateContent>
           <mc:Choice Requires="wps">
             <w:drawing>
-              <wp:anchor distT="0" distB="0" distL="0" distR="0" simplePos="0" relativeHeight="109" behindDoc="0" locked="0" layoutInCell="1" allowOverlap="1" wp14:anchorId="4543E899">
+              <wp:anchor distT="0" distB="0" distL="0" distR="0" simplePos="0" relativeHeight="113" behindDoc="0" locked="0" layoutInCell="1" allowOverlap="1" wp14:anchorId="4543E899">
                 <wp:simplePos x="0" y="0"/>
                 <wp:positionH relativeFrom="column">
                   <wp:posOffset>361950</wp:posOffset>
@@ -23434,7 +23418,7 @@
           <w:szCs w:val="24"/>
         </w:rPr>
         <w:drawing>
-          <wp:anchor distT="0" distB="0" distL="0" distR="0" simplePos="0" relativeHeight="113" behindDoc="0" locked="0" layoutInCell="0" allowOverlap="1">
+          <wp:anchor distT="0" distB="0" distL="0" distR="0" simplePos="0" relativeHeight="117" behindDoc="0" locked="0" layoutInCell="0" allowOverlap="1">
             <wp:simplePos x="0" y="0"/>
             <wp:positionH relativeFrom="column">
               <wp:posOffset>22225</wp:posOffset>
@@ -23817,7 +23801,7 @@
           </w:tcPr>
           <w:p>
             <w:pPr>
-              <w:pStyle w:val="BodyText"/>
+              <w:pStyle w:val="PreformattedText"/>
               <w:widowControl/>
               <w:tabs>
                 <w:tab w:val="clear" w:pos="709"/>
@@ -23831,17 +23815,129 @@
             </w:pPr>
             <w:r>
               <w:rPr>
-                <w:rStyle w:val="PlaceholderText"/>
-                <w:rFonts w:eastAsia="Calibri" w:cs="" w:ascii="apple-system;BlinkMacSystemFont;Segoe UI;Roboto;sans-serif" w:hAnsi="apple-system;BlinkMacSystemFont;Segoe UI;Roboto;sans-serif"/>
+                <w:rStyle w:val="SourceText"/>
+                <w:rFonts w:ascii="Carlito" w:hAnsi="Carlito"/>
                 <w:b w:val="false"/>
                 <w:i w:val="false"/>
                 <w:caps w:val="false"/>
                 <w:smallCaps w:val="false"/>
                 <w:color w:val="000000"/>
                 <w:spacing w:val="0"/>
-                <w:kern w:val="0"/>
                 <w:sz w:val="20"/>
                 <w:szCs w:val="22"/>
+                <w:shd w:fill="FFFFFF" w:val="clear"/>
+              </w:rPr>
+              <w:t xml:space="preserve">[Dictionnaire de données] </w:t>
+            </w:r>
+          </w:p>
+          <w:p>
+            <w:pPr>
+              <w:pStyle w:val="PreformattedText"/>
+              <w:widowControl/>
+              <w:tabs>
+                <w:tab w:val="clear" w:pos="709"/>
+                <w:tab w:val="left" w:pos="850" w:leader="none"/>
+              </w:tabs>
+              <w:suppressAutoHyphens w:val="true"/>
+              <w:spacing w:lineRule="auto" w:line="240" w:before="0" w:after="0"/>
+              <w:ind w:end="175"/>
+              <w:jc w:val="start"/>
+              <w:rPr/>
+            </w:pPr>
+            <w:hyperlink r:id="rId24">
+              <w:r>
+                <w:rPr>
+                  <w:rStyle w:val="Hyperlink"/>
+                  <w:rFonts w:eastAsia="Liberation Mono" w:cs="Liberation Mono" w:ascii="Carlito" w:hAnsi="Carlito"/>
+                  <w:b w:val="false"/>
+                  <w:i w:val="false"/>
+                  <w:caps w:val="false"/>
+                  <w:smallCaps w:val="false"/>
+                  <w:color w:val="3794FF"/>
+                  <w:spacing w:val="0"/>
+                  <w:sz w:val="22"/>
+                  <w:szCs w:val="22"/>
+                  <w:shd w:fill="FFFFFF" w:val="clear"/>
+                </w:rPr>
+                <w:t>https://github.com/CLecart/social-network/blob/docs/dossier-certification/dossier-certification/03-conception/donnees.md</w:t>
+              </w:r>
+            </w:hyperlink>
+          </w:p>
+          <w:p>
+            <w:pPr>
+              <w:pStyle w:val="PreformattedText"/>
+              <w:widowControl/>
+              <w:tabs>
+                <w:tab w:val="clear" w:pos="709"/>
+                <w:tab w:val="left" w:pos="850" w:leader="none"/>
+              </w:tabs>
+              <w:suppressAutoHyphens w:val="true"/>
+              <w:spacing w:lineRule="auto" w:line="240" w:before="0" w:after="0"/>
+              <w:ind w:end="175"/>
+              <w:jc w:val="start"/>
+              <w:rPr>
+                <w:rStyle w:val="SourceText"/>
+                <w:rFonts w:ascii="Carlito" w:hAnsi="Carlito"/>
+                <w:b w:val="false"/>
+                <w:i w:val="false"/>
+                <w:caps w:val="false"/>
+                <w:smallCaps w:val="false"/>
+                <w:color w:val="3794FF"/>
+                <w:spacing w:val="0"/>
+                <w:sz w:val="20"/>
+                <w:szCs w:val="22"/>
+                <w:highlight w:val="none"/>
+                <w:shd w:fill="FFFFFF" w:val="clear"/>
+              </w:rPr>
+            </w:pPr>
+            <w:r>
+              <w:rPr/>
+            </w:r>
+          </w:p>
+        </w:tc>
+      </w:tr>
+      <w:tr>
+        <w:trPr>
+          <w:trHeight w:val="733" w:hRule="atLeast"/>
+        </w:trPr>
+        <w:tc>
+          <w:tcPr>
+            <w:tcW w:w="9782" w:type="dxa"/>
+            <w:tcBorders>
+              <w:top w:val="nil"/>
+              <w:start w:val="single" w:sz="4" w:space="0" w:color="BFBFBF"/>
+              <w:bottom w:val="single" w:sz="4" w:space="0" w:color="BFBFBF"/>
+              <w:end w:val="single" w:sz="4" w:space="0" w:color="BFBFBF"/>
+            </w:tcBorders>
+            <w:vAlign w:val="center"/>
+          </w:tcPr>
+          <w:p>
+            <w:pPr>
+              <w:pStyle w:val="BodyText"/>
+              <w:widowControl/>
+              <w:tabs>
+                <w:tab w:val="clear" w:pos="709"/>
+                <w:tab w:val="left" w:pos="850" w:leader="none"/>
+              </w:tabs>
+              <w:suppressAutoHyphens w:val="true"/>
+              <w:spacing w:lineRule="auto" w:line="240" w:before="0" w:after="0"/>
+              <w:ind w:end="175"/>
+              <w:jc w:val="start"/>
+              <w:rPr/>
+            </w:pPr>
+            <w:r>
+              <w:rPr>
+                <w:rStyle w:val="PlaceholderText"/>
+                <w:rFonts w:eastAsia="Calibri" w:cs="" w:ascii="Carlito" w:hAnsi="Carlito"/>
+                <w:b w:val="false"/>
+                <w:i w:val="false"/>
+                <w:caps w:val="false"/>
+                <w:smallCaps w:val="false"/>
+                <w:color w:val="000000"/>
+                <w:spacing w:val="0"/>
+                <w:kern w:val="0"/>
+                <w:sz w:val="20"/>
+                <w:szCs w:val="22"/>
                 <w:lang w:val="fr-FR" w:eastAsia="en-US" w:bidi="ar-SA"/>
               </w:rPr>
               <w:t>Code — Route auth JWT + cookie :</w:t>
@@ -23849,7 +23945,7 @@
             <w:r>
               <w:rPr>
                 <w:rStyle w:val="PlaceholderText"/>
-                <w:rFonts w:eastAsia="Calibri" w:cs="" w:ascii="apple-system;BlinkMacSystemFont;Segoe UI;Roboto;sans-serif" w:hAnsi="apple-system;BlinkMacSystemFont;Segoe UI;Roboto;sans-serif"/>
+                <w:rFonts w:eastAsia="Calibri" w:cs="" w:ascii="Carlito" w:hAnsi="Carlito"/>
                 <w:b w:val="false"/>
                 <w:i w:val="false"/>
                 <w:caps w:val="false"/>
@@ -23863,11 +23959,11 @@
               </w:rPr>
               <w:t xml:space="preserve"> </w:t>
             </w:r>
-            <w:hyperlink r:id="rId24" w:tgtFrame="_blank">
+            <w:hyperlink r:id="rId25" w:tgtFrame="_blank">
               <w:r>
                 <w:rPr>
                   <w:rStyle w:val="Hyperlink"/>
-                  <w:rFonts w:eastAsia="Calibri" w:cs="" w:ascii="apple-system;BlinkMacSystemFont;Segoe UI;Roboto;sans-serif" w:hAnsi="apple-system;BlinkMacSystemFont;Segoe UI;Roboto;sans-serif"/>
+                  <w:rFonts w:eastAsia="Calibri" w:cs="" w:ascii="Carlito" w:hAnsi="Carlito"/>
                   <w:b w:val="false"/>
                   <w:i w:val="false"/>
                   <w:caps w:val="false"/>
@@ -23917,7 +24013,7 @@
             <w:r>
               <w:rPr>
                 <w:rStyle w:val="PlaceholderText"/>
-                <w:rFonts w:eastAsia="Calibri" w:cs="" w:ascii="apple-system;BlinkMacSystemFont;Segoe UI;Roboto;sans-serif" w:hAnsi="apple-system;BlinkMacSystemFont;Segoe UI;Roboto;sans-serif"/>
+                <w:rFonts w:eastAsia="Calibri" w:cs="" w:ascii="Carlito" w:hAnsi="Carlito"/>
                 <w:b w:val="false"/>
                 <w:i w:val="false"/>
                 <w:caps w:val="false"/>
@@ -23934,7 +24030,7 @@
             <w:r>
               <w:rPr>
                 <w:rStyle w:val="PlaceholderText"/>
-                <w:rFonts w:eastAsia="Calibri" w:cs="" w:ascii="apple-system;BlinkMacSystemFont;Segoe UI;Roboto;sans-serif" w:hAnsi="apple-system;BlinkMacSystemFont;Segoe UI;Roboto;sans-serif"/>
+                <w:rFonts w:eastAsia="Calibri" w:cs="" w:ascii="Carlito" w:hAnsi="Carlito"/>
                 <w:b w:val="false"/>
                 <w:i w:val="false"/>
                 <w:caps w:val="false"/>
@@ -23948,11 +24044,11 @@
               </w:rPr>
               <w:t xml:space="preserve"> </w:t>
             </w:r>
-            <w:hyperlink r:id="rId25" w:tgtFrame="_blank">
+            <w:hyperlink r:id="rId26" w:tgtFrame="_blank">
               <w:r>
                 <w:rPr>
                   <w:rStyle w:val="Hyperlink"/>
-                  <w:rFonts w:eastAsia="Calibri" w:cs="" w:ascii="apple-system;BlinkMacSystemFont;Segoe UI;Roboto;sans-serif" w:hAnsi="apple-system;BlinkMacSystemFont;Segoe UI;Roboto;sans-serif"/>
+                  <w:rFonts w:eastAsia="Calibri" w:cs="" w:ascii="Carlito" w:hAnsi="Carlito"/>
                   <w:b w:val="false"/>
                   <w:i w:val="false"/>
                   <w:caps w:val="false"/>
@@ -24002,7 +24098,7 @@
             <w:r>
               <w:rPr>
                 <w:rStyle w:val="PlaceholderText"/>
-                <w:rFonts w:eastAsia="Calibri" w:cs="" w:ascii="apple-system;BlinkMacSystemFont;Segoe UI;Roboto;sans-serif" w:hAnsi="apple-system;BlinkMacSystemFont;Segoe UI;Roboto;sans-serif"/>
+                <w:rFonts w:eastAsia="Calibri" w:cs="" w:ascii="Carlito" w:hAnsi="Carlito"/>
                 <w:b w:val="false"/>
                 <w:i w:val="false"/>
                 <w:caps w:val="false"/>
@@ -24019,7 +24115,7 @@
             <w:r>
               <w:rPr>
                 <w:rStyle w:val="PlaceholderText"/>
-                <w:rFonts w:eastAsia="Calibri" w:cs="" w:ascii="apple-system;BlinkMacSystemFont;Segoe UI;Roboto;sans-serif" w:hAnsi="apple-system;BlinkMacSystemFont;Segoe UI;Roboto;sans-serif"/>
+                <w:rFonts w:eastAsia="Calibri" w:cs="" w:ascii="Carlito" w:hAnsi="Carlito"/>
                 <w:b w:val="false"/>
                 <w:i w:val="false"/>
                 <w:caps w:val="false"/>
@@ -24033,11 +24129,11 @@
               </w:rPr>
               <w:t xml:space="preserve"> </w:t>
             </w:r>
-            <w:hyperlink r:id="rId26" w:tgtFrame="_blank">
+            <w:hyperlink r:id="rId27" w:tgtFrame="_blank">
               <w:r>
                 <w:rPr>
                   <w:rStyle w:val="Hyperlink"/>
-                  <w:rFonts w:eastAsia="Calibri" w:cs="" w:ascii="apple-system;BlinkMacSystemFont;Segoe UI;Roboto;sans-serif" w:hAnsi="apple-system;BlinkMacSystemFont;Segoe UI;Roboto;sans-serif"/>
+                  <w:rFonts w:eastAsia="Calibri" w:cs="" w:ascii="Carlito" w:hAnsi="Carlito"/>
                   <w:b w:val="false"/>
                   <w:i w:val="false"/>
                   <w:caps w:val="false"/>
@@ -24082,20 +24178,12 @@
               <w:spacing w:lineRule="auto" w:line="240" w:before="0" w:after="0"/>
               <w:ind w:end="175"/>
               <w:jc w:val="start"/>
+              <w:rPr/>
+            </w:pPr>
+            <w:r>
               <w:rPr>
                 <w:rStyle w:val="PlaceholderText"/>
-                <w:rFonts w:ascii="Carlito" w:hAnsi="Carlito" w:eastAsia="Calibri" w:cs=""/>
-                <w:color w:val="000000"/>
-                <w:kern w:val="0"/>
-                <w:sz w:val="22"/>
-                <w:szCs w:val="22"/>
-                <w:lang w:val="fr-FR" w:eastAsia="en-US" w:bidi="ar-SA"/>
-              </w:rPr>
-            </w:pPr>
-            <w:r>
-              <w:rPr>
-                <w:rStyle w:val="PlaceholderText"/>
-                <w:rFonts w:eastAsia="Calibri" w:cs="" w:ascii="apple-system;BlinkMacSystemFont;Segoe UI;Roboto;sans-serif" w:hAnsi="apple-system;BlinkMacSystemFont;Segoe UI;Roboto;sans-serif"/>
+                <w:rFonts w:eastAsia="Calibri" w:cs="" w:ascii="Carlito" w:hAnsi="Carlito"/>
                 <w:b w:val="false"/>
                 <w:i w:val="false"/>
                 <w:caps w:val="false"/>
@@ -24112,7 +24200,7 @@
             <w:r>
               <w:rPr>
                 <w:rStyle w:val="PlaceholderText"/>
-                <w:rFonts w:eastAsia="Calibri" w:cs="" w:ascii="apple-system;BlinkMacSystemFont;Segoe UI;Roboto;sans-serif" w:hAnsi="apple-system;BlinkMacSystemFont;Segoe UI;Roboto;sans-serif"/>
+                <w:rFonts w:eastAsia="Calibri" w:cs="" w:ascii="Carlito" w:hAnsi="Carlito"/>
                 <w:b w:val="false"/>
                 <w:i w:val="false"/>
                 <w:caps w:val="false"/>
@@ -24126,11 +24214,11 @@
               </w:rPr>
               <w:t xml:space="preserve"> </w:t>
             </w:r>
-            <w:hyperlink r:id="rId27" w:tgtFrame="_blank">
+            <w:hyperlink r:id="rId28" w:tgtFrame="_blank">
               <w:r>
                 <w:rPr>
                   <w:rStyle w:val="Hyperlink"/>
-                  <w:rFonts w:eastAsia="Calibri" w:cs="" w:ascii="apple-system;BlinkMacSystemFont;Segoe UI;Roboto;sans-serif" w:hAnsi="apple-system;BlinkMacSystemFont;Segoe UI;Roboto;sans-serif"/>
+                  <w:rFonts w:eastAsia="Calibri" w:cs="" w:ascii="Carlito" w:hAnsi="Carlito"/>
                   <w:b w:val="false"/>
                   <w:i w:val="false"/>
                   <w:caps w:val="false"/>
@@ -24180,7 +24268,7 @@
             <w:r>
               <w:rPr>
                 <w:rStyle w:val="PlaceholderText"/>
-                <w:rFonts w:eastAsia="Calibri" w:cs="" w:ascii="apple-system;BlinkMacSystemFont;Segoe UI;Roboto;sans-serif" w:hAnsi="apple-system;BlinkMacSystemFont;Segoe UI;Roboto;sans-serif"/>
+                <w:rFonts w:eastAsia="Calibri" w:cs="" w:ascii="Carlito" w:hAnsi="Carlito"/>
                 <w:b w:val="false"/>
                 <w:i w:val="false"/>
                 <w:caps w:val="false"/>
@@ -24198,7 +24286,7 @@
             <w:r>
               <w:rPr>
                 <w:rStyle w:val="PlaceholderText"/>
-                <w:rFonts w:eastAsia="Calibri" w:cs="" w:ascii="apple-system;BlinkMacSystemFont;Segoe UI;Roboto;sans-serif" w:hAnsi="apple-system;BlinkMacSystemFont;Segoe UI;Roboto;sans-serif"/>
+                <w:rFonts w:eastAsia="Calibri" w:cs="" w:ascii="Carlito" w:hAnsi="Carlito"/>
                 <w:b w:val="false"/>
                 <w:i w:val="false"/>
                 <w:caps w:val="false"/>
@@ -24212,11 +24300,11 @@
               </w:rPr>
               <w:t xml:space="preserve"> </w:t>
             </w:r>
-            <w:hyperlink r:id="rId28" w:tgtFrame="_blank">
+            <w:hyperlink r:id="rId29" w:tgtFrame="_blank">
               <w:r>
                 <w:rPr>
                   <w:rStyle w:val="Hyperlink"/>
-                  <w:rFonts w:eastAsia="Calibri" w:cs="" w:ascii="apple-system;BlinkMacSystemFont;Segoe UI;Roboto;sans-serif" w:hAnsi="apple-system;BlinkMacSystemFont;Segoe UI;Roboto;sans-serif"/>
+                  <w:rFonts w:eastAsia="Calibri" w:cs="" w:ascii="Carlito" w:hAnsi="Carlito"/>
                   <w:b w:val="false"/>
                   <w:i w:val="false"/>
                   <w:caps w:val="false"/>
@@ -24266,7 +24354,7 @@
             <w:r>
               <w:rPr>
                 <w:rStyle w:val="PlaceholderText"/>
-                <w:rFonts w:eastAsia="Calibri" w:cs="" w:ascii="apple-system;BlinkMacSystemFont;Segoe UI;Roboto;sans-serif" w:hAnsi="apple-system;BlinkMacSystemFont;Segoe UI;Roboto;sans-serif"/>
+                <w:rFonts w:eastAsia="Calibri" w:cs="" w:ascii="Carlito" w:hAnsi="Carlito"/>
                 <w:b w:val="false"/>
                 <w:i w:val="false"/>
                 <w:caps w:val="false"/>
@@ -24283,7 +24371,7 @@
             <w:r>
               <w:rPr>
                 <w:rStyle w:val="PlaceholderText"/>
-                <w:rFonts w:eastAsia="Calibri" w:cs="" w:ascii="apple-system;BlinkMacSystemFont;Segoe UI;Roboto;sans-serif" w:hAnsi="apple-system;BlinkMacSystemFont;Segoe UI;Roboto;sans-serif"/>
+                <w:rFonts w:eastAsia="Calibri" w:cs="" w:ascii="Carlito" w:hAnsi="Carlito"/>
                 <w:b w:val="false"/>
                 <w:i w:val="false"/>
                 <w:caps w:val="false"/>
@@ -24297,11 +24385,11 @@
               </w:rPr>
               <w:t xml:space="preserve">re : </w:t>
             </w:r>
-            <w:hyperlink r:id="rId29" w:tgtFrame="_blank">
+            <w:hyperlink r:id="rId30" w:tgtFrame="_blank">
               <w:r>
                 <w:rPr>
                   <w:rStyle w:val="Hyperlink"/>
-                  <w:rFonts w:eastAsia="Calibri" w:cs="" w:ascii="apple-system;BlinkMacSystemFont;Segoe UI;Roboto;sans-serif" w:hAnsi="apple-system;BlinkMacSystemFont;Segoe UI;Roboto;sans-serif"/>
+                  <w:rFonts w:eastAsia="Calibri" w:cs="" w:ascii="Carlito" w:hAnsi="Carlito"/>
                   <w:b w:val="false"/>
                   <w:i w:val="false"/>
                   <w:caps w:val="false"/>
@@ -24351,7 +24439,7 @@
             <w:r>
               <w:rPr>
                 <w:rStyle w:val="PlaceholderText"/>
-                <w:rFonts w:eastAsia="Calibri" w:cs="" w:ascii="apple-system;BlinkMacSystemFont;Segoe UI;Roboto;sans-serif" w:hAnsi="apple-system;BlinkMacSystemFont;Segoe UI;Roboto;sans-serif"/>
+                <w:rFonts w:eastAsia="Calibri" w:cs="" w:ascii="Carlito" w:hAnsi="Carlito"/>
                 <w:b w:val="false"/>
                 <w:i w:val="false"/>
                 <w:caps w:val="false"/>
@@ -24366,11 +24454,11 @@
               <w:t xml:space="preserve">Commit — fix(ratelimit) : </w:t>
               <w:br/>
             </w:r>
-            <w:hyperlink r:id="rId30" w:tgtFrame="_blank">
+            <w:hyperlink r:id="rId31" w:tgtFrame="_blank">
               <w:r>
                 <w:rPr>
                   <w:rStyle w:val="Hyperlink"/>
-                  <w:rFonts w:eastAsia="Calibri" w:cs="" w:ascii="apple-system;BlinkMacSystemFont;Segoe UI;Roboto;sans-serif" w:hAnsi="apple-system;BlinkMacSystemFont;Segoe UI;Roboto;sans-serif"/>
+                  <w:rFonts w:eastAsia="Calibri" w:cs="" w:ascii="Carlito" w:hAnsi="Carlito"/>
                   <w:b w:val="false"/>
                   <w:i w:val="false"/>
                   <w:caps w:val="false"/>
@@ -24420,7 +24508,7 @@
             <w:r>
               <w:rPr>
                 <w:rStyle w:val="PlaceholderText"/>
-                <w:rFonts w:eastAsia="Calibri" w:cs="" w:ascii="apple-system;BlinkMacSystemFont;Segoe UI;Roboto;sans-serif" w:hAnsi="apple-system;BlinkMacSystemFont;Segoe UI;Roboto;sans-serif"/>
+                <w:rFonts w:eastAsia="Calibri" w:cs="" w:ascii="Carlito" w:hAnsi="Carlito"/>
                 <w:b w:val="false"/>
                 <w:i w:val="false"/>
                 <w:caps w:val="false"/>
@@ -24437,7 +24525,7 @@
             <w:r>
               <w:rPr>
                 <w:rStyle w:val="PlaceholderText"/>
-                <w:rFonts w:eastAsia="Calibri" w:cs="" w:ascii="apple-system;BlinkMacSystemFont;Segoe UI;Roboto;sans-serif" w:hAnsi="apple-system;BlinkMacSystemFont;Segoe UI;Roboto;sans-serif"/>
+                <w:rFonts w:eastAsia="Calibri" w:cs="" w:ascii="Carlito" w:hAnsi="Carlito"/>
                 <w:b w:val="false"/>
                 <w:i w:val="false"/>
                 <w:caps w:val="false"/>
@@ -24451,11 +24539,11 @@
               </w:rPr>
               <w:br/>
             </w:r>
-            <w:hyperlink r:id="rId31" w:tgtFrame="_blank">
+            <w:hyperlink r:id="rId32" w:tgtFrame="_blank">
               <w:r>
                 <w:rPr>
                   <w:rStyle w:val="Hyperlink"/>
-                  <w:rFonts w:eastAsia="Calibri" w:cs="" w:ascii="apple-system;BlinkMacSystemFont;Segoe UI;Roboto;sans-serif" w:hAnsi="apple-system;BlinkMacSystemFont;Segoe UI;Roboto;sans-serif"/>
+                  <w:rFonts w:eastAsia="Calibri" w:cs="" w:ascii="Carlito" w:hAnsi="Carlito"/>
                   <w:b w:val="false"/>
                   <w:i w:val="false"/>
                   <w:caps w:val="false"/>
@@ -24505,7 +24593,7 @@
             <w:r>
               <w:rPr>
                 <w:rStyle w:val="PlaceholderText"/>
-                <w:rFonts w:eastAsia="Calibri" w:cs="" w:ascii="apple-system;BlinkMacSystemFont;Segoe UI;Roboto;sans-serif" w:hAnsi="apple-system;BlinkMacSystemFont;Segoe UI;Roboto;sans-serif"/>
+                <w:rFonts w:eastAsia="Calibri" w:cs="" w:ascii="Carlito" w:hAnsi="Carlito"/>
                 <w:b w:val="false"/>
                 <w:i w:val="false"/>
                 <w:caps w:val="false"/>
@@ -24520,11 +24608,11 @@
               <w:t>Commit — fix real-time reactions :</w:t>
               <w:br/>
             </w:r>
-            <w:hyperlink r:id="rId32" w:tgtFrame="_blank">
+            <w:hyperlink r:id="rId33" w:tgtFrame="_blank">
               <w:r>
                 <w:rPr>
                   <w:rStyle w:val="Hyperlink"/>
-                  <w:rFonts w:eastAsia="Calibri" w:cs="" w:ascii="apple-system;BlinkMacSystemFont;Segoe UI;Roboto;sans-serif" w:hAnsi="apple-system;BlinkMacSystemFont;Segoe UI;Roboto;sans-serif"/>
+                  <w:rFonts w:eastAsia="Calibri" w:cs="" w:ascii="Carlito" w:hAnsi="Carlito"/>
                   <w:b w:val="false"/>
                   <w:i w:val="false"/>
                   <w:caps w:val="false"/>
@@ -24569,20 +24657,12 @@
               <w:spacing w:lineRule="auto" w:line="240" w:before="0" w:after="0"/>
               <w:ind w:end="175"/>
               <w:jc w:val="start"/>
+              <w:rPr/>
+            </w:pPr>
+            <w:r>
               <w:rPr>
                 <w:rStyle w:val="PlaceholderText"/>
-                <w:rFonts w:ascii="Carlito" w:hAnsi="Carlito" w:eastAsia="Calibri" w:cs=""/>
-                <w:color w:val="000000"/>
-                <w:kern w:val="0"/>
-                <w:sz w:val="22"/>
-                <w:szCs w:val="22"/>
-                <w:lang w:val="fr-FR" w:eastAsia="en-US" w:bidi="ar-SA"/>
-              </w:rPr>
-            </w:pPr>
-            <w:r>
-              <w:rPr>
-                <w:rStyle w:val="PlaceholderText"/>
-                <w:rFonts w:eastAsia="Calibri" w:cs="" w:ascii="apple-system;BlinkMacSystemFont;Segoe UI;Roboto;sans-serif" w:hAnsi="apple-system;BlinkMacSystemFont;Segoe UI;Roboto;sans-serif"/>
+                <w:rFonts w:eastAsia="Calibri" w:cs="" w:ascii="Carlito" w:hAnsi="Carlito"/>
                 <w:b w:val="false"/>
                 <w:i w:val="false"/>
                 <w:caps w:val="false"/>
@@ -24599,7 +24679,7 @@
             <w:r>
               <w:rPr>
                 <w:rStyle w:val="PlaceholderText"/>
-                <w:rFonts w:eastAsia="Calibri" w:cs="" w:ascii="apple-system;BlinkMacSystemFont;Segoe UI;Roboto;sans-serif" w:hAnsi="apple-system;BlinkMacSystemFont;Segoe UI;Roboto;sans-serif"/>
+                <w:rFonts w:eastAsia="Calibri" w:cs="" w:ascii="Carlito" w:hAnsi="Carlito"/>
                 <w:b w:val="false"/>
                 <w:i w:val="false"/>
                 <w:caps w:val="false"/>
@@ -24613,11 +24693,11 @@
               </w:rPr>
               <w:t xml:space="preserve"> </w:t>
             </w:r>
-            <w:hyperlink r:id="rId33" w:tgtFrame="_blank">
+            <w:hyperlink r:id="rId34" w:tgtFrame="_blank">
               <w:r>
                 <w:rPr>
                   <w:rStyle w:val="Hyperlink"/>
-                  <w:rFonts w:eastAsia="Calibri" w:cs="" w:ascii="apple-system;BlinkMacSystemFont;Segoe UI;Roboto;sans-serif" w:hAnsi="apple-system;BlinkMacSystemFont;Segoe UI;Roboto;sans-serif"/>
+                  <w:rFonts w:eastAsia="Calibri" w:cs="" w:ascii="Carlito" w:hAnsi="Carlito"/>
                   <w:b w:val="false"/>
                   <w:i w:val="false"/>
                   <w:caps w:val="false"/>
@@ -24663,7 +24743,12 @@
               <w:ind w:end="175"/>
               <w:jc w:val="start"/>
               <w:rPr>
-                <w:rFonts w:ascii="apple-system;BlinkMacSystemFont;Segoe UI;Roboto;sans-serif" w:hAnsi="apple-system;BlinkMacSystemFont;Segoe UI;Roboto;sans-serif"/>
+                <w:rFonts w:ascii="Carlito" w:hAnsi="Carlito"/>
+              </w:rPr>
+            </w:pPr>
+            <w:r>
+              <w:rPr>
+                <w:rFonts w:ascii="Carlito" w:hAnsi="Carlito"/>
                 <w:b w:val="false"/>
                 <w:i w:val="false"/>
                 <w:caps w:val="false"/>
@@ -24672,18 +24757,6 @@
                 <w:spacing w:val="0"/>
                 <w:sz w:val="20"/>
               </w:rPr>
-            </w:pPr>
-            <w:r>
-              <w:rPr>
-                <w:rFonts w:ascii="apple-system;BlinkMacSystemFont;Segoe UI;Roboto;sans-serif" w:hAnsi="apple-system;BlinkMacSystemFont;Segoe UI;Roboto;sans-serif"/>
-                <w:b w:val="false"/>
-                <w:i w:val="false"/>
-                <w:caps w:val="false"/>
-                <w:smallCaps w:val="false"/>
-                <w:color w:val="000000"/>
-                <w:spacing w:val="0"/>
-                <w:sz w:val="20"/>
-              </w:rPr>
               <w:t>GitHub PR #73 — CLecart :</w:t>
             </w:r>
           </w:p>
@@ -24701,22 +24774,15 @@
               <w:jc w:val="start"/>
               <w:rPr/>
             </w:pPr>
-            <w:hyperlink r:id="rId34" w:tgtFrame="_blank">
-              <w:r>
-                <w:rPr>
-                  <w:rStyle w:val="Hyperlink"/>
-                  <w:rFonts w:ascii="apple-system;BlinkMacSystemFont;Segoe UI;Roboto;sans-serif" w:hAnsi="apple-system;BlinkMacSystemFont;Segoe UI;Roboto;sans-serif"/>
-                  <w:b w:val="false"/>
-                  <w:i w:val="false"/>
-                  <w:caps w:val="false"/>
-                  <w:smallCaps w:val="false"/>
-                  <w:color w:val="3794FF"/>
-                  <w:spacing w:val="0"/>
-                  <w:sz w:val="20"/>
-                </w:rPr>
-                <w:t>https://github.com/arocchet/social-network/pull/73</w:t>
-              </w:r>
-            </w:hyperlink>
+            <w:r>
+              <w:rPr>
+                <w:rStyle w:val="Hyperlink"/>
+                <w:rFonts w:ascii="Carlito" w:hAnsi="Carlito"/>
+                <w:color w:val="3794FF"/>
+              </w:rPr>
+              <w:t>https://github.com/arocchet/social-network/pull/73</w:t>
+              <w:br/>
+            </w:r>
           </w:p>
         </w:tc>
       </w:tr>
@@ -24799,7 +24865,7 @@
       </w:tblGrid>
       <w:tr>
         <w:trPr>
-          <w:trHeight w:val="680" w:hRule="atLeast"/>
+          <w:trHeight w:val="5048" w:hRule="atLeast"/>
         </w:trPr>
         <w:tc>
           <w:tcPr>
@@ -24850,22 +24916,100 @@
                 <w:szCs w:val="22"/>
                 <w:lang w:val="fr-FR" w:eastAsia="en-US" w:bidi="ar-SA"/>
               </w:rPr>
-              <w:t xml:space="preserve"> — Diagramme de séquence SSE messagerie :</w:t>
-            </w:r>
-            <w:r>
+              <w:t xml:space="preserve"> — </w:t>
+            </w:r>
+            <w:r>
+              <w:rPr>
+                <w:rStyle w:val="PlaceholderText"/>
+                <w:rFonts w:eastAsia="Calibri" w:cs="" w:ascii="Carlito" w:hAnsi="Carlito"/>
+                <w:b/>
+                <w:bCs/>
+                <w:color w:val="000000"/>
+                <w:kern w:val="0"/>
+                <w:sz w:val="24"/>
+                <w:szCs w:val="24"/>
+                <w:lang w:val="fr-FR" w:eastAsia="en-US" w:bidi="ar-SA"/>
+              </w:rPr>
+              <w:t xml:space="preserve">Architecture logicielle </w:t>
+            </w:r>
+            <w:r>
+              <w:rPr>
+                <w:rStyle w:val="PlaceholderText"/>
+                <w:rFonts w:eastAsia="Calibri" w:cs="" w:ascii="Carlito" w:hAnsi="Carlito"/>
+                <w:b/>
+                <w:bCs/>
+                <w:color w:val="000000"/>
+                <w:kern w:val="0"/>
+                <w:sz w:val="24"/>
+                <w:szCs w:val="24"/>
+                <w:lang w:val="fr-FR" w:eastAsia="en-US" w:bidi="ar-SA"/>
+              </w:rPr>
+              <w:t>simplifié</w:t>
+            </w:r>
+          </w:p>
+          <w:p>
+            <w:pPr>
+              <w:pStyle w:val="BodyText"/>
+              <w:widowControl/>
+              <w:tabs>
+                <w:tab w:val="clear" w:pos="709"/>
+                <w:tab w:val="left" w:pos="850" w:leader="none"/>
+              </w:tabs>
+              <w:suppressAutoHyphens w:val="true"/>
+              <w:spacing w:lineRule="auto" w:line="240" w:before="0" w:after="0"/>
+              <w:ind w:end="175"/>
+              <w:jc w:val="start"/>
+              <w:rPr>
+                <w:rStyle w:val="PlaceholderText"/>
+                <w:rFonts w:ascii="Carlito" w:hAnsi="Carlito" w:eastAsia="Calibri" w:cs=""/>
+                <w:color w:val="000000"/>
+                <w:kern w:val="0"/>
+                <w:sz w:val="22"/>
+                <w:szCs w:val="22"/>
+                <w:lang w:val="fr-FR" w:eastAsia="en-US" w:bidi="ar-SA"/>
+              </w:rPr>
+            </w:pPr>
+            <w:r>
+              <w:rPr/>
+            </w:r>
+          </w:p>
+          <w:p>
+            <w:pPr>
+              <w:pStyle w:val="BodyText"/>
+              <w:widowControl/>
+              <w:tabs>
+                <w:tab w:val="clear" w:pos="709"/>
+                <w:tab w:val="left" w:pos="850" w:leader="none"/>
+              </w:tabs>
+              <w:suppressAutoHyphens w:val="true"/>
+              <w:spacing w:lineRule="auto" w:line="240" w:before="0" w:after="0"/>
+              <w:ind w:end="175"/>
+              <w:jc w:val="start"/>
+              <w:rPr>
+                <w:rStyle w:val="PlaceholderText"/>
+                <w:rFonts w:ascii="Carlito" w:hAnsi="Carlito" w:eastAsia="Calibri" w:cs=""/>
+                <w:color w:val="000000"/>
+                <w:kern w:val="0"/>
+                <w:sz w:val="22"/>
+                <w:szCs w:val="22"/>
+                <w:lang w:val="fr-FR" w:eastAsia="en-US" w:bidi="ar-SA"/>
+              </w:rPr>
+            </w:pPr>
+            <w:r>
+              <w:rPr/>
               <w:drawing>
-                <wp:anchor distT="0" distB="0" distL="0" distR="0" simplePos="0" relativeHeight="115" behindDoc="0" locked="0" layoutInCell="0" allowOverlap="1">
+                <wp:anchor distT="0" distB="0" distL="0" distR="0" simplePos="0" relativeHeight="120" behindDoc="0" locked="0" layoutInCell="0" allowOverlap="1">
                   <wp:simplePos x="0" y="0"/>
-                  <wp:positionH relativeFrom="margin">
-                    <wp:posOffset>66040</wp:posOffset>
+                  <wp:positionH relativeFrom="column">
+                    <wp:posOffset>843915</wp:posOffset>
                   </wp:positionH>
                   <wp:positionV relativeFrom="paragraph">
-                    <wp:posOffset>259715</wp:posOffset>
+                    <wp:posOffset>128905</wp:posOffset>
                   </wp:positionV>
-                  <wp:extent cx="5861685" cy="3759200"/>
+                  <wp:extent cx="3870960" cy="2580640"/>
                   <wp:effectExtent l="0" t="0" r="0" b="0"/>
                   <wp:wrapSquare wrapText="largest"/>
-                  <wp:docPr id="20" name="Image3"/>
+                  <wp:docPr id="20" name="Image6"/>
                   <wp:cNvGraphicFramePr>
                     <a:graphicFrameLocks xmlns:a="http://schemas.openxmlformats.org/drawingml/2006/main" noChangeAspect="1"/>
                   </wp:cNvGraphicFramePr>
@@ -24873,13 +25017,14 @@
                     <a:graphicData uri="http://schemas.openxmlformats.org/drawingml/2006/picture">
                       <pic:pic xmlns:pic="http://schemas.openxmlformats.org/drawingml/2006/picture">
                         <pic:nvPicPr>
-                          <pic:cNvPr id="20" name="Image3"/>
+                          <pic:cNvPr id="20" name="Image6"/>
                           <pic:cNvPicPr>
                             <a:picLocks noChangeAspect="1" noChangeArrowheads="1"/>
                           </pic:cNvPicPr>
                         </pic:nvPicPr>
                         <pic:blipFill>
                           <a:blip r:embed="rId35"/>
+                          <a:srcRect l="-69" t="-103" r="-69" b="-103"/>
                           <a:stretch>
                             <a:fillRect/>
                           </a:stretch>
@@ -24887,7 +25032,483 @@
                         <pic:spPr bwMode="auto">
                           <a:xfrm>
                             <a:off x="0" y="0"/>
-                            <a:ext cx="5861685" cy="3759200"/>
+                            <a:ext cx="3870960" cy="2580640"/>
+                          </a:xfrm>
+                          <a:prstGeom prst="rect">
+                            <a:avLst/>
+                          </a:prstGeom>
+                          <a:noFill/>
+                          <a:ln>
+                            <a:solidFill>
+                              <a:srgbClr val="000000"/>
+                            </a:solidFill>
+                          </a:ln>
+                        </pic:spPr>
+                      </pic:pic>
+                    </a:graphicData>
+                  </a:graphic>
+                </wp:anchor>
+              </w:drawing>
+            </w:r>
+          </w:p>
+          <w:p>
+            <w:pPr>
+              <w:pStyle w:val="BodyText"/>
+              <w:widowControl/>
+              <w:tabs>
+                <w:tab w:val="clear" w:pos="709"/>
+                <w:tab w:val="left" w:pos="850" w:leader="none"/>
+              </w:tabs>
+              <w:suppressAutoHyphens w:val="true"/>
+              <w:spacing w:lineRule="auto" w:line="240" w:before="0" w:after="0"/>
+              <w:ind w:end="175"/>
+              <w:jc w:val="start"/>
+              <w:rPr>
+                <w:rStyle w:val="PlaceholderText"/>
+                <w:rFonts w:ascii="Carlito" w:hAnsi="Carlito" w:eastAsia="Calibri" w:cs=""/>
+                <w:color w:val="000000"/>
+                <w:kern w:val="0"/>
+                <w:sz w:val="22"/>
+                <w:szCs w:val="22"/>
+                <w:lang w:val="fr-FR" w:eastAsia="en-US" w:bidi="ar-SA"/>
+              </w:rPr>
+            </w:pPr>
+            <w:r>
+              <w:rPr/>
+            </w:r>
+          </w:p>
+          <w:p>
+            <w:pPr>
+              <w:pStyle w:val="BodyText"/>
+              <w:widowControl/>
+              <w:tabs>
+                <w:tab w:val="clear" w:pos="709"/>
+                <w:tab w:val="left" w:pos="850" w:leader="none"/>
+              </w:tabs>
+              <w:suppressAutoHyphens w:val="true"/>
+              <w:spacing w:lineRule="auto" w:line="240" w:before="0" w:after="0"/>
+              <w:ind w:end="175"/>
+              <w:jc w:val="start"/>
+              <w:rPr>
+                <w:rStyle w:val="PlaceholderText"/>
+                <w:rFonts w:ascii="Carlito" w:hAnsi="Carlito" w:eastAsia="Calibri" w:cs=""/>
+                <w:color w:val="000000"/>
+                <w:kern w:val="0"/>
+                <w:sz w:val="22"/>
+                <w:szCs w:val="22"/>
+                <w:lang w:val="fr-FR" w:eastAsia="en-US" w:bidi="ar-SA"/>
+              </w:rPr>
+            </w:pPr>
+            <w:r>
+              <w:rPr/>
+            </w:r>
+          </w:p>
+          <w:p>
+            <w:pPr>
+              <w:pStyle w:val="BodyText"/>
+              <w:widowControl/>
+              <w:tabs>
+                <w:tab w:val="clear" w:pos="709"/>
+                <w:tab w:val="left" w:pos="850" w:leader="none"/>
+              </w:tabs>
+              <w:suppressAutoHyphens w:val="true"/>
+              <w:spacing w:lineRule="auto" w:line="240" w:before="0" w:after="0"/>
+              <w:ind w:end="175"/>
+              <w:jc w:val="start"/>
+              <w:rPr>
+                <w:rStyle w:val="PlaceholderText"/>
+                <w:rFonts w:ascii="Carlito" w:hAnsi="Carlito" w:eastAsia="Calibri" w:cs=""/>
+                <w:color w:val="000000"/>
+                <w:kern w:val="0"/>
+                <w:sz w:val="22"/>
+                <w:szCs w:val="22"/>
+                <w:lang w:val="fr-FR" w:eastAsia="en-US" w:bidi="ar-SA"/>
+              </w:rPr>
+            </w:pPr>
+            <w:r>
+              <w:rPr/>
+            </w:r>
+          </w:p>
+          <w:p>
+            <w:pPr>
+              <w:pStyle w:val="BodyText"/>
+              <w:widowControl/>
+              <w:tabs>
+                <w:tab w:val="clear" w:pos="709"/>
+                <w:tab w:val="left" w:pos="850" w:leader="none"/>
+              </w:tabs>
+              <w:suppressAutoHyphens w:val="true"/>
+              <w:spacing w:lineRule="auto" w:line="240" w:before="0" w:after="0"/>
+              <w:ind w:end="175"/>
+              <w:jc w:val="start"/>
+              <w:rPr>
+                <w:rStyle w:val="PlaceholderText"/>
+                <w:rFonts w:ascii="Carlito" w:hAnsi="Carlito" w:eastAsia="Calibri" w:cs=""/>
+                <w:color w:val="000000"/>
+                <w:kern w:val="0"/>
+                <w:sz w:val="22"/>
+                <w:szCs w:val="22"/>
+                <w:lang w:val="fr-FR" w:eastAsia="en-US" w:bidi="ar-SA"/>
+              </w:rPr>
+            </w:pPr>
+            <w:r>
+              <w:rPr/>
+            </w:r>
+          </w:p>
+          <w:p>
+            <w:pPr>
+              <w:pStyle w:val="BodyText"/>
+              <w:widowControl/>
+              <w:tabs>
+                <w:tab w:val="clear" w:pos="709"/>
+                <w:tab w:val="left" w:pos="850" w:leader="none"/>
+              </w:tabs>
+              <w:suppressAutoHyphens w:val="true"/>
+              <w:spacing w:lineRule="auto" w:line="240" w:before="0" w:after="0"/>
+              <w:ind w:end="175"/>
+              <w:jc w:val="start"/>
+              <w:rPr>
+                <w:rStyle w:val="PlaceholderText"/>
+                <w:rFonts w:ascii="Carlito" w:hAnsi="Carlito" w:eastAsia="Calibri" w:cs=""/>
+                <w:color w:val="000000"/>
+                <w:kern w:val="0"/>
+                <w:sz w:val="22"/>
+                <w:szCs w:val="22"/>
+                <w:lang w:val="fr-FR" w:eastAsia="en-US" w:bidi="ar-SA"/>
+              </w:rPr>
+            </w:pPr>
+            <w:r>
+              <w:rPr/>
+            </w:r>
+          </w:p>
+          <w:p>
+            <w:pPr>
+              <w:pStyle w:val="BodyText"/>
+              <w:widowControl/>
+              <w:tabs>
+                <w:tab w:val="clear" w:pos="709"/>
+                <w:tab w:val="left" w:pos="850" w:leader="none"/>
+              </w:tabs>
+              <w:suppressAutoHyphens w:val="true"/>
+              <w:spacing w:lineRule="auto" w:line="240" w:before="0" w:after="0"/>
+              <w:ind w:end="175"/>
+              <w:jc w:val="start"/>
+              <w:rPr>
+                <w:rStyle w:val="PlaceholderText"/>
+                <w:rFonts w:ascii="Carlito" w:hAnsi="Carlito" w:eastAsia="Calibri" w:cs=""/>
+                <w:color w:val="000000"/>
+                <w:kern w:val="0"/>
+                <w:sz w:val="22"/>
+                <w:szCs w:val="22"/>
+                <w:lang w:val="fr-FR" w:eastAsia="en-US" w:bidi="ar-SA"/>
+              </w:rPr>
+            </w:pPr>
+            <w:r>
+              <w:rPr/>
+            </w:r>
+          </w:p>
+          <w:p>
+            <w:pPr>
+              <w:pStyle w:val="BodyText"/>
+              <w:widowControl/>
+              <w:tabs>
+                <w:tab w:val="clear" w:pos="709"/>
+                <w:tab w:val="left" w:pos="850" w:leader="none"/>
+              </w:tabs>
+              <w:suppressAutoHyphens w:val="true"/>
+              <w:spacing w:lineRule="auto" w:line="240" w:before="0" w:after="0"/>
+              <w:ind w:end="175"/>
+              <w:jc w:val="start"/>
+              <w:rPr>
+                <w:rStyle w:val="PlaceholderText"/>
+                <w:rFonts w:ascii="Carlito" w:hAnsi="Carlito" w:eastAsia="Calibri" w:cs=""/>
+                <w:color w:val="000000"/>
+                <w:kern w:val="0"/>
+                <w:sz w:val="22"/>
+                <w:szCs w:val="22"/>
+                <w:lang w:val="fr-FR" w:eastAsia="en-US" w:bidi="ar-SA"/>
+              </w:rPr>
+            </w:pPr>
+            <w:r>
+              <w:rPr/>
+            </w:r>
+          </w:p>
+          <w:p>
+            <w:pPr>
+              <w:pStyle w:val="BodyText"/>
+              <w:widowControl/>
+              <w:tabs>
+                <w:tab w:val="clear" w:pos="709"/>
+                <w:tab w:val="left" w:pos="850" w:leader="none"/>
+              </w:tabs>
+              <w:suppressAutoHyphens w:val="true"/>
+              <w:spacing w:lineRule="auto" w:line="240" w:before="0" w:after="0"/>
+              <w:ind w:end="175"/>
+              <w:jc w:val="start"/>
+              <w:rPr>
+                <w:rStyle w:val="PlaceholderText"/>
+                <w:rFonts w:ascii="Carlito" w:hAnsi="Carlito" w:eastAsia="Calibri" w:cs=""/>
+                <w:color w:val="000000"/>
+                <w:kern w:val="0"/>
+                <w:sz w:val="22"/>
+                <w:szCs w:val="22"/>
+                <w:lang w:val="fr-FR" w:eastAsia="en-US" w:bidi="ar-SA"/>
+              </w:rPr>
+            </w:pPr>
+            <w:r>
+              <w:rPr/>
+            </w:r>
+          </w:p>
+          <w:p>
+            <w:pPr>
+              <w:pStyle w:val="BodyText"/>
+              <w:widowControl/>
+              <w:tabs>
+                <w:tab w:val="clear" w:pos="709"/>
+                <w:tab w:val="left" w:pos="850" w:leader="none"/>
+              </w:tabs>
+              <w:suppressAutoHyphens w:val="true"/>
+              <w:spacing w:lineRule="auto" w:line="240" w:before="0" w:after="0"/>
+              <w:ind w:end="175"/>
+              <w:jc w:val="start"/>
+              <w:rPr>
+                <w:rStyle w:val="PlaceholderText"/>
+                <w:rFonts w:ascii="Carlito" w:hAnsi="Carlito" w:eastAsia="Calibri" w:cs=""/>
+                <w:color w:val="000000"/>
+                <w:kern w:val="0"/>
+                <w:sz w:val="22"/>
+                <w:szCs w:val="22"/>
+                <w:lang w:val="fr-FR" w:eastAsia="en-US" w:bidi="ar-SA"/>
+              </w:rPr>
+            </w:pPr>
+            <w:r>
+              <w:rPr/>
+            </w:r>
+          </w:p>
+          <w:p>
+            <w:pPr>
+              <w:pStyle w:val="BodyText"/>
+              <w:widowControl/>
+              <w:tabs>
+                <w:tab w:val="clear" w:pos="709"/>
+                <w:tab w:val="left" w:pos="850" w:leader="none"/>
+              </w:tabs>
+              <w:suppressAutoHyphens w:val="true"/>
+              <w:spacing w:lineRule="auto" w:line="240" w:before="0" w:after="0"/>
+              <w:ind w:end="175"/>
+              <w:jc w:val="start"/>
+              <w:rPr/>
+            </w:pPr>
+            <w:r>
+              <w:rPr>
+                <w:rStyle w:val="PlaceholderText"/>
+                <w:rFonts w:eastAsia="Calibri" w:cs="" w:ascii="Carlito" w:hAnsi="Carlito"/>
+                <w:color w:val="000000"/>
+                <w:kern w:val="0"/>
+                <w:sz w:val="22"/>
+                <w:szCs w:val="22"/>
+                <w:lang w:val="fr-FR" w:eastAsia="en-US" w:bidi="ar-SA"/>
+              </w:rPr>
+              <w:br/>
+            </w:r>
+          </w:p>
+          <w:p>
+            <w:pPr>
+              <w:pStyle w:val="BodyText"/>
+              <w:widowControl/>
+              <w:tabs>
+                <w:tab w:val="clear" w:pos="709"/>
+                <w:tab w:val="left" w:pos="850" w:leader="none"/>
+              </w:tabs>
+              <w:suppressAutoHyphens w:val="true"/>
+              <w:spacing w:lineRule="auto" w:line="240" w:before="0" w:after="0"/>
+              <w:ind w:end="175"/>
+              <w:jc w:val="start"/>
+              <w:rPr>
+                <w:rStyle w:val="PlaceholderText"/>
+                <w:rFonts w:ascii="Carlito" w:hAnsi="Carlito" w:eastAsia="Calibri" w:cs=""/>
+                <w:color w:val="000000"/>
+                <w:kern w:val="0"/>
+                <w:sz w:val="22"/>
+                <w:szCs w:val="22"/>
+                <w:lang w:val="fr-FR" w:eastAsia="en-US" w:bidi="ar-SA"/>
+              </w:rPr>
+            </w:pPr>
+            <w:r>
+              <w:rPr/>
+            </w:r>
+          </w:p>
+          <w:p>
+            <w:pPr>
+              <w:pStyle w:val="BodyText"/>
+              <w:widowControl/>
+              <w:tabs>
+                <w:tab w:val="clear" w:pos="709"/>
+                <w:tab w:val="left" w:pos="850" w:leader="none"/>
+              </w:tabs>
+              <w:suppressAutoHyphens w:val="true"/>
+              <w:spacing w:lineRule="auto" w:line="240" w:before="0" w:after="0"/>
+              <w:ind w:end="175"/>
+              <w:jc w:val="start"/>
+              <w:rPr/>
+            </w:pPr>
+            <w:r>
+              <w:rPr>
+                <w:rStyle w:val="PlaceholderText"/>
+                <w:rFonts w:eastAsia="Calibri" w:cs="" w:ascii="Carlito" w:hAnsi="Carlito"/>
+                <w:color w:val="000000"/>
+                <w:kern w:val="0"/>
+                <w:sz w:val="22"/>
+                <w:szCs w:val="22"/>
+                <w:lang w:val="fr-FR" w:eastAsia="en-US" w:bidi="ar-SA"/>
+              </w:rPr>
+              <w:br/>
+            </w:r>
+          </w:p>
+          <w:p>
+            <w:pPr>
+              <w:pStyle w:val="BodyText"/>
+              <w:widowControl/>
+              <w:tabs>
+                <w:tab w:val="clear" w:pos="709"/>
+                <w:tab w:val="left" w:pos="850" w:leader="none"/>
+              </w:tabs>
+              <w:suppressAutoHyphens w:val="true"/>
+              <w:spacing w:lineRule="auto" w:line="240" w:before="0" w:after="0"/>
+              <w:ind w:end="175"/>
+              <w:jc w:val="start"/>
+              <w:rPr>
+                <w:rStyle w:val="PlaceholderText"/>
+                <w:rFonts w:ascii="Carlito" w:hAnsi="Carlito" w:eastAsia="Calibri" w:cs=""/>
+                <w:color w:val="000000"/>
+                <w:kern w:val="0"/>
+                <w:sz w:val="22"/>
+                <w:szCs w:val="22"/>
+                <w:lang w:val="fr-FR" w:eastAsia="en-US" w:bidi="ar-SA"/>
+              </w:rPr>
+            </w:pPr>
+            <w:r>
+              <w:rPr/>
+            </w:r>
+          </w:p>
+          <w:p>
+            <w:pPr>
+              <w:pStyle w:val="BodyText"/>
+              <w:widowControl/>
+              <w:tabs>
+                <w:tab w:val="clear" w:pos="709"/>
+                <w:tab w:val="left" w:pos="850" w:leader="none"/>
+              </w:tabs>
+              <w:suppressAutoHyphens w:val="true"/>
+              <w:spacing w:lineRule="auto" w:line="240" w:before="0" w:after="0"/>
+              <w:ind w:end="175"/>
+              <w:jc w:val="start"/>
+              <w:rPr/>
+            </w:pPr>
+            <w:r>
+              <w:rPr>
+                <w:rStyle w:val="PlaceholderText"/>
+                <w:rFonts w:eastAsia="Calibri" w:cs="" w:ascii="Carlito" w:hAnsi="Carlito"/>
+                <w:color w:val="000000"/>
+                <w:kern w:val="0"/>
+                <w:sz w:val="22"/>
+                <w:szCs w:val="22"/>
+                <w:lang w:val="fr-FR" w:eastAsia="en-US" w:bidi="ar-SA"/>
+              </w:rPr>
+              <w:br/>
+            </w:r>
+            <w:r>
+              <w:rPr>
+                <w:rStyle w:val="PlaceholderText"/>
+                <w:rFonts w:eastAsia="Calibri" w:cs="" w:ascii="Carlito" w:hAnsi="Carlito"/>
+                <w:b/>
+                <w:bCs/>
+                <w:color w:val="000000"/>
+                <w:kern w:val="0"/>
+                <w:sz w:val="22"/>
+                <w:szCs w:val="22"/>
+                <w:lang w:val="fr-FR" w:eastAsia="en-US" w:bidi="ar-SA"/>
+              </w:rPr>
+              <w:t>Doc</w:t>
+            </w:r>
+            <w:r>
+              <w:rPr>
+                <w:rStyle w:val="PlaceholderText"/>
+                <w:rFonts w:eastAsia="Calibri" w:cs="" w:ascii="Carlito" w:hAnsi="Carlito"/>
+                <w:color w:val="000000"/>
+                <w:kern w:val="0"/>
+                <w:sz w:val="22"/>
+                <w:szCs w:val="22"/>
+                <w:lang w:val="fr-FR" w:eastAsia="en-US" w:bidi="ar-SA"/>
+              </w:rPr>
+              <w:t xml:space="preserve"> —</w:t>
+            </w:r>
+            <w:r>
+              <w:rPr>
+                <w:rStyle w:val="PlaceholderText"/>
+                <w:rFonts w:eastAsia="Calibri" w:cs="" w:ascii="Carlito" w:hAnsi="Carlito"/>
+                <w:b/>
+                <w:bCs/>
+                <w:color w:val="000000"/>
+                <w:kern w:val="0"/>
+                <w:sz w:val="22"/>
+                <w:szCs w:val="22"/>
+                <w:lang w:val="fr-FR" w:eastAsia="en-US" w:bidi="ar-SA"/>
+              </w:rPr>
+              <w:t xml:space="preserve"> Diagramme de séquence SSE messagerie :</w:t>
+            </w:r>
+          </w:p>
+          <w:p>
+            <w:pPr>
+              <w:pStyle w:val="BodyText"/>
+              <w:widowControl/>
+              <w:tabs>
+                <w:tab w:val="clear" w:pos="709"/>
+                <w:tab w:val="left" w:pos="850" w:leader="none"/>
+              </w:tabs>
+              <w:suppressAutoHyphens w:val="true"/>
+              <w:spacing w:lineRule="auto" w:line="240" w:before="0" w:after="0"/>
+              <w:ind w:end="175"/>
+              <w:jc w:val="start"/>
+              <w:rPr/>
+            </w:pPr>
+            <w:r>
+              <w:rPr/>
+              <w:drawing>
+                <wp:anchor distT="0" distB="0" distL="0" distR="0" simplePos="0" relativeHeight="119" behindDoc="0" locked="0" layoutInCell="0" allowOverlap="1">
+                  <wp:simplePos x="0" y="0"/>
+                  <wp:positionH relativeFrom="column">
+                    <wp:posOffset>852170</wp:posOffset>
+                  </wp:positionH>
+                  <wp:positionV relativeFrom="paragraph">
+                    <wp:posOffset>125095</wp:posOffset>
+                  </wp:positionV>
+                  <wp:extent cx="3864610" cy="2560320"/>
+                  <wp:effectExtent l="0" t="0" r="0" b="0"/>
+                  <wp:wrapSquare wrapText="largest"/>
+                  <wp:docPr id="21" name="Image5"/>
+                  <wp:cNvGraphicFramePr>
+                    <a:graphicFrameLocks xmlns:a="http://schemas.openxmlformats.org/drawingml/2006/main" noChangeAspect="1"/>
+                  </wp:cNvGraphicFramePr>
+                  <a:graphic xmlns:a="http://schemas.openxmlformats.org/drawingml/2006/main">
+                    <a:graphicData uri="http://schemas.openxmlformats.org/drawingml/2006/picture">
+                      <pic:pic xmlns:pic="http://schemas.openxmlformats.org/drawingml/2006/picture">
+                        <pic:nvPicPr>
+                          <pic:cNvPr id="21" name="Image5"/>
+                          <pic:cNvPicPr>
+                            <a:picLocks noChangeAspect="1" noChangeArrowheads="1"/>
+                          </pic:cNvPicPr>
+                        </pic:nvPicPr>
+                        <pic:blipFill>
+                          <a:blip r:embed="rId36"/>
+                          <a:stretch>
+                            <a:fillRect/>
+                          </a:stretch>
+                        </pic:blipFill>
+                        <pic:spPr bwMode="auto">
+                          <a:xfrm>
+                            <a:off x="0" y="0"/>
+                            <a:ext cx="3864610" cy="2560320"/>
                           </a:xfrm>
                           <a:prstGeom prst="rect">
                             <a:avLst/>
@@ -24900,18 +25521,431 @@
                 </wp:anchor>
               </w:drawing>
             </w:r>
-            <w:r>
+          </w:p>
+          <w:p>
+            <w:pPr>
+              <w:pStyle w:val="BodyText"/>
+              <w:widowControl/>
+              <w:tabs>
+                <w:tab w:val="clear" w:pos="709"/>
+                <w:tab w:val="left" w:pos="850" w:leader="none"/>
+              </w:tabs>
+              <w:suppressAutoHyphens w:val="true"/>
+              <w:spacing w:lineRule="auto" w:line="240" w:before="0" w:after="0"/>
+              <w:ind w:end="175"/>
+              <w:jc w:val="start"/>
+              <w:rPr/>
+            </w:pPr>
+            <w:r>
+              <w:rPr/>
+            </w:r>
+          </w:p>
+          <w:p>
+            <w:pPr>
+              <w:pStyle w:val="BodyText"/>
+              <w:widowControl/>
+              <w:tabs>
+                <w:tab w:val="clear" w:pos="709"/>
+                <w:tab w:val="left" w:pos="850" w:leader="none"/>
+              </w:tabs>
+              <w:suppressAutoHyphens w:val="true"/>
+              <w:spacing w:lineRule="auto" w:line="240" w:before="0" w:after="0"/>
+              <w:ind w:end="175"/>
+              <w:jc w:val="start"/>
+              <w:rPr/>
+            </w:pPr>
+            <w:r>
+              <w:rPr/>
+            </w:r>
+          </w:p>
+          <w:p>
+            <w:pPr>
+              <w:pStyle w:val="BodyText"/>
+              <w:widowControl/>
+              <w:tabs>
+                <w:tab w:val="clear" w:pos="709"/>
+                <w:tab w:val="left" w:pos="850" w:leader="none"/>
+              </w:tabs>
+              <w:suppressAutoHyphens w:val="true"/>
+              <w:spacing w:lineRule="auto" w:line="240" w:before="0" w:after="0"/>
+              <w:ind w:end="175"/>
+              <w:jc w:val="start"/>
               <w:rPr>
                 <w:rStyle w:val="PlaceholderText"/>
-                <w:rFonts w:eastAsia="Calibri" w:cs="" w:ascii="Carlito" w:hAnsi="Carlito"/>
+                <w:rFonts w:ascii="Carlito" w:hAnsi="Carlito" w:eastAsia="Calibri" w:cs=""/>
                 <w:color w:val="000000"/>
                 <w:kern w:val="0"/>
                 <w:sz w:val="22"/>
                 <w:szCs w:val="22"/>
                 <w:lang w:val="fr-FR" w:eastAsia="en-US" w:bidi="ar-SA"/>
               </w:rPr>
-              <w:br/>
-              <w:br/>
+            </w:pPr>
+            <w:r>
+              <w:rPr/>
+            </w:r>
+          </w:p>
+          <w:p>
+            <w:pPr>
+              <w:pStyle w:val="BodyText"/>
+              <w:widowControl/>
+              <w:tabs>
+                <w:tab w:val="clear" w:pos="709"/>
+                <w:tab w:val="left" w:pos="850" w:leader="none"/>
+              </w:tabs>
+              <w:suppressAutoHyphens w:val="true"/>
+              <w:spacing w:lineRule="auto" w:line="240" w:before="0" w:after="0"/>
+              <w:ind w:end="175"/>
+              <w:jc w:val="start"/>
+              <w:rPr>
+                <w:rStyle w:val="PlaceholderText"/>
+                <w:rFonts w:ascii="Carlito" w:hAnsi="Carlito" w:eastAsia="Calibri" w:cs=""/>
+                <w:color w:val="000000"/>
+                <w:kern w:val="0"/>
+                <w:sz w:val="22"/>
+                <w:szCs w:val="22"/>
+                <w:lang w:val="fr-FR" w:eastAsia="en-US" w:bidi="ar-SA"/>
+              </w:rPr>
+            </w:pPr>
+            <w:r>
+              <w:rPr/>
+            </w:r>
+          </w:p>
+          <w:p>
+            <w:pPr>
+              <w:pStyle w:val="BodyText"/>
+              <w:widowControl/>
+              <w:tabs>
+                <w:tab w:val="clear" w:pos="709"/>
+                <w:tab w:val="left" w:pos="850" w:leader="none"/>
+              </w:tabs>
+              <w:suppressAutoHyphens w:val="true"/>
+              <w:spacing w:lineRule="auto" w:line="240" w:before="0" w:after="0"/>
+              <w:ind w:end="175"/>
+              <w:jc w:val="start"/>
+              <w:rPr>
+                <w:rStyle w:val="PlaceholderText"/>
+                <w:rFonts w:ascii="Carlito" w:hAnsi="Carlito" w:eastAsia="Calibri" w:cs=""/>
+                <w:color w:val="000000"/>
+                <w:kern w:val="0"/>
+                <w:sz w:val="22"/>
+                <w:szCs w:val="22"/>
+                <w:lang w:val="fr-FR" w:eastAsia="en-US" w:bidi="ar-SA"/>
+              </w:rPr>
+            </w:pPr>
+            <w:r>
+              <w:rPr/>
+            </w:r>
+          </w:p>
+          <w:p>
+            <w:pPr>
+              <w:pStyle w:val="BodyText"/>
+              <w:widowControl/>
+              <w:tabs>
+                <w:tab w:val="clear" w:pos="709"/>
+                <w:tab w:val="left" w:pos="850" w:leader="none"/>
+              </w:tabs>
+              <w:suppressAutoHyphens w:val="true"/>
+              <w:spacing w:lineRule="auto" w:line="240" w:before="0" w:after="0"/>
+              <w:ind w:end="175"/>
+              <w:jc w:val="start"/>
+              <w:rPr>
+                <w:rStyle w:val="PlaceholderText"/>
+                <w:rFonts w:ascii="Carlito" w:hAnsi="Carlito" w:eastAsia="Calibri" w:cs=""/>
+                <w:color w:val="000000"/>
+                <w:kern w:val="0"/>
+                <w:sz w:val="22"/>
+                <w:szCs w:val="22"/>
+                <w:lang w:val="fr-FR" w:eastAsia="en-US" w:bidi="ar-SA"/>
+              </w:rPr>
+            </w:pPr>
+            <w:r>
+              <w:rPr/>
+            </w:r>
+          </w:p>
+          <w:p>
+            <w:pPr>
+              <w:pStyle w:val="BodyText"/>
+              <w:widowControl/>
+              <w:tabs>
+                <w:tab w:val="clear" w:pos="709"/>
+                <w:tab w:val="left" w:pos="850" w:leader="none"/>
+              </w:tabs>
+              <w:suppressAutoHyphens w:val="true"/>
+              <w:spacing w:lineRule="auto" w:line="240" w:before="0" w:after="0"/>
+              <w:ind w:end="175"/>
+              <w:jc w:val="start"/>
+              <w:rPr>
+                <w:rStyle w:val="PlaceholderText"/>
+                <w:rFonts w:ascii="Carlito" w:hAnsi="Carlito" w:eastAsia="Calibri" w:cs=""/>
+                <w:color w:val="000000"/>
+                <w:kern w:val="0"/>
+                <w:sz w:val="22"/>
+                <w:szCs w:val="22"/>
+                <w:lang w:val="fr-FR" w:eastAsia="en-US" w:bidi="ar-SA"/>
+              </w:rPr>
+            </w:pPr>
+            <w:r>
+              <w:rPr/>
+            </w:r>
+          </w:p>
+          <w:p>
+            <w:pPr>
+              <w:pStyle w:val="BodyText"/>
+              <w:widowControl/>
+              <w:tabs>
+                <w:tab w:val="clear" w:pos="709"/>
+                <w:tab w:val="left" w:pos="850" w:leader="none"/>
+              </w:tabs>
+              <w:suppressAutoHyphens w:val="true"/>
+              <w:spacing w:lineRule="auto" w:line="240" w:before="0" w:after="0"/>
+              <w:ind w:end="175"/>
+              <w:jc w:val="start"/>
+              <w:rPr>
+                <w:rStyle w:val="PlaceholderText"/>
+                <w:rFonts w:ascii="Carlito" w:hAnsi="Carlito" w:eastAsia="Calibri" w:cs=""/>
+                <w:color w:val="000000"/>
+                <w:kern w:val="0"/>
+                <w:sz w:val="22"/>
+                <w:szCs w:val="22"/>
+                <w:lang w:val="fr-FR" w:eastAsia="en-US" w:bidi="ar-SA"/>
+              </w:rPr>
+            </w:pPr>
+            <w:r>
+              <w:rPr/>
+            </w:r>
+          </w:p>
+          <w:p>
+            <w:pPr>
+              <w:pStyle w:val="BodyText"/>
+              <w:widowControl/>
+              <w:tabs>
+                <w:tab w:val="clear" w:pos="709"/>
+                <w:tab w:val="left" w:pos="850" w:leader="none"/>
+              </w:tabs>
+              <w:suppressAutoHyphens w:val="true"/>
+              <w:spacing w:lineRule="auto" w:line="240" w:before="0" w:after="0"/>
+              <w:ind w:end="175"/>
+              <w:jc w:val="start"/>
+              <w:rPr>
+                <w:rStyle w:val="PlaceholderText"/>
+                <w:rFonts w:ascii="Carlito" w:hAnsi="Carlito" w:eastAsia="Calibri" w:cs=""/>
+                <w:color w:val="000000"/>
+                <w:kern w:val="0"/>
+                <w:sz w:val="22"/>
+                <w:szCs w:val="22"/>
+                <w:lang w:val="fr-FR" w:eastAsia="en-US" w:bidi="ar-SA"/>
+              </w:rPr>
+            </w:pPr>
+            <w:r>
+              <w:rPr/>
+            </w:r>
+          </w:p>
+          <w:p>
+            <w:pPr>
+              <w:pStyle w:val="BodyText"/>
+              <w:widowControl/>
+              <w:tabs>
+                <w:tab w:val="clear" w:pos="709"/>
+                <w:tab w:val="left" w:pos="850" w:leader="none"/>
+              </w:tabs>
+              <w:suppressAutoHyphens w:val="true"/>
+              <w:spacing w:lineRule="auto" w:line="240" w:before="0" w:after="0"/>
+              <w:ind w:end="175"/>
+              <w:jc w:val="start"/>
+              <w:rPr>
+                <w:rStyle w:val="PlaceholderText"/>
+                <w:rFonts w:ascii="Carlito" w:hAnsi="Carlito" w:eastAsia="Calibri" w:cs=""/>
+                <w:color w:val="000000"/>
+                <w:kern w:val="0"/>
+                <w:sz w:val="22"/>
+                <w:szCs w:val="22"/>
+                <w:lang w:val="fr-FR" w:eastAsia="en-US" w:bidi="ar-SA"/>
+              </w:rPr>
+            </w:pPr>
+            <w:r>
+              <w:rPr/>
+            </w:r>
+          </w:p>
+          <w:p>
+            <w:pPr>
+              <w:pStyle w:val="BodyText"/>
+              <w:widowControl/>
+              <w:tabs>
+                <w:tab w:val="clear" w:pos="709"/>
+                <w:tab w:val="left" w:pos="850" w:leader="none"/>
+              </w:tabs>
+              <w:suppressAutoHyphens w:val="true"/>
+              <w:spacing w:lineRule="auto" w:line="240" w:before="0" w:after="0"/>
+              <w:ind w:end="175"/>
+              <w:jc w:val="start"/>
+              <w:rPr>
+                <w:rStyle w:val="PlaceholderText"/>
+                <w:rFonts w:ascii="Carlito" w:hAnsi="Carlito" w:eastAsia="Calibri" w:cs=""/>
+                <w:color w:val="000000"/>
+                <w:kern w:val="0"/>
+                <w:sz w:val="22"/>
+                <w:szCs w:val="22"/>
+                <w:lang w:val="fr-FR" w:eastAsia="en-US" w:bidi="ar-SA"/>
+              </w:rPr>
+            </w:pPr>
+            <w:r>
+              <w:rPr/>
+            </w:r>
+          </w:p>
+          <w:p>
+            <w:pPr>
+              <w:pStyle w:val="BodyText"/>
+              <w:widowControl/>
+              <w:tabs>
+                <w:tab w:val="clear" w:pos="709"/>
+                <w:tab w:val="left" w:pos="850" w:leader="none"/>
+              </w:tabs>
+              <w:suppressAutoHyphens w:val="true"/>
+              <w:spacing w:lineRule="auto" w:line="240" w:before="0" w:after="0"/>
+              <w:ind w:end="175"/>
+              <w:jc w:val="start"/>
+              <w:rPr>
+                <w:rStyle w:val="PlaceholderText"/>
+                <w:rFonts w:ascii="Carlito" w:hAnsi="Carlito" w:eastAsia="Calibri" w:cs=""/>
+                <w:color w:val="000000"/>
+                <w:kern w:val="0"/>
+                <w:sz w:val="22"/>
+                <w:szCs w:val="22"/>
+                <w:lang w:val="fr-FR" w:eastAsia="en-US" w:bidi="ar-SA"/>
+              </w:rPr>
+            </w:pPr>
+            <w:r>
+              <w:rPr/>
+            </w:r>
+          </w:p>
+          <w:p>
+            <w:pPr>
+              <w:pStyle w:val="BodyText"/>
+              <w:widowControl/>
+              <w:tabs>
+                <w:tab w:val="clear" w:pos="709"/>
+                <w:tab w:val="left" w:pos="850" w:leader="none"/>
+              </w:tabs>
+              <w:suppressAutoHyphens w:val="true"/>
+              <w:spacing w:lineRule="auto" w:line="240" w:before="0" w:after="0"/>
+              <w:ind w:end="175"/>
+              <w:jc w:val="start"/>
+              <w:rPr>
+                <w:rStyle w:val="PlaceholderText"/>
+                <w:rFonts w:ascii="Carlito" w:hAnsi="Carlito" w:eastAsia="Calibri" w:cs=""/>
+                <w:color w:val="000000"/>
+                <w:kern w:val="0"/>
+                <w:sz w:val="22"/>
+                <w:szCs w:val="22"/>
+                <w:lang w:val="fr-FR" w:eastAsia="en-US" w:bidi="ar-SA"/>
+              </w:rPr>
+            </w:pPr>
+            <w:r>
+              <w:rPr/>
+            </w:r>
+          </w:p>
+          <w:p>
+            <w:pPr>
+              <w:pStyle w:val="BodyText"/>
+              <w:widowControl/>
+              <w:tabs>
+                <w:tab w:val="clear" w:pos="709"/>
+                <w:tab w:val="left" w:pos="850" w:leader="none"/>
+              </w:tabs>
+              <w:suppressAutoHyphens w:val="true"/>
+              <w:spacing w:lineRule="auto" w:line="240" w:before="0" w:after="0"/>
+              <w:ind w:end="175"/>
+              <w:jc w:val="start"/>
+              <w:rPr>
+                <w:rStyle w:val="PlaceholderText"/>
+                <w:rFonts w:ascii="Carlito" w:hAnsi="Carlito" w:eastAsia="Calibri" w:cs=""/>
+                <w:color w:val="000000"/>
+                <w:kern w:val="0"/>
+                <w:sz w:val="22"/>
+                <w:szCs w:val="22"/>
+                <w:lang w:val="fr-FR" w:eastAsia="en-US" w:bidi="ar-SA"/>
+              </w:rPr>
+            </w:pPr>
+            <w:r>
+              <w:rPr/>
+            </w:r>
+          </w:p>
+          <w:p>
+            <w:pPr>
+              <w:pStyle w:val="BodyText"/>
+              <w:widowControl/>
+              <w:tabs>
+                <w:tab w:val="clear" w:pos="709"/>
+                <w:tab w:val="left" w:pos="850" w:leader="none"/>
+              </w:tabs>
+              <w:suppressAutoHyphens w:val="true"/>
+              <w:spacing w:lineRule="auto" w:line="240" w:before="0" w:after="0"/>
+              <w:ind w:end="175"/>
+              <w:jc w:val="start"/>
+              <w:rPr>
+                <w:rStyle w:val="PlaceholderText"/>
+                <w:rFonts w:ascii="Carlito" w:hAnsi="Carlito" w:eastAsia="Calibri" w:cs=""/>
+                <w:color w:val="000000"/>
+                <w:kern w:val="0"/>
+                <w:sz w:val="22"/>
+                <w:szCs w:val="22"/>
+                <w:lang w:val="fr-FR" w:eastAsia="en-US" w:bidi="ar-SA"/>
+              </w:rPr>
+            </w:pPr>
+            <w:r>
+              <w:rPr/>
+            </w:r>
+          </w:p>
+          <w:p>
+            <w:pPr>
+              <w:pStyle w:val="BodyText"/>
+              <w:widowControl/>
+              <w:tabs>
+                <w:tab w:val="clear" w:pos="709"/>
+                <w:tab w:val="left" w:pos="850" w:leader="none"/>
+              </w:tabs>
+              <w:suppressAutoHyphens w:val="true"/>
+              <w:spacing w:lineRule="auto" w:line="240" w:before="0" w:after="0"/>
+              <w:ind w:end="175"/>
+              <w:jc w:val="start"/>
+              <w:rPr>
+                <w:rStyle w:val="PlaceholderText"/>
+                <w:rFonts w:ascii="Carlito" w:hAnsi="Carlito" w:eastAsia="Calibri" w:cs=""/>
+                <w:color w:val="000000"/>
+                <w:kern w:val="0"/>
+                <w:sz w:val="22"/>
+                <w:szCs w:val="22"/>
+                <w:lang w:val="fr-FR" w:eastAsia="en-US" w:bidi="ar-SA"/>
+              </w:rPr>
+            </w:pPr>
+            <w:r>
+              <w:rPr/>
+            </w:r>
+          </w:p>
+          <w:p>
+            <w:pPr>
+              <w:pStyle w:val="BodyText"/>
+              <w:widowControl/>
+              <w:tabs>
+                <w:tab w:val="clear" w:pos="709"/>
+                <w:tab w:val="left" w:pos="850" w:leader="none"/>
+              </w:tabs>
+              <w:suppressAutoHyphens w:val="true"/>
+              <w:spacing w:lineRule="auto" w:line="240" w:before="0" w:after="0"/>
+              <w:ind w:end="175"/>
+              <w:jc w:val="start"/>
+              <w:rPr>
+                <w:rStyle w:val="PlaceholderText"/>
+                <w:rFonts w:ascii="Carlito" w:hAnsi="Carlito" w:eastAsia="Calibri" w:cs=""/>
+                <w:color w:val="000000"/>
+                <w:kern w:val="0"/>
+                <w:sz w:val="22"/>
+                <w:szCs w:val="22"/>
+                <w:lang w:val="fr-FR" w:eastAsia="en-US" w:bidi="ar-SA"/>
+              </w:rPr>
+            </w:pPr>
+            <w:r>
+              <w:rPr/>
             </w:r>
           </w:p>
         </w:tc>
@@ -24943,60 +25977,9 @@
               <w:spacing w:lineRule="auto" w:line="240" w:before="0" w:after="0"/>
               <w:ind w:end="175"/>
               <w:jc w:val="start"/>
-              <w:rPr/>
-            </w:pPr>
-            <w:r>
-              <w:drawing>
-                <wp:anchor distT="0" distB="0" distL="0" distR="0" simplePos="0" relativeHeight="116" behindDoc="0" locked="0" layoutInCell="1" allowOverlap="1">
-                  <wp:simplePos x="0" y="0"/>
-                  <wp:positionH relativeFrom="column">
-                    <wp:posOffset>92075</wp:posOffset>
-                  </wp:positionH>
-                  <wp:positionV relativeFrom="paragraph">
-                    <wp:posOffset>317500</wp:posOffset>
-                  </wp:positionV>
-                  <wp:extent cx="5861050" cy="3256280"/>
-                  <wp:effectExtent l="0" t="0" r="0" b="0"/>
-                  <wp:wrapNone/>
-                  <wp:docPr id="21" name="Image with transparency 1"/>
-                  <wp:cNvGraphicFramePr>
-                    <a:graphicFrameLocks xmlns:a="http://schemas.openxmlformats.org/drawingml/2006/main" noChangeAspect="1"/>
-                  </wp:cNvGraphicFramePr>
-                  <a:graphic xmlns:a="http://schemas.openxmlformats.org/drawingml/2006/main">
-                    <a:graphicData uri="http://schemas.openxmlformats.org/drawingml/2006/picture">
-                      <pic:pic xmlns:pic="http://schemas.openxmlformats.org/drawingml/2006/picture">
-                        <pic:nvPicPr>
-                          <pic:cNvPr id="21" name="Image with transparency 1"/>
-                          <pic:cNvPicPr>
-                            <a:picLocks noChangeAspect="1" noChangeArrowheads="1"/>
-                          </pic:cNvPicPr>
-                        </pic:nvPicPr>
-                        <pic:blipFill>
-                          <a:blip r:embed="rId36"/>
-                          <a:stretch>
-                            <a:fillRect/>
-                          </a:stretch>
-                        </pic:blipFill>
-                        <pic:spPr bwMode="auto">
-                          <a:xfrm>
-                            <a:off x="0" y="0"/>
-                            <a:ext cx="5861050" cy="3256280"/>
-                          </a:xfrm>
-                          <a:prstGeom prst="rect">
-                            <a:avLst/>
-                          </a:prstGeom>
-                          <a:noFill/>
-                        </pic:spPr>
-                      </pic:pic>
-                    </a:graphicData>
-                  </a:graphic>
-                </wp:anchor>
-              </w:drawing>
-            </w:r>
-            <w:r>
               <w:rPr>
                 <w:rStyle w:val="PlaceholderText"/>
-                <w:rFonts w:eastAsia="Calibri" w:cs="" w:ascii="Carlito" w:hAnsi="Carlito"/>
+                <w:rFonts w:ascii="Carlito" w:hAnsi="Carlito" w:eastAsia="Calibri" w:cs=""/>
                 <w:b/>
                 <w:bCs/>
                 <w:color w:val="000000"/>
@@ -25005,8 +25988,987 @@
                 <w:szCs w:val="22"/>
                 <w:lang w:val="fr-FR" w:eastAsia="en-US" w:bidi="ar-SA"/>
               </w:rPr>
-              <w:t>Doc</w:t>
-            </w:r>
+            </w:pPr>
+            <w:r>
+              <w:rPr/>
+            </w:r>
+          </w:p>
+          <w:p>
+            <w:pPr>
+              <w:pStyle w:val="BodyText"/>
+              <w:widowControl/>
+              <w:tabs>
+                <w:tab w:val="clear" w:pos="709"/>
+                <w:tab w:val="left" w:pos="850" w:leader="none"/>
+              </w:tabs>
+              <w:suppressAutoHyphens w:val="true"/>
+              <w:spacing w:lineRule="auto" w:line="240" w:before="0" w:after="0"/>
+              <w:ind w:end="175"/>
+              <w:jc w:val="start"/>
+              <w:rPr>
+                <w:rStyle w:val="PlaceholderText"/>
+                <w:rFonts w:ascii="Carlito" w:hAnsi="Carlito" w:eastAsia="Calibri" w:cs=""/>
+                <w:color w:val="000000"/>
+                <w:kern w:val="0"/>
+                <w:sz w:val="22"/>
+                <w:szCs w:val="22"/>
+                <w:lang w:val="fr-FR" w:eastAsia="en-US" w:bidi="ar-SA"/>
+              </w:rPr>
+            </w:pPr>
+            <w:r>
+              <w:rPr/>
+            </w:r>
+          </w:p>
+          <w:p>
+            <w:pPr>
+              <w:pStyle w:val="BodyText"/>
+              <w:widowControl/>
+              <w:tabs>
+                <w:tab w:val="clear" w:pos="709"/>
+                <w:tab w:val="left" w:pos="850" w:leader="none"/>
+              </w:tabs>
+              <w:suppressAutoHyphens w:val="true"/>
+              <w:spacing w:lineRule="auto" w:line="240" w:before="0" w:after="0"/>
+              <w:ind w:end="175"/>
+              <w:jc w:val="start"/>
+              <w:rPr>
+                <w:rStyle w:val="PlaceholderText"/>
+                <w:rFonts w:ascii="Carlito" w:hAnsi="Carlito" w:eastAsia="Calibri" w:cs=""/>
+                <w:color w:val="000000"/>
+                <w:kern w:val="0"/>
+                <w:sz w:val="22"/>
+                <w:szCs w:val="22"/>
+                <w:lang w:val="fr-FR" w:eastAsia="en-US" w:bidi="ar-SA"/>
+              </w:rPr>
+            </w:pPr>
+            <w:r>
+              <w:rPr/>
+            </w:r>
+          </w:p>
+          <w:p>
+            <w:pPr>
+              <w:pStyle w:val="BodyText"/>
+              <w:widowControl/>
+              <w:tabs>
+                <w:tab w:val="clear" w:pos="709"/>
+                <w:tab w:val="left" w:pos="850" w:leader="none"/>
+              </w:tabs>
+              <w:suppressAutoHyphens w:val="true"/>
+              <w:spacing w:lineRule="auto" w:line="240" w:before="0" w:after="0"/>
+              <w:ind w:end="175"/>
+              <w:jc w:val="start"/>
+              <w:rPr>
+                <w:rStyle w:val="PlaceholderText"/>
+                <w:rFonts w:ascii="Carlito" w:hAnsi="Carlito" w:eastAsia="Calibri" w:cs=""/>
+                <w:color w:val="000000"/>
+                <w:kern w:val="0"/>
+                <w:sz w:val="22"/>
+                <w:szCs w:val="22"/>
+                <w:lang w:val="fr-FR" w:eastAsia="en-US" w:bidi="ar-SA"/>
+              </w:rPr>
+            </w:pPr>
+            <w:r>
+              <w:rPr/>
+            </w:r>
+          </w:p>
+          <w:p>
+            <w:pPr>
+              <w:pStyle w:val="BodyText"/>
+              <w:widowControl/>
+              <w:tabs>
+                <w:tab w:val="clear" w:pos="709"/>
+                <w:tab w:val="left" w:pos="850" w:leader="none"/>
+              </w:tabs>
+              <w:suppressAutoHyphens w:val="true"/>
+              <w:spacing w:lineRule="auto" w:line="240" w:before="0" w:after="0"/>
+              <w:ind w:end="175"/>
+              <w:jc w:val="start"/>
+              <w:rPr>
+                <w:rStyle w:val="PlaceholderText"/>
+                <w:rFonts w:ascii="Carlito" w:hAnsi="Carlito" w:eastAsia="Calibri" w:cs=""/>
+                <w:color w:val="000000"/>
+                <w:kern w:val="0"/>
+                <w:sz w:val="22"/>
+                <w:szCs w:val="22"/>
+                <w:lang w:val="fr-FR" w:eastAsia="en-US" w:bidi="ar-SA"/>
+              </w:rPr>
+            </w:pPr>
+            <w:r>
+              <w:rPr/>
+            </w:r>
+          </w:p>
+          <w:p>
+            <w:pPr>
+              <w:pStyle w:val="BodyText"/>
+              <w:widowControl/>
+              <w:tabs>
+                <w:tab w:val="clear" w:pos="709"/>
+                <w:tab w:val="left" w:pos="850" w:leader="none"/>
+              </w:tabs>
+              <w:suppressAutoHyphens w:val="true"/>
+              <w:spacing w:lineRule="auto" w:line="240" w:before="0" w:after="0"/>
+              <w:ind w:end="175"/>
+              <w:jc w:val="start"/>
+              <w:rPr>
+                <w:rStyle w:val="PlaceholderText"/>
+                <w:rFonts w:ascii="Carlito" w:hAnsi="Carlito" w:eastAsia="Calibri" w:cs=""/>
+                <w:color w:val="000000"/>
+                <w:kern w:val="0"/>
+                <w:sz w:val="22"/>
+                <w:szCs w:val="22"/>
+                <w:lang w:val="fr-FR" w:eastAsia="en-US" w:bidi="ar-SA"/>
+              </w:rPr>
+            </w:pPr>
+            <w:r>
+              <w:rPr/>
+            </w:r>
+          </w:p>
+          <w:p>
+            <w:pPr>
+              <w:pStyle w:val="BodyText"/>
+              <w:widowControl/>
+              <w:tabs>
+                <w:tab w:val="clear" w:pos="709"/>
+                <w:tab w:val="left" w:pos="850" w:leader="none"/>
+              </w:tabs>
+              <w:suppressAutoHyphens w:val="true"/>
+              <w:spacing w:lineRule="auto" w:line="240" w:before="0" w:after="0"/>
+              <w:ind w:end="175"/>
+              <w:jc w:val="start"/>
+              <w:rPr>
+                <w:rStyle w:val="PlaceholderText"/>
+                <w:rFonts w:ascii="Carlito" w:hAnsi="Carlito" w:eastAsia="Calibri" w:cs=""/>
+                <w:color w:val="000000"/>
+                <w:kern w:val="0"/>
+                <w:sz w:val="22"/>
+                <w:szCs w:val="22"/>
+                <w:lang w:val="fr-FR" w:eastAsia="en-US" w:bidi="ar-SA"/>
+              </w:rPr>
+            </w:pPr>
+            <w:r>
+              <w:rPr/>
+            </w:r>
+          </w:p>
+          <w:p>
+            <w:pPr>
+              <w:pStyle w:val="BodyText"/>
+              <w:widowControl/>
+              <w:tabs>
+                <w:tab w:val="clear" w:pos="709"/>
+                <w:tab w:val="left" w:pos="850" w:leader="none"/>
+              </w:tabs>
+              <w:suppressAutoHyphens w:val="true"/>
+              <w:spacing w:lineRule="auto" w:line="240" w:before="0" w:after="0"/>
+              <w:ind w:end="175"/>
+              <w:jc w:val="start"/>
+              <w:rPr>
+                <w:rStyle w:val="PlaceholderText"/>
+                <w:rFonts w:ascii="Carlito" w:hAnsi="Carlito" w:eastAsia="Calibri" w:cs=""/>
+                <w:color w:val="000000"/>
+                <w:kern w:val="0"/>
+                <w:sz w:val="22"/>
+                <w:szCs w:val="22"/>
+                <w:lang w:val="fr-FR" w:eastAsia="en-US" w:bidi="ar-SA"/>
+              </w:rPr>
+            </w:pPr>
+            <w:r>
+              <w:rPr/>
+            </w:r>
+          </w:p>
+          <w:p>
+            <w:pPr>
+              <w:pStyle w:val="BodyText"/>
+              <w:widowControl/>
+              <w:tabs>
+                <w:tab w:val="clear" w:pos="709"/>
+                <w:tab w:val="left" w:pos="850" w:leader="none"/>
+              </w:tabs>
+              <w:suppressAutoHyphens w:val="true"/>
+              <w:spacing w:lineRule="auto" w:line="240" w:before="0" w:after="0"/>
+              <w:ind w:end="175"/>
+              <w:jc w:val="start"/>
+              <w:rPr>
+                <w:rStyle w:val="PlaceholderText"/>
+                <w:rFonts w:ascii="Carlito" w:hAnsi="Carlito" w:eastAsia="Calibri" w:cs=""/>
+                <w:color w:val="000000"/>
+                <w:kern w:val="0"/>
+                <w:sz w:val="22"/>
+                <w:szCs w:val="22"/>
+                <w:lang w:val="fr-FR" w:eastAsia="en-US" w:bidi="ar-SA"/>
+              </w:rPr>
+            </w:pPr>
+            <w:r>
+              <w:rPr/>
+            </w:r>
+          </w:p>
+          <w:p>
+            <w:pPr>
+              <w:pStyle w:val="BodyText"/>
+              <w:widowControl/>
+              <w:tabs>
+                <w:tab w:val="clear" w:pos="709"/>
+                <w:tab w:val="left" w:pos="850" w:leader="none"/>
+              </w:tabs>
+              <w:suppressAutoHyphens w:val="true"/>
+              <w:spacing w:lineRule="auto" w:line="240" w:before="0" w:after="0"/>
+              <w:ind w:end="175"/>
+              <w:jc w:val="start"/>
+              <w:rPr>
+                <w:rStyle w:val="PlaceholderText"/>
+                <w:rFonts w:ascii="Carlito" w:hAnsi="Carlito" w:eastAsia="Calibri" w:cs=""/>
+                <w:color w:val="000000"/>
+                <w:kern w:val="0"/>
+                <w:sz w:val="22"/>
+                <w:szCs w:val="22"/>
+                <w:lang w:val="fr-FR" w:eastAsia="en-US" w:bidi="ar-SA"/>
+              </w:rPr>
+            </w:pPr>
+            <w:r>
+              <w:rPr/>
+            </w:r>
+          </w:p>
+          <w:p>
+            <w:pPr>
+              <w:pStyle w:val="BodyText"/>
+              <w:widowControl/>
+              <w:tabs>
+                <w:tab w:val="clear" w:pos="709"/>
+                <w:tab w:val="left" w:pos="850" w:leader="none"/>
+              </w:tabs>
+              <w:suppressAutoHyphens w:val="true"/>
+              <w:spacing w:lineRule="auto" w:line="240" w:before="0" w:after="0"/>
+              <w:ind w:end="175"/>
+              <w:jc w:val="start"/>
+              <w:rPr>
+                <w:rStyle w:val="PlaceholderText"/>
+                <w:rFonts w:ascii="Carlito" w:hAnsi="Carlito" w:eastAsia="Calibri" w:cs=""/>
+                <w:color w:val="000000"/>
+                <w:kern w:val="0"/>
+                <w:sz w:val="22"/>
+                <w:szCs w:val="22"/>
+                <w:lang w:val="fr-FR" w:eastAsia="en-US" w:bidi="ar-SA"/>
+              </w:rPr>
+            </w:pPr>
+            <w:r>
+              <w:rPr/>
+            </w:r>
+          </w:p>
+          <w:p>
+            <w:pPr>
+              <w:pStyle w:val="BodyText"/>
+              <w:widowControl/>
+              <w:tabs>
+                <w:tab w:val="clear" w:pos="709"/>
+                <w:tab w:val="left" w:pos="850" w:leader="none"/>
+              </w:tabs>
+              <w:suppressAutoHyphens w:val="true"/>
+              <w:spacing w:lineRule="auto" w:line="240" w:before="0" w:after="0"/>
+              <w:ind w:end="175"/>
+              <w:jc w:val="start"/>
+              <w:rPr>
+                <w:rStyle w:val="PlaceholderText"/>
+                <w:rFonts w:ascii="Carlito" w:hAnsi="Carlito" w:eastAsia="Calibri" w:cs=""/>
+                <w:color w:val="000000"/>
+                <w:kern w:val="0"/>
+                <w:sz w:val="22"/>
+                <w:szCs w:val="22"/>
+                <w:lang w:val="fr-FR" w:eastAsia="en-US" w:bidi="ar-SA"/>
+              </w:rPr>
+            </w:pPr>
+            <w:r>
+              <w:rPr/>
+            </w:r>
+          </w:p>
+          <w:p>
+            <w:pPr>
+              <w:pStyle w:val="BodyText"/>
+              <w:widowControl/>
+              <w:tabs>
+                <w:tab w:val="clear" w:pos="709"/>
+                <w:tab w:val="left" w:pos="850" w:leader="none"/>
+              </w:tabs>
+              <w:suppressAutoHyphens w:val="true"/>
+              <w:spacing w:lineRule="auto" w:line="240" w:before="0" w:after="0"/>
+              <w:ind w:end="175"/>
+              <w:jc w:val="start"/>
+              <w:rPr>
+                <w:rStyle w:val="PlaceholderText"/>
+                <w:rFonts w:ascii="Carlito" w:hAnsi="Carlito" w:eastAsia="Calibri" w:cs=""/>
+                <w:color w:val="000000"/>
+                <w:kern w:val="0"/>
+                <w:sz w:val="22"/>
+                <w:szCs w:val="22"/>
+                <w:lang w:val="fr-FR" w:eastAsia="en-US" w:bidi="ar-SA"/>
+              </w:rPr>
+            </w:pPr>
+            <w:r>
+              <w:rPr/>
+            </w:r>
+          </w:p>
+          <w:p>
+            <w:pPr>
+              <w:pStyle w:val="BodyText"/>
+              <w:widowControl/>
+              <w:tabs>
+                <w:tab w:val="clear" w:pos="709"/>
+                <w:tab w:val="left" w:pos="850" w:leader="none"/>
+              </w:tabs>
+              <w:suppressAutoHyphens w:val="true"/>
+              <w:spacing w:lineRule="auto" w:line="240" w:before="0" w:after="0"/>
+              <w:ind w:end="175"/>
+              <w:jc w:val="start"/>
+              <w:rPr>
+                <w:rStyle w:val="PlaceholderText"/>
+                <w:rFonts w:ascii="Carlito" w:hAnsi="Carlito" w:eastAsia="Calibri" w:cs=""/>
+                <w:color w:val="000000"/>
+                <w:kern w:val="0"/>
+                <w:sz w:val="22"/>
+                <w:szCs w:val="22"/>
+                <w:lang w:val="fr-FR" w:eastAsia="en-US" w:bidi="ar-SA"/>
+              </w:rPr>
+            </w:pPr>
+            <w:r>
+              <w:rPr/>
+            </w:r>
+          </w:p>
+          <w:p>
+            <w:pPr>
+              <w:pStyle w:val="BodyText"/>
+              <w:widowControl/>
+              <w:tabs>
+                <w:tab w:val="clear" w:pos="709"/>
+                <w:tab w:val="left" w:pos="850" w:leader="none"/>
+              </w:tabs>
+              <w:suppressAutoHyphens w:val="true"/>
+              <w:spacing w:lineRule="auto" w:line="240" w:before="0" w:after="0"/>
+              <w:ind w:end="175"/>
+              <w:jc w:val="start"/>
+              <w:rPr>
+                <w:rStyle w:val="PlaceholderText"/>
+                <w:rFonts w:ascii="Carlito" w:hAnsi="Carlito" w:eastAsia="Calibri" w:cs=""/>
+                <w:color w:val="000000"/>
+                <w:kern w:val="0"/>
+                <w:sz w:val="22"/>
+                <w:szCs w:val="22"/>
+                <w:lang w:val="fr-FR" w:eastAsia="en-US" w:bidi="ar-SA"/>
+              </w:rPr>
+            </w:pPr>
+            <w:r>
+              <w:rPr/>
+            </w:r>
+          </w:p>
+          <w:p>
+            <w:pPr>
+              <w:pStyle w:val="BodyText"/>
+              <w:widowControl/>
+              <w:tabs>
+                <w:tab w:val="clear" w:pos="709"/>
+                <w:tab w:val="left" w:pos="850" w:leader="none"/>
+              </w:tabs>
+              <w:suppressAutoHyphens w:val="true"/>
+              <w:spacing w:lineRule="auto" w:line="240" w:before="0" w:after="0"/>
+              <w:ind w:end="175"/>
+              <w:jc w:val="start"/>
+              <w:rPr>
+                <w:rStyle w:val="PlaceholderText"/>
+                <w:rFonts w:ascii="Carlito" w:hAnsi="Carlito" w:eastAsia="Calibri" w:cs=""/>
+                <w:color w:val="000000"/>
+                <w:kern w:val="0"/>
+                <w:sz w:val="22"/>
+                <w:szCs w:val="22"/>
+                <w:lang w:val="fr-FR" w:eastAsia="en-US" w:bidi="ar-SA"/>
+              </w:rPr>
+            </w:pPr>
+            <w:r>
+              <w:rPr/>
+            </w:r>
+          </w:p>
+          <w:p>
+            <w:pPr>
+              <w:pStyle w:val="BodyText"/>
+              <w:widowControl/>
+              <w:tabs>
+                <w:tab w:val="clear" w:pos="709"/>
+                <w:tab w:val="left" w:pos="850" w:leader="none"/>
+              </w:tabs>
+              <w:suppressAutoHyphens w:val="true"/>
+              <w:spacing w:lineRule="auto" w:line="240" w:before="0" w:after="0"/>
+              <w:ind w:end="175"/>
+              <w:jc w:val="start"/>
+              <w:rPr>
+                <w:rStyle w:val="PlaceholderText"/>
+                <w:rFonts w:ascii="Carlito" w:hAnsi="Carlito" w:eastAsia="Calibri" w:cs=""/>
+                <w:color w:val="000000"/>
+                <w:kern w:val="0"/>
+                <w:sz w:val="22"/>
+                <w:szCs w:val="22"/>
+                <w:lang w:val="fr-FR" w:eastAsia="en-US" w:bidi="ar-SA"/>
+              </w:rPr>
+            </w:pPr>
+            <w:r>
+              <w:rPr/>
+            </w:r>
+          </w:p>
+          <w:p>
+            <w:pPr>
+              <w:pStyle w:val="BodyText"/>
+              <w:widowControl/>
+              <w:tabs>
+                <w:tab w:val="clear" w:pos="709"/>
+                <w:tab w:val="left" w:pos="850" w:leader="none"/>
+              </w:tabs>
+              <w:suppressAutoHyphens w:val="true"/>
+              <w:spacing w:lineRule="auto" w:line="240" w:before="0" w:after="0"/>
+              <w:ind w:end="175"/>
+              <w:jc w:val="start"/>
+              <w:rPr>
+                <w:rStyle w:val="PlaceholderText"/>
+                <w:rFonts w:ascii="Carlito" w:hAnsi="Carlito" w:eastAsia="Calibri" w:cs=""/>
+                <w:color w:val="000000"/>
+                <w:kern w:val="0"/>
+                <w:sz w:val="22"/>
+                <w:szCs w:val="22"/>
+                <w:lang w:val="fr-FR" w:eastAsia="en-US" w:bidi="ar-SA"/>
+              </w:rPr>
+            </w:pPr>
+            <w:r>
+              <w:rPr/>
+            </w:r>
+          </w:p>
+          <w:p>
+            <w:pPr>
+              <w:pStyle w:val="BodyText"/>
+              <w:widowControl/>
+              <w:tabs>
+                <w:tab w:val="clear" w:pos="709"/>
+                <w:tab w:val="left" w:pos="850" w:leader="none"/>
+              </w:tabs>
+              <w:suppressAutoHyphens w:val="true"/>
+              <w:spacing w:lineRule="auto" w:line="240" w:before="0" w:after="0"/>
+              <w:ind w:end="175"/>
+              <w:jc w:val="start"/>
+              <w:rPr>
+                <w:rStyle w:val="PlaceholderText"/>
+                <w:rFonts w:ascii="Carlito" w:hAnsi="Carlito" w:eastAsia="Calibri" w:cs=""/>
+                <w:color w:val="000000"/>
+                <w:kern w:val="0"/>
+                <w:sz w:val="22"/>
+                <w:szCs w:val="22"/>
+                <w:lang w:val="fr-FR" w:eastAsia="en-US" w:bidi="ar-SA"/>
+              </w:rPr>
+            </w:pPr>
+            <w:r>
+              <w:rPr/>
+            </w:r>
+          </w:p>
+          <w:p>
+            <w:pPr>
+              <w:pStyle w:val="BodyText"/>
+              <w:widowControl/>
+              <w:tabs>
+                <w:tab w:val="clear" w:pos="709"/>
+                <w:tab w:val="left" w:pos="850" w:leader="none"/>
+              </w:tabs>
+              <w:suppressAutoHyphens w:val="true"/>
+              <w:spacing w:lineRule="auto" w:line="240" w:before="0" w:after="0"/>
+              <w:ind w:end="175"/>
+              <w:jc w:val="start"/>
+              <w:rPr>
+                <w:rStyle w:val="PlaceholderText"/>
+                <w:rFonts w:ascii="Carlito" w:hAnsi="Carlito" w:eastAsia="Calibri" w:cs=""/>
+                <w:color w:val="000000"/>
+                <w:kern w:val="0"/>
+                <w:sz w:val="22"/>
+                <w:szCs w:val="22"/>
+                <w:lang w:val="fr-FR" w:eastAsia="en-US" w:bidi="ar-SA"/>
+              </w:rPr>
+            </w:pPr>
+            <w:r>
+              <w:rPr/>
+            </w:r>
+          </w:p>
+          <w:p>
+            <w:pPr>
+              <w:pStyle w:val="BodyText"/>
+              <w:widowControl/>
+              <w:tabs>
+                <w:tab w:val="clear" w:pos="709"/>
+                <w:tab w:val="left" w:pos="850" w:leader="none"/>
+              </w:tabs>
+              <w:suppressAutoHyphens w:val="true"/>
+              <w:spacing w:lineRule="auto" w:line="240" w:before="0" w:after="0"/>
+              <w:ind w:end="175"/>
+              <w:jc w:val="start"/>
+              <w:rPr>
+                <w:rStyle w:val="PlaceholderText"/>
+                <w:rFonts w:ascii="Carlito" w:hAnsi="Carlito" w:eastAsia="Calibri" w:cs=""/>
+                <w:color w:val="000000"/>
+                <w:kern w:val="0"/>
+                <w:sz w:val="22"/>
+                <w:szCs w:val="22"/>
+                <w:lang w:val="fr-FR" w:eastAsia="en-US" w:bidi="ar-SA"/>
+              </w:rPr>
+            </w:pPr>
+            <w:r>
+              <w:rPr/>
+            </w:r>
+          </w:p>
+          <w:p>
+            <w:pPr>
+              <w:pStyle w:val="BodyText"/>
+              <w:widowControl/>
+              <w:tabs>
+                <w:tab w:val="clear" w:pos="709"/>
+                <w:tab w:val="left" w:pos="850" w:leader="none"/>
+              </w:tabs>
+              <w:suppressAutoHyphens w:val="true"/>
+              <w:spacing w:lineRule="auto" w:line="240" w:before="0" w:after="0"/>
+              <w:ind w:end="175"/>
+              <w:jc w:val="start"/>
+              <w:rPr>
+                <w:rStyle w:val="PlaceholderText"/>
+                <w:rFonts w:ascii="Carlito" w:hAnsi="Carlito" w:eastAsia="Calibri" w:cs=""/>
+                <w:color w:val="000000"/>
+                <w:kern w:val="0"/>
+                <w:sz w:val="22"/>
+                <w:szCs w:val="22"/>
+                <w:lang w:val="fr-FR" w:eastAsia="en-US" w:bidi="ar-SA"/>
+              </w:rPr>
+            </w:pPr>
+            <w:r>
+              <w:rPr/>
+            </w:r>
+          </w:p>
+          <w:p>
+            <w:pPr>
+              <w:pStyle w:val="BodyText"/>
+              <w:widowControl/>
+              <w:tabs>
+                <w:tab w:val="clear" w:pos="709"/>
+                <w:tab w:val="left" w:pos="850" w:leader="none"/>
+              </w:tabs>
+              <w:suppressAutoHyphens w:val="true"/>
+              <w:spacing w:lineRule="auto" w:line="240" w:before="0" w:after="0"/>
+              <w:ind w:end="175"/>
+              <w:jc w:val="start"/>
+              <w:rPr>
+                <w:rStyle w:val="PlaceholderText"/>
+                <w:rFonts w:ascii="Carlito" w:hAnsi="Carlito" w:eastAsia="Calibri" w:cs=""/>
+                <w:color w:val="000000"/>
+                <w:kern w:val="0"/>
+                <w:sz w:val="22"/>
+                <w:szCs w:val="22"/>
+                <w:lang w:val="fr-FR" w:eastAsia="en-US" w:bidi="ar-SA"/>
+              </w:rPr>
+            </w:pPr>
+            <w:r>
+              <w:rPr/>
+            </w:r>
+          </w:p>
+          <w:p>
+            <w:pPr>
+              <w:pStyle w:val="BodyText"/>
+              <w:widowControl/>
+              <w:tabs>
+                <w:tab w:val="clear" w:pos="709"/>
+                <w:tab w:val="left" w:pos="850" w:leader="none"/>
+              </w:tabs>
+              <w:suppressAutoHyphens w:val="true"/>
+              <w:spacing w:lineRule="auto" w:line="240" w:before="0" w:after="0"/>
+              <w:ind w:end="175"/>
+              <w:jc w:val="start"/>
+              <w:rPr>
+                <w:rStyle w:val="PlaceholderText"/>
+                <w:rFonts w:ascii="Carlito" w:hAnsi="Carlito" w:eastAsia="Calibri" w:cs=""/>
+                <w:color w:val="000000"/>
+                <w:kern w:val="0"/>
+                <w:sz w:val="22"/>
+                <w:szCs w:val="22"/>
+                <w:lang w:val="fr-FR" w:eastAsia="en-US" w:bidi="ar-SA"/>
+              </w:rPr>
+            </w:pPr>
+            <w:r>
+              <w:rPr/>
+            </w:r>
+          </w:p>
+          <w:p>
+            <w:pPr>
+              <w:pStyle w:val="BodyText"/>
+              <w:widowControl/>
+              <w:tabs>
+                <w:tab w:val="clear" w:pos="709"/>
+                <w:tab w:val="left" w:pos="850" w:leader="none"/>
+              </w:tabs>
+              <w:suppressAutoHyphens w:val="true"/>
+              <w:spacing w:lineRule="auto" w:line="240" w:before="0" w:after="0"/>
+              <w:ind w:end="175"/>
+              <w:jc w:val="start"/>
+              <w:rPr>
+                <w:rStyle w:val="PlaceholderText"/>
+                <w:rFonts w:ascii="Carlito" w:hAnsi="Carlito" w:eastAsia="Calibri" w:cs=""/>
+                <w:color w:val="000000"/>
+                <w:kern w:val="0"/>
+                <w:sz w:val="22"/>
+                <w:szCs w:val="22"/>
+                <w:lang w:val="fr-FR" w:eastAsia="en-US" w:bidi="ar-SA"/>
+              </w:rPr>
+            </w:pPr>
+            <w:r>
+              <w:rPr/>
+            </w:r>
+          </w:p>
+          <w:p>
+            <w:pPr>
+              <w:pStyle w:val="BodyText"/>
+              <w:widowControl/>
+              <w:tabs>
+                <w:tab w:val="clear" w:pos="709"/>
+                <w:tab w:val="left" w:pos="850" w:leader="none"/>
+              </w:tabs>
+              <w:suppressAutoHyphens w:val="true"/>
+              <w:spacing w:lineRule="auto" w:line="240" w:before="0" w:after="0"/>
+              <w:ind w:end="175"/>
+              <w:jc w:val="start"/>
+              <w:rPr>
+                <w:rStyle w:val="PlaceholderText"/>
+                <w:rFonts w:ascii="Carlito" w:hAnsi="Carlito" w:eastAsia="Calibri" w:cs=""/>
+                <w:color w:val="000000"/>
+                <w:kern w:val="0"/>
+                <w:sz w:val="22"/>
+                <w:szCs w:val="22"/>
+                <w:lang w:val="fr-FR" w:eastAsia="en-US" w:bidi="ar-SA"/>
+              </w:rPr>
+            </w:pPr>
+            <w:r>
+              <w:rPr/>
+            </w:r>
+          </w:p>
+          <w:p>
+            <w:pPr>
+              <w:pStyle w:val="BodyText"/>
+              <w:widowControl/>
+              <w:tabs>
+                <w:tab w:val="clear" w:pos="709"/>
+                <w:tab w:val="left" w:pos="850" w:leader="none"/>
+              </w:tabs>
+              <w:suppressAutoHyphens w:val="true"/>
+              <w:spacing w:lineRule="auto" w:line="240" w:before="0" w:after="0"/>
+              <w:ind w:end="175"/>
+              <w:jc w:val="start"/>
+              <w:rPr>
+                <w:rStyle w:val="PlaceholderText"/>
+                <w:rFonts w:ascii="Carlito" w:hAnsi="Carlito" w:eastAsia="Calibri" w:cs=""/>
+                <w:color w:val="000000"/>
+                <w:kern w:val="0"/>
+                <w:sz w:val="22"/>
+                <w:szCs w:val="22"/>
+                <w:lang w:val="fr-FR" w:eastAsia="en-US" w:bidi="ar-SA"/>
+              </w:rPr>
+            </w:pPr>
+            <w:r>
+              <w:rPr/>
+            </w:r>
+          </w:p>
+          <w:p>
+            <w:pPr>
+              <w:pStyle w:val="BodyText"/>
+              <w:widowControl/>
+              <w:tabs>
+                <w:tab w:val="clear" w:pos="709"/>
+                <w:tab w:val="left" w:pos="850" w:leader="none"/>
+              </w:tabs>
+              <w:suppressAutoHyphens w:val="true"/>
+              <w:spacing w:lineRule="auto" w:line="240" w:before="0" w:after="0"/>
+              <w:ind w:end="175"/>
+              <w:jc w:val="start"/>
+              <w:rPr>
+                <w:rStyle w:val="PlaceholderText"/>
+                <w:rFonts w:ascii="Carlito" w:hAnsi="Carlito" w:eastAsia="Calibri" w:cs=""/>
+                <w:color w:val="000000"/>
+                <w:kern w:val="0"/>
+                <w:sz w:val="22"/>
+                <w:szCs w:val="22"/>
+                <w:lang w:val="fr-FR" w:eastAsia="en-US" w:bidi="ar-SA"/>
+              </w:rPr>
+            </w:pPr>
+            <w:r>
+              <w:rPr/>
+            </w:r>
+          </w:p>
+          <w:p>
+            <w:pPr>
+              <w:pStyle w:val="BodyText"/>
+              <w:widowControl/>
+              <w:tabs>
+                <w:tab w:val="clear" w:pos="709"/>
+                <w:tab w:val="left" w:pos="850" w:leader="none"/>
+              </w:tabs>
+              <w:suppressAutoHyphens w:val="true"/>
+              <w:spacing w:lineRule="auto" w:line="240" w:before="0" w:after="0"/>
+              <w:ind w:end="175"/>
+              <w:jc w:val="start"/>
+              <w:rPr>
+                <w:rStyle w:val="PlaceholderText"/>
+                <w:rFonts w:ascii="Carlito" w:hAnsi="Carlito" w:eastAsia="Calibri" w:cs=""/>
+                <w:color w:val="000000"/>
+                <w:kern w:val="0"/>
+                <w:sz w:val="22"/>
+                <w:szCs w:val="22"/>
+                <w:lang w:val="fr-FR" w:eastAsia="en-US" w:bidi="ar-SA"/>
+              </w:rPr>
+            </w:pPr>
+            <w:r>
+              <w:rPr/>
+            </w:r>
+          </w:p>
+          <w:p>
+            <w:pPr>
+              <w:pStyle w:val="BodyText"/>
+              <w:widowControl/>
+              <w:tabs>
+                <w:tab w:val="clear" w:pos="709"/>
+                <w:tab w:val="left" w:pos="850" w:leader="none"/>
+              </w:tabs>
+              <w:suppressAutoHyphens w:val="true"/>
+              <w:spacing w:lineRule="auto" w:line="240" w:before="0" w:after="0"/>
+              <w:ind w:end="175"/>
+              <w:jc w:val="start"/>
+              <w:rPr>
+                <w:rStyle w:val="PlaceholderText"/>
+                <w:rFonts w:ascii="Carlito" w:hAnsi="Carlito" w:eastAsia="Calibri" w:cs=""/>
+                <w:color w:val="000000"/>
+                <w:kern w:val="0"/>
+                <w:sz w:val="22"/>
+                <w:szCs w:val="22"/>
+                <w:lang w:val="fr-FR" w:eastAsia="en-US" w:bidi="ar-SA"/>
+              </w:rPr>
+            </w:pPr>
+            <w:r>
+              <w:rPr/>
+            </w:r>
+          </w:p>
+          <w:p>
+            <w:pPr>
+              <w:pStyle w:val="BodyText"/>
+              <w:widowControl/>
+              <w:tabs>
+                <w:tab w:val="clear" w:pos="709"/>
+                <w:tab w:val="left" w:pos="850" w:leader="none"/>
+              </w:tabs>
+              <w:suppressAutoHyphens w:val="true"/>
+              <w:spacing w:lineRule="auto" w:line="240" w:before="0" w:after="0"/>
+              <w:ind w:end="175"/>
+              <w:jc w:val="start"/>
+              <w:rPr>
+                <w:rStyle w:val="PlaceholderText"/>
+                <w:rFonts w:ascii="Carlito" w:hAnsi="Carlito" w:eastAsia="Calibri" w:cs=""/>
+                <w:color w:val="000000"/>
+                <w:kern w:val="0"/>
+                <w:sz w:val="22"/>
+                <w:szCs w:val="22"/>
+                <w:lang w:val="fr-FR" w:eastAsia="en-US" w:bidi="ar-SA"/>
+              </w:rPr>
+            </w:pPr>
+            <w:r>
+              <w:rPr/>
+            </w:r>
+          </w:p>
+          <w:p>
+            <w:pPr>
+              <w:pStyle w:val="BodyText"/>
+              <w:widowControl/>
+              <w:tabs>
+                <w:tab w:val="clear" w:pos="709"/>
+                <w:tab w:val="left" w:pos="850" w:leader="none"/>
+              </w:tabs>
+              <w:suppressAutoHyphens w:val="true"/>
+              <w:spacing w:lineRule="auto" w:line="240" w:before="0" w:after="0"/>
+              <w:ind w:end="175"/>
+              <w:jc w:val="start"/>
+              <w:rPr>
+                <w:rStyle w:val="PlaceholderText"/>
+                <w:rFonts w:ascii="Carlito" w:hAnsi="Carlito" w:eastAsia="Calibri" w:cs=""/>
+                <w:color w:val="000000"/>
+                <w:kern w:val="0"/>
+                <w:sz w:val="22"/>
+                <w:szCs w:val="22"/>
+                <w:lang w:val="fr-FR" w:eastAsia="en-US" w:bidi="ar-SA"/>
+              </w:rPr>
+            </w:pPr>
+            <w:r>
+              <w:rPr/>
+            </w:r>
+          </w:p>
+          <w:p>
+            <w:pPr>
+              <w:pStyle w:val="BodyText"/>
+              <w:widowControl/>
+              <w:tabs>
+                <w:tab w:val="clear" w:pos="709"/>
+                <w:tab w:val="left" w:pos="850" w:leader="none"/>
+              </w:tabs>
+              <w:suppressAutoHyphens w:val="true"/>
+              <w:spacing w:lineRule="auto" w:line="240" w:before="0" w:after="0"/>
+              <w:ind w:end="175"/>
+              <w:jc w:val="start"/>
+              <w:rPr>
+                <w:rStyle w:val="PlaceholderText"/>
+                <w:rFonts w:ascii="Carlito" w:hAnsi="Carlito" w:eastAsia="Calibri" w:cs=""/>
+                <w:color w:val="000000"/>
+                <w:kern w:val="0"/>
+                <w:sz w:val="22"/>
+                <w:szCs w:val="22"/>
+                <w:lang w:val="fr-FR" w:eastAsia="en-US" w:bidi="ar-SA"/>
+              </w:rPr>
+            </w:pPr>
+            <w:r>
+              <w:rPr/>
+            </w:r>
+          </w:p>
+          <w:p>
+            <w:pPr>
+              <w:pStyle w:val="BodyText"/>
+              <w:widowControl/>
+              <w:tabs>
+                <w:tab w:val="clear" w:pos="709"/>
+                <w:tab w:val="left" w:pos="850" w:leader="none"/>
+              </w:tabs>
+              <w:suppressAutoHyphens w:val="true"/>
+              <w:spacing w:lineRule="auto" w:line="240" w:before="0" w:after="0"/>
+              <w:ind w:end="175"/>
+              <w:jc w:val="start"/>
+              <w:rPr>
+                <w:rStyle w:val="PlaceholderText"/>
+                <w:rFonts w:ascii="Carlito" w:hAnsi="Carlito" w:eastAsia="Calibri" w:cs=""/>
+                <w:color w:val="000000"/>
+                <w:kern w:val="0"/>
+                <w:sz w:val="22"/>
+                <w:szCs w:val="22"/>
+                <w:lang w:val="fr-FR" w:eastAsia="en-US" w:bidi="ar-SA"/>
+              </w:rPr>
+            </w:pPr>
+            <w:r>
+              <w:rPr/>
+            </w:r>
+          </w:p>
+          <w:p>
+            <w:pPr>
+              <w:pStyle w:val="BodyText"/>
+              <w:widowControl/>
+              <w:tabs>
+                <w:tab w:val="clear" w:pos="709"/>
+                <w:tab w:val="left" w:pos="850" w:leader="none"/>
+              </w:tabs>
+              <w:suppressAutoHyphens w:val="true"/>
+              <w:spacing w:lineRule="auto" w:line="240" w:before="0" w:after="0"/>
+              <w:ind w:end="175"/>
+              <w:jc w:val="start"/>
+              <w:rPr>
+                <w:rStyle w:val="PlaceholderText"/>
+                <w:rFonts w:ascii="Carlito" w:hAnsi="Carlito" w:eastAsia="Calibri" w:cs=""/>
+                <w:color w:val="000000"/>
+                <w:kern w:val="0"/>
+                <w:sz w:val="22"/>
+                <w:szCs w:val="22"/>
+                <w:lang w:val="fr-FR" w:eastAsia="en-US" w:bidi="ar-SA"/>
+              </w:rPr>
+            </w:pPr>
+            <w:r>
+              <w:rPr/>
+            </w:r>
+          </w:p>
+          <w:p>
+            <w:pPr>
+              <w:pStyle w:val="BodyText"/>
+              <w:widowControl/>
+              <w:tabs>
+                <w:tab w:val="clear" w:pos="709"/>
+                <w:tab w:val="left" w:pos="850" w:leader="none"/>
+              </w:tabs>
+              <w:suppressAutoHyphens w:val="true"/>
+              <w:spacing w:lineRule="auto" w:line="240" w:before="0" w:after="0"/>
+              <w:ind w:end="175"/>
+              <w:jc w:val="start"/>
+              <w:rPr>
+                <w:rStyle w:val="PlaceholderText"/>
+                <w:rFonts w:ascii="Carlito" w:hAnsi="Carlito" w:eastAsia="Calibri" w:cs=""/>
+                <w:color w:val="000000"/>
+                <w:kern w:val="0"/>
+                <w:sz w:val="22"/>
+                <w:szCs w:val="22"/>
+                <w:lang w:val="fr-FR" w:eastAsia="en-US" w:bidi="ar-SA"/>
+              </w:rPr>
+            </w:pPr>
+            <w:r>
+              <w:rPr/>
+            </w:r>
+          </w:p>
+          <w:p>
+            <w:pPr>
+              <w:pStyle w:val="BodyText"/>
+              <w:widowControl/>
+              <w:tabs>
+                <w:tab w:val="clear" w:pos="709"/>
+                <w:tab w:val="left" w:pos="850" w:leader="none"/>
+              </w:tabs>
+              <w:suppressAutoHyphens w:val="true"/>
+              <w:spacing w:lineRule="auto" w:line="240" w:before="0" w:after="0"/>
+              <w:ind w:end="175"/>
+              <w:jc w:val="start"/>
+              <w:rPr>
+                <w:rStyle w:val="PlaceholderText"/>
+                <w:rFonts w:ascii="Carlito" w:hAnsi="Carlito" w:eastAsia="Calibri" w:cs=""/>
+                <w:color w:val="000000"/>
+                <w:kern w:val="0"/>
+                <w:sz w:val="22"/>
+                <w:szCs w:val="22"/>
+                <w:lang w:val="fr-FR" w:eastAsia="en-US" w:bidi="ar-SA"/>
+              </w:rPr>
+            </w:pPr>
+            <w:r>
+              <w:rPr/>
+            </w:r>
+          </w:p>
+          <w:p>
+            <w:pPr>
+              <w:pStyle w:val="BodyText"/>
+              <w:widowControl/>
+              <w:tabs>
+                <w:tab w:val="clear" w:pos="709"/>
+                <w:tab w:val="left" w:pos="850" w:leader="none"/>
+              </w:tabs>
+              <w:suppressAutoHyphens w:val="true"/>
+              <w:spacing w:lineRule="auto" w:line="240" w:before="0" w:after="0"/>
+              <w:ind w:end="175"/>
+              <w:jc w:val="start"/>
+              <w:rPr>
+                <w:rStyle w:val="PlaceholderText"/>
+                <w:rFonts w:ascii="Carlito" w:hAnsi="Carlito" w:eastAsia="Calibri" w:cs=""/>
+                <w:color w:val="000000"/>
+                <w:kern w:val="0"/>
+                <w:sz w:val="22"/>
+                <w:szCs w:val="22"/>
+                <w:lang w:val="fr-FR" w:eastAsia="en-US" w:bidi="ar-SA"/>
+              </w:rPr>
+            </w:pPr>
+            <w:r>
+              <w:rPr/>
+            </w:r>
+          </w:p>
+          <w:p>
+            <w:pPr>
+              <w:pStyle w:val="BodyText"/>
+              <w:widowControl/>
+              <w:tabs>
+                <w:tab w:val="clear" w:pos="709"/>
+                <w:tab w:val="left" w:pos="850" w:leader="none"/>
+              </w:tabs>
+              <w:suppressAutoHyphens w:val="true"/>
+              <w:spacing w:lineRule="auto" w:line="240" w:before="0" w:after="0"/>
+              <w:ind w:end="175"/>
+              <w:jc w:val="start"/>
+              <w:rPr/>
+            </w:pPr>
             <w:r>
               <w:rPr>
                 <w:rStyle w:val="PlaceholderText"/>
@@ -25017,26 +26979,6 @@
                 <w:szCs w:val="22"/>
                 <w:lang w:val="fr-FR" w:eastAsia="en-US" w:bidi="ar-SA"/>
               </w:rPr>
-              <w:t xml:space="preserve"> — MCD Prisma 18 modèles :</w:t>
-              <w:br/>
-              <w:br/>
-              <w:br/>
-              <w:br/>
-              <w:br/>
-              <w:br/>
-              <w:br/>
-              <w:br/>
-              <w:br/>
-              <w:br/>
-              <w:br/>
-              <w:br/>
-              <w:br/>
-              <w:br/>
-              <w:br/>
-              <w:br/>
-              <w:br/>
-              <w:br/>
-              <w:br/>
               <w:br/>
               <w:br/>
             </w:r>
@@ -25312,7 +27254,7 @@
         <mc:AlternateContent>
           <mc:Choice Requires="wps">
             <w:drawing>
-              <wp:anchor distT="0" distB="0" distL="0" distR="0" simplePos="0" relativeHeight="105" behindDoc="0" locked="0" layoutInCell="0" allowOverlap="1" wp14:anchorId="7C090976">
+              <wp:anchor distT="0" distB="0" distL="0" distR="0" simplePos="0" relativeHeight="109" behindDoc="0" locked="0" layoutInCell="0" allowOverlap="1" wp14:anchorId="7C090976">
                 <wp:simplePos x="0" y="0"/>
                 <wp:positionH relativeFrom="margin">
                   <wp:posOffset>5346700</wp:posOffset>
@@ -25487,7 +27429,7 @@
       <mc:AlternateContent>
         <mc:Choice Requires="wps">
           <w:drawing>
-            <wp:anchor distT="1270" distB="1270" distL="1270" distR="1270" simplePos="0" relativeHeight="54" behindDoc="1" locked="0" layoutInCell="0" allowOverlap="1" wp14:anchorId="7E31E2B7">
+            <wp:anchor distT="1270" distB="1270" distL="1270" distR="1270" simplePos="0" relativeHeight="56" behindDoc="1" locked="0" layoutInCell="0" allowOverlap="1" wp14:anchorId="7E31E2B7">
               <wp:simplePos x="0" y="0"/>
               <wp:positionH relativeFrom="margin">
                 <wp:posOffset>5241925</wp:posOffset>
@@ -25608,7 +27550,7 @@
       <mc:AlternateContent>
         <mc:Choice Requires="wps">
           <w:drawing>
-            <wp:anchor distT="0" distB="0" distL="103505" distR="114300" simplePos="0" relativeHeight="92" behindDoc="1" locked="0" layoutInCell="0" allowOverlap="1" wp14:anchorId="1A5B76DB">
+            <wp:anchor distT="0" distB="0" distL="103505" distR="114300" simplePos="0" relativeHeight="96" behindDoc="1" locked="0" layoutInCell="0" allowOverlap="1" wp14:anchorId="1A5B76DB">
               <wp:simplePos x="0" y="0"/>
               <wp:positionH relativeFrom="margin">
                 <wp:posOffset>5332095</wp:posOffset>
@@ -25704,7 +27646,7 @@
                               <w:sz w:val="28"/>
                               <w:szCs w:val="28"/>
                             </w:rPr>
-                            <w:t>22</w:t>
+                            <w:t>23</w:t>
                           </w:r>
                           <w:r>
                             <w:rPr>
@@ -25793,7 +27735,7 @@
                         <w:sz w:val="28"/>
                         <w:szCs w:val="28"/>
                       </w:rPr>
-                      <w:t>22</w:t>
+                      <w:t>23</w:t>
                     </w:r>
                     <w:r>
                       <w:rPr>
@@ -25881,7 +27823,7 @@
       <mc:AlternateContent>
         <mc:Choice Requires="wps">
           <w:drawing>
-            <wp:anchor distT="1270" distB="1270" distL="1270" distR="1270" simplePos="0" relativeHeight="54" behindDoc="1" locked="0" layoutInCell="0" allowOverlap="1" wp14:anchorId="7E31E2B7">
+            <wp:anchor distT="1270" distB="1270" distL="1270" distR="1270" simplePos="0" relativeHeight="56" behindDoc="1" locked="0" layoutInCell="0" allowOverlap="1" wp14:anchorId="7E31E2B7">
               <wp:simplePos x="0" y="0"/>
               <wp:positionH relativeFrom="margin">
                 <wp:posOffset>5241925</wp:posOffset>
@@ -26002,7 +27944,7 @@
       <mc:AlternateContent>
         <mc:Choice Requires="wps">
           <w:drawing>
-            <wp:anchor distT="0" distB="0" distL="103505" distR="114300" simplePos="0" relativeHeight="92" behindDoc="1" locked="0" layoutInCell="0" allowOverlap="1" wp14:anchorId="1A5B76DB">
+            <wp:anchor distT="0" distB="0" distL="103505" distR="114300" simplePos="0" relativeHeight="96" behindDoc="1" locked="0" layoutInCell="0" allowOverlap="1" wp14:anchorId="1A5B76DB">
               <wp:simplePos x="0" y="0"/>
               <wp:positionH relativeFrom="margin">
                 <wp:posOffset>5332095</wp:posOffset>
@@ -26098,7 +28040,7 @@
                               <w:sz w:val="28"/>
                               <w:szCs w:val="28"/>
                             </w:rPr>
-                            <w:t>22</w:t>
+                            <w:t>23</w:t>
                           </w:r>
                           <w:r>
                             <w:rPr>
@@ -26187,7 +28129,7 @@
                         <w:sz w:val="28"/>
                         <w:szCs w:val="28"/>
                       </w:rPr>
-                      <w:t>22</w:t>
+                      <w:t>23</w:t>
                     </w:r>
                     <w:r>
                       <w:rPr>
@@ -26506,7 +28448,7 @@
                               <w:sz w:val="28"/>
                               <w:szCs w:val="28"/>
                             </w:rPr>
-                            <w:t>23</w:t>
+                            <w:t>24</w:t>
                           </w:r>
                           <w:r>
                             <w:rPr>
@@ -26595,7 +28537,7 @@
                         <w:sz w:val="28"/>
                         <w:szCs w:val="28"/>
                       </w:rPr>
-                      <w:t>23</w:t>
+                      <w:t>24</w:t>
                     </w:r>
                     <w:r>
                       <w:rPr>
@@ -26900,7 +28842,7 @@
                               <w:sz w:val="28"/>
                               <w:szCs w:val="28"/>
                             </w:rPr>
-                            <w:t>23</w:t>
+                            <w:t>24</w:t>
                           </w:r>
                           <w:r>
                             <w:rPr>
@@ -26989,7 +28931,7 @@
                         <w:sz w:val="28"/>
                         <w:szCs w:val="28"/>
                       </w:rPr>
-                      <w:t>23</w:t>
+                      <w:t>24</w:t>
                     </w:r>
                     <w:r>
                       <w:rPr>
@@ -27914,7 +29856,7 @@
       <mc:AlternateContent>
         <mc:Choice Requires="wps">
           <w:drawing>
-            <wp:anchor distT="0" distB="0" distL="103505" distR="114300" simplePos="0" relativeHeight="99" behindDoc="1" locked="0" layoutInCell="0" allowOverlap="1" wp14:anchorId="1A5B76DB">
+            <wp:anchor distT="0" distB="0" distL="103505" distR="114300" simplePos="0" relativeHeight="103" behindDoc="1" locked="0" layoutInCell="0" allowOverlap="1" wp14:anchorId="1A5B76DB">
               <wp:simplePos x="0" y="0"/>
               <wp:positionH relativeFrom="margin">
                 <wp:posOffset>5332095</wp:posOffset>
@@ -28109,7 +30051,7 @@
       <mc:AlternateContent>
         <mc:Choice Requires="wps">
           <w:drawing>
-            <wp:anchor distT="1270" distB="1270" distL="1270" distR="1270" simplePos="0" relativeHeight="101" behindDoc="1" locked="0" layoutInCell="0" allowOverlap="1" wp14:anchorId="7E31E2B7">
+            <wp:anchor distT="1270" distB="1270" distL="1270" distR="1270" simplePos="0" relativeHeight="105" behindDoc="1" locked="0" layoutInCell="0" allowOverlap="1" wp14:anchorId="7E31E2B7">
               <wp:simplePos x="0" y="0"/>
               <wp:positionH relativeFrom="margin">
                 <wp:posOffset>5241925</wp:posOffset>
@@ -28294,7 +30236,7 @@
       <mc:AlternateContent>
         <mc:Choice Requires="wps">
           <w:drawing>
-            <wp:anchor distT="0" distB="0" distL="103505" distR="114300" simplePos="0" relativeHeight="99" behindDoc="1" locked="0" layoutInCell="0" allowOverlap="1" wp14:anchorId="1A5B76DB">
+            <wp:anchor distT="0" distB="0" distL="103505" distR="114300" simplePos="0" relativeHeight="103" behindDoc="1" locked="0" layoutInCell="0" allowOverlap="1" wp14:anchorId="1A5B76DB">
               <wp:simplePos x="0" y="0"/>
               <wp:positionH relativeFrom="margin">
                 <wp:posOffset>5332095</wp:posOffset>
@@ -28489,7 +30431,7 @@
       <mc:AlternateContent>
         <mc:Choice Requires="wps">
           <w:drawing>
-            <wp:anchor distT="1270" distB="1270" distL="1270" distR="1270" simplePos="0" relativeHeight="101" behindDoc="1" locked="0" layoutInCell="0" allowOverlap="1" wp14:anchorId="7E31E2B7">
+            <wp:anchor distT="1270" distB="1270" distL="1270" distR="1270" simplePos="0" relativeHeight="105" behindDoc="1" locked="0" layoutInCell="0" allowOverlap="1" wp14:anchorId="7E31E2B7">
               <wp:simplePos x="0" y="0"/>
               <wp:positionH relativeFrom="margin">
                 <wp:posOffset>5241925</wp:posOffset>
@@ -28897,7 +30839,7 @@
       <mc:AlternateContent>
         <mc:Choice Requires="wps">
           <w:drawing>
-            <wp:anchor distT="1270" distB="1270" distL="1270" distR="1270" simplePos="0" relativeHeight="95" behindDoc="1" locked="0" layoutInCell="0" allowOverlap="1" wp14:anchorId="7E31E2B7">
+            <wp:anchor distT="1270" distB="1270" distL="1270" distR="1270" simplePos="0" relativeHeight="99" behindDoc="1" locked="0" layoutInCell="0" allowOverlap="1" wp14:anchorId="7E31E2B7">
               <wp:simplePos x="0" y="0"/>
               <wp:positionH relativeFrom="margin">
                 <wp:posOffset>5241925</wp:posOffset>
@@ -29291,7 +31233,7 @@
       <mc:AlternateContent>
         <mc:Choice Requires="wps">
           <w:drawing>
-            <wp:anchor distT="1270" distB="1270" distL="1270" distR="1270" simplePos="0" relativeHeight="95" behindDoc="1" locked="0" layoutInCell="0" allowOverlap="1" wp14:anchorId="7E31E2B7">
+            <wp:anchor distT="1270" distB="1270" distL="1270" distR="1270" simplePos="0" relativeHeight="99" behindDoc="1" locked="0" layoutInCell="0" allowOverlap="1" wp14:anchorId="7E31E2B7">
               <wp:simplePos x="0" y="0"/>
               <wp:positionH relativeFrom="margin">
                 <wp:posOffset>5241925</wp:posOffset>

</xml_diff>

<commit_message>
docs(certification): corrections factsuelles PPTX + section 2.4 backlog DC/DP
- PPTX : pagination offset, CI/CD YAML, docker-compose env vars, normalisation typo headers
- DC : ajout section 2.4 Organisation du projet (GitHub Projects Kanban) avec espaces photos
- DP : mise à jour suite corrections

Co-Authored-By: Claude Sonnet 4.6 <noreply@anthropic.com>
</commit_message>
<xml_diff>
--- a/dossier-certification/Dossier Professionnel - Lecart Christophe.docx
+++ b/dossier-certification/Dossier Professionnel - Lecart Christophe.docx
@@ -1040,10 +1040,10 @@
         <w:tblLook w:noHBand="0" w:noVBand="1" w:firstColumn="1" w:lastRow="0" w:lastColumn="0" w:firstRow="1" w:val="04a0"/>
       </w:tblPr>
       <w:tblGrid>
-        <w:gridCol w:w="419"/>
-        <w:gridCol w:w="2842"/>
-        <w:gridCol w:w="6122"/>
-        <w:gridCol w:w="399"/>
+        <w:gridCol w:w="417"/>
+        <w:gridCol w:w="2844"/>
+        <w:gridCol w:w="6120"/>
+        <w:gridCol w:w="401"/>
       </w:tblGrid>
       <w:tr>
         <w:trPr/>
@@ -1215,7 +1215,7 @@
         <w:trPr/>
         <w:tc>
           <w:tcPr>
-            <w:tcW w:w="419" w:type="dxa"/>
+            <w:tcW w:w="417" w:type="dxa"/>
             <w:tcBorders>
               <w:top w:val="nil"/>
               <w:start w:val="single" w:sz="4" w:space="0" w:color="D9D9D9"/>
@@ -1392,7 +1392,7 @@
         </w:tc>
         <w:tc>
           <w:tcPr>
-            <w:tcW w:w="399" w:type="dxa"/>
+            <w:tcW w:w="401" w:type="dxa"/>
             <w:tcBorders>
               <w:top w:val="nil"/>
               <w:start w:val="nil"/>
@@ -2215,8 +2215,8 @@
         <w:tblLook w:noHBand="0" w:noVBand="1" w:firstColumn="1" w:lastRow="0" w:lastColumn="0" w:firstRow="1" w:val="04a0"/>
       </w:tblPr>
       <w:tblGrid>
-        <w:gridCol w:w="277"/>
-        <w:gridCol w:w="8831"/>
+        <w:gridCol w:w="275"/>
+        <w:gridCol w:w="8833"/>
         <w:gridCol w:w="674"/>
       </w:tblGrid>
       <w:tr>
@@ -2439,7 +2439,7 @@
         <w:trPr/>
         <w:tc>
           <w:tcPr>
-            <w:tcW w:w="277" w:type="dxa"/>
+            <w:tcW w:w="275" w:type="dxa"/>
             <w:tcBorders>
               <w:top w:val="single" w:sz="4" w:space="0" w:color="FFFFFF"/>
               <w:start w:val="nil"/>
@@ -2472,7 +2472,7 @@
         </w:tc>
         <w:tc>
           <w:tcPr>
-            <w:tcW w:w="8831" w:type="dxa"/>
+            <w:tcW w:w="8833" w:type="dxa"/>
             <w:tcBorders>
               <w:top w:val="nil"/>
               <w:start w:val="single" w:sz="8" w:space="0" w:color="F2F2F2"/>
@@ -2568,7 +2568,7 @@
         <w:trPr/>
         <w:tc>
           <w:tcPr>
-            <w:tcW w:w="277" w:type="dxa"/>
+            <w:tcW w:w="275" w:type="dxa"/>
             <w:tcBorders>
               <w:top w:val="nil"/>
               <w:start w:val="nil"/>
@@ -2601,7 +2601,7 @@
         </w:tc>
         <w:tc>
           <w:tcPr>
-            <w:tcW w:w="8831" w:type="dxa"/>
+            <w:tcW w:w="8833" w:type="dxa"/>
             <w:tcBorders>
               <w:top w:val="nil"/>
               <w:start w:val="single" w:sz="8" w:space="0" w:color="F2F2F2"/>
@@ -2715,7 +2715,7 @@
         <w:trPr/>
         <w:tc>
           <w:tcPr>
-            <w:tcW w:w="277" w:type="dxa"/>
+            <w:tcW w:w="275" w:type="dxa"/>
             <w:tcBorders>
               <w:top w:val="nil"/>
               <w:start w:val="nil"/>
@@ -2748,7 +2748,7 @@
         </w:tc>
         <w:tc>
           <w:tcPr>
-            <w:tcW w:w="8831" w:type="dxa"/>
+            <w:tcW w:w="8833" w:type="dxa"/>
             <w:tcBorders>
               <w:top w:val="nil"/>
               <w:start w:val="single" w:sz="8" w:space="0" w:color="F2F2F2"/>
@@ -2939,7 +2939,7 @@
         <w:trPr/>
         <w:tc>
           <w:tcPr>
-            <w:tcW w:w="277" w:type="dxa"/>
+            <w:tcW w:w="275" w:type="dxa"/>
             <w:tcBorders>
               <w:top w:val="single" w:sz="4" w:space="0" w:color="FFFFFF"/>
               <w:start w:val="nil"/>
@@ -2972,7 +2972,7 @@
         </w:tc>
         <w:tc>
           <w:tcPr>
-            <w:tcW w:w="8831" w:type="dxa"/>
+            <w:tcW w:w="8833" w:type="dxa"/>
             <w:tcBorders>
               <w:top w:val="nil"/>
               <w:start w:val="single" w:sz="8" w:space="0" w:color="F2F2F2"/>
@@ -3071,7 +3071,7 @@
         <w:trPr/>
         <w:tc>
           <w:tcPr>
-            <w:tcW w:w="277" w:type="dxa"/>
+            <w:tcW w:w="275" w:type="dxa"/>
             <w:tcBorders>
               <w:top w:val="nil"/>
               <w:start w:val="nil"/>
@@ -3104,7 +3104,7 @@
         </w:tc>
         <w:tc>
           <w:tcPr>
-            <w:tcW w:w="8831" w:type="dxa"/>
+            <w:tcW w:w="8833" w:type="dxa"/>
             <w:tcBorders>
               <w:top w:val="nil"/>
               <w:start w:val="single" w:sz="8" w:space="0" w:color="F2F2F2"/>
@@ -3203,7 +3203,7 @@
         <w:trPr/>
         <w:tc>
           <w:tcPr>
-            <w:tcW w:w="277" w:type="dxa"/>
+            <w:tcW w:w="275" w:type="dxa"/>
             <w:tcBorders>
               <w:top w:val="nil"/>
               <w:start w:val="nil"/>
@@ -3236,7 +3236,7 @@
         </w:tc>
         <w:tc>
           <w:tcPr>
-            <w:tcW w:w="8831" w:type="dxa"/>
+            <w:tcW w:w="8833" w:type="dxa"/>
             <w:tcBorders>
               <w:top w:val="nil"/>
               <w:start w:val="single" w:sz="8" w:space="0" w:color="F2F2F2"/>
@@ -3425,7 +3425,7 @@
         <w:trPr/>
         <w:tc>
           <w:tcPr>
-            <w:tcW w:w="277" w:type="dxa"/>
+            <w:tcW w:w="275" w:type="dxa"/>
             <w:tcBorders>
               <w:top w:val="nil"/>
               <w:start w:val="nil"/>
@@ -3464,7 +3464,7 @@
         </w:tc>
         <w:tc>
           <w:tcPr>
-            <w:tcW w:w="8831" w:type="dxa"/>
+            <w:tcW w:w="8833" w:type="dxa"/>
             <w:tcBorders>
               <w:top w:val="nil"/>
               <w:start w:val="single" w:sz="8" w:space="0" w:color="F2F2F2"/>
@@ -3567,7 +3567,7 @@
         <w:trPr/>
         <w:tc>
           <w:tcPr>
-            <w:tcW w:w="277" w:type="dxa"/>
+            <w:tcW w:w="275" w:type="dxa"/>
             <w:tcBorders>
               <w:top w:val="nil"/>
               <w:start w:val="nil"/>
@@ -3606,7 +3606,7 @@
         </w:tc>
         <w:tc>
           <w:tcPr>
-            <w:tcW w:w="8831" w:type="dxa"/>
+            <w:tcW w:w="8833" w:type="dxa"/>
             <w:tcBorders>
               <w:top w:val="nil"/>
               <w:start w:val="single" w:sz="8" w:space="0" w:color="F2F2F2"/>
@@ -3703,7 +3703,7 @@
         <w:trPr/>
         <w:tc>
           <w:tcPr>
-            <w:tcW w:w="277" w:type="dxa"/>
+            <w:tcW w:w="275" w:type="dxa"/>
             <w:tcBorders>
               <w:top w:val="nil"/>
               <w:start w:val="nil"/>
@@ -3742,7 +3742,7 @@
         </w:tc>
         <w:tc>
           <w:tcPr>
-            <w:tcW w:w="8831" w:type="dxa"/>
+            <w:tcW w:w="8833" w:type="dxa"/>
             <w:tcBorders>
               <w:top w:val="nil"/>
               <w:start w:val="single" w:sz="8" w:space="0" w:color="F2F2F2"/>
@@ -4428,12 +4428,12 @@
       <w:tblGrid>
         <w:gridCol w:w="2411"/>
         <w:gridCol w:w="142"/>
-        <w:gridCol w:w="370"/>
+        <w:gridCol w:w="368"/>
         <w:gridCol w:w="48"/>
-        <w:gridCol w:w="526"/>
-        <w:gridCol w:w="1175"/>
+        <w:gridCol w:w="528"/>
+        <w:gridCol w:w="1173"/>
         <w:gridCol w:w="142"/>
-        <w:gridCol w:w="570"/>
+        <w:gridCol w:w="572"/>
         <w:gridCol w:w="4398"/>
       </w:tblGrid>
       <w:tr>
@@ -4484,7 +4484,7 @@
         </w:tc>
         <w:tc>
           <w:tcPr>
-            <w:tcW w:w="560" w:type="dxa"/>
+            <w:tcW w:w="558" w:type="dxa"/>
             <w:gridSpan w:val="3"/>
             <w:tcBorders>
               <w:top w:val="nil"/>
@@ -4537,7 +4537,7 @@
         </w:tc>
         <w:tc>
           <w:tcPr>
-            <w:tcW w:w="6811" w:type="dxa"/>
+            <w:tcW w:w="6813" w:type="dxa"/>
             <w:gridSpan w:val="5"/>
             <w:tcBorders>
               <w:top w:val="nil"/>
@@ -4612,7 +4612,7 @@
         </w:trPr>
         <w:tc>
           <w:tcPr>
-            <w:tcW w:w="2971" w:type="dxa"/>
+            <w:tcW w:w="2969" w:type="dxa"/>
             <w:gridSpan w:val="4"/>
             <w:tcBorders>
               <w:top w:val="nil"/>
@@ -4682,7 +4682,7 @@
         </w:tc>
         <w:tc>
           <w:tcPr>
-            <w:tcW w:w="6811" w:type="dxa"/>
+            <w:tcW w:w="6813" w:type="dxa"/>
             <w:gridSpan w:val="5"/>
             <w:tcBorders>
               <w:top w:val="nil"/>
@@ -4732,7 +4732,7 @@
         </w:trPr>
         <w:tc>
           <w:tcPr>
-            <w:tcW w:w="2971" w:type="dxa"/>
+            <w:tcW w:w="2969" w:type="dxa"/>
             <w:gridSpan w:val="4"/>
             <w:tcBorders>
               <w:top w:val="thinThickMediumGap" w:sz="24" w:space="0" w:color="D60093"/>
@@ -4765,7 +4765,7 @@
         </w:tc>
         <w:tc>
           <w:tcPr>
-            <w:tcW w:w="6811" w:type="dxa"/>
+            <w:tcW w:w="6813" w:type="dxa"/>
             <w:gridSpan w:val="5"/>
             <w:tcBorders>
               <w:top w:val="thinThickMediumGap" w:sz="24" w:space="0" w:color="D60093"/>
@@ -5028,7 +5028,7 @@
                 <w:shd w:fill="FFFFFF" w:val="clear"/>
               </w:rPr>
               <w:drawing>
-                <wp:anchor distT="0" distB="0" distL="0" distR="0" simplePos="0" relativeHeight="126" behindDoc="0" locked="0" layoutInCell="0" allowOverlap="1">
+                <wp:anchor distT="0" distB="0" distL="0" distR="0" simplePos="0" relativeHeight="112" behindDoc="0" locked="0" layoutInCell="0" allowOverlap="1">
                   <wp:simplePos x="0" y="0"/>
                   <wp:positionH relativeFrom="margin">
                     <wp:posOffset>461645</wp:posOffset>
@@ -5909,7 +5909,7 @@
         </w:trPr>
         <w:tc>
           <w:tcPr>
-            <w:tcW w:w="4672" w:type="dxa"/>
+            <w:tcW w:w="4670" w:type="dxa"/>
             <w:gridSpan w:val="6"/>
             <w:tcBorders>
               <w:top w:val="single" w:sz="8" w:space="0" w:color="D60093"/>
@@ -5946,7 +5946,7 @@
         </w:tc>
         <w:tc>
           <w:tcPr>
-            <w:tcW w:w="5110" w:type="dxa"/>
+            <w:tcW w:w="5112" w:type="dxa"/>
             <w:gridSpan w:val="3"/>
             <w:tcBorders>
               <w:top w:val="single" w:sz="8" w:space="0" w:color="D60093"/>
@@ -5990,7 +5990,7 @@
         </w:trPr>
         <w:tc>
           <w:tcPr>
-            <w:tcW w:w="4672" w:type="dxa"/>
+            <w:tcW w:w="4670" w:type="dxa"/>
             <w:gridSpan w:val="6"/>
             <w:tcBorders>
               <w:top w:val="nil"/>
@@ -6041,7 +6041,7 @@
         </w:tc>
         <w:tc>
           <w:tcPr>
-            <w:tcW w:w="5110" w:type="dxa"/>
+            <w:tcW w:w="5112" w:type="dxa"/>
             <w:gridSpan w:val="3"/>
             <w:tcBorders>
               <w:top w:val="nil"/>
@@ -6205,7 +6205,7 @@
         </w:tc>
         <w:tc>
           <w:tcPr>
-            <w:tcW w:w="370" w:type="dxa"/>
+            <w:tcW w:w="368" w:type="dxa"/>
             <w:tcBorders>
               <w:top w:val="nil"/>
               <w:start w:val="single" w:sz="8" w:space="0" w:color="F2F2F2"/>
@@ -6241,7 +6241,7 @@
         </w:tc>
         <w:tc>
           <w:tcPr>
-            <w:tcW w:w="6859" w:type="dxa"/>
+            <w:tcW w:w="6861" w:type="dxa"/>
             <w:gridSpan w:val="6"/>
             <w:tcBorders>
               <w:top w:val="nil"/>
@@ -6329,7 +6329,7 @@
         </w:tc>
         <w:tc>
           <w:tcPr>
-            <w:tcW w:w="370" w:type="dxa"/>
+            <w:tcW w:w="368" w:type="dxa"/>
             <w:tcBorders>
               <w:top w:val="nil"/>
               <w:start w:val="single" w:sz="8" w:space="0" w:color="F2F2F2"/>
@@ -6365,7 +6365,7 @@
         </w:tc>
         <w:tc>
           <w:tcPr>
-            <w:tcW w:w="574" w:type="dxa"/>
+            <w:tcW w:w="576" w:type="dxa"/>
             <w:gridSpan w:val="2"/>
             <w:tcBorders>
               <w:top w:val="nil"/>
@@ -6403,7 +6403,7 @@
         </w:tc>
         <w:tc>
           <w:tcPr>
-            <w:tcW w:w="1317" w:type="dxa"/>
+            <w:tcW w:w="1315" w:type="dxa"/>
             <w:gridSpan w:val="2"/>
             <w:tcBorders>
               <w:top w:val="nil"/>
@@ -6473,7 +6473,7 @@
         </w:tc>
         <w:tc>
           <w:tcPr>
-            <w:tcW w:w="570" w:type="dxa"/>
+            <w:tcW w:w="572" w:type="dxa"/>
             <w:tcBorders>
               <w:top w:val="nil"/>
               <w:start w:val="nil"/>
@@ -6771,12 +6771,12 @@
       <w:tblGrid>
         <w:gridCol w:w="2411"/>
         <w:gridCol w:w="142"/>
-        <w:gridCol w:w="370"/>
+        <w:gridCol w:w="368"/>
         <w:gridCol w:w="48"/>
-        <w:gridCol w:w="526"/>
-        <w:gridCol w:w="1175"/>
+        <w:gridCol w:w="528"/>
+        <w:gridCol w:w="1173"/>
         <w:gridCol w:w="142"/>
-        <w:gridCol w:w="570"/>
+        <w:gridCol w:w="572"/>
         <w:gridCol w:w="4398"/>
       </w:tblGrid>
       <w:tr>
@@ -6827,7 +6827,7 @@
         </w:tc>
         <w:tc>
           <w:tcPr>
-            <w:tcW w:w="560" w:type="dxa"/>
+            <w:tcW w:w="558" w:type="dxa"/>
             <w:gridSpan w:val="3"/>
             <w:tcBorders>
               <w:top w:val="nil"/>
@@ -6880,7 +6880,7 @@
         </w:tc>
         <w:tc>
           <w:tcPr>
-            <w:tcW w:w="6811" w:type="dxa"/>
+            <w:tcW w:w="6813" w:type="dxa"/>
             <w:gridSpan w:val="5"/>
             <w:tcBorders>
               <w:top w:val="nil"/>
@@ -6955,7 +6955,7 @@
         </w:trPr>
         <w:tc>
           <w:tcPr>
-            <w:tcW w:w="2971" w:type="dxa"/>
+            <w:tcW w:w="2969" w:type="dxa"/>
             <w:gridSpan w:val="4"/>
             <w:tcBorders>
               <w:top w:val="nil"/>
@@ -7025,7 +7025,7 @@
         </w:tc>
         <w:tc>
           <w:tcPr>
-            <w:tcW w:w="6811" w:type="dxa"/>
+            <w:tcW w:w="6813" w:type="dxa"/>
             <w:gridSpan w:val="5"/>
             <w:tcBorders>
               <w:top w:val="nil"/>
@@ -7076,7 +7076,7 @@
         </w:trPr>
         <w:tc>
           <w:tcPr>
-            <w:tcW w:w="2971" w:type="dxa"/>
+            <w:tcW w:w="2969" w:type="dxa"/>
             <w:gridSpan w:val="4"/>
             <w:tcBorders>
               <w:top w:val="thinThickMediumGap" w:sz="24" w:space="0" w:color="D60093"/>
@@ -7109,7 +7109,7 @@
         </w:tc>
         <w:tc>
           <w:tcPr>
-            <w:tcW w:w="6811" w:type="dxa"/>
+            <w:tcW w:w="6813" w:type="dxa"/>
             <w:gridSpan w:val="5"/>
             <w:tcBorders>
               <w:top w:val="thinThickMediumGap" w:sz="24" w:space="0" w:color="D60093"/>
@@ -7677,7 +7677,7 @@
         </w:trPr>
         <w:tc>
           <w:tcPr>
-            <w:tcW w:w="4672" w:type="dxa"/>
+            <w:tcW w:w="4670" w:type="dxa"/>
             <w:gridSpan w:val="6"/>
             <w:tcBorders>
               <w:top w:val="single" w:sz="8" w:space="0" w:color="D60093"/>
@@ -7714,7 +7714,7 @@
         </w:tc>
         <w:tc>
           <w:tcPr>
-            <w:tcW w:w="5110" w:type="dxa"/>
+            <w:tcW w:w="5112" w:type="dxa"/>
             <w:gridSpan w:val="3"/>
             <w:tcBorders>
               <w:top w:val="single" w:sz="8" w:space="0" w:color="D60093"/>
@@ -7758,7 +7758,7 @@
         </w:trPr>
         <w:tc>
           <w:tcPr>
-            <w:tcW w:w="4672" w:type="dxa"/>
+            <w:tcW w:w="4670" w:type="dxa"/>
             <w:gridSpan w:val="6"/>
             <w:tcBorders>
               <w:top w:val="nil"/>
@@ -7809,7 +7809,7 @@
         </w:tc>
         <w:tc>
           <w:tcPr>
-            <w:tcW w:w="5110" w:type="dxa"/>
+            <w:tcW w:w="5112" w:type="dxa"/>
             <w:gridSpan w:val="3"/>
             <w:tcBorders>
               <w:top w:val="nil"/>
@@ -8008,7 +8008,7 @@
         </w:tc>
         <w:tc>
           <w:tcPr>
-            <w:tcW w:w="370" w:type="dxa"/>
+            <w:tcW w:w="368" w:type="dxa"/>
             <w:tcBorders>
               <w:top w:val="nil"/>
               <w:start w:val="single" w:sz="8" w:space="0" w:color="F2F2F2"/>
@@ -8044,7 +8044,7 @@
         </w:tc>
         <w:tc>
           <w:tcPr>
-            <w:tcW w:w="6859" w:type="dxa"/>
+            <w:tcW w:w="6861" w:type="dxa"/>
             <w:gridSpan w:val="6"/>
             <w:tcBorders>
               <w:top w:val="nil"/>
@@ -8132,7 +8132,7 @@
         </w:tc>
         <w:tc>
           <w:tcPr>
-            <w:tcW w:w="370" w:type="dxa"/>
+            <w:tcW w:w="368" w:type="dxa"/>
             <w:tcBorders>
               <w:top w:val="nil"/>
               <w:start w:val="single" w:sz="8" w:space="0" w:color="F2F2F2"/>
@@ -8168,7 +8168,7 @@
         </w:tc>
         <w:tc>
           <w:tcPr>
-            <w:tcW w:w="574" w:type="dxa"/>
+            <w:tcW w:w="576" w:type="dxa"/>
             <w:gridSpan w:val="2"/>
             <w:tcBorders>
               <w:top w:val="nil"/>
@@ -8206,7 +8206,7 @@
         </w:tc>
         <w:tc>
           <w:tcPr>
-            <w:tcW w:w="1317" w:type="dxa"/>
+            <w:tcW w:w="1315" w:type="dxa"/>
             <w:gridSpan w:val="2"/>
             <w:tcBorders>
               <w:top w:val="nil"/>
@@ -8266,7 +8266,7 @@
         </w:tc>
         <w:tc>
           <w:tcPr>
-            <w:tcW w:w="570" w:type="dxa"/>
+            <w:tcW w:w="572" w:type="dxa"/>
             <w:tcBorders>
               <w:top w:val="nil"/>
               <w:start w:val="nil"/>
@@ -8571,7 +8571,7 @@
         </w:tc>
         <w:tc>
           <w:tcPr>
-            <w:tcW w:w="560" w:type="dxa"/>
+            <w:tcW w:w="558" w:type="dxa"/>
             <w:gridSpan w:val="3"/>
             <w:tcBorders>
               <w:top w:val="nil"/>
@@ -8624,7 +8624,7 @@
         </w:tc>
         <w:tc>
           <w:tcPr>
-            <w:tcW w:w="6811" w:type="dxa"/>
+            <w:tcW w:w="6813" w:type="dxa"/>
             <w:gridSpan w:val="5"/>
             <w:tcBorders>
               <w:top w:val="nil"/>
@@ -8699,7 +8699,7 @@
         </w:trPr>
         <w:tc>
           <w:tcPr>
-            <w:tcW w:w="2971" w:type="dxa"/>
+            <w:tcW w:w="2969" w:type="dxa"/>
             <w:gridSpan w:val="4"/>
             <w:tcBorders>
               <w:top w:val="nil"/>
@@ -8756,7 +8756,7 @@
         </w:tc>
         <w:tc>
           <w:tcPr>
-            <w:tcW w:w="6811" w:type="dxa"/>
+            <w:tcW w:w="6813" w:type="dxa"/>
             <w:gridSpan w:val="5"/>
             <w:tcBorders>
               <w:top w:val="nil"/>
@@ -8817,7 +8817,7 @@
         </w:trPr>
         <w:tc>
           <w:tcPr>
-            <w:tcW w:w="2971" w:type="dxa"/>
+            <w:tcW w:w="2969" w:type="dxa"/>
             <w:gridSpan w:val="4"/>
             <w:tcBorders>
               <w:top w:val="thinThickMediumGap" w:sz="24" w:space="0" w:color="D60093"/>
@@ -8850,7 +8850,7 @@
         </w:tc>
         <w:tc>
           <w:tcPr>
-            <w:tcW w:w="6811" w:type="dxa"/>
+            <w:tcW w:w="6813" w:type="dxa"/>
             <w:gridSpan w:val="5"/>
             <w:tcBorders>
               <w:top w:val="thinThickMediumGap" w:sz="24" w:space="0" w:color="D60093"/>
@@ -9513,7 +9513,7 @@
         </w:trPr>
         <w:tc>
           <w:tcPr>
-            <w:tcW w:w="4672" w:type="dxa"/>
+            <w:tcW w:w="4670" w:type="dxa"/>
             <w:gridSpan w:val="6"/>
             <w:tcBorders>
               <w:top w:val="single" w:sz="8" w:space="0" w:color="D60093"/>
@@ -9550,7 +9550,7 @@
         </w:tc>
         <w:tc>
           <w:tcPr>
-            <w:tcW w:w="5110" w:type="dxa"/>
+            <w:tcW w:w="5112" w:type="dxa"/>
             <w:gridSpan w:val="3"/>
             <w:tcBorders>
               <w:top w:val="single" w:sz="8" w:space="0" w:color="D60093"/>
@@ -9594,7 +9594,7 @@
         </w:trPr>
         <w:tc>
           <w:tcPr>
-            <w:tcW w:w="4672" w:type="dxa"/>
+            <w:tcW w:w="4670" w:type="dxa"/>
             <w:gridSpan w:val="6"/>
             <w:tcBorders>
               <w:top w:val="nil"/>
@@ -9645,7 +9645,7 @@
         </w:tc>
         <w:tc>
           <w:tcPr>
-            <w:tcW w:w="5110" w:type="dxa"/>
+            <w:tcW w:w="5112" w:type="dxa"/>
             <w:gridSpan w:val="3"/>
             <w:tcBorders>
               <w:top w:val="nil"/>
@@ -9844,7 +9844,7 @@
         </w:tc>
         <w:tc>
           <w:tcPr>
-            <w:tcW w:w="370" w:type="dxa"/>
+            <w:tcW w:w="368" w:type="dxa"/>
             <w:tcBorders>
               <w:top w:val="nil"/>
               <w:start w:val="single" w:sz="8" w:space="0" w:color="F2F2F2"/>
@@ -9880,7 +9880,7 @@
         </w:tc>
         <w:tc>
           <w:tcPr>
-            <w:tcW w:w="6859" w:type="dxa"/>
+            <w:tcW w:w="6861" w:type="dxa"/>
             <w:gridSpan w:val="6"/>
             <w:tcBorders>
               <w:top w:val="nil"/>
@@ -9968,7 +9968,7 @@
         </w:tc>
         <w:tc>
           <w:tcPr>
-            <w:tcW w:w="370" w:type="dxa"/>
+            <w:tcW w:w="368" w:type="dxa"/>
             <w:tcBorders>
               <w:top w:val="nil"/>
               <w:start w:val="single" w:sz="8" w:space="0" w:color="F2F2F2"/>
@@ -10004,7 +10004,7 @@
         </w:tc>
         <w:tc>
           <w:tcPr>
-            <w:tcW w:w="574" w:type="dxa"/>
+            <w:tcW w:w="576" w:type="dxa"/>
             <w:gridSpan w:val="2"/>
             <w:tcBorders>
               <w:top w:val="nil"/>
@@ -10042,7 +10042,7 @@
         </w:tc>
         <w:tc>
           <w:tcPr>
-            <w:tcW w:w="1317" w:type="dxa"/>
+            <w:tcW w:w="1315" w:type="dxa"/>
             <w:gridSpan w:val="2"/>
             <w:tcBorders>
               <w:top w:val="nil"/>
@@ -10112,7 +10112,7 @@
         </w:tc>
         <w:tc>
           <w:tcPr>
-            <w:tcW w:w="570" w:type="dxa"/>
+            <w:tcW w:w="572" w:type="dxa"/>
             <w:tcBorders>
               <w:top w:val="nil"/>
               <w:start w:val="nil"/>
@@ -10499,7 +10499,7 @@
         </w:tc>
         <w:tc>
           <w:tcPr>
-            <w:tcW w:w="560" w:type="dxa"/>
+            <w:tcW w:w="558" w:type="dxa"/>
             <w:gridSpan w:val="3"/>
             <w:tcBorders>
               <w:top w:val="nil"/>
@@ -10551,7 +10551,7 @@
         </w:tc>
         <w:tc>
           <w:tcPr>
-            <w:tcW w:w="6811" w:type="dxa"/>
+            <w:tcW w:w="6813" w:type="dxa"/>
             <w:gridSpan w:val="5"/>
             <w:tcBorders>
               <w:top w:val="nil"/>
@@ -10626,7 +10626,7 @@
         </w:trPr>
         <w:tc>
           <w:tcPr>
-            <w:tcW w:w="2971" w:type="dxa"/>
+            <w:tcW w:w="2969" w:type="dxa"/>
             <w:gridSpan w:val="4"/>
             <w:tcBorders>
               <w:top w:val="nil"/>
@@ -10696,7 +10696,7 @@
         </w:tc>
         <w:tc>
           <w:tcPr>
-            <w:tcW w:w="6811" w:type="dxa"/>
+            <w:tcW w:w="6813" w:type="dxa"/>
             <w:gridSpan w:val="5"/>
             <w:tcBorders>
               <w:top w:val="nil"/>
@@ -10750,7 +10750,7 @@
         </w:trPr>
         <w:tc>
           <w:tcPr>
-            <w:tcW w:w="2971" w:type="dxa"/>
+            <w:tcW w:w="2969" w:type="dxa"/>
             <w:gridSpan w:val="4"/>
             <w:tcBorders>
               <w:top w:val="thinThickMediumGap" w:sz="24" w:space="0" w:color="D60093"/>
@@ -10783,7 +10783,7 @@
         </w:tc>
         <w:tc>
           <w:tcPr>
-            <w:tcW w:w="6811" w:type="dxa"/>
+            <w:tcW w:w="6813" w:type="dxa"/>
             <w:gridSpan w:val="5"/>
             <w:tcBorders>
               <w:top w:val="thinThickMediumGap" w:sz="24" w:space="0" w:color="D60093"/>
@@ -11414,7 +11414,7 @@
         </w:trPr>
         <w:tc>
           <w:tcPr>
-            <w:tcW w:w="4672" w:type="dxa"/>
+            <w:tcW w:w="4670" w:type="dxa"/>
             <w:gridSpan w:val="6"/>
             <w:tcBorders>
               <w:top w:val="single" w:sz="8" w:space="0" w:color="D60093"/>
@@ -11451,7 +11451,7 @@
         </w:tc>
         <w:tc>
           <w:tcPr>
-            <w:tcW w:w="5110" w:type="dxa"/>
+            <w:tcW w:w="5112" w:type="dxa"/>
             <w:gridSpan w:val="3"/>
             <w:tcBorders>
               <w:top w:val="single" w:sz="8" w:space="0" w:color="D60093"/>
@@ -11495,7 +11495,7 @@
         </w:trPr>
         <w:tc>
           <w:tcPr>
-            <w:tcW w:w="4672" w:type="dxa"/>
+            <w:tcW w:w="4670" w:type="dxa"/>
             <w:gridSpan w:val="6"/>
             <w:tcBorders>
               <w:top w:val="nil"/>
@@ -11546,7 +11546,7 @@
         </w:tc>
         <w:tc>
           <w:tcPr>
-            <w:tcW w:w="5110" w:type="dxa"/>
+            <w:tcW w:w="5112" w:type="dxa"/>
             <w:gridSpan w:val="3"/>
             <w:tcBorders>
               <w:top w:val="nil"/>
@@ -11745,7 +11745,7 @@
         </w:tc>
         <w:tc>
           <w:tcPr>
-            <w:tcW w:w="370" w:type="dxa"/>
+            <w:tcW w:w="368" w:type="dxa"/>
             <w:tcBorders>
               <w:top w:val="nil"/>
               <w:start w:val="single" w:sz="8" w:space="0" w:color="F2F2F2"/>
@@ -11777,7 +11777,7 @@
         </w:tc>
         <w:tc>
           <w:tcPr>
-            <w:tcW w:w="6859" w:type="dxa"/>
+            <w:tcW w:w="6861" w:type="dxa"/>
             <w:gridSpan w:val="6"/>
             <w:tcBorders>
               <w:top w:val="nil"/>
@@ -11867,7 +11867,7 @@
         </w:tc>
         <w:tc>
           <w:tcPr>
-            <w:tcW w:w="370" w:type="dxa"/>
+            <w:tcW w:w="368" w:type="dxa"/>
             <w:tcBorders>
               <w:top w:val="nil"/>
               <w:start w:val="single" w:sz="8" w:space="0" w:color="F2F2F2"/>
@@ -11903,7 +11903,7 @@
         </w:tc>
         <w:tc>
           <w:tcPr>
-            <w:tcW w:w="574" w:type="dxa"/>
+            <w:tcW w:w="576" w:type="dxa"/>
             <w:gridSpan w:val="2"/>
             <w:tcBorders>
               <w:top w:val="nil"/>
@@ -11941,7 +11941,7 @@
         </w:tc>
         <w:tc>
           <w:tcPr>
-            <w:tcW w:w="1317" w:type="dxa"/>
+            <w:tcW w:w="1315" w:type="dxa"/>
             <w:gridSpan w:val="2"/>
             <w:tcBorders>
               <w:top w:val="nil"/>
@@ -12001,7 +12001,7 @@
         </w:tc>
         <w:tc>
           <w:tcPr>
-            <w:tcW w:w="570" w:type="dxa"/>
+            <w:tcW w:w="572" w:type="dxa"/>
             <w:tcBorders>
               <w:top w:val="nil"/>
               <w:start w:val="nil"/>
@@ -12316,7 +12316,7 @@
         </w:tc>
         <w:tc>
           <w:tcPr>
-            <w:tcW w:w="560" w:type="dxa"/>
+            <w:tcW w:w="558" w:type="dxa"/>
             <w:gridSpan w:val="3"/>
             <w:tcBorders>
               <w:top w:val="nil"/>
@@ -12368,7 +12368,7 @@
         </w:tc>
         <w:tc>
           <w:tcPr>
-            <w:tcW w:w="6811" w:type="dxa"/>
+            <w:tcW w:w="6813" w:type="dxa"/>
             <w:gridSpan w:val="5"/>
             <w:tcBorders>
               <w:top w:val="nil"/>
@@ -12443,7 +12443,7 @@
         </w:trPr>
         <w:tc>
           <w:tcPr>
-            <w:tcW w:w="2971" w:type="dxa"/>
+            <w:tcW w:w="2969" w:type="dxa"/>
             <w:gridSpan w:val="4"/>
             <w:tcBorders>
               <w:top w:val="nil"/>
@@ -12513,7 +12513,7 @@
         </w:tc>
         <w:tc>
           <w:tcPr>
-            <w:tcW w:w="6811" w:type="dxa"/>
+            <w:tcW w:w="6813" w:type="dxa"/>
             <w:gridSpan w:val="5"/>
             <w:tcBorders>
               <w:top w:val="nil"/>
@@ -12567,7 +12567,7 @@
         </w:trPr>
         <w:tc>
           <w:tcPr>
-            <w:tcW w:w="2971" w:type="dxa"/>
+            <w:tcW w:w="2969" w:type="dxa"/>
             <w:gridSpan w:val="4"/>
             <w:tcBorders>
               <w:top w:val="thinThickMediumGap" w:sz="24" w:space="0" w:color="D60093"/>
@@ -12600,7 +12600,7 @@
         </w:tc>
         <w:tc>
           <w:tcPr>
-            <w:tcW w:w="6811" w:type="dxa"/>
+            <w:tcW w:w="6813" w:type="dxa"/>
             <w:gridSpan w:val="5"/>
             <w:tcBorders>
               <w:top w:val="thinThickMediumGap" w:sz="24" w:space="0" w:color="D60093"/>
@@ -13275,7 +13275,7 @@
         </w:trPr>
         <w:tc>
           <w:tcPr>
-            <w:tcW w:w="4672" w:type="dxa"/>
+            <w:tcW w:w="4670" w:type="dxa"/>
             <w:gridSpan w:val="6"/>
             <w:tcBorders>
               <w:top w:val="single" w:sz="8" w:space="0" w:color="D60093"/>
@@ -13312,7 +13312,7 @@
         </w:tc>
         <w:tc>
           <w:tcPr>
-            <w:tcW w:w="5110" w:type="dxa"/>
+            <w:tcW w:w="5112" w:type="dxa"/>
             <w:gridSpan w:val="3"/>
             <w:tcBorders>
               <w:top w:val="single" w:sz="8" w:space="0" w:color="D60093"/>
@@ -13356,7 +13356,7 @@
         </w:trPr>
         <w:tc>
           <w:tcPr>
-            <w:tcW w:w="4672" w:type="dxa"/>
+            <w:tcW w:w="4670" w:type="dxa"/>
             <w:gridSpan w:val="6"/>
             <w:tcBorders>
               <w:top w:val="nil"/>
@@ -13407,7 +13407,7 @@
         </w:tc>
         <w:tc>
           <w:tcPr>
-            <w:tcW w:w="5110" w:type="dxa"/>
+            <w:tcW w:w="5112" w:type="dxa"/>
             <w:gridSpan w:val="3"/>
             <w:tcBorders>
               <w:top w:val="nil"/>
@@ -13606,7 +13606,7 @@
         </w:tc>
         <w:tc>
           <w:tcPr>
-            <w:tcW w:w="370" w:type="dxa"/>
+            <w:tcW w:w="368" w:type="dxa"/>
             <w:tcBorders>
               <w:top w:val="nil"/>
               <w:start w:val="single" w:sz="8" w:space="0" w:color="F2F2F2"/>
@@ -13638,7 +13638,7 @@
         </w:tc>
         <w:tc>
           <w:tcPr>
-            <w:tcW w:w="6859" w:type="dxa"/>
+            <w:tcW w:w="6861" w:type="dxa"/>
             <w:gridSpan w:val="6"/>
             <w:tcBorders>
               <w:top w:val="nil"/>
@@ -13726,7 +13726,7 @@
         </w:tc>
         <w:tc>
           <w:tcPr>
-            <w:tcW w:w="370" w:type="dxa"/>
+            <w:tcW w:w="368" w:type="dxa"/>
             <w:tcBorders>
               <w:top w:val="nil"/>
               <w:start w:val="single" w:sz="8" w:space="0" w:color="F2F2F2"/>
@@ -13762,7 +13762,7 @@
         </w:tc>
         <w:tc>
           <w:tcPr>
-            <w:tcW w:w="574" w:type="dxa"/>
+            <w:tcW w:w="576" w:type="dxa"/>
             <w:gridSpan w:val="2"/>
             <w:tcBorders>
               <w:top w:val="nil"/>
@@ -13800,7 +13800,7 @@
         </w:tc>
         <w:tc>
           <w:tcPr>
-            <w:tcW w:w="1317" w:type="dxa"/>
+            <w:tcW w:w="1315" w:type="dxa"/>
             <w:gridSpan w:val="2"/>
             <w:tcBorders>
               <w:top w:val="nil"/>
@@ -13860,7 +13860,7 @@
         </w:tc>
         <w:tc>
           <w:tcPr>
-            <w:tcW w:w="570" w:type="dxa"/>
+            <w:tcW w:w="572" w:type="dxa"/>
             <w:tcBorders>
               <w:top w:val="nil"/>
               <w:start w:val="nil"/>
@@ -14183,7 +14183,7 @@
         </w:tc>
         <w:tc>
           <w:tcPr>
-            <w:tcW w:w="560" w:type="dxa"/>
+            <w:tcW w:w="558" w:type="dxa"/>
             <w:gridSpan w:val="3"/>
             <w:tcBorders>
               <w:top w:val="nil"/>
@@ -14235,7 +14235,7 @@
         </w:tc>
         <w:tc>
           <w:tcPr>
-            <w:tcW w:w="6811" w:type="dxa"/>
+            <w:tcW w:w="6813" w:type="dxa"/>
             <w:gridSpan w:val="5"/>
             <w:tcBorders>
               <w:top w:val="nil"/>
@@ -14310,7 +14310,7 @@
         </w:trPr>
         <w:tc>
           <w:tcPr>
-            <w:tcW w:w="2971" w:type="dxa"/>
+            <w:tcW w:w="2969" w:type="dxa"/>
             <w:gridSpan w:val="4"/>
             <w:tcBorders>
               <w:top w:val="nil"/>
@@ -14380,7 +14380,7 @@
         </w:tc>
         <w:tc>
           <w:tcPr>
-            <w:tcW w:w="6811" w:type="dxa"/>
+            <w:tcW w:w="6813" w:type="dxa"/>
             <w:gridSpan w:val="5"/>
             <w:tcBorders>
               <w:top w:val="nil"/>
@@ -14434,7 +14434,7 @@
         </w:trPr>
         <w:tc>
           <w:tcPr>
-            <w:tcW w:w="2971" w:type="dxa"/>
+            <w:tcW w:w="2969" w:type="dxa"/>
             <w:gridSpan w:val="4"/>
             <w:tcBorders>
               <w:top w:val="thinThickMediumGap" w:sz="24" w:space="0" w:color="D60093"/>
@@ -14467,7 +14467,7 @@
         </w:tc>
         <w:tc>
           <w:tcPr>
-            <w:tcW w:w="6811" w:type="dxa"/>
+            <w:tcW w:w="6813" w:type="dxa"/>
             <w:gridSpan w:val="5"/>
             <w:tcBorders>
               <w:top w:val="thinThickMediumGap" w:sz="24" w:space="0" w:color="D60093"/>
@@ -15138,7 +15138,7 @@
         </w:trPr>
         <w:tc>
           <w:tcPr>
-            <w:tcW w:w="4672" w:type="dxa"/>
+            <w:tcW w:w="4670" w:type="dxa"/>
             <w:gridSpan w:val="6"/>
             <w:tcBorders>
               <w:top w:val="single" w:sz="8" w:space="0" w:color="D60093"/>
@@ -15175,7 +15175,7 @@
         </w:tc>
         <w:tc>
           <w:tcPr>
-            <w:tcW w:w="5110" w:type="dxa"/>
+            <w:tcW w:w="5112" w:type="dxa"/>
             <w:gridSpan w:val="3"/>
             <w:tcBorders>
               <w:top w:val="single" w:sz="8" w:space="0" w:color="D60093"/>
@@ -15219,7 +15219,7 @@
         </w:trPr>
         <w:tc>
           <w:tcPr>
-            <w:tcW w:w="4672" w:type="dxa"/>
+            <w:tcW w:w="4670" w:type="dxa"/>
             <w:gridSpan w:val="6"/>
             <w:tcBorders>
               <w:top w:val="nil"/>
@@ -15270,7 +15270,7 @@
         </w:tc>
         <w:tc>
           <w:tcPr>
-            <w:tcW w:w="5110" w:type="dxa"/>
+            <w:tcW w:w="5112" w:type="dxa"/>
             <w:gridSpan w:val="3"/>
             <w:tcBorders>
               <w:top w:val="nil"/>
@@ -15469,7 +15469,7 @@
         </w:tc>
         <w:tc>
           <w:tcPr>
-            <w:tcW w:w="370" w:type="dxa"/>
+            <w:tcW w:w="368" w:type="dxa"/>
             <w:tcBorders>
               <w:top w:val="nil"/>
               <w:start w:val="single" w:sz="8" w:space="0" w:color="F2F2F2"/>
@@ -15501,7 +15501,7 @@
         </w:tc>
         <w:tc>
           <w:tcPr>
-            <w:tcW w:w="6859" w:type="dxa"/>
+            <w:tcW w:w="6861" w:type="dxa"/>
             <w:gridSpan w:val="6"/>
             <w:tcBorders>
               <w:top w:val="nil"/>
@@ -15591,7 +15591,7 @@
         </w:tc>
         <w:tc>
           <w:tcPr>
-            <w:tcW w:w="370" w:type="dxa"/>
+            <w:tcW w:w="368" w:type="dxa"/>
             <w:tcBorders>
               <w:top w:val="nil"/>
               <w:start w:val="single" w:sz="8" w:space="0" w:color="F2F2F2"/>
@@ -15627,7 +15627,7 @@
         </w:tc>
         <w:tc>
           <w:tcPr>
-            <w:tcW w:w="574" w:type="dxa"/>
+            <w:tcW w:w="576" w:type="dxa"/>
             <w:gridSpan w:val="2"/>
             <w:tcBorders>
               <w:top w:val="nil"/>
@@ -15665,7 +15665,7 @@
         </w:tc>
         <w:tc>
           <w:tcPr>
-            <w:tcW w:w="1317" w:type="dxa"/>
+            <w:tcW w:w="1315" w:type="dxa"/>
             <w:gridSpan w:val="2"/>
             <w:tcBorders>
               <w:top w:val="nil"/>
@@ -15725,7 +15725,7 @@
         </w:tc>
         <w:tc>
           <w:tcPr>
-            <w:tcW w:w="570" w:type="dxa"/>
+            <w:tcW w:w="572" w:type="dxa"/>
             <w:tcBorders>
               <w:top w:val="nil"/>
               <w:start w:val="nil"/>
@@ -16068,7 +16068,7 @@
         </w:tc>
         <w:tc>
           <w:tcPr>
-            <w:tcW w:w="560" w:type="dxa"/>
+            <w:tcW w:w="558" w:type="dxa"/>
             <w:gridSpan w:val="3"/>
             <w:tcBorders>
               <w:top w:val="nil"/>
@@ -16120,7 +16120,7 @@
         </w:tc>
         <w:tc>
           <w:tcPr>
-            <w:tcW w:w="6811" w:type="dxa"/>
+            <w:tcW w:w="6813" w:type="dxa"/>
             <w:gridSpan w:val="5"/>
             <w:tcBorders>
               <w:top w:val="nil"/>
@@ -16195,7 +16195,7 @@
         </w:trPr>
         <w:tc>
           <w:tcPr>
-            <w:tcW w:w="2971" w:type="dxa"/>
+            <w:tcW w:w="2969" w:type="dxa"/>
             <w:gridSpan w:val="4"/>
             <w:tcBorders>
               <w:top w:val="nil"/>
@@ -16252,7 +16252,7 @@
         </w:tc>
         <w:tc>
           <w:tcPr>
-            <w:tcW w:w="6811" w:type="dxa"/>
+            <w:tcW w:w="6813" w:type="dxa"/>
             <w:gridSpan w:val="5"/>
             <w:tcBorders>
               <w:top w:val="nil"/>
@@ -16297,7 +16297,7 @@
         </w:trPr>
         <w:tc>
           <w:tcPr>
-            <w:tcW w:w="2971" w:type="dxa"/>
+            <w:tcW w:w="2969" w:type="dxa"/>
             <w:gridSpan w:val="4"/>
             <w:tcBorders>
               <w:top w:val="thinThickMediumGap" w:sz="24" w:space="0" w:color="D60093"/>
@@ -16330,7 +16330,7 @@
         </w:tc>
         <w:tc>
           <w:tcPr>
-            <w:tcW w:w="6811" w:type="dxa"/>
+            <w:tcW w:w="6813" w:type="dxa"/>
             <w:gridSpan w:val="5"/>
             <w:tcBorders>
               <w:top w:val="thinThickMediumGap" w:sz="24" w:space="0" w:color="D60093"/>
@@ -16425,36 +16425,46 @@
               <w:suppressAutoHyphens w:val="true"/>
               <w:spacing w:lineRule="auto" w:line="240" w:before="120" w:after="0"/>
               <w:jc w:val="start"/>
-              <w:rPr/>
+              <w:rPr>
+                <w:rFonts w:ascii="Calibri" w:hAnsi="Calibri" w:eastAsia="Calibri" w:cs=""/>
+                <w:kern w:val="0"/>
+                <w:sz w:val="22"/>
+                <w:szCs w:val="22"/>
+                <w:lang w:val="fr-FR" w:eastAsia="en-US" w:bidi="ar-SA"/>
+              </w:rPr>
             </w:pPr>
             <w:r>
               <w:rPr>
                 <w:rStyle w:val="PlaceholderText"/>
-                <w:rFonts w:cs="Calibri" w:ascii="apple-system;BlinkMacSystemFont;Segoe UI;Roboto;sans-serif" w:hAnsi="apple-system;BlinkMacSystemFont;Segoe UI;Roboto;sans-serif"/>
+                <w:rFonts w:eastAsia="Calibri" w:cs="Calibri" w:ascii="apple-system;BlinkMacSystemFont;Segoe UI;Roboto;sans-serif" w:hAnsi="apple-system;BlinkMacSystemFont;Segoe UI;Roboto;sans-serif"/>
                 <w:b w:val="false"/>
                 <w:i w:val="false"/>
                 <w:caps w:val="false"/>
                 <w:smallCaps w:val="false"/>
                 <w:color w:val="000000"/>
                 <w:spacing w:val="0"/>
+                <w:kern w:val="0"/>
                 <w:sz w:val="20"/>
                 <w:szCs w:val="22"/>
+                <w:lang w:val="fr-FR" w:eastAsia="en-US" w:bidi="ar-SA"/>
               </w:rPr>
               <w:t>J'ai conçu et mis en place la chaîne de build du projet : Dockerfile multi-stage optimisé et docker-compose.yml avec profils dev/prod. Le Dockerfile sépare l'étape builder (bun install, prisma generate, next build) de l'image runner finale, faisant passer l'image de plus de 2 Go à moins de 500 Mo. Le docker-compose</w:t>
             </w:r>
             <w:r>
               <w:rPr>
                 <w:rStyle w:val="PlaceholderText"/>
-                <w:rFonts w:cs="Calibri" w:ascii="apple-system;BlinkMacSystemFont;Segoe UI;Roboto;sans-serif" w:hAnsi="apple-system;BlinkMacSystemFont;Segoe UI;Roboto;sans-serif"/>
+                <w:rFonts w:eastAsia="Calibri" w:cs="Calibri" w:ascii="apple-system;BlinkMacSystemFont;Segoe UI;Roboto;sans-serif" w:hAnsi="apple-system;BlinkMacSystemFont;Segoe UI;Roboto;sans-serif"/>
                 <w:b w:val="false"/>
                 <w:i w:val="false"/>
                 <w:caps w:val="false"/>
                 <w:smallCaps w:val="false"/>
                 <w:color w:val="000000"/>
                 <w:spacing w:val="0"/>
+                <w:kern w:val="0"/>
                 <w:sz w:val="20"/>
                 <w:szCs w:val="22"/>
                 <w:shd w:fill="FFFFFF" w:val="clear"/>
+                <w:lang w:val="fr-FR" w:eastAsia="en-US" w:bidi="ar-SA"/>
               </w:rPr>
               <w:t xml:space="preserve"> orchestre uniquement le service applicatif — la base de données Neon et Redis Upstash sont des services externes. Le déploiement en production est effectué via la CLI Vercel avec </w:t>
             </w:r>
@@ -16468,25 +16478,29 @@
                 <w:smallCaps w:val="false"/>
                 <w:color w:val="000000"/>
                 <w:spacing w:val="0"/>
+                <w:kern w:val="0"/>
                 <w:sz w:val="20"/>
                 <w:szCs w:val="22"/>
                 <w:shd w:fill="FFFFFF" w:val="clear"/>
+                <w:lang w:val="fr-FR" w:eastAsia="en-US" w:bidi="ar-SA"/>
               </w:rPr>
               <w:t>prisma migrate deploy</w:t>
             </w:r>
             <w:r>
               <w:rPr>
                 <w:rStyle w:val="PlaceholderText"/>
-                <w:rFonts w:cs="Calibri" w:ascii="apple-system;BlinkMacSystemFont;Segoe UI;Roboto;sans-serif" w:hAnsi="apple-system;BlinkMacSystemFont;Segoe UI;Roboto;sans-serif"/>
+                <w:rFonts w:eastAsia="Calibri" w:cs="Calibri" w:ascii="apple-system;BlinkMacSystemFont;Segoe UI;Roboto;sans-serif" w:hAnsi="apple-system;BlinkMacSystemFont;Segoe UI;Roboto;sans-serif"/>
                 <w:b w:val="false"/>
                 <w:i w:val="false"/>
                 <w:caps w:val="false"/>
                 <w:smallCaps w:val="false"/>
                 <w:color w:val="000000"/>
                 <w:spacing w:val="0"/>
+                <w:kern w:val="0"/>
                 <w:sz w:val="20"/>
                 <w:szCs w:val="22"/>
                 <w:shd w:fill="FFFFFF" w:val="clear"/>
+                <w:lang w:val="fr-FR" w:eastAsia="en-US" w:bidi="ar-SA"/>
               </w:rPr>
               <w:t xml:space="preserve"> avant chaque mise en ligne. L'analyse qualité est assurée par SonarQube.</w:t>
             </w:r>
@@ -16950,7 +16964,7 @@
         </w:trPr>
         <w:tc>
           <w:tcPr>
-            <w:tcW w:w="4672" w:type="dxa"/>
+            <w:tcW w:w="4670" w:type="dxa"/>
             <w:gridSpan w:val="6"/>
             <w:tcBorders>
               <w:top w:val="single" w:sz="8" w:space="0" w:color="D60093"/>
@@ -16987,7 +17001,7 @@
         </w:tc>
         <w:tc>
           <w:tcPr>
-            <w:tcW w:w="5110" w:type="dxa"/>
+            <w:tcW w:w="5112" w:type="dxa"/>
             <w:gridSpan w:val="3"/>
             <w:tcBorders>
               <w:top w:val="single" w:sz="8" w:space="0" w:color="D60093"/>
@@ -17031,7 +17045,7 @@
         </w:trPr>
         <w:tc>
           <w:tcPr>
-            <w:tcW w:w="4672" w:type="dxa"/>
+            <w:tcW w:w="4670" w:type="dxa"/>
             <w:gridSpan w:val="6"/>
             <w:tcBorders>
               <w:top w:val="nil"/>
@@ -17082,7 +17096,7 @@
         </w:tc>
         <w:tc>
           <w:tcPr>
-            <w:tcW w:w="5110" w:type="dxa"/>
+            <w:tcW w:w="5112" w:type="dxa"/>
             <w:gridSpan w:val="3"/>
             <w:tcBorders>
               <w:top w:val="nil"/>
@@ -17281,7 +17295,7 @@
         </w:tc>
         <w:tc>
           <w:tcPr>
-            <w:tcW w:w="370" w:type="dxa"/>
+            <w:tcW w:w="368" w:type="dxa"/>
             <w:tcBorders>
               <w:top w:val="nil"/>
               <w:start w:val="single" w:sz="8" w:space="0" w:color="F2F2F2"/>
@@ -17317,7 +17331,7 @@
         </w:tc>
         <w:tc>
           <w:tcPr>
-            <w:tcW w:w="6859" w:type="dxa"/>
+            <w:tcW w:w="6861" w:type="dxa"/>
             <w:gridSpan w:val="6"/>
             <w:tcBorders>
               <w:top w:val="nil"/>
@@ -17407,7 +17421,7 @@
         </w:tc>
         <w:tc>
           <w:tcPr>
-            <w:tcW w:w="370" w:type="dxa"/>
+            <w:tcW w:w="368" w:type="dxa"/>
             <w:tcBorders>
               <w:top w:val="nil"/>
               <w:start w:val="single" w:sz="8" w:space="0" w:color="F2F2F2"/>
@@ -17443,7 +17457,7 @@
         </w:tc>
         <w:tc>
           <w:tcPr>
-            <w:tcW w:w="574" w:type="dxa"/>
+            <w:tcW w:w="576" w:type="dxa"/>
             <w:gridSpan w:val="2"/>
             <w:tcBorders>
               <w:top w:val="nil"/>
@@ -17481,7 +17495,7 @@
         </w:tc>
         <w:tc>
           <w:tcPr>
-            <w:tcW w:w="1317" w:type="dxa"/>
+            <w:tcW w:w="1315" w:type="dxa"/>
             <w:gridSpan w:val="2"/>
             <w:tcBorders>
               <w:top w:val="nil"/>
@@ -17551,7 +17565,7 @@
         </w:tc>
         <w:tc>
           <w:tcPr>
-            <w:tcW w:w="570" w:type="dxa"/>
+            <w:tcW w:w="572" w:type="dxa"/>
             <w:tcBorders>
               <w:top w:val="nil"/>
               <w:start w:val="nil"/>
@@ -17872,7 +17886,7 @@
         </w:tc>
         <w:tc>
           <w:tcPr>
-            <w:tcW w:w="560" w:type="dxa"/>
+            <w:tcW w:w="558" w:type="dxa"/>
             <w:gridSpan w:val="3"/>
             <w:tcBorders>
               <w:top w:val="nil"/>
@@ -17924,7 +17938,7 @@
         </w:tc>
         <w:tc>
           <w:tcPr>
-            <w:tcW w:w="6811" w:type="dxa"/>
+            <w:tcW w:w="6813" w:type="dxa"/>
             <w:gridSpan w:val="5"/>
             <w:tcBorders>
               <w:top w:val="nil"/>
@@ -17999,7 +18013,7 @@
         </w:trPr>
         <w:tc>
           <w:tcPr>
-            <w:tcW w:w="2971" w:type="dxa"/>
+            <w:tcW w:w="2969" w:type="dxa"/>
             <w:gridSpan w:val="4"/>
             <w:tcBorders>
               <w:top w:val="nil"/>
@@ -18056,7 +18070,7 @@
         </w:tc>
         <w:tc>
           <w:tcPr>
-            <w:tcW w:w="6811" w:type="dxa"/>
+            <w:tcW w:w="6813" w:type="dxa"/>
             <w:gridSpan w:val="5"/>
             <w:tcBorders>
               <w:top w:val="nil"/>
@@ -18109,7 +18123,7 @@
         </w:trPr>
         <w:tc>
           <w:tcPr>
-            <w:tcW w:w="2971" w:type="dxa"/>
+            <w:tcW w:w="2969" w:type="dxa"/>
             <w:gridSpan w:val="4"/>
             <w:tcBorders>
               <w:top w:val="thinThickMediumGap" w:sz="24" w:space="0" w:color="D60093"/>
@@ -18142,7 +18156,7 @@
         </w:tc>
         <w:tc>
           <w:tcPr>
-            <w:tcW w:w="6811" w:type="dxa"/>
+            <w:tcW w:w="6813" w:type="dxa"/>
             <w:gridSpan w:val="5"/>
             <w:tcBorders>
               <w:top w:val="thinThickMediumGap" w:sz="24" w:space="0" w:color="D60093"/>
@@ -18712,7 +18726,7 @@
         </w:trPr>
         <w:tc>
           <w:tcPr>
-            <w:tcW w:w="4672" w:type="dxa"/>
+            <w:tcW w:w="4670" w:type="dxa"/>
             <w:gridSpan w:val="6"/>
             <w:tcBorders>
               <w:top w:val="single" w:sz="8" w:space="0" w:color="D60093"/>
@@ -18749,7 +18763,7 @@
         </w:tc>
         <w:tc>
           <w:tcPr>
-            <w:tcW w:w="5110" w:type="dxa"/>
+            <w:tcW w:w="5112" w:type="dxa"/>
             <w:gridSpan w:val="3"/>
             <w:tcBorders>
               <w:top w:val="single" w:sz="8" w:space="0" w:color="D60093"/>
@@ -18793,7 +18807,7 @@
         </w:trPr>
         <w:tc>
           <w:tcPr>
-            <w:tcW w:w="4672" w:type="dxa"/>
+            <w:tcW w:w="4670" w:type="dxa"/>
             <w:gridSpan w:val="6"/>
             <w:tcBorders>
               <w:top w:val="nil"/>
@@ -18844,7 +18858,7 @@
         </w:tc>
         <w:tc>
           <w:tcPr>
-            <w:tcW w:w="5110" w:type="dxa"/>
+            <w:tcW w:w="5112" w:type="dxa"/>
             <w:gridSpan w:val="3"/>
             <w:tcBorders>
               <w:top w:val="nil"/>
@@ -19043,7 +19057,7 @@
         </w:tc>
         <w:tc>
           <w:tcPr>
-            <w:tcW w:w="370" w:type="dxa"/>
+            <w:tcW w:w="368" w:type="dxa"/>
             <w:tcBorders>
               <w:top w:val="nil"/>
               <w:start w:val="single" w:sz="8" w:space="0" w:color="F2F2F2"/>
@@ -19079,7 +19093,7 @@
         </w:tc>
         <w:tc>
           <w:tcPr>
-            <w:tcW w:w="6859" w:type="dxa"/>
+            <w:tcW w:w="6861" w:type="dxa"/>
             <w:gridSpan w:val="6"/>
             <w:tcBorders>
               <w:top w:val="nil"/>
@@ -19169,7 +19183,7 @@
         </w:tc>
         <w:tc>
           <w:tcPr>
-            <w:tcW w:w="370" w:type="dxa"/>
+            <w:tcW w:w="368" w:type="dxa"/>
             <w:tcBorders>
               <w:top w:val="nil"/>
               <w:start w:val="single" w:sz="8" w:space="0" w:color="F2F2F2"/>
@@ -19205,7 +19219,7 @@
         </w:tc>
         <w:tc>
           <w:tcPr>
-            <w:tcW w:w="574" w:type="dxa"/>
+            <w:tcW w:w="576" w:type="dxa"/>
             <w:gridSpan w:val="2"/>
             <w:tcBorders>
               <w:top w:val="nil"/>
@@ -19243,7 +19257,7 @@
         </w:tc>
         <w:tc>
           <w:tcPr>
-            <w:tcW w:w="1317" w:type="dxa"/>
+            <w:tcW w:w="1315" w:type="dxa"/>
             <w:gridSpan w:val="2"/>
             <w:tcBorders>
               <w:top w:val="nil"/>
@@ -19313,7 +19327,7 @@
         </w:tc>
         <w:tc>
           <w:tcPr>
-            <w:tcW w:w="570" w:type="dxa"/>
+            <w:tcW w:w="572" w:type="dxa"/>
             <w:tcBorders>
               <w:top w:val="nil"/>
               <w:start w:val="nil"/>
@@ -19603,7 +19617,7 @@
         </w:tc>
         <w:tc>
           <w:tcPr>
-            <w:tcW w:w="560" w:type="dxa"/>
+            <w:tcW w:w="558" w:type="dxa"/>
             <w:gridSpan w:val="3"/>
             <w:tcBorders>
               <w:top w:val="nil"/>
@@ -19655,7 +19669,7 @@
         </w:tc>
         <w:tc>
           <w:tcPr>
-            <w:tcW w:w="6811" w:type="dxa"/>
+            <w:tcW w:w="6813" w:type="dxa"/>
             <w:gridSpan w:val="5"/>
             <w:tcBorders>
               <w:top w:val="nil"/>
@@ -19730,7 +19744,7 @@
         </w:trPr>
         <w:tc>
           <w:tcPr>
-            <w:tcW w:w="2971" w:type="dxa"/>
+            <w:tcW w:w="2969" w:type="dxa"/>
             <w:gridSpan w:val="4"/>
             <w:tcBorders>
               <w:top w:val="nil"/>
@@ -19787,7 +19801,7 @@
         </w:tc>
         <w:tc>
           <w:tcPr>
-            <w:tcW w:w="6811" w:type="dxa"/>
+            <w:tcW w:w="6813" w:type="dxa"/>
             <w:gridSpan w:val="5"/>
             <w:tcBorders>
               <w:top w:val="nil"/>
@@ -19844,7 +19858,7 @@
         </w:trPr>
         <w:tc>
           <w:tcPr>
-            <w:tcW w:w="2971" w:type="dxa"/>
+            <w:tcW w:w="2969" w:type="dxa"/>
             <w:gridSpan w:val="4"/>
             <w:tcBorders>
               <w:top w:val="thinThickMediumGap" w:sz="24" w:space="0" w:color="D60093"/>
@@ -19877,7 +19891,7 @@
         </w:tc>
         <w:tc>
           <w:tcPr>
-            <w:tcW w:w="6811" w:type="dxa"/>
+            <w:tcW w:w="6813" w:type="dxa"/>
             <w:gridSpan w:val="5"/>
             <w:tcBorders>
               <w:top w:val="thinThickMediumGap" w:sz="24" w:space="0" w:color="D60093"/>
@@ -20445,7 +20459,7 @@
         </w:trPr>
         <w:tc>
           <w:tcPr>
-            <w:tcW w:w="4672" w:type="dxa"/>
+            <w:tcW w:w="4670" w:type="dxa"/>
             <w:gridSpan w:val="6"/>
             <w:tcBorders>
               <w:top w:val="single" w:sz="8" w:space="0" w:color="D60093"/>
@@ -20482,7 +20496,7 @@
         </w:tc>
         <w:tc>
           <w:tcPr>
-            <w:tcW w:w="5110" w:type="dxa"/>
+            <w:tcW w:w="5112" w:type="dxa"/>
             <w:gridSpan w:val="3"/>
             <w:tcBorders>
               <w:top w:val="single" w:sz="8" w:space="0" w:color="D60093"/>
@@ -20526,7 +20540,7 @@
         </w:trPr>
         <w:tc>
           <w:tcPr>
-            <w:tcW w:w="4672" w:type="dxa"/>
+            <w:tcW w:w="4670" w:type="dxa"/>
             <w:gridSpan w:val="6"/>
             <w:tcBorders>
               <w:top w:val="nil"/>
@@ -20577,7 +20591,7 @@
         </w:tc>
         <w:tc>
           <w:tcPr>
-            <w:tcW w:w="5110" w:type="dxa"/>
+            <w:tcW w:w="5112" w:type="dxa"/>
             <w:gridSpan w:val="3"/>
             <w:tcBorders>
               <w:top w:val="nil"/>
@@ -20776,7 +20790,7 @@
         </w:tc>
         <w:tc>
           <w:tcPr>
-            <w:tcW w:w="370" w:type="dxa"/>
+            <w:tcW w:w="368" w:type="dxa"/>
             <w:tcBorders>
               <w:top w:val="nil"/>
               <w:start w:val="single" w:sz="8" w:space="0" w:color="F2F2F2"/>
@@ -20812,7 +20826,7 @@
         </w:tc>
         <w:tc>
           <w:tcPr>
-            <w:tcW w:w="6859" w:type="dxa"/>
+            <w:tcW w:w="6861" w:type="dxa"/>
             <w:gridSpan w:val="6"/>
             <w:tcBorders>
               <w:top w:val="nil"/>
@@ -20902,7 +20916,7 @@
         </w:tc>
         <w:tc>
           <w:tcPr>
-            <w:tcW w:w="370" w:type="dxa"/>
+            <w:tcW w:w="368" w:type="dxa"/>
             <w:tcBorders>
               <w:top w:val="nil"/>
               <w:start w:val="single" w:sz="8" w:space="0" w:color="F2F2F2"/>
@@ -20938,7 +20952,7 @@
         </w:tc>
         <w:tc>
           <w:tcPr>
-            <w:tcW w:w="574" w:type="dxa"/>
+            <w:tcW w:w="576" w:type="dxa"/>
             <w:gridSpan w:val="2"/>
             <w:tcBorders>
               <w:top w:val="nil"/>
@@ -20976,7 +20990,7 @@
         </w:tc>
         <w:tc>
           <w:tcPr>
-            <w:tcW w:w="1317" w:type="dxa"/>
+            <w:tcW w:w="1315" w:type="dxa"/>
             <w:gridSpan w:val="2"/>
             <w:tcBorders>
               <w:top w:val="nil"/>
@@ -21046,7 +21060,7 @@
         </w:tc>
         <w:tc>
           <w:tcPr>
-            <w:tcW w:w="570" w:type="dxa"/>
+            <w:tcW w:w="572" w:type="dxa"/>
             <w:tcBorders>
               <w:top w:val="nil"/>
               <w:start w:val="nil"/>
@@ -22668,7 +22682,7 @@
         <mc:AlternateContent>
           <mc:Choice Requires="wps">
             <w:drawing>
-              <wp:anchor distT="0" distB="0" distL="0" distR="0" simplePos="0" relativeHeight="123" behindDoc="0" locked="0" layoutInCell="1" allowOverlap="1" wp14:anchorId="37EC57A2">
+              <wp:anchor distT="0" distB="0" distL="0" distR="0" simplePos="0" relativeHeight="109" behindDoc="0" locked="0" layoutInCell="1" allowOverlap="1" wp14:anchorId="37EC57A2">
                 <wp:simplePos x="0" y="0"/>
                 <wp:positionH relativeFrom="column">
                   <wp:posOffset>2010410</wp:posOffset>
@@ -22875,7 +22889,7 @@
         <mc:AlternateContent>
           <mc:Choice Requires="wps">
             <w:drawing>
-              <wp:anchor distT="0" distB="0" distL="0" distR="0" simplePos="0" relativeHeight="119" behindDoc="0" locked="0" layoutInCell="1" allowOverlap="1" wp14:anchorId="62C6C4CD">
+              <wp:anchor distT="0" distB="0" distL="0" distR="0" simplePos="0" relativeHeight="12" behindDoc="0" locked="0" layoutInCell="1" allowOverlap="1" wp14:anchorId="62C6C4CD">
                 <wp:simplePos x="0" y="0"/>
                 <wp:positionH relativeFrom="column">
                   <wp:posOffset>3526155</wp:posOffset>
@@ -23025,7 +23039,7 @@
         <mc:AlternateContent>
           <mc:Choice Requires="wps">
             <w:drawing>
-              <wp:anchor distT="0" distB="0" distL="0" distR="0" simplePos="0" relativeHeight="121" behindDoc="0" locked="0" layoutInCell="1" allowOverlap="1" wp14:anchorId="4543E899">
+              <wp:anchor distT="0" distB="0" distL="0" distR="0" simplePos="0" relativeHeight="104" behindDoc="0" locked="0" layoutInCell="1" allowOverlap="1" wp14:anchorId="4543E899">
                 <wp:simplePos x="0" y="0"/>
                 <wp:positionH relativeFrom="column">
                   <wp:posOffset>361950</wp:posOffset>
@@ -23306,7 +23320,7 @@
           <w:szCs w:val="24"/>
         </w:rPr>
         <w:drawing>
-          <wp:anchor distT="0" distB="0" distL="0" distR="0" simplePos="0" relativeHeight="125" behindDoc="0" locked="0" layoutInCell="0" allowOverlap="1">
+          <wp:anchor distT="0" distB="0" distL="0" distR="0" simplePos="0" relativeHeight="111" behindDoc="0" locked="0" layoutInCell="0" allowOverlap="1">
             <wp:simplePos x="0" y="0"/>
             <wp:positionH relativeFrom="column">
               <wp:posOffset>22225</wp:posOffset>
@@ -23645,36 +23659,11 @@
               </w:rPr>
             </w:r>
           </w:p>
-          <w:p>
-            <w:pPr>
-              <w:pStyle w:val="Normal"/>
-              <w:widowControl/>
-              <w:suppressAutoHyphens w:val="true"/>
-              <w:spacing w:lineRule="auto" w:line="240" w:before="0" w:after="0"/>
-              <w:jc w:val="center"/>
-              <w:rPr>
-                <w:rFonts w:cs="Calibri" w:cstheme="minorHAnsi"/>
-                <w:i/>
-                <w:color w:themeColor="text1" w:themeTint="bf" w:val="404040"/>
-                <w:sz w:val="28"/>
-                <w:szCs w:val="28"/>
-              </w:rPr>
-            </w:pPr>
-            <w:r>
-              <w:rPr>
-                <w:rFonts w:cs="Calibri" w:cstheme="minorHAnsi"/>
-                <w:i/>
-                <w:color w:themeColor="text1" w:themeTint="bf" w:val="404040"/>
-                <w:sz w:val="28"/>
-                <w:szCs w:val="28"/>
-              </w:rPr>
-            </w:r>
-          </w:p>
         </w:tc>
       </w:tr>
       <w:tr>
         <w:trPr>
-          <w:trHeight w:val="733" w:hRule="atLeast"/>
+          <w:trHeight w:val="958" w:hRule="atLeast"/>
         </w:trPr>
         <w:tc>
           <w:tcPr>
@@ -23713,9 +23702,10 @@
                 <w:spacing w:val="0"/>
                 <w:sz w:val="20"/>
                 <w:szCs w:val="22"/>
+                <w:u w:val="none" w:color="000000"/>
                 <w:shd w:fill="FFFFFF" w:val="clear"/>
               </w:rPr>
-              <w:t>[Dictionnaire de données]</w:t>
+              <w:t>Dictionnaire de données</w:t>
             </w:r>
           </w:p>
           <w:p>
@@ -23745,15 +23735,33 @@
                   <w:spacing w:val="0"/>
                   <w:sz w:val="22"/>
                   <w:szCs w:val="22"/>
+                  <w:u w:val="none" w:color="000000"/>
                   <w:shd w:fill="FFFFFF" w:val="clear"/>
                 </w:rPr>
                 <w:t>https://github.com/CLecart/social-network/blob/docs/dossier-certification/dossier-certification/03-conception/donnees.md</w:t>
               </w:r>
             </w:hyperlink>
           </w:p>
-          <w:p>
-            <w:pPr>
-              <w:pStyle w:val="PreformattedText"/>
+        </w:tc>
+      </w:tr>
+      <w:tr>
+        <w:trPr>
+          <w:trHeight w:val="958" w:hRule="atLeast"/>
+        </w:trPr>
+        <w:tc>
+          <w:tcPr>
+            <w:tcW w:w="9782" w:type="dxa"/>
+            <w:tcBorders>
+              <w:top w:val="nil"/>
+              <w:start w:val="single" w:sz="4" w:space="0" w:color="BFBFBF"/>
+              <w:bottom w:val="single" w:sz="4" w:space="0" w:color="BFBFBF"/>
+              <w:end w:val="single" w:sz="4" w:space="0" w:color="BFBFBF"/>
+            </w:tcBorders>
+            <w:vAlign w:val="center"/>
+          </w:tcPr>
+          <w:p>
+            <w:pPr>
+              <w:pStyle w:val="Heading1"/>
               <w:widowControl/>
               <w:tabs>
                 <w:tab w:val="clear" w:pos="709"/>
@@ -23763,35 +23771,46 @@
               <w:spacing w:lineRule="auto" w:line="240" w:before="0" w:after="0"/>
               <w:ind w:end="175"/>
               <w:jc w:val="start"/>
-              <w:rPr>
-                <w:rStyle w:val="SourceText"/>
-                <w:rFonts w:ascii="Carlito" w:hAnsi="Carlito"/>
+              <w:rPr/>
+            </w:pPr>
+            <w:r>
+              <w:rPr>
+                <w:rFonts w:eastAsia="Liberation Mono" w:cs="Liberation Mono" w:ascii="Carlito" w:hAnsi="Carlito"/>
                 <w:b w:val="false"/>
                 <w:i w:val="false"/>
                 <w:caps w:val="false"/>
                 <w:smallCaps w:val="false"/>
-                <w:color w:val="3794FF"/>
+                <w:color w:val="000000"/>
                 <w:spacing w:val="0"/>
                 <w:sz w:val="20"/>
-                <w:szCs w:val="22"/>
-                <w:highlight w:val="none"/>
-                <w:shd w:fill="FFFFFF" w:val="clear"/>
-              </w:rPr>
-            </w:pPr>
+                <w:szCs w:val="20"/>
+                <w:u w:val="none" w:color="000000"/>
+              </w:rPr>
+              <w:t>Cahier des Charges</w:t>
+            </w:r>
             <w:r>
               <w:rPr>
                 <w:rFonts w:ascii="Carlito" w:hAnsi="Carlito"/>
-                <w:b w:val="false"/>
-                <w:i w:val="false"/>
-                <w:caps w:val="false"/>
-                <w:smallCaps w:val="false"/>
                 <w:color w:val="3794FF"/>
-                <w:spacing w:val="0"/>
-                <w:sz w:val="20"/>
-                <w:szCs w:val="22"/>
-                <w:shd w:fill="FFFFFF" w:val="clear"/>
-              </w:rPr>
-            </w:r>
+                <w:u w:val="none" w:color="000000"/>
+              </w:rPr>
+              <w:br/>
+            </w:r>
+            <w:hyperlink r:id="rId24">
+              <w:r>
+                <w:rPr>
+                  <w:rStyle w:val="Hyperlink"/>
+                  <w:rFonts w:ascii="Carlito" w:hAnsi="Carlito"/>
+                  <w:b w:val="false"/>
+                  <w:bCs w:val="false"/>
+                  <w:color w:val="3794FF"/>
+                  <w:sz w:val="22"/>
+                  <w:szCs w:val="22"/>
+                  <w:u w:val="none" w:color="000000"/>
+                </w:rPr>
+                <w:t>https://github.com/CLecart/social-network/blob/main/dossier-certification/02-cahier-des-charges/README.md</w:t>
+              </w:r>
+            </w:hyperlink>
           </w:p>
         </w:tc>
       </w:tr>
@@ -23837,6 +23856,7 @@
                 <w:kern w:val="0"/>
                 <w:sz w:val="20"/>
                 <w:szCs w:val="22"/>
+                <w:u w:val="none" w:color="000000"/>
                 <w:lang w:val="fr-FR" w:eastAsia="en-US" w:bidi="ar-SA"/>
               </w:rPr>
               <w:t>Code — Route auth JWT + cookie :</w:t>
@@ -23854,11 +23874,12 @@
                 <w:kern w:val="0"/>
                 <w:sz w:val="20"/>
                 <w:szCs w:val="22"/>
+                <w:u w:val="none" w:color="000000"/>
                 <w:lang w:val="fr-FR" w:eastAsia="en-US" w:bidi="ar-SA"/>
               </w:rPr>
               <w:t xml:space="preserve"> </w:t>
             </w:r>
-            <w:hyperlink r:id="rId24" w:tgtFrame="_blank">
+            <w:hyperlink r:id="rId25" w:tgtFrame="_blank">
               <w:r>
                 <w:rPr>
                   <w:rStyle w:val="Hyperlink"/>
@@ -23872,6 +23893,7 @@
                   <w:kern w:val="0"/>
                   <w:sz w:val="20"/>
                   <w:szCs w:val="22"/>
+                  <w:u w:val="none" w:color="000000"/>
                   <w:lang w:val="fr-FR" w:eastAsia="en-US" w:bidi="ar-SA"/>
                 </w:rPr>
                 <w:t>https://github.com/arocchet/social-network/blob/main/src/app/api/public/auth/login/route.ts</w:t>
@@ -23922,6 +23944,7 @@
                 <w:kern w:val="0"/>
                 <w:sz w:val="20"/>
                 <w:szCs w:val="22"/>
+                <w:u w:val="none" w:color="000000"/>
                 <w:lang w:val="fr-FR" w:eastAsia="en-US" w:bidi="ar-SA"/>
               </w:rPr>
               <w:t>Code — Middleware protection des routes :</w:t>
@@ -23939,11 +23962,12 @@
                 <w:kern w:val="0"/>
                 <w:sz w:val="20"/>
                 <w:szCs w:val="22"/>
+                <w:u w:val="none" w:color="000000"/>
                 <w:lang w:val="fr-FR" w:eastAsia="en-US" w:bidi="ar-SA"/>
               </w:rPr>
               <w:t xml:space="preserve"> </w:t>
             </w:r>
-            <w:hyperlink r:id="rId25" w:tgtFrame="_blank">
+            <w:hyperlink r:id="rId26" w:tgtFrame="_blank">
               <w:r>
                 <w:rPr>
                   <w:rStyle w:val="Hyperlink"/>
@@ -23957,6 +23981,7 @@
                   <w:kern w:val="0"/>
                   <w:sz w:val="20"/>
                   <w:szCs w:val="22"/>
+                  <w:u w:val="none" w:color="000000"/>
                   <w:lang w:val="fr-FR" w:eastAsia="en-US" w:bidi="ar-SA"/>
                 </w:rPr>
                 <w:t>https://github.com/arocchet/social-network/blob/main/src/middleware.ts</w:t>
@@ -24007,6 +24032,7 @@
                 <w:kern w:val="0"/>
                 <w:sz w:val="20"/>
                 <w:szCs w:val="22"/>
+                <w:u w:val="none" w:color="000000"/>
                 <w:lang w:val="fr-FR" w:eastAsia="en-US" w:bidi="ar-SA"/>
               </w:rPr>
               <w:t>Code — Schéma Prisma 18 modèles :</w:t>
@@ -24024,11 +24050,12 @@
                 <w:kern w:val="0"/>
                 <w:sz w:val="20"/>
                 <w:szCs w:val="22"/>
+                <w:u w:val="none" w:color="000000"/>
                 <w:lang w:val="fr-FR" w:eastAsia="en-US" w:bidi="ar-SA"/>
               </w:rPr>
               <w:t xml:space="preserve"> </w:t>
             </w:r>
-            <w:hyperlink r:id="rId26" w:tgtFrame="_blank">
+            <w:hyperlink r:id="rId27" w:tgtFrame="_blank">
               <w:r>
                 <w:rPr>
                   <w:rStyle w:val="Hyperlink"/>
@@ -24042,6 +24069,7 @@
                   <w:kern w:val="0"/>
                   <w:sz w:val="20"/>
                   <w:szCs w:val="22"/>
+                  <w:u w:val="none" w:color="000000"/>
                   <w:lang w:val="fr-FR" w:eastAsia="en-US" w:bidi="ar-SA"/>
                 </w:rPr>
                 <w:t>https://github.com/arocchet/social-network/blob/main/prisma/schema.prisma</w:t>
@@ -24092,6 +24120,7 @@
                 <w:kern w:val="0"/>
                 <w:sz w:val="20"/>
                 <w:szCs w:val="22"/>
+                <w:u w:val="none" w:color="000000"/>
                 <w:lang w:val="fr-FR" w:eastAsia="en-US" w:bidi="ar-SA"/>
               </w:rPr>
               <w:t>Code — SSE messagerie temps réel :</w:t>
@@ -24109,11 +24138,12 @@
                 <w:kern w:val="0"/>
                 <w:sz w:val="20"/>
                 <w:szCs w:val="22"/>
+                <w:u w:val="none" w:color="000000"/>
                 <w:lang w:val="fr-FR" w:eastAsia="en-US" w:bidi="ar-SA"/>
               </w:rPr>
               <w:t xml:space="preserve"> </w:t>
             </w:r>
-            <w:hyperlink r:id="rId27" w:tgtFrame="_blank">
+            <w:hyperlink r:id="rId28" w:tgtFrame="_blank">
               <w:r>
                 <w:rPr>
                   <w:rStyle w:val="Hyperlink"/>
@@ -24127,6 +24157,7 @@
                   <w:kern w:val="0"/>
                   <w:sz w:val="20"/>
                   <w:szCs w:val="22"/>
+                  <w:u w:val="none" w:color="000000"/>
                   <w:lang w:val="fr-FR" w:eastAsia="en-US" w:bidi="ar-SA"/>
                 </w:rPr>
                 <w:t>https://github.com/arocchet/social-network/blob/main/src/app/api/private/chat/listen/route.ts</w:t>
@@ -24177,6 +24208,7 @@
                 <w:kern w:val="0"/>
                 <w:sz w:val="20"/>
                 <w:szCs w:val="22"/>
+                <w:u w:val="none" w:color="000000"/>
                 <w:lang w:val="fr-FR" w:eastAsia="en-US" w:bidi="ar-SA"/>
               </w:rPr>
               <w:t>Code — Dockerfile multi-stage:</w:t>
@@ -24195,11 +24227,12 @@
                 <w:kern w:val="0"/>
                 <w:sz w:val="20"/>
                 <w:szCs w:val="22"/>
+                <w:u w:val="none" w:color="000000"/>
                 <w:lang w:val="fr-FR" w:eastAsia="en-US" w:bidi="ar-SA"/>
               </w:rPr>
               <w:t xml:space="preserve"> </w:t>
             </w:r>
-            <w:hyperlink r:id="rId28" w:tgtFrame="_blank">
+            <w:hyperlink r:id="rId29" w:tgtFrame="_blank">
               <w:r>
                 <w:rPr>
                   <w:rStyle w:val="Hyperlink"/>
@@ -24213,6 +24246,7 @@
                   <w:kern w:val="0"/>
                   <w:sz w:val="20"/>
                   <w:szCs w:val="22"/>
+                  <w:u w:val="none" w:color="000000"/>
                   <w:lang w:val="fr-FR" w:eastAsia="en-US" w:bidi="ar-SA"/>
                 </w:rPr>
                 <w:t>https://github.com/arocchet/social-network/blob/main/Dockerfile</w:t>
@@ -24263,6 +24297,7 @@
                 <w:kern w:val="0"/>
                 <w:sz w:val="20"/>
                 <w:szCs w:val="22"/>
+                <w:u w:val="none" w:color="000000"/>
                 <w:lang w:val="fr-FR" w:eastAsia="en-US" w:bidi="ar-SA"/>
               </w:rPr>
               <w:t>Commit — auth login/register/middlewa</w:t>
@@ -24275,16 +24310,36 @@
                 <w:i w:val="false"/>
                 <w:caps w:val="false"/>
                 <w:smallCaps w:val="false"/>
-                <w:color w:val="F8F8F2"/>
+                <w:color w:val="000000"/>
                 <w:spacing w:val="0"/>
                 <w:kern w:val="0"/>
                 <w:sz w:val="20"/>
                 <w:szCs w:val="22"/>
-                <w:lang w:val="fr-FR" w:eastAsia="en-US" w:bidi="ar-SA"/>
-              </w:rPr>
-              <w:t xml:space="preserve">re : </w:t>
-            </w:r>
-            <w:hyperlink r:id="rId29" w:tgtFrame="_blank">
+                <w:u w:val="none" w:color="000000"/>
+                <w:lang w:val="fr-FR" w:eastAsia="en-US" w:bidi="ar-SA"/>
+              </w:rPr>
+              <w:t>r</w:t>
+            </w:r>
+            <w:r>
+              <w:rPr>
+                <w:rStyle w:val="PlaceholderText"/>
+                <w:rFonts w:eastAsia="Calibri" w:cs="" w:ascii="Carlito" w:hAnsi="Carlito"/>
+                <w:b w:val="false"/>
+                <w:i w:val="false"/>
+                <w:caps w:val="false"/>
+                <w:smallCaps w:val="false"/>
+                <w:color w:val="000000"/>
+                <w:spacing w:val="0"/>
+                <w:kern w:val="0"/>
+                <w:sz w:val="20"/>
+                <w:szCs w:val="22"/>
+                <w:u w:val="none" w:color="000000"/>
+                <w:lang w:val="fr-FR" w:eastAsia="en-US" w:bidi="ar-SA"/>
+              </w:rPr>
+              <w:t>e:</w:t>
+              <w:br/>
+            </w:r>
+            <w:hyperlink r:id="rId30" w:tgtFrame="_blank">
               <w:r>
                 <w:rPr>
                   <w:rStyle w:val="Hyperlink"/>
@@ -24298,6 +24353,7 @@
                   <w:kern w:val="0"/>
                   <w:sz w:val="20"/>
                   <w:szCs w:val="22"/>
+                  <w:u w:val="none" w:color="000000"/>
                   <w:lang w:val="fr-FR" w:eastAsia="en-US" w:bidi="ar-SA"/>
                 </w:rPr>
                 <w:t>https://github.com/arocchet/social-network/commit/f08fbee</w:t>
@@ -24348,12 +24404,13 @@
                 <w:kern w:val="0"/>
                 <w:sz w:val="20"/>
                 <w:szCs w:val="22"/>
+                <w:u w:val="none" w:color="000000"/>
                 <w:lang w:val="fr-FR" w:eastAsia="en-US" w:bidi="ar-SA"/>
               </w:rPr>
               <w:t xml:space="preserve">Commit — fix(ratelimit) : </w:t>
               <w:br/>
             </w:r>
-            <w:hyperlink r:id="rId30" w:tgtFrame="_blank">
+            <w:hyperlink r:id="rId31" w:tgtFrame="_blank">
               <w:r>
                 <w:rPr>
                   <w:rStyle w:val="Hyperlink"/>
@@ -24367,6 +24424,7 @@
                   <w:kern w:val="0"/>
                   <w:sz w:val="20"/>
                   <w:szCs w:val="22"/>
+                  <w:u w:val="none" w:color="000000"/>
                   <w:lang w:val="fr-FR" w:eastAsia="en-US" w:bidi="ar-SA"/>
                 </w:rPr>
                 <w:t>https://github.com/arocchet/social-network/commit/c27bb60</w:t>
@@ -24417,6 +24475,7 @@
                 <w:kern w:val="0"/>
                 <w:sz w:val="20"/>
                 <w:szCs w:val="22"/>
+                <w:u w:val="none" w:color="000000"/>
                 <w:lang w:val="fr-FR" w:eastAsia="en-US" w:bidi="ar-SA"/>
               </w:rPr>
               <w:t>Commit — feat reactions universelles :</w:t>
@@ -24434,11 +24493,12 @@
                 <w:kern w:val="0"/>
                 <w:sz w:val="20"/>
                 <w:szCs w:val="22"/>
+                <w:u w:val="none" w:color="000000"/>
                 <w:lang w:val="fr-FR" w:eastAsia="en-US" w:bidi="ar-SA"/>
               </w:rPr>
               <w:br/>
             </w:r>
-            <w:hyperlink r:id="rId31" w:tgtFrame="_blank">
+            <w:hyperlink r:id="rId32" w:tgtFrame="_blank">
               <w:r>
                 <w:rPr>
                   <w:rStyle w:val="Hyperlink"/>
@@ -24452,6 +24512,7 @@
                   <w:kern w:val="0"/>
                   <w:sz w:val="20"/>
                   <w:szCs w:val="22"/>
+                  <w:u w:val="none" w:color="000000"/>
                   <w:lang w:val="fr-FR" w:eastAsia="en-US" w:bidi="ar-SA"/>
                 </w:rPr>
                 <w:t>https://github.com/arocchet/social-network/commit/158d8ee</w:t>
@@ -24502,12 +24563,13 @@
                 <w:kern w:val="0"/>
                 <w:sz w:val="20"/>
                 <w:szCs w:val="22"/>
+                <w:u w:val="none" w:color="000000"/>
                 <w:lang w:val="fr-FR" w:eastAsia="en-US" w:bidi="ar-SA"/>
               </w:rPr>
               <w:t>Commit — fix real-time reactions :</w:t>
               <w:br/>
             </w:r>
-            <w:hyperlink r:id="rId32" w:tgtFrame="_blank">
+            <w:hyperlink r:id="rId33" w:tgtFrame="_blank">
               <w:r>
                 <w:rPr>
                   <w:rStyle w:val="Hyperlink"/>
@@ -24521,6 +24583,7 @@
                   <w:kern w:val="0"/>
                   <w:sz w:val="20"/>
                   <w:szCs w:val="22"/>
+                  <w:u w:val="none" w:color="000000"/>
                   <w:lang w:val="fr-FR" w:eastAsia="en-US" w:bidi="ar-SA"/>
                 </w:rPr>
                 <w:t>https://github.com/arocchet/social-network/commit/0ca9588</w:t>
@@ -24571,28 +24634,27 @@
                 <w:kern w:val="0"/>
                 <w:sz w:val="20"/>
                 <w:szCs w:val="22"/>
+                <w:u w:val="none" w:color="000000"/>
                 <w:lang w:val="fr-FR" w:eastAsia="en-US" w:bidi="ar-SA"/>
               </w:rPr>
               <w:t>Commit — build(docker) openssl Prisma :</w:t>
             </w:r>
-            <w:r>
-              <w:rPr>
-                <w:rStyle w:val="PlaceholderText"/>
-                <w:rFonts w:eastAsia="Calibri" w:cs="" w:ascii="Carlito" w:hAnsi="Carlito"/>
-                <w:b w:val="false"/>
-                <w:i w:val="false"/>
-                <w:caps w:val="false"/>
-                <w:smallCaps w:val="false"/>
-                <w:color w:val="F8F8F2"/>
-                <w:spacing w:val="0"/>
-                <w:kern w:val="0"/>
-                <w:sz w:val="20"/>
-                <w:szCs w:val="22"/>
-                <w:lang w:val="fr-FR" w:eastAsia="en-US" w:bidi="ar-SA"/>
-              </w:rPr>
-              <w:t xml:space="preserve"> </w:t>
-            </w:r>
-            <w:hyperlink r:id="rId33" w:tgtFrame="_blank">
+          </w:p>
+          <w:p>
+            <w:pPr>
+              <w:pStyle w:val="BodyText"/>
+              <w:widowControl/>
+              <w:tabs>
+                <w:tab w:val="clear" w:pos="709"/>
+                <w:tab w:val="left" w:pos="850" w:leader="none"/>
+              </w:tabs>
+              <w:suppressAutoHyphens w:val="true"/>
+              <w:spacing w:lineRule="auto" w:line="240" w:before="0" w:after="0"/>
+              <w:ind w:end="175"/>
+              <w:jc w:val="start"/>
+              <w:rPr/>
+            </w:pPr>
+            <w:hyperlink r:id="rId34" w:tgtFrame="_blank">
               <w:r>
                 <w:rPr>
                   <w:rStyle w:val="Hyperlink"/>
@@ -24601,11 +24663,14 @@
                   <w:i w:val="false"/>
                   <w:caps w:val="false"/>
                   <w:smallCaps w:val="false"/>
+                  <w:strike w:val="false"/>
+                  <w:dstrike w:val="false"/>
                   <w:color w:val="3794FF"/>
                   <w:spacing w:val="0"/>
                   <w:kern w:val="0"/>
                   <w:sz w:val="20"/>
                   <w:szCs w:val="22"/>
+                  <w:u w:val="none" w:color="000000"/>
                   <w:lang w:val="fr-FR" w:eastAsia="en-US" w:bidi="ar-SA"/>
                 </w:rPr>
                 <w:t>https://github.com/arocchet/social-network/commit/1bf7504</w:t>
@@ -24643,6 +24708,7 @@
               <w:jc w:val="start"/>
               <w:rPr>
                 <w:rFonts w:ascii="Carlito" w:hAnsi="Carlito"/>
+                <w:u w:val="none" w:color="000000"/>
               </w:rPr>
             </w:pPr>
             <w:r>
@@ -24655,6 +24721,7 @@
                 <w:color w:val="000000"/>
                 <w:spacing w:val="0"/>
                 <w:sz w:val="20"/>
+                <w:u w:val="none" w:color="000000"/>
               </w:rPr>
               <w:t>GitHub PR #73 — CLecart :</w:t>
             </w:r>
@@ -24673,15 +24740,17 @@
               <w:jc w:val="start"/>
               <w:rPr/>
             </w:pPr>
-            <w:r>
-              <w:rPr>
-                <w:rStyle w:val="Hyperlink"/>
-                <w:rFonts w:ascii="Carlito" w:hAnsi="Carlito"/>
-                <w:color w:val="3794FF"/>
-              </w:rPr>
-              <w:t>https://github.com/arocchet/social-network/pull/73</w:t>
-              <w:br/>
-            </w:r>
+            <w:hyperlink r:id="rId35">
+              <w:r>
+                <w:rPr>
+                  <w:rStyle w:val="Hyperlink"/>
+                  <w:rFonts w:ascii="Carlito" w:hAnsi="Carlito"/>
+                  <w:color w:val="3794FF"/>
+                  <w:u w:val="none" w:color="000000"/>
+                </w:rPr>
+                <w:t>https://github.com/arocchet/social-network/pull/73</w:t>
+              </w:r>
+            </w:hyperlink>
           </w:p>
         </w:tc>
       </w:tr>
@@ -24700,48 +24769,7 @@
         </w:rPr>
       </w:pPr>
       <w:r>
-        <w:rPr>
-          <w:rFonts w:cs="Calibri" w:cstheme="minorHAnsi"/>
-          <w:b/>
-          <w:smallCaps/>
-          <w:color w:themeColor="text1" w:themeTint="bf" w:val="404040"/>
-          <w:sz w:val="28"/>
-          <w:szCs w:val="28"/>
-        </w:rPr>
-      </w:r>
-    </w:p>
-    <w:p>
-      <w:pPr>
-        <w:pStyle w:val="Normal"/>
-        <w:spacing w:before="0" w:after="0"/>
-        <w:rPr>
-          <w:rFonts w:cs="Calibri" w:cstheme="minorHAnsi"/>
-          <w:color w:themeColor="text1" w:themeTint="bf" w:val="404040"/>
-        </w:rPr>
-      </w:pPr>
-      <w:r>
-        <w:rPr>
-          <w:rFonts w:cs="Calibri" w:cstheme="minorHAnsi"/>
-          <w:color w:themeColor="text1" w:themeTint="bf" w:val="404040"/>
-        </w:rPr>
-        <w:br/>
-        <w:br/>
-      </w:r>
-    </w:p>
-    <w:p>
-      <w:pPr>
-        <w:pStyle w:val="Normal"/>
-        <w:spacing w:before="0" w:after="0"/>
-        <w:rPr>
-          <w:rFonts w:cs="Calibri" w:cstheme="minorHAnsi"/>
-          <w:color w:themeColor="text1" w:themeTint="bf" w:val="404040"/>
-        </w:rPr>
-      </w:pPr>
-      <w:r>
-        <w:rPr>
-          <w:rFonts w:cs="Calibri" w:cstheme="minorHAnsi"/>
-          <w:color w:themeColor="text1" w:themeTint="bf" w:val="404040"/>
-        </w:rPr>
+        <w:rPr/>
       </w:r>
     </w:p>
     <w:tbl>
@@ -24897,7 +24925,7 @@
                 <w:lang w:val="fr-FR" w:eastAsia="en-US" w:bidi="ar-SA"/>
               </w:rPr>
               <w:drawing>
-                <wp:anchor distT="0" distB="0" distL="0" distR="0" simplePos="0" relativeHeight="128" behindDoc="0" locked="0" layoutInCell="0" allowOverlap="1">
+                <wp:anchor distT="0" distB="0" distL="0" distR="0" simplePos="0" relativeHeight="115" behindDoc="0" locked="0" layoutInCell="0" allowOverlap="1">
                   <wp:simplePos x="0" y="0"/>
                   <wp:positionH relativeFrom="margin">
                     <wp:posOffset>843915</wp:posOffset>
@@ -24922,7 +24950,7 @@
                           </pic:cNvPicPr>
                         </pic:nvPicPr>
                         <pic:blipFill>
-                          <a:blip r:embed="rId34"/>
+                          <a:blip r:embed="rId36"/>
                           <a:srcRect l="-138" t="-207" r="-138" b="-207"/>
                           <a:stretch>
                             <a:fillRect/>
@@ -24937,11 +24965,6 @@
                             <a:avLst/>
                           </a:prstGeom>
                           <a:noFill/>
-                          <a:ln>
-                            <a:solidFill>
-                              <a:srgbClr val="000000"/>
-                            </a:solidFill>
-                          </a:ln>
                         </pic:spPr>
                       </pic:pic>
                     </a:graphicData>
@@ -25451,7 +25474,7 @@
             <w:r>
               <w:rPr/>
               <w:drawing>
-                <wp:anchor distT="0" distB="0" distL="0" distR="0" simplePos="0" relativeHeight="127" behindDoc="0" locked="0" layoutInCell="0" allowOverlap="1">
+                <wp:anchor distT="0" distB="0" distL="0" distR="0" simplePos="0" relativeHeight="113" behindDoc="0" locked="0" layoutInCell="0" allowOverlap="1">
                   <wp:simplePos x="0" y="0"/>
                   <wp:positionH relativeFrom="margin">
                     <wp:posOffset>852170</wp:posOffset>
@@ -25476,7 +25499,7 @@
                           </pic:cNvPicPr>
                         </pic:nvPicPr>
                         <pic:blipFill>
-                          <a:blip r:embed="rId35"/>
+                          <a:blip r:embed="rId37"/>
                           <a:srcRect l="-92" t="-139" r="-92" b="-139"/>
                           <a:stretch>
                             <a:fillRect/>
@@ -25491,11 +25514,6 @@
                             <a:avLst/>
                           </a:prstGeom>
                           <a:noFill/>
-                          <a:ln>
-                            <a:solidFill>
-                              <a:srgbClr val="000000"/>
-                            </a:solidFill>
-                          </a:ln>
                         </pic:spPr>
                       </pic:pic>
                     </a:graphicData>
@@ -26178,6 +26196,84 @@
               </w:rPr>
             </w:pPr>
             <w:r>
+              <w:rPr/>
+            </w:r>
+          </w:p>
+          <w:p>
+            <w:pPr>
+              <w:pStyle w:val="BodyText"/>
+              <w:widowControl/>
+              <w:tabs>
+                <w:tab w:val="clear" w:pos="709"/>
+                <w:tab w:val="left" w:pos="850" w:leader="none"/>
+              </w:tabs>
+              <w:suppressAutoHyphens w:val="true"/>
+              <w:spacing w:lineRule="auto" w:line="240" w:before="0" w:after="0"/>
+              <w:ind w:end="175"/>
+              <w:jc w:val="start"/>
+              <w:rPr>
+                <w:rStyle w:val="PlaceholderText"/>
+                <w:rFonts w:ascii="Carlito" w:hAnsi="Carlito" w:eastAsia="Calibri" w:cs=""/>
+                <w:color w:val="000000"/>
+                <w:kern w:val="0"/>
+                <w:sz w:val="22"/>
+                <w:szCs w:val="22"/>
+                <w:lang w:val="fr-FR" w:eastAsia="en-US" w:bidi="ar-SA"/>
+              </w:rPr>
+            </w:pPr>
+            <w:r>
+              <w:rPr/>
+            </w:r>
+          </w:p>
+          <w:p>
+            <w:pPr>
+              <w:pStyle w:val="BodyText"/>
+              <w:widowControl/>
+              <w:tabs>
+                <w:tab w:val="clear" w:pos="709"/>
+                <w:tab w:val="left" w:pos="850" w:leader="none"/>
+              </w:tabs>
+              <w:suppressAutoHyphens w:val="true"/>
+              <w:spacing w:lineRule="auto" w:line="240" w:before="0" w:after="0"/>
+              <w:ind w:end="175"/>
+              <w:jc w:val="start"/>
+              <w:rPr>
+                <w:rStyle w:val="PlaceholderText"/>
+                <w:rFonts w:ascii="Carlito" w:hAnsi="Carlito" w:eastAsia="Calibri" w:cs=""/>
+                <w:color w:val="000000"/>
+                <w:kern w:val="0"/>
+                <w:sz w:val="22"/>
+                <w:szCs w:val="22"/>
+                <w:lang w:val="fr-FR" w:eastAsia="en-US" w:bidi="ar-SA"/>
+              </w:rPr>
+            </w:pPr>
+            <w:r>
+              <w:rPr/>
+            </w:r>
+          </w:p>
+          <w:p>
+            <w:pPr>
+              <w:pStyle w:val="BodyText"/>
+              <w:widowControl/>
+              <w:tabs>
+                <w:tab w:val="clear" w:pos="709"/>
+                <w:tab w:val="left" w:pos="850" w:leader="none"/>
+              </w:tabs>
+              <w:suppressAutoHyphens w:val="true"/>
+              <w:spacing w:lineRule="auto" w:line="240" w:before="0" w:after="0"/>
+              <w:ind w:end="175"/>
+              <w:jc w:val="start"/>
+              <w:rPr>
+                <w:rStyle w:val="PlaceholderText"/>
+                <w:rFonts w:ascii="Carlito" w:hAnsi="Carlito" w:eastAsia="Calibri" w:cs=""/>
+                <w:color w:val="000000"/>
+                <w:kern w:val="0"/>
+                <w:sz w:val="22"/>
+                <w:szCs w:val="22"/>
+                <w:lang w:val="fr-FR" w:eastAsia="en-US" w:bidi="ar-SA"/>
+              </w:rPr>
+            </w:pPr>
+            <w:r>
               <w:rPr>
                 <w:rStyle w:val="PlaceholderText"/>
                 <w:rFonts w:eastAsia="Calibri" w:cs="" w:ascii="Carlito" w:hAnsi="Carlito"/>
@@ -26265,26 +26361,7 @@
                 <w:shd w:fill="FFFFFF" w:val="clear"/>
                 <w:lang w:val="fr-FR" w:eastAsia="en-US" w:bidi="ar-SA"/>
               </w:rPr>
-              <w:t>MCD (Modèle Conceptuel de Données</w:t>
-            </w:r>
-            <w:r>
-              <w:rPr>
-                <w:rStyle w:val="SourceText"/>
-                <w:rFonts w:ascii="monospace" w:hAnsi="monospace"/>
-                <w:b/>
-                <w:bCs/>
-                <w:i w:val="false"/>
-                <w:caps w:val="false"/>
-                <w:smallCaps w:val="false"/>
-                <w:color w:val="000000"/>
-                <w:spacing w:val="0"/>
-                <w:kern w:val="0"/>
-                <w:sz w:val="19"/>
-                <w:szCs w:val="19"/>
-                <w:shd w:fill="FFFFFF" w:val="clear"/>
-                <w:lang w:val="fr-FR" w:eastAsia="en-US" w:bidi="ar-SA"/>
-              </w:rPr>
-              <w:t>)</w:t>
+              <w:t>MCD (Modèle Conceptuel de Données)</w:t>
             </w:r>
             <w:r>
               <w:rPr>
@@ -26363,9 +26440,9 @@
                 <w:lang w:val="fr-FR" w:eastAsia="en-US" w:bidi="ar-SA"/>
               </w:rPr>
               <w:drawing>
-                <wp:anchor distT="0" distB="0" distL="0" distR="0" simplePos="0" relativeHeight="129" behindDoc="0" locked="0" layoutInCell="0" allowOverlap="1">
+                <wp:anchor distT="0" distB="0" distL="0" distR="0" simplePos="0" relativeHeight="127" behindDoc="0" locked="0" layoutInCell="0" allowOverlap="1">
                   <wp:simplePos x="0" y="0"/>
-                  <wp:positionH relativeFrom="column">
+                  <wp:positionH relativeFrom="margin">
                     <wp:align>center</wp:align>
                   </wp:positionH>
                   <wp:positionV relativeFrom="paragraph">
@@ -26388,7 +26465,7 @@
                           </pic:cNvPicPr>
                         </pic:nvPicPr>
                         <pic:blipFill>
-                          <a:blip r:embed="rId36"/>
+                          <a:blip r:embed="rId38"/>
                           <a:stretch>
                             <a:fillRect/>
                           </a:stretch>
@@ -26541,185 +26618,24 @@
                 <w:shd w:fill="FFFFFF" w:val="clear"/>
                 <w:lang w:val="fr-FR" w:eastAsia="en-US" w:bidi="ar-SA"/>
               </w:rPr>
-              <w:t>M</w:t>
-            </w:r>
-            <w:r>
-              <w:rPr>
-                <w:rStyle w:val="SourceText"/>
-                <w:rFonts w:ascii="monospace" w:hAnsi="monospace"/>
+              <w:t>MLD (Modèle Logique de Données)</w:t>
+            </w:r>
+            <w:r>
+              <w:rPr>
+                <w:rStyle w:val="PlaceholderText"/>
+                <w:rFonts w:eastAsia="Calibri" w:cs="" w:ascii="Carlito" w:hAnsi="Carlito"/>
                 <w:b/>
                 <w:bCs/>
-                <w:i w:val="false"/>
-                <w:caps w:val="false"/>
-                <w:smallCaps w:val="false"/>
                 <w:color w:val="000000"/>
-                <w:spacing w:val="0"/>
                 <w:kern w:val="0"/>
                 <w:sz w:val="19"/>
                 <w:szCs w:val="19"/>
-                <w:shd w:fill="FFFFFF" w:val="clear"/>
-                <w:lang w:val="fr-FR" w:eastAsia="en-US" w:bidi="ar-SA"/>
-              </w:rPr>
-              <w:t>L</w:t>
-            </w:r>
-            <w:r>
-              <w:rPr>
-                <w:rStyle w:val="SourceText"/>
-                <w:rFonts w:ascii="monospace" w:hAnsi="monospace"/>
-                <w:b/>
-                <w:bCs/>
-                <w:i w:val="false"/>
-                <w:caps w:val="false"/>
-                <w:smallCaps w:val="false"/>
-                <w:color w:val="000000"/>
-                <w:spacing w:val="0"/>
-                <w:kern w:val="0"/>
-                <w:sz w:val="19"/>
-                <w:szCs w:val="19"/>
-                <w:shd w:fill="FFFFFF" w:val="clear"/>
-                <w:lang w:val="fr-FR" w:eastAsia="en-US" w:bidi="ar-SA"/>
-              </w:rPr>
-              <w:t>D</w:t>
-            </w:r>
-            <w:r>
-              <w:rPr>
-                <w:rStyle w:val="SourceText"/>
-                <w:rFonts w:ascii="monospace" w:hAnsi="monospace"/>
-                <w:b/>
-                <w:bCs/>
-                <w:i w:val="false"/>
-                <w:caps w:val="false"/>
-                <w:smallCaps w:val="false"/>
-                <w:color w:val="000000"/>
-                <w:spacing w:val="0"/>
-                <w:kern w:val="0"/>
-                <w:sz w:val="19"/>
-                <w:szCs w:val="19"/>
-                <w:shd w:fill="FFFFFF" w:val="clear"/>
-                <w:lang w:val="fr-FR" w:eastAsia="en-US" w:bidi="ar-SA"/>
-              </w:rPr>
-              <w:t xml:space="preserve"> (Modèle </w:t>
-            </w:r>
-            <w:r>
-              <w:rPr>
-                <w:rStyle w:val="SourceText"/>
-                <w:rFonts w:ascii="monospace" w:hAnsi="monospace"/>
-                <w:b/>
-                <w:bCs/>
-                <w:i w:val="false"/>
-                <w:caps w:val="false"/>
-                <w:smallCaps w:val="false"/>
-                <w:color w:val="000000"/>
-                <w:spacing w:val="0"/>
-                <w:kern w:val="0"/>
-                <w:sz w:val="19"/>
-                <w:szCs w:val="19"/>
-                <w:shd w:fill="FFFFFF" w:val="clear"/>
-                <w:lang w:val="fr-FR" w:eastAsia="en-US" w:bidi="ar-SA"/>
-              </w:rPr>
-              <w:t>L</w:t>
-            </w:r>
-            <w:r>
-              <w:rPr>
-                <w:rStyle w:val="SourceText"/>
-                <w:rFonts w:ascii="monospace" w:hAnsi="monospace"/>
-                <w:b/>
-                <w:bCs/>
-                <w:i w:val="false"/>
-                <w:caps w:val="false"/>
-                <w:smallCaps w:val="false"/>
-                <w:color w:val="000000"/>
-                <w:spacing w:val="0"/>
-                <w:kern w:val="0"/>
-                <w:sz w:val="19"/>
-                <w:szCs w:val="19"/>
-                <w:shd w:fill="FFFFFF" w:val="clear"/>
-                <w:lang w:val="fr-FR" w:eastAsia="en-US" w:bidi="ar-SA"/>
-              </w:rPr>
-              <w:t>o</w:t>
-            </w:r>
-            <w:r>
-              <w:rPr>
-                <w:rStyle w:val="SourceText"/>
-                <w:rFonts w:ascii="monospace" w:hAnsi="monospace"/>
-                <w:b/>
-                <w:bCs/>
-                <w:i w:val="false"/>
-                <w:caps w:val="false"/>
-                <w:smallCaps w:val="false"/>
-                <w:color w:val="000000"/>
-                <w:spacing w:val="0"/>
-                <w:kern w:val="0"/>
-                <w:sz w:val="19"/>
-                <w:szCs w:val="19"/>
-                <w:shd w:fill="FFFFFF" w:val="clear"/>
-                <w:lang w:val="fr-FR" w:eastAsia="en-US" w:bidi="ar-SA"/>
-              </w:rPr>
-              <w:t>gique</w:t>
-            </w:r>
-            <w:r>
-              <w:rPr>
-                <w:rStyle w:val="SourceText"/>
-                <w:rFonts w:ascii="monospace" w:hAnsi="monospace"/>
-                <w:b/>
-                <w:bCs/>
-                <w:i w:val="false"/>
-                <w:caps w:val="false"/>
-                <w:smallCaps w:val="false"/>
-                <w:color w:val="000000"/>
-                <w:spacing w:val="0"/>
-                <w:kern w:val="0"/>
-                <w:sz w:val="19"/>
-                <w:szCs w:val="19"/>
-                <w:shd w:fill="FFFFFF" w:val="clear"/>
-                <w:lang w:val="fr-FR" w:eastAsia="en-US" w:bidi="ar-SA"/>
-              </w:rPr>
-              <w:t xml:space="preserve"> de Données</w:t>
-            </w:r>
-            <w:r>
-              <w:rPr>
-                <w:rStyle w:val="SourceText"/>
-                <w:rFonts w:ascii="monospace" w:hAnsi="monospace"/>
-                <w:b/>
-                <w:bCs/>
-                <w:i w:val="false"/>
-                <w:caps w:val="false"/>
-                <w:smallCaps w:val="false"/>
-                <w:color w:val="000000"/>
-                <w:spacing w:val="0"/>
-                <w:kern w:val="0"/>
-                <w:sz w:val="19"/>
-                <w:szCs w:val="19"/>
-                <w:shd w:fill="FFFFFF" w:val="clear"/>
-                <w:lang w:val="fr-FR" w:eastAsia="en-US" w:bidi="ar-SA"/>
-              </w:rPr>
-              <w:t>)</w:t>
-            </w:r>
-            <w:r>
-              <w:rPr>
-                <w:rStyle w:val="PlaceholderText"/>
-                <w:rFonts w:eastAsia="Calibri" w:cs="" w:ascii="Carlito" w:hAnsi="Carlito"/>
-                <w:b/>
-                <w:bCs/>
-                <w:color w:val="000000"/>
-                <w:kern w:val="0"/>
-                <w:sz w:val="19"/>
-                <w:szCs w:val="19"/>
-                <w:lang w:val="fr-FR" w:eastAsia="en-US" w:bidi="ar-SA"/>
-              </w:rPr>
-              <w:t>:</w:t>
-              <w:br/>
-              <w:br/>
-              <w:br/>
-              <w:br/>
-              <w:br/>
-              <w:br/>
-            </w:r>
-            <w:r>
+                <w:lang w:val="fr-FR" w:eastAsia="en-US" w:bidi="ar-SA"/>
+              </w:rPr>
               <w:drawing>
-                <wp:anchor distT="0" distB="0" distL="0" distR="0" simplePos="0" relativeHeight="130" behindDoc="0" locked="0" layoutInCell="0" allowOverlap="1">
+                <wp:anchor distT="0" distB="0" distL="0" distR="0" simplePos="0" relativeHeight="116" behindDoc="0" locked="0" layoutInCell="0" allowOverlap="1">
                   <wp:simplePos x="0" y="0"/>
-                  <wp:positionH relativeFrom="column">
+                  <wp:positionH relativeFrom="margin">
                     <wp:posOffset>55880</wp:posOffset>
                   </wp:positionH>
                   <wp:positionV relativeFrom="paragraph">
@@ -26742,7 +26658,7 @@
                           </pic:cNvPicPr>
                         </pic:nvPicPr>
                         <pic:blipFill>
-                          <a:blip r:embed="rId37"/>
+                          <a:blip r:embed="rId39"/>
                           <a:stretch>
                             <a:fillRect/>
                           </a:stretch>
@@ -26775,11 +26691,733 @@
                 <w:szCs w:val="19"/>
                 <w:lang w:val="fr-FR" w:eastAsia="en-US" w:bidi="ar-SA"/>
               </w:rPr>
-              <w:br/>
-              <w:br/>
-              <w:br/>
-              <w:br/>
-            </w:r>
+              <w:t>:</w:t>
+            </w:r>
+          </w:p>
+          <w:p>
+            <w:pPr>
+              <w:pStyle w:val="BodyText"/>
+              <w:widowControl/>
+              <w:tabs>
+                <w:tab w:val="clear" w:pos="709"/>
+                <w:tab w:val="left" w:pos="850" w:leader="none"/>
+              </w:tabs>
+              <w:suppressAutoHyphens w:val="true"/>
+              <w:spacing w:lineRule="auto" w:line="240" w:before="0" w:after="0"/>
+              <w:ind w:end="175"/>
+              <w:jc w:val="start"/>
+              <w:rPr>
+                <w:rStyle w:val="PlaceholderText"/>
+                <w:rFonts w:ascii="Carlito" w:hAnsi="Carlito" w:eastAsia="Calibri" w:cs=""/>
+                <w:color w:val="000000"/>
+                <w:kern w:val="0"/>
+                <w:sz w:val="22"/>
+                <w:szCs w:val="22"/>
+                <w:lang w:val="fr-FR" w:eastAsia="en-US" w:bidi="ar-SA"/>
+              </w:rPr>
+            </w:pPr>
+            <w:r>
+              <w:rPr/>
+            </w:r>
+          </w:p>
+          <w:p>
+            <w:pPr>
+              <w:pStyle w:val="BodyText"/>
+              <w:widowControl/>
+              <w:tabs>
+                <w:tab w:val="clear" w:pos="709"/>
+                <w:tab w:val="left" w:pos="850" w:leader="none"/>
+              </w:tabs>
+              <w:suppressAutoHyphens w:val="true"/>
+              <w:spacing w:lineRule="auto" w:line="240" w:before="0" w:after="0"/>
+              <w:ind w:end="175"/>
+              <w:jc w:val="start"/>
+              <w:rPr>
+                <w:rStyle w:val="PlaceholderText"/>
+                <w:rFonts w:ascii="Carlito" w:hAnsi="Carlito" w:eastAsia="Calibri" w:cs=""/>
+                <w:color w:val="000000"/>
+                <w:kern w:val="0"/>
+                <w:sz w:val="22"/>
+                <w:szCs w:val="22"/>
+                <w:lang w:val="fr-FR" w:eastAsia="en-US" w:bidi="ar-SA"/>
+              </w:rPr>
+            </w:pPr>
+            <w:r>
+              <w:rPr/>
+            </w:r>
+          </w:p>
+          <w:p>
+            <w:pPr>
+              <w:pStyle w:val="BodyText"/>
+              <w:widowControl/>
+              <w:tabs>
+                <w:tab w:val="clear" w:pos="709"/>
+                <w:tab w:val="left" w:pos="850" w:leader="none"/>
+              </w:tabs>
+              <w:suppressAutoHyphens w:val="true"/>
+              <w:spacing w:lineRule="auto" w:line="240" w:before="0" w:after="0"/>
+              <w:ind w:end="175"/>
+              <w:jc w:val="start"/>
+              <w:rPr>
+                <w:rStyle w:val="PlaceholderText"/>
+                <w:rFonts w:ascii="Carlito" w:hAnsi="Carlito" w:eastAsia="Calibri" w:cs=""/>
+                <w:color w:val="000000"/>
+                <w:kern w:val="0"/>
+                <w:sz w:val="22"/>
+                <w:szCs w:val="22"/>
+                <w:lang w:val="fr-FR" w:eastAsia="en-US" w:bidi="ar-SA"/>
+              </w:rPr>
+            </w:pPr>
+            <w:r>
+              <w:rPr/>
+            </w:r>
+          </w:p>
+          <w:p>
+            <w:pPr>
+              <w:pStyle w:val="BodyText"/>
+              <w:widowControl/>
+              <w:tabs>
+                <w:tab w:val="clear" w:pos="709"/>
+                <w:tab w:val="left" w:pos="850" w:leader="none"/>
+              </w:tabs>
+              <w:suppressAutoHyphens w:val="true"/>
+              <w:spacing w:lineRule="auto" w:line="240" w:before="0" w:after="0"/>
+              <w:ind w:end="175"/>
+              <w:jc w:val="start"/>
+              <w:rPr>
+                <w:rStyle w:val="PlaceholderText"/>
+                <w:rFonts w:ascii="Carlito" w:hAnsi="Carlito" w:eastAsia="Calibri" w:cs=""/>
+                <w:color w:val="000000"/>
+                <w:kern w:val="0"/>
+                <w:sz w:val="22"/>
+                <w:szCs w:val="22"/>
+                <w:lang w:val="fr-FR" w:eastAsia="en-US" w:bidi="ar-SA"/>
+              </w:rPr>
+            </w:pPr>
+            <w:r>
+              <w:rPr/>
+            </w:r>
+          </w:p>
+          <w:p>
+            <w:pPr>
+              <w:pStyle w:val="BodyText"/>
+              <w:widowControl/>
+              <w:tabs>
+                <w:tab w:val="clear" w:pos="709"/>
+                <w:tab w:val="left" w:pos="850" w:leader="none"/>
+              </w:tabs>
+              <w:suppressAutoHyphens w:val="true"/>
+              <w:spacing w:lineRule="auto" w:line="240" w:before="0" w:after="0"/>
+              <w:ind w:end="175"/>
+              <w:jc w:val="start"/>
+              <w:rPr>
+                <w:rStyle w:val="PlaceholderText"/>
+                <w:rFonts w:ascii="Carlito" w:hAnsi="Carlito" w:eastAsia="Calibri" w:cs=""/>
+                <w:color w:val="000000"/>
+                <w:kern w:val="0"/>
+                <w:sz w:val="22"/>
+                <w:szCs w:val="22"/>
+                <w:lang w:val="fr-FR" w:eastAsia="en-US" w:bidi="ar-SA"/>
+              </w:rPr>
+            </w:pPr>
+            <w:r>
+              <w:rPr/>
+            </w:r>
+          </w:p>
+          <w:p>
+            <w:pPr>
+              <w:pStyle w:val="BodyText"/>
+              <w:widowControl/>
+              <w:tabs>
+                <w:tab w:val="clear" w:pos="709"/>
+                <w:tab w:val="left" w:pos="850" w:leader="none"/>
+              </w:tabs>
+              <w:suppressAutoHyphens w:val="true"/>
+              <w:spacing w:lineRule="auto" w:line="240" w:before="0" w:after="0"/>
+              <w:ind w:end="175"/>
+              <w:jc w:val="start"/>
+              <w:rPr>
+                <w:rStyle w:val="PlaceholderText"/>
+                <w:rFonts w:ascii="Carlito" w:hAnsi="Carlito" w:eastAsia="Calibri" w:cs=""/>
+                <w:color w:val="000000"/>
+                <w:kern w:val="0"/>
+                <w:sz w:val="22"/>
+                <w:szCs w:val="22"/>
+                <w:lang w:val="fr-FR" w:eastAsia="en-US" w:bidi="ar-SA"/>
+              </w:rPr>
+            </w:pPr>
+            <w:r>
+              <w:rPr/>
+            </w:r>
+          </w:p>
+          <w:p>
+            <w:pPr>
+              <w:pStyle w:val="BodyText"/>
+              <w:widowControl/>
+              <w:tabs>
+                <w:tab w:val="clear" w:pos="709"/>
+                <w:tab w:val="left" w:pos="850" w:leader="none"/>
+              </w:tabs>
+              <w:suppressAutoHyphens w:val="true"/>
+              <w:spacing w:lineRule="auto" w:line="240" w:before="0" w:after="0"/>
+              <w:ind w:end="175"/>
+              <w:jc w:val="start"/>
+              <w:rPr>
+                <w:rStyle w:val="PlaceholderText"/>
+                <w:rFonts w:ascii="Carlito" w:hAnsi="Carlito" w:eastAsia="Calibri" w:cs=""/>
+                <w:color w:val="000000"/>
+                <w:kern w:val="0"/>
+                <w:sz w:val="22"/>
+                <w:szCs w:val="22"/>
+                <w:lang w:val="fr-FR" w:eastAsia="en-US" w:bidi="ar-SA"/>
+              </w:rPr>
+            </w:pPr>
+            <w:r>
+              <w:rPr/>
+            </w:r>
+          </w:p>
+          <w:p>
+            <w:pPr>
+              <w:pStyle w:val="BodyText"/>
+              <w:widowControl/>
+              <w:tabs>
+                <w:tab w:val="clear" w:pos="709"/>
+                <w:tab w:val="left" w:pos="850" w:leader="none"/>
+              </w:tabs>
+              <w:suppressAutoHyphens w:val="true"/>
+              <w:spacing w:lineRule="auto" w:line="240" w:before="0" w:after="0"/>
+              <w:ind w:end="175"/>
+              <w:jc w:val="start"/>
+              <w:rPr>
+                <w:rStyle w:val="PlaceholderText"/>
+                <w:rFonts w:ascii="Carlito" w:hAnsi="Carlito" w:eastAsia="Calibri" w:cs=""/>
+                <w:color w:val="000000"/>
+                <w:kern w:val="0"/>
+                <w:sz w:val="22"/>
+                <w:szCs w:val="22"/>
+                <w:lang w:val="fr-FR" w:eastAsia="en-US" w:bidi="ar-SA"/>
+              </w:rPr>
+            </w:pPr>
+            <w:r>
+              <w:rPr/>
+            </w:r>
+          </w:p>
+          <w:p>
+            <w:pPr>
+              <w:pStyle w:val="BodyText"/>
+              <w:widowControl/>
+              <w:tabs>
+                <w:tab w:val="clear" w:pos="709"/>
+                <w:tab w:val="left" w:pos="850" w:leader="none"/>
+              </w:tabs>
+              <w:suppressAutoHyphens w:val="true"/>
+              <w:spacing w:lineRule="auto" w:line="240" w:before="0" w:after="0"/>
+              <w:ind w:end="175"/>
+              <w:jc w:val="start"/>
+              <w:rPr>
+                <w:rStyle w:val="PlaceholderText"/>
+                <w:rFonts w:ascii="Carlito" w:hAnsi="Carlito" w:eastAsia="Calibri" w:cs=""/>
+                <w:color w:val="000000"/>
+                <w:kern w:val="0"/>
+                <w:sz w:val="22"/>
+                <w:szCs w:val="22"/>
+                <w:lang w:val="fr-FR" w:eastAsia="en-US" w:bidi="ar-SA"/>
+              </w:rPr>
+            </w:pPr>
+            <w:r>
+              <w:rPr/>
+            </w:r>
+          </w:p>
+          <w:p>
+            <w:pPr>
+              <w:pStyle w:val="BodyText"/>
+              <w:widowControl/>
+              <w:tabs>
+                <w:tab w:val="clear" w:pos="709"/>
+                <w:tab w:val="left" w:pos="850" w:leader="none"/>
+              </w:tabs>
+              <w:suppressAutoHyphens w:val="true"/>
+              <w:spacing w:lineRule="auto" w:line="240" w:before="0" w:after="0"/>
+              <w:ind w:end="175"/>
+              <w:jc w:val="start"/>
+              <w:rPr>
+                <w:rStyle w:val="PlaceholderText"/>
+                <w:rFonts w:ascii="Carlito" w:hAnsi="Carlito" w:eastAsia="Calibri" w:cs=""/>
+                <w:color w:val="000000"/>
+                <w:kern w:val="0"/>
+                <w:sz w:val="22"/>
+                <w:szCs w:val="22"/>
+                <w:lang w:val="fr-FR" w:eastAsia="en-US" w:bidi="ar-SA"/>
+              </w:rPr>
+            </w:pPr>
+            <w:r>
+              <w:rPr/>
+            </w:r>
+          </w:p>
+          <w:p>
+            <w:pPr>
+              <w:pStyle w:val="BodyText"/>
+              <w:widowControl/>
+              <w:tabs>
+                <w:tab w:val="clear" w:pos="709"/>
+                <w:tab w:val="left" w:pos="850" w:leader="none"/>
+              </w:tabs>
+              <w:suppressAutoHyphens w:val="true"/>
+              <w:spacing w:lineRule="auto" w:line="240" w:before="0" w:after="0"/>
+              <w:ind w:end="175"/>
+              <w:jc w:val="start"/>
+              <w:rPr>
+                <w:rStyle w:val="PlaceholderText"/>
+                <w:rFonts w:ascii="Carlito" w:hAnsi="Carlito" w:eastAsia="Calibri" w:cs=""/>
+                <w:color w:val="000000"/>
+                <w:kern w:val="0"/>
+                <w:sz w:val="22"/>
+                <w:szCs w:val="22"/>
+                <w:lang w:val="fr-FR" w:eastAsia="en-US" w:bidi="ar-SA"/>
+              </w:rPr>
+            </w:pPr>
+            <w:r>
+              <w:rPr/>
+            </w:r>
+          </w:p>
+          <w:p>
+            <w:pPr>
+              <w:pStyle w:val="BodyText"/>
+              <w:widowControl/>
+              <w:tabs>
+                <w:tab w:val="clear" w:pos="709"/>
+                <w:tab w:val="left" w:pos="850" w:leader="none"/>
+              </w:tabs>
+              <w:suppressAutoHyphens w:val="true"/>
+              <w:spacing w:lineRule="auto" w:line="240" w:before="0" w:after="0"/>
+              <w:ind w:end="175"/>
+              <w:jc w:val="start"/>
+              <w:rPr>
+                <w:rStyle w:val="PlaceholderText"/>
+                <w:rFonts w:ascii="Carlito" w:hAnsi="Carlito" w:eastAsia="Calibri" w:cs=""/>
+                <w:color w:val="000000"/>
+                <w:kern w:val="0"/>
+                <w:sz w:val="22"/>
+                <w:szCs w:val="22"/>
+                <w:lang w:val="fr-FR" w:eastAsia="en-US" w:bidi="ar-SA"/>
+              </w:rPr>
+            </w:pPr>
+            <w:r>
+              <w:rPr/>
+            </w:r>
+          </w:p>
+          <w:p>
+            <w:pPr>
+              <w:pStyle w:val="BodyText"/>
+              <w:widowControl/>
+              <w:tabs>
+                <w:tab w:val="clear" w:pos="709"/>
+                <w:tab w:val="left" w:pos="850" w:leader="none"/>
+              </w:tabs>
+              <w:suppressAutoHyphens w:val="true"/>
+              <w:spacing w:lineRule="auto" w:line="240" w:before="0" w:after="0"/>
+              <w:ind w:end="175"/>
+              <w:jc w:val="start"/>
+              <w:rPr>
+                <w:rStyle w:val="PlaceholderText"/>
+                <w:rFonts w:ascii="Carlito" w:hAnsi="Carlito" w:eastAsia="Calibri" w:cs=""/>
+                <w:color w:val="000000"/>
+                <w:kern w:val="0"/>
+                <w:sz w:val="22"/>
+                <w:szCs w:val="22"/>
+                <w:lang w:val="fr-FR" w:eastAsia="en-US" w:bidi="ar-SA"/>
+              </w:rPr>
+            </w:pPr>
+            <w:r>
+              <w:rPr/>
+            </w:r>
+          </w:p>
+          <w:p>
+            <w:pPr>
+              <w:pStyle w:val="BodyText"/>
+              <w:widowControl/>
+              <w:tabs>
+                <w:tab w:val="clear" w:pos="709"/>
+                <w:tab w:val="left" w:pos="850" w:leader="none"/>
+              </w:tabs>
+              <w:suppressAutoHyphens w:val="true"/>
+              <w:spacing w:lineRule="auto" w:line="240" w:before="0" w:after="0"/>
+              <w:ind w:end="175"/>
+              <w:jc w:val="start"/>
+              <w:rPr>
+                <w:rStyle w:val="PlaceholderText"/>
+                <w:rFonts w:ascii="Carlito" w:hAnsi="Carlito" w:eastAsia="Calibri" w:cs=""/>
+                <w:color w:val="000000"/>
+                <w:kern w:val="0"/>
+                <w:sz w:val="22"/>
+                <w:szCs w:val="22"/>
+                <w:lang w:val="fr-FR" w:eastAsia="en-US" w:bidi="ar-SA"/>
+              </w:rPr>
+            </w:pPr>
+            <w:r>
+              <w:rPr/>
+            </w:r>
+          </w:p>
+          <w:p>
+            <w:pPr>
+              <w:pStyle w:val="BodyText"/>
+              <w:widowControl/>
+              <w:tabs>
+                <w:tab w:val="clear" w:pos="709"/>
+                <w:tab w:val="left" w:pos="850" w:leader="none"/>
+              </w:tabs>
+              <w:suppressAutoHyphens w:val="true"/>
+              <w:spacing w:lineRule="auto" w:line="240" w:before="0" w:after="0"/>
+              <w:ind w:end="175"/>
+              <w:jc w:val="start"/>
+              <w:rPr>
+                <w:rStyle w:val="PlaceholderText"/>
+                <w:rFonts w:ascii="Carlito" w:hAnsi="Carlito" w:eastAsia="Calibri" w:cs=""/>
+                <w:color w:val="000000"/>
+                <w:kern w:val="0"/>
+                <w:sz w:val="22"/>
+                <w:szCs w:val="22"/>
+                <w:lang w:val="fr-FR" w:eastAsia="en-US" w:bidi="ar-SA"/>
+              </w:rPr>
+            </w:pPr>
+            <w:r>
+              <w:rPr/>
+            </w:r>
+          </w:p>
+          <w:p>
+            <w:pPr>
+              <w:pStyle w:val="BodyText"/>
+              <w:widowControl/>
+              <w:tabs>
+                <w:tab w:val="clear" w:pos="709"/>
+                <w:tab w:val="left" w:pos="850" w:leader="none"/>
+              </w:tabs>
+              <w:suppressAutoHyphens w:val="true"/>
+              <w:spacing w:lineRule="auto" w:line="240" w:before="0" w:after="0"/>
+              <w:ind w:end="175"/>
+              <w:jc w:val="start"/>
+              <w:rPr>
+                <w:rStyle w:val="PlaceholderText"/>
+                <w:rFonts w:ascii="Carlito" w:hAnsi="Carlito" w:eastAsia="Calibri" w:cs=""/>
+                <w:color w:val="000000"/>
+                <w:kern w:val="0"/>
+                <w:sz w:val="22"/>
+                <w:szCs w:val="22"/>
+                <w:lang w:val="fr-FR" w:eastAsia="en-US" w:bidi="ar-SA"/>
+              </w:rPr>
+            </w:pPr>
+            <w:r>
+              <w:rPr/>
+            </w:r>
+          </w:p>
+          <w:p>
+            <w:pPr>
+              <w:pStyle w:val="BodyText"/>
+              <w:widowControl/>
+              <w:tabs>
+                <w:tab w:val="clear" w:pos="709"/>
+                <w:tab w:val="left" w:pos="850" w:leader="none"/>
+              </w:tabs>
+              <w:suppressAutoHyphens w:val="true"/>
+              <w:spacing w:lineRule="auto" w:line="240" w:before="0" w:after="0"/>
+              <w:ind w:end="175"/>
+              <w:jc w:val="start"/>
+              <w:rPr>
+                <w:rStyle w:val="PlaceholderText"/>
+                <w:rFonts w:ascii="Carlito" w:hAnsi="Carlito" w:eastAsia="Calibri" w:cs=""/>
+                <w:color w:val="000000"/>
+                <w:kern w:val="0"/>
+                <w:sz w:val="22"/>
+                <w:szCs w:val="22"/>
+                <w:lang w:val="fr-FR" w:eastAsia="en-US" w:bidi="ar-SA"/>
+              </w:rPr>
+            </w:pPr>
+            <w:r>
+              <w:rPr/>
+            </w:r>
+          </w:p>
+          <w:p>
+            <w:pPr>
+              <w:pStyle w:val="BodyText"/>
+              <w:widowControl/>
+              <w:tabs>
+                <w:tab w:val="clear" w:pos="709"/>
+                <w:tab w:val="left" w:pos="850" w:leader="none"/>
+              </w:tabs>
+              <w:suppressAutoHyphens w:val="true"/>
+              <w:spacing w:lineRule="auto" w:line="240" w:before="0" w:after="0"/>
+              <w:ind w:end="175"/>
+              <w:jc w:val="start"/>
+              <w:rPr>
+                <w:rStyle w:val="PlaceholderText"/>
+                <w:rFonts w:ascii="Carlito" w:hAnsi="Carlito" w:eastAsia="Calibri" w:cs=""/>
+                <w:color w:val="000000"/>
+                <w:kern w:val="0"/>
+                <w:sz w:val="22"/>
+                <w:szCs w:val="22"/>
+                <w:lang w:val="fr-FR" w:eastAsia="en-US" w:bidi="ar-SA"/>
+              </w:rPr>
+            </w:pPr>
+            <w:r>
+              <w:rPr/>
+            </w:r>
+          </w:p>
+          <w:p>
+            <w:pPr>
+              <w:pStyle w:val="BodyText"/>
+              <w:widowControl/>
+              <w:tabs>
+                <w:tab w:val="clear" w:pos="709"/>
+                <w:tab w:val="left" w:pos="850" w:leader="none"/>
+              </w:tabs>
+              <w:suppressAutoHyphens w:val="true"/>
+              <w:spacing w:lineRule="auto" w:line="240" w:before="0" w:after="0"/>
+              <w:ind w:end="175"/>
+              <w:jc w:val="start"/>
+              <w:rPr>
+                <w:rStyle w:val="PlaceholderText"/>
+                <w:rFonts w:ascii="Carlito" w:hAnsi="Carlito" w:eastAsia="Calibri" w:cs=""/>
+                <w:color w:val="000000"/>
+                <w:kern w:val="0"/>
+                <w:sz w:val="22"/>
+                <w:szCs w:val="22"/>
+                <w:lang w:val="fr-FR" w:eastAsia="en-US" w:bidi="ar-SA"/>
+              </w:rPr>
+            </w:pPr>
+            <w:r>
+              <w:rPr/>
+            </w:r>
+          </w:p>
+          <w:p>
+            <w:pPr>
+              <w:pStyle w:val="BodyText"/>
+              <w:widowControl/>
+              <w:tabs>
+                <w:tab w:val="clear" w:pos="709"/>
+                <w:tab w:val="left" w:pos="850" w:leader="none"/>
+              </w:tabs>
+              <w:suppressAutoHyphens w:val="true"/>
+              <w:spacing w:lineRule="auto" w:line="240" w:before="0" w:after="0"/>
+              <w:ind w:end="175"/>
+              <w:jc w:val="start"/>
+              <w:rPr>
+                <w:rStyle w:val="PlaceholderText"/>
+                <w:rFonts w:ascii="Carlito" w:hAnsi="Carlito" w:eastAsia="Calibri" w:cs=""/>
+                <w:color w:val="000000"/>
+                <w:kern w:val="0"/>
+                <w:sz w:val="22"/>
+                <w:szCs w:val="22"/>
+                <w:lang w:val="fr-FR" w:eastAsia="en-US" w:bidi="ar-SA"/>
+              </w:rPr>
+            </w:pPr>
+            <w:r>
+              <w:rPr/>
+            </w:r>
+          </w:p>
+          <w:p>
+            <w:pPr>
+              <w:pStyle w:val="BodyText"/>
+              <w:widowControl/>
+              <w:tabs>
+                <w:tab w:val="clear" w:pos="709"/>
+                <w:tab w:val="left" w:pos="850" w:leader="none"/>
+              </w:tabs>
+              <w:suppressAutoHyphens w:val="true"/>
+              <w:spacing w:lineRule="auto" w:line="240" w:before="0" w:after="0"/>
+              <w:ind w:end="175"/>
+              <w:jc w:val="start"/>
+              <w:rPr>
+                <w:rStyle w:val="PlaceholderText"/>
+                <w:rFonts w:ascii="Carlito" w:hAnsi="Carlito" w:eastAsia="Calibri" w:cs=""/>
+                <w:color w:val="000000"/>
+                <w:kern w:val="0"/>
+                <w:sz w:val="22"/>
+                <w:szCs w:val="22"/>
+                <w:lang w:val="fr-FR" w:eastAsia="en-US" w:bidi="ar-SA"/>
+              </w:rPr>
+            </w:pPr>
+            <w:r>
+              <w:rPr/>
+            </w:r>
+          </w:p>
+          <w:p>
+            <w:pPr>
+              <w:pStyle w:val="BodyText"/>
+              <w:widowControl/>
+              <w:tabs>
+                <w:tab w:val="clear" w:pos="709"/>
+                <w:tab w:val="left" w:pos="850" w:leader="none"/>
+              </w:tabs>
+              <w:suppressAutoHyphens w:val="true"/>
+              <w:spacing w:lineRule="auto" w:line="240" w:before="0" w:after="0"/>
+              <w:ind w:end="175"/>
+              <w:jc w:val="start"/>
+              <w:rPr>
+                <w:rStyle w:val="PlaceholderText"/>
+                <w:rFonts w:ascii="Carlito" w:hAnsi="Carlito" w:eastAsia="Calibri" w:cs=""/>
+                <w:color w:val="000000"/>
+                <w:kern w:val="0"/>
+                <w:sz w:val="22"/>
+                <w:szCs w:val="22"/>
+                <w:lang w:val="fr-FR" w:eastAsia="en-US" w:bidi="ar-SA"/>
+              </w:rPr>
+            </w:pPr>
+            <w:r>
+              <w:rPr/>
+            </w:r>
+          </w:p>
+          <w:p>
+            <w:pPr>
+              <w:pStyle w:val="BodyText"/>
+              <w:widowControl/>
+              <w:tabs>
+                <w:tab w:val="clear" w:pos="709"/>
+                <w:tab w:val="left" w:pos="850" w:leader="none"/>
+              </w:tabs>
+              <w:suppressAutoHyphens w:val="true"/>
+              <w:spacing w:lineRule="auto" w:line="240" w:before="0" w:after="0"/>
+              <w:ind w:end="175"/>
+              <w:jc w:val="start"/>
+              <w:rPr>
+                <w:rStyle w:val="PlaceholderText"/>
+                <w:rFonts w:ascii="Carlito" w:hAnsi="Carlito" w:eastAsia="Calibri" w:cs=""/>
+                <w:color w:val="000000"/>
+                <w:kern w:val="0"/>
+                <w:sz w:val="22"/>
+                <w:szCs w:val="22"/>
+                <w:lang w:val="fr-FR" w:eastAsia="en-US" w:bidi="ar-SA"/>
+              </w:rPr>
+            </w:pPr>
+            <w:r>
+              <w:rPr/>
+            </w:r>
+          </w:p>
+          <w:p>
+            <w:pPr>
+              <w:pStyle w:val="BodyText"/>
+              <w:widowControl/>
+              <w:tabs>
+                <w:tab w:val="clear" w:pos="709"/>
+                <w:tab w:val="left" w:pos="850" w:leader="none"/>
+              </w:tabs>
+              <w:suppressAutoHyphens w:val="true"/>
+              <w:spacing w:lineRule="auto" w:line="240" w:before="0" w:after="0"/>
+              <w:ind w:end="175"/>
+              <w:jc w:val="start"/>
+              <w:rPr>
+                <w:rStyle w:val="PlaceholderText"/>
+                <w:rFonts w:ascii="Carlito" w:hAnsi="Carlito" w:eastAsia="Calibri" w:cs=""/>
+                <w:color w:val="000000"/>
+                <w:kern w:val="0"/>
+                <w:sz w:val="22"/>
+                <w:szCs w:val="22"/>
+                <w:lang w:val="fr-FR" w:eastAsia="en-US" w:bidi="ar-SA"/>
+              </w:rPr>
+            </w:pPr>
+            <w:r>
+              <w:rPr/>
+            </w:r>
+          </w:p>
+          <w:p>
+            <w:pPr>
+              <w:pStyle w:val="BodyText"/>
+              <w:widowControl/>
+              <w:tabs>
+                <w:tab w:val="clear" w:pos="709"/>
+                <w:tab w:val="left" w:pos="850" w:leader="none"/>
+              </w:tabs>
+              <w:suppressAutoHyphens w:val="true"/>
+              <w:spacing w:lineRule="auto" w:line="240" w:before="0" w:after="0"/>
+              <w:ind w:end="175"/>
+              <w:jc w:val="start"/>
+              <w:rPr>
+                <w:rStyle w:val="PlaceholderText"/>
+                <w:rFonts w:ascii="Carlito" w:hAnsi="Carlito" w:eastAsia="Calibri" w:cs=""/>
+                <w:color w:val="000000"/>
+                <w:kern w:val="0"/>
+                <w:sz w:val="22"/>
+                <w:szCs w:val="22"/>
+                <w:lang w:val="fr-FR" w:eastAsia="en-US" w:bidi="ar-SA"/>
+              </w:rPr>
+            </w:pPr>
+            <w:r>
+              <w:rPr/>
+            </w:r>
+          </w:p>
+          <w:p>
+            <w:pPr>
+              <w:pStyle w:val="BodyText"/>
+              <w:widowControl/>
+              <w:tabs>
+                <w:tab w:val="clear" w:pos="709"/>
+                <w:tab w:val="left" w:pos="850" w:leader="none"/>
+              </w:tabs>
+              <w:suppressAutoHyphens w:val="true"/>
+              <w:spacing w:lineRule="auto" w:line="240" w:before="0" w:after="0"/>
+              <w:ind w:end="175"/>
+              <w:jc w:val="start"/>
+              <w:rPr>
+                <w:rStyle w:val="PlaceholderText"/>
+                <w:rFonts w:ascii="Carlito" w:hAnsi="Carlito" w:eastAsia="Calibri" w:cs=""/>
+                <w:color w:val="000000"/>
+                <w:kern w:val="0"/>
+                <w:sz w:val="22"/>
+                <w:szCs w:val="22"/>
+                <w:lang w:val="fr-FR" w:eastAsia="en-US" w:bidi="ar-SA"/>
+              </w:rPr>
+            </w:pPr>
+            <w:r>
+              <w:rPr/>
+            </w:r>
+          </w:p>
+          <w:p>
+            <w:pPr>
+              <w:pStyle w:val="BodyText"/>
+              <w:widowControl/>
+              <w:tabs>
+                <w:tab w:val="clear" w:pos="709"/>
+                <w:tab w:val="left" w:pos="850" w:leader="none"/>
+              </w:tabs>
+              <w:suppressAutoHyphens w:val="true"/>
+              <w:spacing w:lineRule="auto" w:line="240" w:before="0" w:after="0"/>
+              <w:ind w:end="175"/>
+              <w:jc w:val="start"/>
+              <w:rPr>
+                <w:rStyle w:val="PlaceholderText"/>
+                <w:rFonts w:ascii="Carlito" w:hAnsi="Carlito" w:eastAsia="Calibri" w:cs=""/>
+                <w:color w:val="000000"/>
+                <w:kern w:val="0"/>
+                <w:sz w:val="22"/>
+                <w:szCs w:val="22"/>
+                <w:lang w:val="fr-FR" w:eastAsia="en-US" w:bidi="ar-SA"/>
+              </w:rPr>
+            </w:pPr>
+            <w:r>
+              <w:rPr/>
+            </w:r>
+          </w:p>
+          <w:p>
+            <w:pPr>
+              <w:pStyle w:val="BodyText"/>
+              <w:widowControl/>
+              <w:tabs>
+                <w:tab w:val="clear" w:pos="709"/>
+                <w:tab w:val="left" w:pos="850" w:leader="none"/>
+              </w:tabs>
+              <w:suppressAutoHyphens w:val="true"/>
+              <w:spacing w:lineRule="auto" w:line="240" w:before="0" w:after="0"/>
+              <w:ind w:end="175"/>
+              <w:jc w:val="start"/>
+              <w:rPr>
+                <w:rStyle w:val="PlaceholderText"/>
+                <w:rFonts w:ascii="Carlito" w:hAnsi="Carlito" w:eastAsia="Calibri" w:cs=""/>
+                <w:color w:val="000000"/>
+                <w:kern w:val="0"/>
+                <w:sz w:val="22"/>
+                <w:szCs w:val="22"/>
+                <w:lang w:val="fr-FR" w:eastAsia="en-US" w:bidi="ar-SA"/>
+              </w:rPr>
+            </w:pPr>
             <w:r>
               <w:rPr>
                 <w:rStyle w:val="PlaceholderText"/>
@@ -26869,121 +27507,7 @@
                 <w:shd w:fill="FFFFFF" w:val="clear"/>
                 <w:lang w:val="fr-FR" w:eastAsia="en-US" w:bidi="ar-SA"/>
               </w:rPr>
-              <w:t>M</w:t>
-            </w:r>
-            <w:r>
-              <w:rPr>
-                <w:rStyle w:val="SourceText"/>
-                <w:rFonts w:ascii="monospace" w:hAnsi="monospace"/>
-                <w:b/>
-                <w:bCs/>
-                <w:i w:val="false"/>
-                <w:caps w:val="false"/>
-                <w:smallCaps w:val="false"/>
-                <w:color w:val="000000"/>
-                <w:spacing w:val="0"/>
-                <w:kern w:val="0"/>
-                <w:sz w:val="19"/>
-                <w:szCs w:val="19"/>
-                <w:shd w:fill="FFFFFF" w:val="clear"/>
-                <w:lang w:val="fr-FR" w:eastAsia="en-US" w:bidi="ar-SA"/>
-              </w:rPr>
-              <w:t>P</w:t>
-            </w:r>
-            <w:r>
-              <w:rPr>
-                <w:rStyle w:val="SourceText"/>
-                <w:rFonts w:ascii="monospace" w:hAnsi="monospace"/>
-                <w:b/>
-                <w:bCs/>
-                <w:i w:val="false"/>
-                <w:caps w:val="false"/>
-                <w:smallCaps w:val="false"/>
-                <w:color w:val="000000"/>
-                <w:spacing w:val="0"/>
-                <w:kern w:val="0"/>
-                <w:sz w:val="19"/>
-                <w:szCs w:val="19"/>
-                <w:shd w:fill="FFFFFF" w:val="clear"/>
-                <w:lang w:val="fr-FR" w:eastAsia="en-US" w:bidi="ar-SA"/>
-              </w:rPr>
-              <w:t>D</w:t>
-            </w:r>
-            <w:r>
-              <w:rPr>
-                <w:rStyle w:val="SourceText"/>
-                <w:rFonts w:ascii="monospace" w:hAnsi="monospace"/>
-                <w:b/>
-                <w:bCs/>
-                <w:i w:val="false"/>
-                <w:caps w:val="false"/>
-                <w:smallCaps w:val="false"/>
-                <w:color w:val="000000"/>
-                <w:spacing w:val="0"/>
-                <w:kern w:val="0"/>
-                <w:sz w:val="19"/>
-                <w:szCs w:val="19"/>
-                <w:shd w:fill="FFFFFF" w:val="clear"/>
-                <w:lang w:val="fr-FR" w:eastAsia="en-US" w:bidi="ar-SA"/>
-              </w:rPr>
-              <w:t xml:space="preserve"> (Modèle </w:t>
-            </w:r>
-            <w:r>
-              <w:rPr>
-                <w:rStyle w:val="SourceText"/>
-                <w:rFonts w:ascii="monospace" w:hAnsi="monospace"/>
-                <w:b/>
-                <w:bCs/>
-                <w:i w:val="false"/>
-                <w:caps w:val="false"/>
-                <w:smallCaps w:val="false"/>
-                <w:color w:val="000000"/>
-                <w:spacing w:val="0"/>
-                <w:kern w:val="0"/>
-                <w:sz w:val="19"/>
-                <w:szCs w:val="19"/>
-                <w:shd w:fill="FFFFFF" w:val="clear"/>
-                <w:lang w:val="fr-FR" w:eastAsia="en-US" w:bidi="ar-SA"/>
-              </w:rPr>
-              <w:t>P</w:t>
-            </w:r>
-            <w:r>
-              <w:rPr>
-                <w:rStyle w:val="SourceText"/>
-                <w:rFonts w:ascii="monospace" w:hAnsi="monospace"/>
-                <w:b/>
-                <w:bCs/>
-                <w:i w:val="false"/>
-                <w:caps w:val="false"/>
-                <w:smallCaps w:val="false"/>
-                <w:color w:val="000000"/>
-                <w:spacing w:val="0"/>
-                <w:kern w:val="0"/>
-                <w:sz w:val="19"/>
-                <w:szCs w:val="19"/>
-                <w:shd w:fill="FFFFFF" w:val="clear"/>
-                <w:lang w:val="fr-FR" w:eastAsia="en-US" w:bidi="ar-SA"/>
-              </w:rPr>
-              <w:t>hysique de données</w:t>
-            </w:r>
-            <w:r>
-              <w:rPr>
-                <w:rStyle w:val="SourceText"/>
-                <w:rFonts w:ascii="monospace" w:hAnsi="monospace"/>
-                <w:b/>
-                <w:bCs/>
-                <w:i w:val="false"/>
-                <w:caps w:val="false"/>
-                <w:smallCaps w:val="false"/>
-                <w:color w:val="000000"/>
-                <w:spacing w:val="0"/>
-                <w:kern w:val="0"/>
-                <w:sz w:val="19"/>
-                <w:szCs w:val="19"/>
-                <w:shd w:fill="FFFFFF" w:val="clear"/>
-                <w:lang w:val="fr-FR" w:eastAsia="en-US" w:bidi="ar-SA"/>
-              </w:rPr>
-              <w:t>)</w:t>
+              <w:t>MPD (Modèle Physique de données)</w:t>
             </w:r>
           </w:p>
           <w:p>
@@ -27051,9 +27575,9 @@
                 <w:lang w:val="fr-FR" w:eastAsia="en-US" w:bidi="ar-SA"/>
               </w:rPr>
               <w:drawing>
-                <wp:anchor distT="0" distB="0" distL="0" distR="0" simplePos="0" relativeHeight="131" behindDoc="0" locked="0" layoutInCell="0" allowOverlap="1">
+                <wp:anchor distT="0" distB="0" distL="0" distR="0" simplePos="0" relativeHeight="114" behindDoc="0" locked="0" layoutInCell="0" allowOverlap="1">
                   <wp:simplePos x="0" y="0"/>
-                  <wp:positionH relativeFrom="column">
+                  <wp:positionH relativeFrom="margin">
                     <wp:posOffset>55880</wp:posOffset>
                   </wp:positionH>
                   <wp:positionV relativeFrom="paragraph">
@@ -27076,7 +27600,7 @@
                           </pic:cNvPicPr>
                         </pic:nvPicPr>
                         <pic:blipFill>
-                          <a:blip r:embed="rId38"/>
+                          <a:blip r:embed="rId40"/>
                           <a:stretch>
                             <a:fillRect/>
                           </a:stretch>
@@ -27693,12 +28217,12 @@
     <w:p>
       <w:pPr>
         <w:sectPr>
-          <w:headerReference w:type="even" r:id="rId39"/>
-          <w:headerReference w:type="default" r:id="rId40"/>
-          <w:headerReference w:type="first" r:id="rId41"/>
-          <w:footerReference w:type="even" r:id="rId42"/>
-          <w:footerReference w:type="default" r:id="rId43"/>
-          <w:footerReference w:type="first" r:id="rId44"/>
+          <w:headerReference w:type="even" r:id="rId41"/>
+          <w:headerReference w:type="default" r:id="rId42"/>
+          <w:headerReference w:type="first" r:id="rId43"/>
+          <w:footerReference w:type="even" r:id="rId44"/>
+          <w:footerReference w:type="default" r:id="rId45"/>
+          <w:footerReference w:type="first" r:id="rId46"/>
           <w:type w:val="nextPage"/>
           <w:pgSz w:w="11906" w:h="16838"/>
           <w:pgMar w:left="1417" w:right="1417" w:gutter="0" w:header="737" w:top="1417" w:footer="510" w:bottom="1417"/>
@@ -27958,13 +28482,13 @@
         <mc:AlternateContent>
           <mc:Choice Requires="wps">
             <w:drawing>
-              <wp:anchor distT="0" distB="0" distL="0" distR="0" simplePos="0" relativeHeight="117" behindDoc="0" locked="0" layoutInCell="0" allowOverlap="1" wp14:anchorId="7C090976">
+              <wp:anchor distT="0" distB="0" distL="0" distR="0" simplePos="0" relativeHeight="6" behindDoc="0" locked="0" layoutInCell="0" allowOverlap="1" wp14:anchorId="7C090976">
                 <wp:simplePos x="0" y="0"/>
                 <wp:positionH relativeFrom="margin">
-                  <wp:posOffset>5346065</wp:posOffset>
+                  <wp:posOffset>5344795</wp:posOffset>
                 </wp:positionH>
                 <wp:positionV relativeFrom="page">
-                  <wp:posOffset>9927590</wp:posOffset>
+                  <wp:posOffset>9928860</wp:posOffset>
                 </wp:positionV>
                 <wp:extent cx="473710" cy="376555"/>
                 <wp:effectExtent l="0" t="0" r="0" b="0"/>
@@ -28031,7 +28555,7 @@
           </mc:Choice>
           <mc:Fallback>
             <w:pict>
-              <v:shape id="shape_0" stroked="f" o:allowincell="f" style="position:absolute;margin-left:420.95pt;margin-top:781.65pt;width:37.25pt;height:29.6pt;mso-wrap-style:none;v-text-anchor:middle;rotation:90;mso-position-horizontal-relative:margin;mso-position-vertical-relative:page" wp14:anchorId="7C090976" type="_x0000_t186" path="l-2147483642,-2147483642l-2147483623,-2147483622l-2147483642,-2147483634l-2147483642,-2147483642l-2147483621,-2147483620l-2147483642,-2147483642l-2147483619,-2147483618l-2147483642,-2147483642l-2147483642,-2147483642l-2147483617,-2147483616l-2147483639,0l-2147483642,-2147483642l-2147483615,-2147483614xel-2147483642,-2147483642l-2147483613,-2147483612l-2147483642,-2147483642l-2147483611,-2147483610l-2147483638,-2147483633l-2147483642,-2147483642l-2147483640,-2147483625l-2147483642,-2147483642l-2147483607,-2147483606l-2147483642,-2147483634l-2147483642,-2147483642l-2147483605,-2147483604e">
+              <v:shape id="shape_0" stroked="f" o:allowincell="f" style="position:absolute;margin-left:420.85pt;margin-top:781.75pt;width:37.25pt;height:29.6pt;mso-wrap-style:none;v-text-anchor:middle;rotation:90;mso-position-horizontal-relative:margin;mso-position-vertical-relative:page" wp14:anchorId="7C090976" type="_x0000_t186" path="l-2147483642,-2147483642l-2147483623,-2147483622l-2147483642,-2147483634l-2147483642,-2147483642l-2147483621,-2147483620l-2147483642,-2147483642l-2147483619,-2147483618l-2147483642,-2147483642l-2147483642,-2147483642l-2147483617,-2147483616l-2147483639,0l-2147483642,-2147483642l-2147483615,-2147483614xel-2147483642,-2147483642l-2147483613,-2147483612l-2147483642,-2147483642l-2147483611,-2147483610l-2147483638,-2147483633l-2147483642,-2147483642l-2147483640,-2147483625l-2147483642,-2147483642l-2147483607,-2147483606l-2147483642,-2147483634l-2147483642,-2147483642l-2147483605,-2147483604e">
                 <v:fill o:detectmouseclick="t" on="false"/>
                 <v:stroke color="#3465a4" joinstyle="round" endcap="flat"/>
                 <v:textbox>
@@ -28067,12 +28591,12 @@
       </w:r>
     </w:p>
     <w:sectPr>
-      <w:headerReference w:type="even" r:id="rId45"/>
-      <w:headerReference w:type="default" r:id="rId46"/>
-      <w:headerReference w:type="first" r:id="rId47"/>
-      <w:footerReference w:type="even" r:id="rId48"/>
-      <w:footerReference w:type="default" r:id="rId49"/>
-      <w:footerReference w:type="first" r:id="rId50"/>
+      <w:headerReference w:type="even" r:id="rId47"/>
+      <w:headerReference w:type="default" r:id="rId48"/>
+      <w:headerReference w:type="first" r:id="rId49"/>
+      <w:footerReference w:type="even" r:id="rId50"/>
+      <w:footerReference w:type="default" r:id="rId51"/>
+      <w:footerReference w:type="first" r:id="rId52"/>
       <w:type w:val="nextPage"/>
       <w:pgSz w:w="11906" w:h="16838"/>
       <w:pgMar w:left="1417" w:right="1417" w:gutter="0" w:header="737" w:top="1417" w:footer="510" w:bottom="1417"/>
@@ -28133,13 +28657,13 @@
       <mc:AlternateContent>
         <mc:Choice Requires="wps">
           <w:drawing>
-            <wp:anchor distT="1270" distB="1270" distL="1270" distR="1270" simplePos="0" relativeHeight="50" behindDoc="1" locked="0" layoutInCell="0" allowOverlap="1" wp14:anchorId="7E31E2B7">
+            <wp:anchor distT="1270" distB="1270" distL="1270" distR="1270" simplePos="0" relativeHeight="54" behindDoc="1" locked="0" layoutInCell="0" allowOverlap="1" wp14:anchorId="7E31E2B7">
               <wp:simplePos x="0" y="0"/>
               <wp:positionH relativeFrom="margin">
-                <wp:posOffset>5241290</wp:posOffset>
+                <wp:posOffset>5240020</wp:posOffset>
               </wp:positionH>
               <wp:positionV relativeFrom="page">
-                <wp:posOffset>9817735</wp:posOffset>
+                <wp:posOffset>9819005</wp:posOffset>
               </wp:positionV>
               <wp:extent cx="355600" cy="600075"/>
               <wp:effectExtent l="1270" t="1270" r="1270" b="1270"/>
@@ -28213,7 +28737,7 @@
         </mc:Choice>
         <mc:Fallback>
           <w:pict>
-            <v:shape id="shape_0" stroked="t" o:allowincell="f" style="position:absolute;margin-left:412.65pt;margin-top:773.05pt;width:27.95pt;height:47.2pt;mso-wrap-style:none;v-text-anchor:middle;rotation:90;mso-position-horizontal-relative:margin;mso-position-vertical-relative:page" wp14:anchorId="7E31E2B7" type="_x0000_t186" path="l-2147483642,-2147483642l-2147483623,-2147483622l-2147483642,-2147483634l-2147483642,-2147483642l-2147483621,-2147483620l-2147483642,-2147483642l-2147483619,-2147483618l-2147483642,-2147483642l-2147483642,-2147483642l-2147483617,-2147483616l-2147483639,0l-2147483642,-2147483642l-2147483615,-2147483614xel-2147483642,-2147483642l-2147483613,-2147483612l-2147483642,-2147483642l-2147483611,-2147483610l-2147483638,-2147483633l-2147483642,-2147483642l-2147483640,-2147483625l-2147483642,-2147483642l-2147483607,-2147483606l-2147483642,-2147483634l-2147483642,-2147483642l-2147483605,-2147483604e">
+            <v:shape id="shape_0" stroked="t" o:allowincell="f" style="position:absolute;margin-left:412.55pt;margin-top:773.15pt;width:27.95pt;height:47.2pt;mso-wrap-style:none;v-text-anchor:middle;rotation:90;mso-position-horizontal-relative:margin;mso-position-vertical-relative:page" wp14:anchorId="7E31E2B7" type="_x0000_t186" path="l-2147483642,-2147483642l-2147483623,-2147483622l-2147483642,-2147483634l-2147483642,-2147483642l-2147483621,-2147483620l-2147483642,-2147483642l-2147483619,-2147483618l-2147483642,-2147483642l-2147483642,-2147483642l-2147483617,-2147483616l-2147483639,0l-2147483642,-2147483642l-2147483615,-2147483614xel-2147483642,-2147483642l-2147483613,-2147483612l-2147483642,-2147483642l-2147483611,-2147483610l-2147483638,-2147483633l-2147483642,-2147483642l-2147483640,-2147483625l-2147483642,-2147483642l-2147483607,-2147483606l-2147483642,-2147483634l-2147483642,-2147483642l-2147483605,-2147483604e">
               <v:fill o:detectmouseclick="t" on="false"/>
               <v:stroke color="#d9d9d9" joinstyle="round" endcap="flat"/>
               <v:textbox>
@@ -28254,13 +28778,13 @@
       <mc:AlternateContent>
         <mc:Choice Requires="wps">
           <w:drawing>
-            <wp:anchor distT="0" distB="0" distL="101600" distR="114300" simplePos="0" relativeHeight="94" behindDoc="1" locked="0" layoutInCell="0" allowOverlap="1" wp14:anchorId="1A5B76DB">
+            <wp:anchor distT="0" distB="0" distL="97790" distR="114300" simplePos="0" relativeHeight="101" behindDoc="1" locked="0" layoutInCell="0" allowOverlap="1" wp14:anchorId="1A5B76DB">
               <wp:simplePos x="0" y="0"/>
               <wp:positionH relativeFrom="margin">
-                <wp:posOffset>5331460</wp:posOffset>
+                <wp:posOffset>5330190</wp:posOffset>
               </wp:positionH>
               <wp:positionV relativeFrom="page">
-                <wp:posOffset>9916160</wp:posOffset>
+                <wp:posOffset>9917430</wp:posOffset>
               </wp:positionV>
               <wp:extent cx="473710" cy="376555"/>
               <wp:effectExtent l="0" t="0" r="0" b="0"/>
@@ -28350,7 +28874,7 @@
                               <w:sz w:val="28"/>
                               <w:szCs w:val="28"/>
                             </w:rPr>
-                            <w:t>24</w:t>
+                            <w:t>23</w:t>
                           </w:r>
                           <w:r>
                             <w:rPr>
@@ -28377,7 +28901,7 @@
         </mc:Choice>
         <mc:Fallback>
           <w:pict>
-            <v:shape id="shape_0" stroked="f" o:allowincell="f" style="position:absolute;margin-left:419.8pt;margin-top:780.75pt;width:37.25pt;height:29.6pt;mso-wrap-style:square;v-text-anchor:middle;rotation:90;mso-position-horizontal-relative:margin;mso-position-vertical-relative:page" wp14:anchorId="1A5B76DB" type="_x0000_t186" path="l-2147483642,-2147483642l-2147483623,-2147483622l-2147483642,-2147483634l-2147483642,-2147483642l-2147483621,-2147483620l-2147483642,-2147483642l-2147483619,-2147483618l-2147483642,-2147483642l-2147483642,-2147483642l-2147483617,-2147483616l-2147483639,0l-2147483642,-2147483642l-2147483615,-2147483614xel-2147483642,-2147483642l-2147483613,-2147483612l-2147483642,-2147483642l-2147483611,-2147483610l-2147483638,-2147483633l-2147483642,-2147483642l-2147483640,-2147483625l-2147483642,-2147483642l-2147483607,-2147483606l-2147483642,-2147483634l-2147483642,-2147483642l-2147483605,-2147483604e">
+            <v:shape id="shape_0" stroked="f" o:allowincell="f" style="position:absolute;margin-left:419.7pt;margin-top:780.85pt;width:37.25pt;height:29.6pt;mso-wrap-style:square;v-text-anchor:middle;rotation:90;mso-position-horizontal-relative:margin;mso-position-vertical-relative:page" wp14:anchorId="1A5B76DB" type="_x0000_t186" path="l-2147483642,-2147483642l-2147483623,-2147483622l-2147483642,-2147483634l-2147483642,-2147483642l-2147483621,-2147483620l-2147483642,-2147483642l-2147483619,-2147483618l-2147483642,-2147483642l-2147483642,-2147483642l-2147483617,-2147483616l-2147483639,0l-2147483642,-2147483642l-2147483615,-2147483614xel-2147483642,-2147483642l-2147483613,-2147483612l-2147483642,-2147483642l-2147483611,-2147483610l-2147483638,-2147483633l-2147483642,-2147483642l-2147483640,-2147483625l-2147483642,-2147483642l-2147483607,-2147483606l-2147483642,-2147483634l-2147483642,-2147483642l-2147483605,-2147483604e">
               <v:fill o:detectmouseclick="t" on="false"/>
               <v:stroke color="#3465a4" joinstyle="round" endcap="flat"/>
               <v:textbox>
@@ -28439,7 +28963,7 @@
                         <w:sz w:val="28"/>
                         <w:szCs w:val="28"/>
                       </w:rPr>
-                      <w:t>24</w:t>
+                      <w:t>23</w:t>
                     </w:r>
                     <w:r>
                       <w:rPr>
@@ -28527,13 +29051,13 @@
       <mc:AlternateContent>
         <mc:Choice Requires="wps">
           <w:drawing>
-            <wp:anchor distT="1270" distB="1270" distL="1270" distR="1270" simplePos="0" relativeHeight="50" behindDoc="1" locked="0" layoutInCell="0" allowOverlap="1" wp14:anchorId="7E31E2B7">
+            <wp:anchor distT="1270" distB="1270" distL="1270" distR="1270" simplePos="0" relativeHeight="54" behindDoc="1" locked="0" layoutInCell="0" allowOverlap="1" wp14:anchorId="7E31E2B7">
               <wp:simplePos x="0" y="0"/>
               <wp:positionH relativeFrom="margin">
-                <wp:posOffset>5241290</wp:posOffset>
+                <wp:posOffset>5240020</wp:posOffset>
               </wp:positionH>
               <wp:positionV relativeFrom="page">
-                <wp:posOffset>9817735</wp:posOffset>
+                <wp:posOffset>9819005</wp:posOffset>
               </wp:positionV>
               <wp:extent cx="355600" cy="600075"/>
               <wp:effectExtent l="1270" t="1270" r="1270" b="1270"/>
@@ -28607,7 +29131,7 @@
         </mc:Choice>
         <mc:Fallback>
           <w:pict>
-            <v:shape id="shape_0" stroked="t" o:allowincell="f" style="position:absolute;margin-left:412.65pt;margin-top:773.05pt;width:27.95pt;height:47.2pt;mso-wrap-style:none;v-text-anchor:middle;rotation:90;mso-position-horizontal-relative:margin;mso-position-vertical-relative:page" wp14:anchorId="7E31E2B7" type="_x0000_t186" path="l-2147483642,-2147483642l-2147483623,-2147483622l-2147483642,-2147483634l-2147483642,-2147483642l-2147483621,-2147483620l-2147483642,-2147483642l-2147483619,-2147483618l-2147483642,-2147483642l-2147483642,-2147483642l-2147483617,-2147483616l-2147483639,0l-2147483642,-2147483642l-2147483615,-2147483614xel-2147483642,-2147483642l-2147483613,-2147483612l-2147483642,-2147483642l-2147483611,-2147483610l-2147483638,-2147483633l-2147483642,-2147483642l-2147483640,-2147483625l-2147483642,-2147483642l-2147483607,-2147483606l-2147483642,-2147483634l-2147483642,-2147483642l-2147483605,-2147483604e">
+            <v:shape id="shape_0" stroked="t" o:allowincell="f" style="position:absolute;margin-left:412.55pt;margin-top:773.15pt;width:27.95pt;height:47.2pt;mso-wrap-style:none;v-text-anchor:middle;rotation:90;mso-position-horizontal-relative:margin;mso-position-vertical-relative:page" wp14:anchorId="7E31E2B7" type="_x0000_t186" path="l-2147483642,-2147483642l-2147483623,-2147483622l-2147483642,-2147483634l-2147483642,-2147483642l-2147483621,-2147483620l-2147483642,-2147483642l-2147483619,-2147483618l-2147483642,-2147483642l-2147483642,-2147483642l-2147483617,-2147483616l-2147483639,0l-2147483642,-2147483642l-2147483615,-2147483614xel-2147483642,-2147483642l-2147483613,-2147483612l-2147483642,-2147483642l-2147483611,-2147483610l-2147483638,-2147483633l-2147483642,-2147483642l-2147483640,-2147483625l-2147483642,-2147483642l-2147483607,-2147483606l-2147483642,-2147483634l-2147483642,-2147483642l-2147483605,-2147483604e">
               <v:fill o:detectmouseclick="t" on="false"/>
               <v:stroke color="#d9d9d9" joinstyle="round" endcap="flat"/>
               <v:textbox>
@@ -28648,13 +29172,13 @@
       <mc:AlternateContent>
         <mc:Choice Requires="wps">
           <w:drawing>
-            <wp:anchor distT="0" distB="0" distL="101600" distR="114300" simplePos="0" relativeHeight="94" behindDoc="1" locked="0" layoutInCell="0" allowOverlap="1" wp14:anchorId="1A5B76DB">
+            <wp:anchor distT="0" distB="0" distL="97790" distR="114300" simplePos="0" relativeHeight="101" behindDoc="1" locked="0" layoutInCell="0" allowOverlap="1" wp14:anchorId="1A5B76DB">
               <wp:simplePos x="0" y="0"/>
               <wp:positionH relativeFrom="margin">
-                <wp:posOffset>5331460</wp:posOffset>
+                <wp:posOffset>5330190</wp:posOffset>
               </wp:positionH>
               <wp:positionV relativeFrom="page">
-                <wp:posOffset>9916160</wp:posOffset>
+                <wp:posOffset>9917430</wp:posOffset>
               </wp:positionV>
               <wp:extent cx="473710" cy="376555"/>
               <wp:effectExtent l="0" t="0" r="0" b="0"/>
@@ -28744,7 +29268,7 @@
                               <w:sz w:val="28"/>
                               <w:szCs w:val="28"/>
                             </w:rPr>
-                            <w:t>24</w:t>
+                            <w:t>23</w:t>
                           </w:r>
                           <w:r>
                             <w:rPr>
@@ -28771,7 +29295,7 @@
         </mc:Choice>
         <mc:Fallback>
           <w:pict>
-            <v:shape id="shape_0" stroked="f" o:allowincell="f" style="position:absolute;margin-left:419.8pt;margin-top:780.75pt;width:37.25pt;height:29.6pt;mso-wrap-style:square;v-text-anchor:middle;rotation:90;mso-position-horizontal-relative:margin;mso-position-vertical-relative:page" wp14:anchorId="1A5B76DB" type="_x0000_t186" path="l-2147483642,-2147483642l-2147483623,-2147483622l-2147483642,-2147483634l-2147483642,-2147483642l-2147483621,-2147483620l-2147483642,-2147483642l-2147483619,-2147483618l-2147483642,-2147483642l-2147483642,-2147483642l-2147483617,-2147483616l-2147483639,0l-2147483642,-2147483642l-2147483615,-2147483614xel-2147483642,-2147483642l-2147483613,-2147483612l-2147483642,-2147483642l-2147483611,-2147483610l-2147483638,-2147483633l-2147483642,-2147483642l-2147483640,-2147483625l-2147483642,-2147483642l-2147483607,-2147483606l-2147483642,-2147483634l-2147483642,-2147483642l-2147483605,-2147483604e">
+            <v:shape id="shape_0" stroked="f" o:allowincell="f" style="position:absolute;margin-left:419.7pt;margin-top:780.85pt;width:37.25pt;height:29.6pt;mso-wrap-style:square;v-text-anchor:middle;rotation:90;mso-position-horizontal-relative:margin;mso-position-vertical-relative:page" wp14:anchorId="1A5B76DB" type="_x0000_t186" path="l-2147483642,-2147483642l-2147483623,-2147483622l-2147483642,-2147483634l-2147483642,-2147483642l-2147483621,-2147483620l-2147483642,-2147483642l-2147483619,-2147483618l-2147483642,-2147483642l-2147483642,-2147483642l-2147483617,-2147483616l-2147483639,0l-2147483642,-2147483642l-2147483615,-2147483614xel-2147483642,-2147483642l-2147483613,-2147483612l-2147483642,-2147483642l-2147483611,-2147483610l-2147483638,-2147483633l-2147483642,-2147483642l-2147483640,-2147483625l-2147483642,-2147483642l-2147483607,-2147483606l-2147483642,-2147483634l-2147483642,-2147483642l-2147483605,-2147483604e">
               <v:fill o:detectmouseclick="t" on="false"/>
               <v:stroke color="#3465a4" joinstyle="round" endcap="flat"/>
               <v:textbox>
@@ -28833,7 +29357,7 @@
                         <w:sz w:val="28"/>
                         <w:szCs w:val="28"/>
                       </w:rPr>
-                      <w:t>24</w:t>
+                      <w:t>23</w:t>
                     </w:r>
                     <w:r>
                       <w:rPr>
@@ -28935,13 +29459,13 @@
       <mc:AlternateContent>
         <mc:Choice Requires="wps">
           <w:drawing>
-            <wp:anchor distT="1270" distB="1270" distL="1270" distR="1270" simplePos="0" relativeHeight="101" behindDoc="1" locked="0" layoutInCell="0" allowOverlap="1" wp14:anchorId="7E31E2B7">
+            <wp:anchor distT="1270" distB="1270" distL="1270" distR="1270" simplePos="0" relativeHeight="56" behindDoc="1" locked="0" layoutInCell="0" allowOverlap="1" wp14:anchorId="7E31E2B7">
               <wp:simplePos x="0" y="0"/>
               <wp:positionH relativeFrom="margin">
-                <wp:posOffset>5241290</wp:posOffset>
+                <wp:posOffset>5240020</wp:posOffset>
               </wp:positionH>
               <wp:positionV relativeFrom="page">
-                <wp:posOffset>9817735</wp:posOffset>
+                <wp:posOffset>9819005</wp:posOffset>
               </wp:positionV>
               <wp:extent cx="355600" cy="600075"/>
               <wp:effectExtent l="1270" t="1270" r="1270" b="1270"/>
@@ -29015,7 +29539,7 @@
         </mc:Choice>
         <mc:Fallback>
           <w:pict>
-            <v:shape id="shape_0" stroked="t" o:allowincell="f" style="position:absolute;margin-left:412.65pt;margin-top:773.05pt;width:27.95pt;height:47.2pt;mso-wrap-style:none;v-text-anchor:middle;rotation:90;mso-position-horizontal-relative:margin;mso-position-vertical-relative:page" wp14:anchorId="7E31E2B7" type="_x0000_t186" path="l-2147483642,-2147483642l-2147483623,-2147483622l-2147483642,-2147483634l-2147483642,-2147483642l-2147483621,-2147483620l-2147483642,-2147483642l-2147483619,-2147483618l-2147483642,-2147483642l-2147483642,-2147483642l-2147483617,-2147483616l-2147483639,0l-2147483642,-2147483642l-2147483615,-2147483614xel-2147483642,-2147483642l-2147483613,-2147483612l-2147483642,-2147483642l-2147483611,-2147483610l-2147483638,-2147483633l-2147483642,-2147483642l-2147483640,-2147483625l-2147483642,-2147483642l-2147483607,-2147483606l-2147483642,-2147483634l-2147483642,-2147483642l-2147483605,-2147483604e">
+            <v:shape id="shape_0" stroked="t" o:allowincell="f" style="position:absolute;margin-left:412.55pt;margin-top:773.15pt;width:27.95pt;height:47.2pt;mso-wrap-style:none;v-text-anchor:middle;rotation:90;mso-position-horizontal-relative:margin;mso-position-vertical-relative:page" wp14:anchorId="7E31E2B7" type="_x0000_t186" path="l-2147483642,-2147483642l-2147483623,-2147483622l-2147483642,-2147483634l-2147483642,-2147483642l-2147483621,-2147483620l-2147483642,-2147483642l-2147483619,-2147483618l-2147483642,-2147483642l-2147483642,-2147483642l-2147483617,-2147483616l-2147483639,0l-2147483642,-2147483642l-2147483615,-2147483614xel-2147483642,-2147483642l-2147483613,-2147483612l-2147483642,-2147483642l-2147483611,-2147483610l-2147483638,-2147483633l-2147483642,-2147483642l-2147483640,-2147483625l-2147483642,-2147483642l-2147483607,-2147483606l-2147483642,-2147483634l-2147483642,-2147483642l-2147483605,-2147483604e">
               <v:fill o:detectmouseclick="t" on="false"/>
               <v:stroke color="#d9d9d9" joinstyle="round" endcap="flat"/>
               <v:textbox>
@@ -29056,13 +29580,13 @@
       <mc:AlternateContent>
         <mc:Choice Requires="wps">
           <w:drawing>
-            <wp:anchor distT="0" distB="0" distL="101600" distR="114300" simplePos="0" relativeHeight="103" behindDoc="1" locked="0" layoutInCell="0" allowOverlap="1" wp14:anchorId="1A5B76DB">
+            <wp:anchor distT="0" distB="0" distL="97790" distR="114300" simplePos="0" relativeHeight="58" behindDoc="1" locked="0" layoutInCell="0" allowOverlap="1" wp14:anchorId="1A5B76DB">
               <wp:simplePos x="0" y="0"/>
               <wp:positionH relativeFrom="margin">
-                <wp:posOffset>5331460</wp:posOffset>
+                <wp:posOffset>5330190</wp:posOffset>
               </wp:positionH>
               <wp:positionV relativeFrom="page">
-                <wp:posOffset>9916160</wp:posOffset>
+                <wp:posOffset>9917430</wp:posOffset>
               </wp:positionV>
               <wp:extent cx="473710" cy="376555"/>
               <wp:effectExtent l="0" t="0" r="0" b="0"/>
@@ -29152,7 +29676,7 @@
                               <w:sz w:val="28"/>
                               <w:szCs w:val="28"/>
                             </w:rPr>
-                            <w:t>26</w:t>
+                            <w:t>25</w:t>
                           </w:r>
                           <w:r>
                             <w:rPr>
@@ -29179,7 +29703,7 @@
         </mc:Choice>
         <mc:Fallback>
           <w:pict>
-            <v:shape id="shape_0" stroked="f" o:allowincell="f" style="position:absolute;margin-left:419.8pt;margin-top:780.75pt;width:37.25pt;height:29.6pt;mso-wrap-style:square;v-text-anchor:middle;rotation:90;mso-position-horizontal-relative:margin;mso-position-vertical-relative:page" wp14:anchorId="1A5B76DB" type="_x0000_t186" path="l-2147483642,-2147483642l-2147483623,-2147483622l-2147483642,-2147483634l-2147483642,-2147483642l-2147483621,-2147483620l-2147483642,-2147483642l-2147483619,-2147483618l-2147483642,-2147483642l-2147483642,-2147483642l-2147483617,-2147483616l-2147483639,0l-2147483642,-2147483642l-2147483615,-2147483614xel-2147483642,-2147483642l-2147483613,-2147483612l-2147483642,-2147483642l-2147483611,-2147483610l-2147483638,-2147483633l-2147483642,-2147483642l-2147483640,-2147483625l-2147483642,-2147483642l-2147483607,-2147483606l-2147483642,-2147483634l-2147483642,-2147483642l-2147483605,-2147483604e">
+            <v:shape id="shape_0" stroked="f" o:allowincell="f" style="position:absolute;margin-left:419.7pt;margin-top:780.85pt;width:37.25pt;height:29.6pt;mso-wrap-style:square;v-text-anchor:middle;rotation:90;mso-position-horizontal-relative:margin;mso-position-vertical-relative:page" wp14:anchorId="1A5B76DB" type="_x0000_t186" path="l-2147483642,-2147483642l-2147483623,-2147483622l-2147483642,-2147483634l-2147483642,-2147483642l-2147483621,-2147483620l-2147483642,-2147483642l-2147483619,-2147483618l-2147483642,-2147483642l-2147483642,-2147483642l-2147483617,-2147483616l-2147483639,0l-2147483642,-2147483642l-2147483615,-2147483614xel-2147483642,-2147483642l-2147483613,-2147483612l-2147483642,-2147483642l-2147483611,-2147483610l-2147483638,-2147483633l-2147483642,-2147483642l-2147483640,-2147483625l-2147483642,-2147483642l-2147483607,-2147483606l-2147483642,-2147483634l-2147483642,-2147483642l-2147483605,-2147483604e">
               <v:fill o:detectmouseclick="t" on="false"/>
               <v:stroke color="#3465a4" joinstyle="round" endcap="flat"/>
               <v:textbox>
@@ -29241,7 +29765,7 @@
                         <w:sz w:val="28"/>
                         <w:szCs w:val="28"/>
                       </w:rPr>
-                      <w:t>26</w:t>
+                      <w:t>25</w:t>
                     </w:r>
                     <w:r>
                       <w:rPr>
@@ -29329,13 +29853,13 @@
       <mc:AlternateContent>
         <mc:Choice Requires="wps">
           <w:drawing>
-            <wp:anchor distT="1270" distB="1270" distL="1270" distR="1270" simplePos="0" relativeHeight="101" behindDoc="1" locked="0" layoutInCell="0" allowOverlap="1" wp14:anchorId="7E31E2B7">
+            <wp:anchor distT="1270" distB="1270" distL="1270" distR="1270" simplePos="0" relativeHeight="56" behindDoc="1" locked="0" layoutInCell="0" allowOverlap="1" wp14:anchorId="7E31E2B7">
               <wp:simplePos x="0" y="0"/>
               <wp:positionH relativeFrom="margin">
-                <wp:posOffset>5241290</wp:posOffset>
+                <wp:posOffset>5240020</wp:posOffset>
               </wp:positionH>
               <wp:positionV relativeFrom="page">
-                <wp:posOffset>9817735</wp:posOffset>
+                <wp:posOffset>9819005</wp:posOffset>
               </wp:positionV>
               <wp:extent cx="355600" cy="600075"/>
               <wp:effectExtent l="1270" t="1270" r="1270" b="1270"/>
@@ -29409,7 +29933,7 @@
         </mc:Choice>
         <mc:Fallback>
           <w:pict>
-            <v:shape id="shape_0" stroked="t" o:allowincell="f" style="position:absolute;margin-left:412.65pt;margin-top:773.05pt;width:27.95pt;height:47.2pt;mso-wrap-style:none;v-text-anchor:middle;rotation:90;mso-position-horizontal-relative:margin;mso-position-vertical-relative:page" wp14:anchorId="7E31E2B7" type="_x0000_t186" path="l-2147483642,-2147483642l-2147483623,-2147483622l-2147483642,-2147483634l-2147483642,-2147483642l-2147483621,-2147483620l-2147483642,-2147483642l-2147483619,-2147483618l-2147483642,-2147483642l-2147483642,-2147483642l-2147483617,-2147483616l-2147483639,0l-2147483642,-2147483642l-2147483615,-2147483614xel-2147483642,-2147483642l-2147483613,-2147483612l-2147483642,-2147483642l-2147483611,-2147483610l-2147483638,-2147483633l-2147483642,-2147483642l-2147483640,-2147483625l-2147483642,-2147483642l-2147483607,-2147483606l-2147483642,-2147483634l-2147483642,-2147483642l-2147483605,-2147483604e">
+            <v:shape id="shape_0" stroked="t" o:allowincell="f" style="position:absolute;margin-left:412.55pt;margin-top:773.15pt;width:27.95pt;height:47.2pt;mso-wrap-style:none;v-text-anchor:middle;rotation:90;mso-position-horizontal-relative:margin;mso-position-vertical-relative:page" wp14:anchorId="7E31E2B7" type="_x0000_t186" path="l-2147483642,-2147483642l-2147483623,-2147483622l-2147483642,-2147483634l-2147483642,-2147483642l-2147483621,-2147483620l-2147483642,-2147483642l-2147483619,-2147483618l-2147483642,-2147483642l-2147483642,-2147483642l-2147483617,-2147483616l-2147483639,0l-2147483642,-2147483642l-2147483615,-2147483614xel-2147483642,-2147483642l-2147483613,-2147483612l-2147483642,-2147483642l-2147483611,-2147483610l-2147483638,-2147483633l-2147483642,-2147483642l-2147483640,-2147483625l-2147483642,-2147483642l-2147483607,-2147483606l-2147483642,-2147483634l-2147483642,-2147483642l-2147483605,-2147483604e">
               <v:fill o:detectmouseclick="t" on="false"/>
               <v:stroke color="#d9d9d9" joinstyle="round" endcap="flat"/>
               <v:textbox>
@@ -29450,13 +29974,13 @@
       <mc:AlternateContent>
         <mc:Choice Requires="wps">
           <w:drawing>
-            <wp:anchor distT="0" distB="0" distL="101600" distR="114300" simplePos="0" relativeHeight="103" behindDoc="1" locked="0" layoutInCell="0" allowOverlap="1" wp14:anchorId="1A5B76DB">
+            <wp:anchor distT="0" distB="0" distL="97790" distR="114300" simplePos="0" relativeHeight="58" behindDoc="1" locked="0" layoutInCell="0" allowOverlap="1" wp14:anchorId="1A5B76DB">
               <wp:simplePos x="0" y="0"/>
               <wp:positionH relativeFrom="margin">
-                <wp:posOffset>5331460</wp:posOffset>
+                <wp:posOffset>5330190</wp:posOffset>
               </wp:positionH>
               <wp:positionV relativeFrom="page">
-                <wp:posOffset>9916160</wp:posOffset>
+                <wp:posOffset>9917430</wp:posOffset>
               </wp:positionV>
               <wp:extent cx="473710" cy="376555"/>
               <wp:effectExtent l="0" t="0" r="0" b="0"/>
@@ -29546,7 +30070,7 @@
                               <w:sz w:val="28"/>
                               <w:szCs w:val="28"/>
                             </w:rPr>
-                            <w:t>26</w:t>
+                            <w:t>25</w:t>
                           </w:r>
                           <w:r>
                             <w:rPr>
@@ -29573,7 +30097,7 @@
         </mc:Choice>
         <mc:Fallback>
           <w:pict>
-            <v:shape id="shape_0" stroked="f" o:allowincell="f" style="position:absolute;margin-left:419.8pt;margin-top:780.75pt;width:37.25pt;height:29.6pt;mso-wrap-style:square;v-text-anchor:middle;rotation:90;mso-position-horizontal-relative:margin;mso-position-vertical-relative:page" wp14:anchorId="1A5B76DB" type="_x0000_t186" path="l-2147483642,-2147483642l-2147483623,-2147483622l-2147483642,-2147483634l-2147483642,-2147483642l-2147483621,-2147483620l-2147483642,-2147483642l-2147483619,-2147483618l-2147483642,-2147483642l-2147483642,-2147483642l-2147483617,-2147483616l-2147483639,0l-2147483642,-2147483642l-2147483615,-2147483614xel-2147483642,-2147483642l-2147483613,-2147483612l-2147483642,-2147483642l-2147483611,-2147483610l-2147483638,-2147483633l-2147483642,-2147483642l-2147483640,-2147483625l-2147483642,-2147483642l-2147483607,-2147483606l-2147483642,-2147483634l-2147483642,-2147483642l-2147483605,-2147483604e">
+            <v:shape id="shape_0" stroked="f" o:allowincell="f" style="position:absolute;margin-left:419.7pt;margin-top:780.85pt;width:37.25pt;height:29.6pt;mso-wrap-style:square;v-text-anchor:middle;rotation:90;mso-position-horizontal-relative:margin;mso-position-vertical-relative:page" wp14:anchorId="1A5B76DB" type="_x0000_t186" path="l-2147483642,-2147483642l-2147483623,-2147483622l-2147483642,-2147483634l-2147483642,-2147483642l-2147483621,-2147483620l-2147483642,-2147483642l-2147483619,-2147483618l-2147483642,-2147483642l-2147483642,-2147483642l-2147483617,-2147483616l-2147483639,0l-2147483642,-2147483642l-2147483615,-2147483614xel-2147483642,-2147483642l-2147483613,-2147483612l-2147483642,-2147483642l-2147483611,-2147483610l-2147483638,-2147483633l-2147483642,-2147483642l-2147483640,-2147483625l-2147483642,-2147483642l-2147483607,-2147483606l-2147483642,-2147483634l-2147483642,-2147483642l-2147483605,-2147483604e">
               <v:fill o:detectmouseclick="t" on="false"/>
               <v:stroke color="#3465a4" joinstyle="round" endcap="flat"/>
               <v:textbox>
@@ -29635,7 +30159,7 @@
                         <w:sz w:val="28"/>
                         <w:szCs w:val="28"/>
                       </w:rPr>
-                      <w:t>26</w:t>
+                      <w:t>25</w:t>
                     </w:r>
                     <w:r>
                       <w:rPr>
@@ -29723,13 +30247,13 @@
       <mc:AlternateContent>
         <mc:Choice Requires="wps">
           <w:drawing>
-            <wp:anchor distT="1270" distB="1270" distL="1270" distR="1270" simplePos="0" relativeHeight="2" behindDoc="1" locked="0" layoutInCell="0" allowOverlap="1" wp14:anchorId="7E31E2B7">
+            <wp:anchor distT="1270" distB="1270" distL="1270" distR="1270" simplePos="0" relativeHeight="3" behindDoc="1" locked="0" layoutInCell="0" allowOverlap="1" wp14:anchorId="7E31E2B7">
               <wp:simplePos x="0" y="0"/>
               <wp:positionH relativeFrom="margin">
-                <wp:posOffset>5241290</wp:posOffset>
+                <wp:posOffset>5240020</wp:posOffset>
               </wp:positionH>
               <wp:positionV relativeFrom="page">
-                <wp:posOffset>9817735</wp:posOffset>
+                <wp:posOffset>9819005</wp:posOffset>
               </wp:positionV>
               <wp:extent cx="355600" cy="600075"/>
               <wp:effectExtent l="1270" t="1270" r="1270" b="1270"/>
@@ -29838,7 +30362,7 @@
                 <v:h position="0,@0"/>
               </v:handles>
             </v:shapetype>
-            <v:shape id="shape_0" stroked="t" o:allowincell="f" style="position:absolute;margin-left:412.65pt;margin-top:773.05pt;width:27.95pt;height:47.2pt;mso-wrap-style:none;v-text-anchor:middle;rotation:90;mso-position-horizontal-relative:margin;mso-position-vertical-relative:page" wp14:anchorId="7E31E2B7" type="_x0000_t186" path="l-2147483642,-2147483642l-2147483623,-2147483622l-2147483642,-2147483634l-2147483642,-2147483642l-2147483621,-2147483620l-2147483642,-2147483642l-2147483619,-2147483618l-2147483642,-2147483642l-2147483642,-2147483642l-2147483617,-2147483616l-2147483639,0l-2147483642,-2147483642l-2147483615,-2147483614xel-2147483642,-2147483642l-2147483613,-2147483612l-2147483642,-2147483642l-2147483611,-2147483610l-2147483638,-2147483633l-2147483642,-2147483642l-2147483640,-2147483625l-2147483642,-2147483642l-2147483607,-2147483606l-2147483642,-2147483634l-2147483642,-2147483642l-2147483605,-2147483604e">
+            <v:shape id="shape_0" stroked="t" o:allowincell="f" style="position:absolute;margin-left:412.55pt;margin-top:773.15pt;width:27.95pt;height:47.2pt;mso-wrap-style:none;v-text-anchor:middle;rotation:90;mso-position-horizontal-relative:margin;mso-position-vertical-relative:page" wp14:anchorId="7E31E2B7" type="_x0000_t186" path="l-2147483642,-2147483642l-2147483623,-2147483622l-2147483642,-2147483634l-2147483642,-2147483642l-2147483621,-2147483620l-2147483642,-2147483642l-2147483619,-2147483618l-2147483642,-2147483642l-2147483642,-2147483642l-2147483617,-2147483616l-2147483639,0l-2147483642,-2147483642l-2147483615,-2147483614xel-2147483642,-2147483642l-2147483613,-2147483612l-2147483642,-2147483642l-2147483611,-2147483610l-2147483638,-2147483633l-2147483642,-2147483642l-2147483640,-2147483625l-2147483642,-2147483642l-2147483607,-2147483606l-2147483642,-2147483634l-2147483642,-2147483642l-2147483605,-2147483604e">
               <v:fill o:detectmouseclick="t" on="false"/>
               <v:stroke color="#d9d9d9" joinstyle="round" endcap="flat"/>
               <v:textbox>
@@ -29879,13 +30403,13 @@
       <mc:AlternateContent>
         <mc:Choice Requires="wps">
           <w:drawing>
-            <wp:anchor distT="0" distB="0" distL="101600" distR="114300" simplePos="0" relativeHeight="108" behindDoc="1" locked="0" layoutInCell="0" allowOverlap="1" wp14:anchorId="1A5B76DB">
+            <wp:anchor distT="0" distB="0" distL="97790" distR="114300" simplePos="0" relativeHeight="119" behindDoc="1" locked="0" layoutInCell="0" allowOverlap="1" wp14:anchorId="1A5B76DB">
               <wp:simplePos x="0" y="0"/>
               <wp:positionH relativeFrom="margin">
-                <wp:posOffset>5331460</wp:posOffset>
+                <wp:posOffset>5330190</wp:posOffset>
               </wp:positionH>
               <wp:positionV relativeFrom="page">
-                <wp:posOffset>9916160</wp:posOffset>
+                <wp:posOffset>9917430</wp:posOffset>
               </wp:positionV>
               <wp:extent cx="473710" cy="376555"/>
               <wp:effectExtent l="0" t="0" r="0" b="0"/>
@@ -30002,7 +30526,7 @@
         </mc:Choice>
         <mc:Fallback>
           <w:pict>
-            <v:shape id="shape_0" stroked="f" o:allowincell="f" style="position:absolute;margin-left:419.8pt;margin-top:780.75pt;width:37.25pt;height:29.6pt;mso-wrap-style:square;v-text-anchor:middle;rotation:90;mso-position-horizontal-relative:margin;mso-position-vertical-relative:page" wp14:anchorId="1A5B76DB" type="_x0000_t186" path="l-2147483642,-2147483642l-2147483623,-2147483622l-2147483642,-2147483634l-2147483642,-2147483642l-2147483621,-2147483620l-2147483642,-2147483642l-2147483619,-2147483618l-2147483642,-2147483642l-2147483642,-2147483642l-2147483617,-2147483616l-2147483639,0l-2147483642,-2147483642l-2147483615,-2147483614xel-2147483642,-2147483642l-2147483613,-2147483612l-2147483642,-2147483642l-2147483611,-2147483610l-2147483638,-2147483633l-2147483642,-2147483642l-2147483640,-2147483625l-2147483642,-2147483642l-2147483607,-2147483606l-2147483642,-2147483634l-2147483642,-2147483642l-2147483605,-2147483604e">
+            <v:shape id="shape_0" stroked="f" o:allowincell="f" style="position:absolute;margin-left:419.7pt;margin-top:780.85pt;width:37.25pt;height:29.6pt;mso-wrap-style:square;v-text-anchor:middle;rotation:90;mso-position-horizontal-relative:margin;mso-position-vertical-relative:page" wp14:anchorId="1A5B76DB" type="_x0000_t186" path="l-2147483642,-2147483642l-2147483623,-2147483622l-2147483642,-2147483634l-2147483642,-2147483642l-2147483621,-2147483620l-2147483642,-2147483642l-2147483619,-2147483618l-2147483642,-2147483642l-2147483642,-2147483642l-2147483617,-2147483616l-2147483639,0l-2147483642,-2147483642l-2147483615,-2147483614xel-2147483642,-2147483642l-2147483613,-2147483612l-2147483642,-2147483642l-2147483611,-2147483610l-2147483638,-2147483633l-2147483642,-2147483642l-2147483640,-2147483625l-2147483642,-2147483642l-2147483607,-2147483606l-2147483642,-2147483634l-2147483642,-2147483642l-2147483605,-2147483604e">
               <v:fill o:detectmouseclick="t" on="false"/>
               <v:stroke color="#3465a4" joinstyle="round" endcap="flat"/>
               <v:textbox>
@@ -30152,13 +30676,13 @@
       <mc:AlternateContent>
         <mc:Choice Requires="wps">
           <w:drawing>
-            <wp:anchor distT="1270" distB="1270" distL="1270" distR="1270" simplePos="0" relativeHeight="2" behindDoc="1" locked="0" layoutInCell="0" allowOverlap="1" wp14:anchorId="7E31E2B7">
+            <wp:anchor distT="1270" distB="1270" distL="1270" distR="1270" simplePos="0" relativeHeight="3" behindDoc="1" locked="0" layoutInCell="0" allowOverlap="1" wp14:anchorId="7E31E2B7">
               <wp:simplePos x="0" y="0"/>
               <wp:positionH relativeFrom="margin">
-                <wp:posOffset>5241290</wp:posOffset>
+                <wp:posOffset>5240020</wp:posOffset>
               </wp:positionH>
               <wp:positionV relativeFrom="page">
-                <wp:posOffset>9817735</wp:posOffset>
+                <wp:posOffset>9819005</wp:posOffset>
               </wp:positionV>
               <wp:extent cx="355600" cy="600075"/>
               <wp:effectExtent l="1270" t="1270" r="1270" b="1270"/>
@@ -30232,7 +30756,7 @@
         </mc:Choice>
         <mc:Fallback>
           <w:pict>
-            <v:shape id="shape_0" stroked="t" o:allowincell="f" style="position:absolute;margin-left:412.65pt;margin-top:773.05pt;width:27.95pt;height:47.2pt;mso-wrap-style:none;v-text-anchor:middle;rotation:90;mso-position-horizontal-relative:margin;mso-position-vertical-relative:page" wp14:anchorId="7E31E2B7" type="_x0000_t186" path="l-2147483642,-2147483642l-2147483623,-2147483622l-2147483642,-2147483634l-2147483642,-2147483642l-2147483621,-2147483620l-2147483642,-2147483642l-2147483619,-2147483618l-2147483642,-2147483642l-2147483642,-2147483642l-2147483617,-2147483616l-2147483639,0l-2147483642,-2147483642l-2147483615,-2147483614xel-2147483642,-2147483642l-2147483613,-2147483612l-2147483642,-2147483642l-2147483611,-2147483610l-2147483638,-2147483633l-2147483642,-2147483642l-2147483640,-2147483625l-2147483642,-2147483642l-2147483607,-2147483606l-2147483642,-2147483634l-2147483642,-2147483642l-2147483605,-2147483604e">
+            <v:shape id="shape_0" stroked="t" o:allowincell="f" style="position:absolute;margin-left:412.55pt;margin-top:773.15pt;width:27.95pt;height:47.2pt;mso-wrap-style:none;v-text-anchor:middle;rotation:90;mso-position-horizontal-relative:margin;mso-position-vertical-relative:page" wp14:anchorId="7E31E2B7" type="_x0000_t186" path="l-2147483642,-2147483642l-2147483623,-2147483622l-2147483642,-2147483634l-2147483642,-2147483642l-2147483621,-2147483620l-2147483642,-2147483642l-2147483619,-2147483618l-2147483642,-2147483642l-2147483642,-2147483642l-2147483617,-2147483616l-2147483639,0l-2147483642,-2147483642l-2147483615,-2147483614xel-2147483642,-2147483642l-2147483613,-2147483612l-2147483642,-2147483642l-2147483611,-2147483610l-2147483638,-2147483633l-2147483642,-2147483642l-2147483640,-2147483625l-2147483642,-2147483642l-2147483607,-2147483606l-2147483642,-2147483634l-2147483642,-2147483642l-2147483605,-2147483604e">
               <v:fill o:detectmouseclick="t" on="false"/>
               <v:stroke color="#d9d9d9" joinstyle="round" endcap="flat"/>
               <v:textbox>
@@ -30273,13 +30797,13 @@
       <mc:AlternateContent>
         <mc:Choice Requires="wps">
           <w:drawing>
-            <wp:anchor distT="0" distB="0" distL="101600" distR="114300" simplePos="0" relativeHeight="108" behindDoc="1" locked="0" layoutInCell="0" allowOverlap="1" wp14:anchorId="1A5B76DB">
+            <wp:anchor distT="0" distB="0" distL="97790" distR="114300" simplePos="0" relativeHeight="119" behindDoc="1" locked="0" layoutInCell="0" allowOverlap="1" wp14:anchorId="1A5B76DB">
               <wp:simplePos x="0" y="0"/>
               <wp:positionH relativeFrom="margin">
-                <wp:posOffset>5331460</wp:posOffset>
+                <wp:posOffset>5330190</wp:posOffset>
               </wp:positionH>
               <wp:positionV relativeFrom="page">
-                <wp:posOffset>9916160</wp:posOffset>
+                <wp:posOffset>9917430</wp:posOffset>
               </wp:positionV>
               <wp:extent cx="473710" cy="376555"/>
               <wp:effectExtent l="0" t="0" r="0" b="0"/>
@@ -30396,7 +30920,7 @@
         </mc:Choice>
         <mc:Fallback>
           <w:pict>
-            <v:shape id="shape_0" stroked="f" o:allowincell="f" style="position:absolute;margin-left:419.8pt;margin-top:780.75pt;width:37.25pt;height:29.6pt;mso-wrap-style:square;v-text-anchor:middle;rotation:90;mso-position-horizontal-relative:margin;mso-position-vertical-relative:page" wp14:anchorId="1A5B76DB" type="_x0000_t186" path="l-2147483642,-2147483642l-2147483623,-2147483622l-2147483642,-2147483634l-2147483642,-2147483642l-2147483621,-2147483620l-2147483642,-2147483642l-2147483619,-2147483618l-2147483642,-2147483642l-2147483642,-2147483642l-2147483617,-2147483616l-2147483639,0l-2147483642,-2147483642l-2147483615,-2147483614xel-2147483642,-2147483642l-2147483613,-2147483612l-2147483642,-2147483642l-2147483611,-2147483610l-2147483638,-2147483633l-2147483642,-2147483642l-2147483640,-2147483625l-2147483642,-2147483642l-2147483607,-2147483606l-2147483642,-2147483634l-2147483642,-2147483642l-2147483605,-2147483604e">
+            <v:shape id="shape_0" stroked="f" o:allowincell="f" style="position:absolute;margin-left:419.7pt;margin-top:780.85pt;width:37.25pt;height:29.6pt;mso-wrap-style:square;v-text-anchor:middle;rotation:90;mso-position-horizontal-relative:margin;mso-position-vertical-relative:page" wp14:anchorId="1A5B76DB" type="_x0000_t186" path="l-2147483642,-2147483642l-2147483623,-2147483622l-2147483642,-2147483634l-2147483642,-2147483642l-2147483621,-2147483620l-2147483642,-2147483642l-2147483619,-2147483618l-2147483642,-2147483642l-2147483642,-2147483642l-2147483617,-2147483616l-2147483639,0l-2147483642,-2147483642l-2147483615,-2147483614xel-2147483642,-2147483642l-2147483613,-2147483612l-2147483642,-2147483642l-2147483611,-2147483610l-2147483638,-2147483633l-2147483642,-2147483642l-2147483640,-2147483625l-2147483642,-2147483642l-2147483607,-2147483606l-2147483642,-2147483634l-2147483642,-2147483642l-2147483605,-2147483604e">
               <v:fill o:detectmouseclick="t" on="false"/>
               <v:stroke color="#3465a4" joinstyle="round" endcap="flat"/>
               <v:textbox>
@@ -30560,13 +31084,13 @@
       <mc:AlternateContent>
         <mc:Choice Requires="wps">
           <w:drawing>
-            <wp:anchor distT="1270" distB="1270" distL="1270" distR="1270" simplePos="0" relativeHeight="111" behindDoc="1" locked="0" layoutInCell="0" allowOverlap="1" wp14:anchorId="7E31E2B7">
+            <wp:anchor distT="1270" distB="1270" distL="1270" distR="1270" simplePos="0" relativeHeight="122" behindDoc="1" locked="0" layoutInCell="0" allowOverlap="1" wp14:anchorId="7E31E2B7">
               <wp:simplePos x="0" y="0"/>
               <wp:positionH relativeFrom="margin">
-                <wp:posOffset>5241290</wp:posOffset>
+                <wp:posOffset>5240020</wp:posOffset>
               </wp:positionH>
               <wp:positionV relativeFrom="page">
-                <wp:posOffset>9817735</wp:posOffset>
+                <wp:posOffset>9819005</wp:posOffset>
               </wp:positionV>
               <wp:extent cx="355600" cy="600075"/>
               <wp:effectExtent l="1270" t="1270" r="1270" b="1270"/>
@@ -30640,7 +31164,7 @@
         </mc:Choice>
         <mc:Fallback>
           <w:pict>
-            <v:shape id="shape_0" stroked="t" o:allowincell="f" style="position:absolute;margin-left:412.65pt;margin-top:773.05pt;width:27.95pt;height:47.2pt;mso-wrap-style:none;v-text-anchor:middle;rotation:90;mso-position-horizontal-relative:margin;mso-position-vertical-relative:page" wp14:anchorId="7E31E2B7" type="_x0000_t186" path="l-2147483642,-2147483642l-2147483623,-2147483622l-2147483642,-2147483634l-2147483642,-2147483642l-2147483621,-2147483620l-2147483642,-2147483642l-2147483619,-2147483618l-2147483642,-2147483642l-2147483642,-2147483642l-2147483617,-2147483616l-2147483639,0l-2147483642,-2147483642l-2147483615,-2147483614xel-2147483642,-2147483642l-2147483613,-2147483612l-2147483642,-2147483642l-2147483611,-2147483610l-2147483638,-2147483633l-2147483642,-2147483642l-2147483640,-2147483625l-2147483642,-2147483642l-2147483607,-2147483606l-2147483642,-2147483634l-2147483642,-2147483642l-2147483605,-2147483604e">
+            <v:shape id="shape_0" stroked="t" o:allowincell="f" style="position:absolute;margin-left:412.55pt;margin-top:773.15pt;width:27.95pt;height:47.2pt;mso-wrap-style:none;v-text-anchor:middle;rotation:90;mso-position-horizontal-relative:margin;mso-position-vertical-relative:page" wp14:anchorId="7E31E2B7" type="_x0000_t186" path="l-2147483642,-2147483642l-2147483623,-2147483622l-2147483642,-2147483634l-2147483642,-2147483642l-2147483621,-2147483620l-2147483642,-2147483642l-2147483619,-2147483618l-2147483642,-2147483642l-2147483642,-2147483642l-2147483617,-2147483616l-2147483639,0l-2147483642,-2147483642l-2147483615,-2147483614xel-2147483642,-2147483642l-2147483613,-2147483612l-2147483642,-2147483642l-2147483611,-2147483610l-2147483638,-2147483633l-2147483642,-2147483642l-2147483640,-2147483625l-2147483642,-2147483642l-2147483607,-2147483606l-2147483642,-2147483634l-2147483642,-2147483642l-2147483605,-2147483604e">
               <v:fill o:detectmouseclick="t" on="false"/>
               <v:stroke color="#d9d9d9" joinstyle="round" endcap="flat"/>
               <v:textbox>
@@ -30681,13 +31205,13 @@
       <mc:AlternateContent>
         <mc:Choice Requires="wps">
           <w:drawing>
-            <wp:anchor distT="0" distB="0" distL="101600" distR="114300" simplePos="0" relativeHeight="113" behindDoc="1" locked="0" layoutInCell="0" allowOverlap="1" wp14:anchorId="1A5B76DB">
+            <wp:anchor distT="0" distB="0" distL="97790" distR="114300" simplePos="0" relativeHeight="124" behindDoc="1" locked="0" layoutInCell="0" allowOverlap="1" wp14:anchorId="1A5B76DB">
               <wp:simplePos x="0" y="0"/>
               <wp:positionH relativeFrom="margin">
-                <wp:posOffset>5331460</wp:posOffset>
+                <wp:posOffset>5330190</wp:posOffset>
               </wp:positionH>
               <wp:positionV relativeFrom="page">
-                <wp:posOffset>9916160</wp:posOffset>
+                <wp:posOffset>9917430</wp:posOffset>
               </wp:positionV>
               <wp:extent cx="473710" cy="376555"/>
               <wp:effectExtent l="0" t="0" r="0" b="0"/>
@@ -30797,7 +31321,7 @@
         </mc:Choice>
         <mc:Fallback>
           <w:pict>
-            <v:shape id="shape_0" stroked="f" o:allowincell="f" style="position:absolute;margin-left:419.8pt;margin-top:780.75pt;width:37.25pt;height:29.6pt;mso-wrap-style:square;v-text-anchor:middle;rotation:90;mso-position-horizontal-relative:margin;mso-position-vertical-relative:page" wp14:anchorId="1A5B76DB" type="_x0000_t186" path="l-2147483642,-2147483642l-2147483623,-2147483622l-2147483642,-2147483634l-2147483642,-2147483642l-2147483621,-2147483620l-2147483642,-2147483642l-2147483619,-2147483618l-2147483642,-2147483642l-2147483642,-2147483642l-2147483617,-2147483616l-2147483639,0l-2147483642,-2147483642l-2147483615,-2147483614xel-2147483642,-2147483642l-2147483613,-2147483612l-2147483642,-2147483642l-2147483611,-2147483610l-2147483638,-2147483633l-2147483642,-2147483642l-2147483640,-2147483625l-2147483642,-2147483642l-2147483607,-2147483606l-2147483642,-2147483634l-2147483642,-2147483642l-2147483605,-2147483604e">
+            <v:shape id="shape_0" stroked="f" o:allowincell="f" style="position:absolute;margin-left:419.7pt;margin-top:780.85pt;width:37.25pt;height:29.6pt;mso-wrap-style:square;v-text-anchor:middle;rotation:90;mso-position-horizontal-relative:margin;mso-position-vertical-relative:page" wp14:anchorId="1A5B76DB" type="_x0000_t186" path="l-2147483642,-2147483642l-2147483623,-2147483622l-2147483642,-2147483634l-2147483642,-2147483642l-2147483621,-2147483620l-2147483642,-2147483642l-2147483619,-2147483618l-2147483642,-2147483642l-2147483642,-2147483642l-2147483617,-2147483616l-2147483639,0l-2147483642,-2147483642l-2147483615,-2147483614xel-2147483642,-2147483642l-2147483613,-2147483612l-2147483642,-2147483642l-2147483611,-2147483610l-2147483638,-2147483633l-2147483642,-2147483642l-2147483640,-2147483625l-2147483642,-2147483642l-2147483607,-2147483606l-2147483642,-2147483634l-2147483642,-2147483642l-2147483605,-2147483604e">
               <v:fill o:detectmouseclick="t" on="false"/>
               <v:stroke color="#3465a4" joinstyle="round" endcap="flat"/>
               <v:textbox>
@@ -30940,13 +31464,13 @@
       <mc:AlternateContent>
         <mc:Choice Requires="wps">
           <w:drawing>
-            <wp:anchor distT="1270" distB="1270" distL="1270" distR="1270" simplePos="0" relativeHeight="111" behindDoc="1" locked="0" layoutInCell="0" allowOverlap="1" wp14:anchorId="7E31E2B7">
+            <wp:anchor distT="1270" distB="1270" distL="1270" distR="1270" simplePos="0" relativeHeight="122" behindDoc="1" locked="0" layoutInCell="0" allowOverlap="1" wp14:anchorId="7E31E2B7">
               <wp:simplePos x="0" y="0"/>
               <wp:positionH relativeFrom="margin">
-                <wp:posOffset>5241290</wp:posOffset>
+                <wp:posOffset>5240020</wp:posOffset>
               </wp:positionH>
               <wp:positionV relativeFrom="page">
-                <wp:posOffset>9817735</wp:posOffset>
+                <wp:posOffset>9819005</wp:posOffset>
               </wp:positionV>
               <wp:extent cx="355600" cy="600075"/>
               <wp:effectExtent l="1270" t="1270" r="1270" b="1270"/>
@@ -31020,7 +31544,7 @@
         </mc:Choice>
         <mc:Fallback>
           <w:pict>
-            <v:shape id="shape_0" stroked="t" o:allowincell="f" style="position:absolute;margin-left:412.65pt;margin-top:773.05pt;width:27.95pt;height:47.2pt;mso-wrap-style:none;v-text-anchor:middle;rotation:90;mso-position-horizontal-relative:margin;mso-position-vertical-relative:page" wp14:anchorId="7E31E2B7" type="_x0000_t186" path="l-2147483642,-2147483642l-2147483623,-2147483622l-2147483642,-2147483634l-2147483642,-2147483642l-2147483621,-2147483620l-2147483642,-2147483642l-2147483619,-2147483618l-2147483642,-2147483642l-2147483642,-2147483642l-2147483617,-2147483616l-2147483639,0l-2147483642,-2147483642l-2147483615,-2147483614xel-2147483642,-2147483642l-2147483613,-2147483612l-2147483642,-2147483642l-2147483611,-2147483610l-2147483638,-2147483633l-2147483642,-2147483642l-2147483640,-2147483625l-2147483642,-2147483642l-2147483607,-2147483606l-2147483642,-2147483634l-2147483642,-2147483642l-2147483605,-2147483604e">
+            <v:shape id="shape_0" stroked="t" o:allowincell="f" style="position:absolute;margin-left:412.55pt;margin-top:773.15pt;width:27.95pt;height:47.2pt;mso-wrap-style:none;v-text-anchor:middle;rotation:90;mso-position-horizontal-relative:margin;mso-position-vertical-relative:page" wp14:anchorId="7E31E2B7" type="_x0000_t186" path="l-2147483642,-2147483642l-2147483623,-2147483622l-2147483642,-2147483634l-2147483642,-2147483642l-2147483621,-2147483620l-2147483642,-2147483642l-2147483619,-2147483618l-2147483642,-2147483642l-2147483642,-2147483642l-2147483617,-2147483616l-2147483639,0l-2147483642,-2147483642l-2147483615,-2147483614xel-2147483642,-2147483642l-2147483613,-2147483612l-2147483642,-2147483642l-2147483611,-2147483610l-2147483638,-2147483633l-2147483642,-2147483642l-2147483640,-2147483625l-2147483642,-2147483642l-2147483607,-2147483606l-2147483642,-2147483634l-2147483642,-2147483642l-2147483605,-2147483604e">
               <v:fill o:detectmouseclick="t" on="false"/>
               <v:stroke color="#d9d9d9" joinstyle="round" endcap="flat"/>
               <v:textbox>
@@ -31061,13 +31585,13 @@
       <mc:AlternateContent>
         <mc:Choice Requires="wps">
           <w:drawing>
-            <wp:anchor distT="0" distB="0" distL="101600" distR="114300" simplePos="0" relativeHeight="113" behindDoc="1" locked="0" layoutInCell="0" allowOverlap="1" wp14:anchorId="1A5B76DB">
+            <wp:anchor distT="0" distB="0" distL="97790" distR="114300" simplePos="0" relativeHeight="124" behindDoc="1" locked="0" layoutInCell="0" allowOverlap="1" wp14:anchorId="1A5B76DB">
               <wp:simplePos x="0" y="0"/>
               <wp:positionH relativeFrom="margin">
-                <wp:posOffset>5331460</wp:posOffset>
+                <wp:posOffset>5330190</wp:posOffset>
               </wp:positionH>
               <wp:positionV relativeFrom="page">
-                <wp:posOffset>9916160</wp:posOffset>
+                <wp:posOffset>9917430</wp:posOffset>
               </wp:positionV>
               <wp:extent cx="473710" cy="376555"/>
               <wp:effectExtent l="0" t="0" r="0" b="0"/>
@@ -31177,7 +31701,7 @@
         </mc:Choice>
         <mc:Fallback>
           <w:pict>
-            <v:shape id="shape_0" stroked="f" o:allowincell="f" style="position:absolute;margin-left:419.8pt;margin-top:780.75pt;width:37.25pt;height:29.6pt;mso-wrap-style:square;v-text-anchor:middle;rotation:90;mso-position-horizontal-relative:margin;mso-position-vertical-relative:page" wp14:anchorId="1A5B76DB" type="_x0000_t186" path="l-2147483642,-2147483642l-2147483623,-2147483622l-2147483642,-2147483634l-2147483642,-2147483642l-2147483621,-2147483620l-2147483642,-2147483642l-2147483619,-2147483618l-2147483642,-2147483642l-2147483642,-2147483642l-2147483617,-2147483616l-2147483639,0l-2147483642,-2147483642l-2147483615,-2147483614xel-2147483642,-2147483642l-2147483613,-2147483612l-2147483642,-2147483642l-2147483611,-2147483610l-2147483638,-2147483633l-2147483642,-2147483642l-2147483640,-2147483625l-2147483642,-2147483642l-2147483607,-2147483606l-2147483642,-2147483634l-2147483642,-2147483642l-2147483605,-2147483604e">
+            <v:shape id="shape_0" stroked="f" o:allowincell="f" style="position:absolute;margin-left:419.7pt;margin-top:780.85pt;width:37.25pt;height:29.6pt;mso-wrap-style:square;v-text-anchor:middle;rotation:90;mso-position-horizontal-relative:margin;mso-position-vertical-relative:page" wp14:anchorId="1A5B76DB" type="_x0000_t186" path="l-2147483642,-2147483642l-2147483623,-2147483622l-2147483642,-2147483634l-2147483642,-2147483642l-2147483621,-2147483620l-2147483642,-2147483642l-2147483619,-2147483618l-2147483642,-2147483642l-2147483642,-2147483642l-2147483617,-2147483616l-2147483639,0l-2147483642,-2147483642l-2147483615,-2147483614xel-2147483642,-2147483642l-2147483613,-2147483612l-2147483642,-2147483642l-2147483611,-2147483610l-2147483638,-2147483633l-2147483642,-2147483642l-2147483640,-2147483625l-2147483642,-2147483642l-2147483607,-2147483606l-2147483642,-2147483634l-2147483642,-2147483642l-2147483605,-2147483604e">
               <v:fill o:detectmouseclick="t" on="false"/>
               <v:stroke color="#3465a4" joinstyle="round" endcap="flat"/>
               <v:textbox>
@@ -31334,13 +31858,13 @@
       <mc:AlternateContent>
         <mc:Choice Requires="wps">
           <w:drawing>
-            <wp:anchor distT="0" distB="0" distL="101600" distR="114300" simplePos="0" relativeHeight="5" behindDoc="1" locked="0" layoutInCell="0" allowOverlap="1" wp14:anchorId="1A5B76DB">
+            <wp:anchor distT="0" distB="0" distL="97790" distR="114300" simplePos="0" relativeHeight="8" behindDoc="1" locked="0" layoutInCell="0" allowOverlap="1" wp14:anchorId="1A5B76DB">
               <wp:simplePos x="0" y="0"/>
               <wp:positionH relativeFrom="margin">
-                <wp:posOffset>5331460</wp:posOffset>
+                <wp:posOffset>5330190</wp:posOffset>
               </wp:positionH>
               <wp:positionV relativeFrom="page">
-                <wp:posOffset>9916160</wp:posOffset>
+                <wp:posOffset>9917430</wp:posOffset>
               </wp:positionV>
               <wp:extent cx="473710" cy="376555"/>
               <wp:effectExtent l="0" t="0" r="0" b="0"/>
@@ -31457,7 +31981,7 @@
         </mc:Choice>
         <mc:Fallback>
           <w:pict>
-            <v:shape id="shape_0" stroked="f" o:allowincell="f" style="position:absolute;margin-left:419.8pt;margin-top:780.75pt;width:37.25pt;height:29.6pt;mso-wrap-style:square;v-text-anchor:middle;rotation:90;mso-position-horizontal-relative:margin;mso-position-vertical-relative:page" wp14:anchorId="1A5B76DB" type="_x0000_t186" path="l-2147483642,-2147483642l-2147483623,-2147483622l-2147483642,-2147483634l-2147483642,-2147483642l-2147483621,-2147483620l-2147483642,-2147483642l-2147483619,-2147483618l-2147483642,-2147483642l-2147483642,-2147483642l-2147483617,-2147483616l-2147483639,0l-2147483642,-2147483642l-2147483615,-2147483614xel-2147483642,-2147483642l-2147483613,-2147483612l-2147483642,-2147483642l-2147483611,-2147483610l-2147483638,-2147483633l-2147483642,-2147483642l-2147483640,-2147483625l-2147483642,-2147483642l-2147483607,-2147483606l-2147483642,-2147483634l-2147483642,-2147483642l-2147483605,-2147483604e">
+            <v:shape id="shape_0" stroked="f" o:allowincell="f" style="position:absolute;margin-left:419.7pt;margin-top:780.85pt;width:37.25pt;height:29.6pt;mso-wrap-style:square;v-text-anchor:middle;rotation:90;mso-position-horizontal-relative:margin;mso-position-vertical-relative:page" wp14:anchorId="1A5B76DB" type="_x0000_t186" path="l-2147483642,-2147483642l-2147483623,-2147483622l-2147483642,-2147483634l-2147483642,-2147483642l-2147483621,-2147483620l-2147483642,-2147483642l-2147483619,-2147483618l-2147483642,-2147483642l-2147483642,-2147483642l-2147483617,-2147483616l-2147483639,0l-2147483642,-2147483642l-2147483615,-2147483614xel-2147483642,-2147483642l-2147483613,-2147483612l-2147483642,-2147483642l-2147483611,-2147483610l-2147483638,-2147483633l-2147483642,-2147483642l-2147483640,-2147483625l-2147483642,-2147483642l-2147483607,-2147483606l-2147483642,-2147483634l-2147483642,-2147483642l-2147483605,-2147483604e">
               <v:fill o:detectmouseclick="t" on="false"/>
               <v:stroke color="#3465a4" joinstyle="round" endcap="flat"/>
               <v:textbox>
@@ -31543,13 +32067,13 @@
       <mc:AlternateContent>
         <mc:Choice Requires="wps">
           <w:drawing>
-            <wp:anchor distT="1270" distB="1270" distL="1270" distR="1270" simplePos="0" relativeHeight="98" behindDoc="1" locked="0" layoutInCell="0" allowOverlap="1" wp14:anchorId="7E31E2B7">
+            <wp:anchor distT="1270" distB="1270" distL="1270" distR="1270" simplePos="0" relativeHeight="106" behindDoc="1" locked="0" layoutInCell="0" allowOverlap="1" wp14:anchorId="7E31E2B7">
               <wp:simplePos x="0" y="0"/>
               <wp:positionH relativeFrom="margin">
-                <wp:posOffset>5241290</wp:posOffset>
+                <wp:posOffset>5240020</wp:posOffset>
               </wp:positionH>
               <wp:positionV relativeFrom="page">
-                <wp:posOffset>9817735</wp:posOffset>
+                <wp:posOffset>9819005</wp:posOffset>
               </wp:positionV>
               <wp:extent cx="355600" cy="600075"/>
               <wp:effectExtent l="1270" t="1270" r="1270" b="1270"/>
@@ -31623,7 +32147,7 @@
         </mc:Choice>
         <mc:Fallback>
           <w:pict>
-            <v:shape id="shape_0" stroked="t" o:allowincell="f" style="position:absolute;margin-left:412.65pt;margin-top:773.05pt;width:27.95pt;height:47.2pt;mso-wrap-style:none;v-text-anchor:middle;rotation:90;mso-position-horizontal-relative:margin;mso-position-vertical-relative:page" wp14:anchorId="7E31E2B7" type="_x0000_t186" path="l-2147483642,-2147483642l-2147483623,-2147483622l-2147483642,-2147483634l-2147483642,-2147483642l-2147483621,-2147483620l-2147483642,-2147483642l-2147483619,-2147483618l-2147483642,-2147483642l-2147483642,-2147483642l-2147483617,-2147483616l-2147483639,0l-2147483642,-2147483642l-2147483615,-2147483614xel-2147483642,-2147483642l-2147483613,-2147483612l-2147483642,-2147483642l-2147483611,-2147483610l-2147483638,-2147483633l-2147483642,-2147483642l-2147483640,-2147483625l-2147483642,-2147483642l-2147483607,-2147483606l-2147483642,-2147483634l-2147483642,-2147483642l-2147483605,-2147483604e">
+            <v:shape id="shape_0" stroked="t" o:allowincell="f" style="position:absolute;margin-left:412.55pt;margin-top:773.15pt;width:27.95pt;height:47.2pt;mso-wrap-style:none;v-text-anchor:middle;rotation:90;mso-position-horizontal-relative:margin;mso-position-vertical-relative:page" wp14:anchorId="7E31E2B7" type="_x0000_t186" path="l-2147483642,-2147483642l-2147483623,-2147483622l-2147483642,-2147483634l-2147483642,-2147483642l-2147483621,-2147483620l-2147483642,-2147483642l-2147483619,-2147483618l-2147483642,-2147483642l-2147483642,-2147483642l-2147483617,-2147483616l-2147483639,0l-2147483642,-2147483642l-2147483615,-2147483614xel-2147483642,-2147483642l-2147483613,-2147483612l-2147483642,-2147483642l-2147483611,-2147483610l-2147483638,-2147483633l-2147483642,-2147483642l-2147483640,-2147483625l-2147483642,-2147483642l-2147483607,-2147483606l-2147483642,-2147483634l-2147483642,-2147483642l-2147483605,-2147483604e">
               <v:fill o:detectmouseclick="t" on="false"/>
               <v:stroke color="#d9d9d9" joinstyle="round" endcap="flat"/>
               <v:textbox>
@@ -31728,13 +32252,13 @@
       <mc:AlternateContent>
         <mc:Choice Requires="wps">
           <w:drawing>
-            <wp:anchor distT="0" distB="0" distL="101600" distR="114300" simplePos="0" relativeHeight="5" behindDoc="1" locked="0" layoutInCell="0" allowOverlap="1" wp14:anchorId="1A5B76DB">
+            <wp:anchor distT="0" distB="0" distL="97790" distR="114300" simplePos="0" relativeHeight="8" behindDoc="1" locked="0" layoutInCell="0" allowOverlap="1" wp14:anchorId="1A5B76DB">
               <wp:simplePos x="0" y="0"/>
               <wp:positionH relativeFrom="margin">
-                <wp:posOffset>5331460</wp:posOffset>
+                <wp:posOffset>5330190</wp:posOffset>
               </wp:positionH>
               <wp:positionV relativeFrom="page">
-                <wp:posOffset>9916160</wp:posOffset>
+                <wp:posOffset>9917430</wp:posOffset>
               </wp:positionV>
               <wp:extent cx="473710" cy="376555"/>
               <wp:effectExtent l="0" t="0" r="0" b="0"/>
@@ -31851,7 +32375,7 @@
         </mc:Choice>
         <mc:Fallback>
           <w:pict>
-            <v:shape id="shape_0" stroked="f" o:allowincell="f" style="position:absolute;margin-left:419.8pt;margin-top:780.75pt;width:37.25pt;height:29.6pt;mso-wrap-style:square;v-text-anchor:middle;rotation:90;mso-position-horizontal-relative:margin;mso-position-vertical-relative:page" wp14:anchorId="1A5B76DB" type="_x0000_t186" path="l-2147483642,-2147483642l-2147483623,-2147483622l-2147483642,-2147483634l-2147483642,-2147483642l-2147483621,-2147483620l-2147483642,-2147483642l-2147483619,-2147483618l-2147483642,-2147483642l-2147483642,-2147483642l-2147483617,-2147483616l-2147483639,0l-2147483642,-2147483642l-2147483615,-2147483614xel-2147483642,-2147483642l-2147483613,-2147483612l-2147483642,-2147483642l-2147483611,-2147483610l-2147483638,-2147483633l-2147483642,-2147483642l-2147483640,-2147483625l-2147483642,-2147483642l-2147483607,-2147483606l-2147483642,-2147483634l-2147483642,-2147483642l-2147483605,-2147483604e">
+            <v:shape id="shape_0" stroked="f" o:allowincell="f" style="position:absolute;margin-left:419.7pt;margin-top:780.85pt;width:37.25pt;height:29.6pt;mso-wrap-style:square;v-text-anchor:middle;rotation:90;mso-position-horizontal-relative:margin;mso-position-vertical-relative:page" wp14:anchorId="1A5B76DB" type="_x0000_t186" path="l-2147483642,-2147483642l-2147483623,-2147483622l-2147483642,-2147483634l-2147483642,-2147483642l-2147483621,-2147483620l-2147483642,-2147483642l-2147483619,-2147483618l-2147483642,-2147483642l-2147483642,-2147483642l-2147483617,-2147483616l-2147483639,0l-2147483642,-2147483642l-2147483615,-2147483614xel-2147483642,-2147483642l-2147483613,-2147483612l-2147483642,-2147483642l-2147483611,-2147483610l-2147483638,-2147483633l-2147483642,-2147483642l-2147483640,-2147483625l-2147483642,-2147483642l-2147483607,-2147483606l-2147483642,-2147483634l-2147483642,-2147483642l-2147483605,-2147483604e">
               <v:fill o:detectmouseclick="t" on="false"/>
               <v:stroke color="#3465a4" joinstyle="round" endcap="flat"/>
               <v:textbox>
@@ -31937,13 +32461,13 @@
       <mc:AlternateContent>
         <mc:Choice Requires="wps">
           <w:drawing>
-            <wp:anchor distT="1270" distB="1270" distL="1270" distR="1270" simplePos="0" relativeHeight="98" behindDoc="1" locked="0" layoutInCell="0" allowOverlap="1" wp14:anchorId="7E31E2B7">
+            <wp:anchor distT="1270" distB="1270" distL="1270" distR="1270" simplePos="0" relativeHeight="106" behindDoc="1" locked="0" layoutInCell="0" allowOverlap="1" wp14:anchorId="7E31E2B7">
               <wp:simplePos x="0" y="0"/>
               <wp:positionH relativeFrom="margin">
-                <wp:posOffset>5241290</wp:posOffset>
+                <wp:posOffset>5240020</wp:posOffset>
               </wp:positionH>
               <wp:positionV relativeFrom="page">
-                <wp:posOffset>9817735</wp:posOffset>
+                <wp:posOffset>9819005</wp:posOffset>
               </wp:positionV>
               <wp:extent cx="355600" cy="600075"/>
               <wp:effectExtent l="1270" t="1270" r="1270" b="1270"/>
@@ -32017,7 +32541,7 @@
         </mc:Choice>
         <mc:Fallback>
           <w:pict>
-            <v:shape id="shape_0" stroked="t" o:allowincell="f" style="position:absolute;margin-left:412.65pt;margin-top:773.05pt;width:27.95pt;height:47.2pt;mso-wrap-style:none;v-text-anchor:middle;rotation:90;mso-position-horizontal-relative:margin;mso-position-vertical-relative:page" wp14:anchorId="7E31E2B7" type="_x0000_t186" path="l-2147483642,-2147483642l-2147483623,-2147483622l-2147483642,-2147483634l-2147483642,-2147483642l-2147483621,-2147483620l-2147483642,-2147483642l-2147483619,-2147483618l-2147483642,-2147483642l-2147483642,-2147483642l-2147483617,-2147483616l-2147483639,0l-2147483642,-2147483642l-2147483615,-2147483614xel-2147483642,-2147483642l-2147483613,-2147483612l-2147483642,-2147483642l-2147483611,-2147483610l-2147483638,-2147483633l-2147483642,-2147483642l-2147483640,-2147483625l-2147483642,-2147483642l-2147483607,-2147483606l-2147483642,-2147483634l-2147483642,-2147483642l-2147483605,-2147483604e">
+            <v:shape id="shape_0" stroked="t" o:allowincell="f" style="position:absolute;margin-left:412.55pt;margin-top:773.15pt;width:27.95pt;height:47.2pt;mso-wrap-style:none;v-text-anchor:middle;rotation:90;mso-position-horizontal-relative:margin;mso-position-vertical-relative:page" wp14:anchorId="7E31E2B7" type="_x0000_t186" path="l-2147483642,-2147483642l-2147483623,-2147483622l-2147483642,-2147483634l-2147483642,-2147483642l-2147483621,-2147483620l-2147483642,-2147483642l-2147483619,-2147483618l-2147483642,-2147483642l-2147483642,-2147483642l-2147483617,-2147483616l-2147483639,0l-2147483642,-2147483642l-2147483615,-2147483614xel-2147483642,-2147483642l-2147483613,-2147483612l-2147483642,-2147483642l-2147483611,-2147483610l-2147483638,-2147483633l-2147483642,-2147483642l-2147483640,-2147483625l-2147483642,-2147483642l-2147483607,-2147483606l-2147483642,-2147483634l-2147483642,-2147483642l-2147483605,-2147483604e">
               <v:fill o:detectmouseclick="t" on="false"/>
               <v:stroke color="#d9d9d9" joinstyle="round" endcap="flat"/>
               <v:textbox>
@@ -32149,8 +32673,8 @@
     </w:tblPr>
     <w:tblGrid>
       <w:gridCol w:w="2976"/>
-      <w:gridCol w:w="2403"/>
-      <w:gridCol w:w="4369"/>
+      <w:gridCol w:w="2401"/>
+      <w:gridCol w:w="4371"/>
     </w:tblGrid>
     <w:tr>
       <w:trPr>
@@ -32193,7 +32717,7 @@
       </w:tc>
       <w:tc>
         <w:tcPr>
-          <w:tcW w:w="2403" w:type="dxa"/>
+          <w:tcW w:w="2401" w:type="dxa"/>
           <w:tcBorders>
             <w:top w:val="nil"/>
             <w:start w:val="nil"/>
@@ -32228,7 +32752,7 @@
       </w:tc>
       <w:tc>
         <w:tcPr>
-          <w:tcW w:w="4369" w:type="dxa"/>
+          <w:tcW w:w="4371" w:type="dxa"/>
           <w:tcBorders>
             <w:top w:val="nil"/>
             <w:start w:val="nil"/>
@@ -32418,7 +32942,7 @@
       </w:tc>
       <w:tc>
         <w:tcPr>
-          <w:tcW w:w="2403" w:type="dxa"/>
+          <w:tcW w:w="2401" w:type="dxa"/>
           <w:tcBorders>
             <w:top w:val="nil"/>
             <w:start w:val="nil"/>
@@ -32453,7 +32977,7 @@
       </w:tc>
       <w:tc>
         <w:tcPr>
-          <w:tcW w:w="4369" w:type="dxa"/>
+          <w:tcW w:w="4371" w:type="dxa"/>
           <w:tcBorders>
             <w:top w:val="nil"/>
             <w:start w:val="nil"/>
@@ -32532,7 +33056,7 @@
       </w:tc>
       <w:tc>
         <w:tcPr>
-          <w:tcW w:w="2403" w:type="dxa"/>
+          <w:tcW w:w="2401" w:type="dxa"/>
           <w:tcBorders>
             <w:top w:val="nil"/>
             <w:start w:val="nil"/>
@@ -32567,7 +33091,7 @@
       </w:tc>
       <w:tc>
         <w:tcPr>
-          <w:tcW w:w="4369" w:type="dxa"/>
+          <w:tcW w:w="4371" w:type="dxa"/>
           <w:tcBorders>
             <w:top w:val="nil"/>
             <w:start w:val="nil"/>
@@ -32633,8 +33157,8 @@
     </w:tblPr>
     <w:tblGrid>
       <w:gridCol w:w="2976"/>
-      <w:gridCol w:w="2403"/>
-      <w:gridCol w:w="4369"/>
+      <w:gridCol w:w="2401"/>
+      <w:gridCol w:w="4371"/>
     </w:tblGrid>
     <w:tr>
       <w:trPr>
@@ -32677,7 +33201,7 @@
       </w:tc>
       <w:tc>
         <w:tcPr>
-          <w:tcW w:w="2403" w:type="dxa"/>
+          <w:tcW w:w="2401" w:type="dxa"/>
           <w:tcBorders>
             <w:top w:val="nil"/>
             <w:start w:val="nil"/>
@@ -32712,7 +33236,7 @@
       </w:tc>
       <w:tc>
         <w:tcPr>
-          <w:tcW w:w="4369" w:type="dxa"/>
+          <w:tcW w:w="4371" w:type="dxa"/>
           <w:tcBorders>
             <w:top w:val="nil"/>
             <w:start w:val="nil"/>
@@ -32902,7 +33426,7 @@
       </w:tc>
       <w:tc>
         <w:tcPr>
-          <w:tcW w:w="2403" w:type="dxa"/>
+          <w:tcW w:w="2401" w:type="dxa"/>
           <w:tcBorders>
             <w:top w:val="nil"/>
             <w:start w:val="nil"/>
@@ -32937,7 +33461,7 @@
       </w:tc>
       <w:tc>
         <w:tcPr>
-          <w:tcW w:w="4369" w:type="dxa"/>
+          <w:tcW w:w="4371" w:type="dxa"/>
           <w:tcBorders>
             <w:top w:val="nil"/>
             <w:start w:val="nil"/>
@@ -33016,7 +33540,7 @@
       </w:tc>
       <w:tc>
         <w:tcPr>
-          <w:tcW w:w="2403" w:type="dxa"/>
+          <w:tcW w:w="2401" w:type="dxa"/>
           <w:tcBorders>
             <w:top w:val="nil"/>
             <w:start w:val="nil"/>
@@ -33051,7 +33575,7 @@
       </w:tc>
       <w:tc>
         <w:tcPr>
-          <w:tcW w:w="4369" w:type="dxa"/>
+          <w:tcW w:w="4371" w:type="dxa"/>
           <w:tcBorders>
             <w:top w:val="nil"/>
             <w:start w:val="nil"/>
@@ -33158,10 +33682,10 @@
       <w:tblLook w:noHBand="0" w:noVBand="1" w:firstColumn="1" w:lastRow="0" w:lastColumn="0" w:firstRow="1" w:val="04a0"/>
     </w:tblPr>
     <w:tblGrid>
-      <w:gridCol w:w="2014"/>
-      <w:gridCol w:w="2958"/>
-      <w:gridCol w:w="2378"/>
-      <w:gridCol w:w="2398"/>
+      <w:gridCol w:w="2012"/>
+      <w:gridCol w:w="2960"/>
+      <w:gridCol w:w="2377"/>
+      <w:gridCol w:w="2399"/>
     </w:tblGrid>
     <w:tr>
       <w:trPr>
@@ -33169,7 +33693,7 @@
       </w:trPr>
       <w:tc>
         <w:tcPr>
-          <w:tcW w:w="2014" w:type="dxa"/>
+          <w:tcW w:w="2012" w:type="dxa"/>
           <w:vMerge w:val="restart"/>
           <w:tcBorders>
             <w:top w:val="nil"/>
@@ -33237,7 +33761,7 @@
       </w:tc>
       <w:tc>
         <w:tcPr>
-          <w:tcW w:w="2958" w:type="dxa"/>
+          <w:tcW w:w="2960" w:type="dxa"/>
           <w:tcBorders>
             <w:top w:val="nil"/>
             <w:start w:val="nil"/>
@@ -33272,7 +33796,7 @@
       </w:tc>
       <w:tc>
         <w:tcPr>
-          <w:tcW w:w="2378" w:type="dxa"/>
+          <w:tcW w:w="2377" w:type="dxa"/>
           <w:tcBorders>
             <w:top w:val="nil"/>
             <w:start w:val="nil"/>
@@ -33307,7 +33831,7 @@
       </w:tc>
       <w:tc>
         <w:tcPr>
-          <w:tcW w:w="2398" w:type="dxa"/>
+          <w:tcW w:w="2399" w:type="dxa"/>
           <w:tcBorders>
             <w:top w:val="nil"/>
             <w:start w:val="nil"/>
@@ -33347,7 +33871,7 @@
       </w:trPr>
       <w:tc>
         <w:tcPr>
-          <w:tcW w:w="2014" w:type="dxa"/>
+          <w:tcW w:w="2012" w:type="dxa"/>
           <w:vMerge w:val="continue"/>
           <w:tcBorders>
             <w:top w:val="nil"/>
@@ -33378,7 +33902,7 @@
       </w:tc>
       <w:tc>
         <w:tcPr>
-          <w:tcW w:w="7734" w:type="dxa"/>
+          <w:tcW w:w="7736" w:type="dxa"/>
           <w:gridSpan w:val="3"/>
           <w:tcBorders>
             <w:top w:val="single" w:sz="4" w:space="0" w:color="BFBFBF"/>
@@ -33449,7 +33973,7 @@
       </w:trPr>
       <w:tc>
         <w:tcPr>
-          <w:tcW w:w="2014" w:type="dxa"/>
+          <w:tcW w:w="2012" w:type="dxa"/>
           <w:vMerge w:val="continue"/>
           <w:tcBorders>
             <w:top w:val="nil"/>
@@ -33480,7 +34004,7 @@
       </w:tc>
       <w:tc>
         <w:tcPr>
-          <w:tcW w:w="7734" w:type="dxa"/>
+          <w:tcW w:w="7736" w:type="dxa"/>
           <w:gridSpan w:val="3"/>
           <w:tcBorders>
             <w:top w:val="single" w:sz="18" w:space="0" w:color="BFBFBF"/>
@@ -33520,7 +34044,7 @@
       </w:trPr>
       <w:tc>
         <w:tcPr>
-          <w:tcW w:w="2014" w:type="dxa"/>
+          <w:tcW w:w="2012" w:type="dxa"/>
           <w:vMerge w:val="continue"/>
           <w:tcBorders>
             <w:top w:val="nil"/>
@@ -33551,7 +34075,7 @@
       </w:tc>
       <w:tc>
         <w:tcPr>
-          <w:tcW w:w="2958" w:type="dxa"/>
+          <w:tcW w:w="2960" w:type="dxa"/>
           <w:tcBorders>
             <w:top w:val="nil"/>
             <w:start w:val="nil"/>
@@ -33586,7 +34110,7 @@
       </w:tc>
       <w:tc>
         <w:tcPr>
-          <w:tcW w:w="2378" w:type="dxa"/>
+          <w:tcW w:w="2377" w:type="dxa"/>
           <w:tcBorders>
             <w:top w:val="nil"/>
             <w:start w:val="nil"/>
@@ -33621,7 +34145,7 @@
       </w:tc>
       <w:tc>
         <w:tcPr>
-          <w:tcW w:w="2398" w:type="dxa"/>
+          <w:tcW w:w="2399" w:type="dxa"/>
           <w:tcBorders>
             <w:top w:val="nil"/>
             <w:start w:val="nil"/>
@@ -33665,7 +34189,7 @@
       </w:trPr>
       <w:tc>
         <w:tcPr>
-          <w:tcW w:w="2014" w:type="dxa"/>
+          <w:tcW w:w="2012" w:type="dxa"/>
           <w:vMerge w:val="continue"/>
           <w:tcBorders>
             <w:top w:val="nil"/>
@@ -33701,7 +34225,7 @@
       </w:tc>
       <w:tc>
         <w:tcPr>
-          <w:tcW w:w="2958" w:type="dxa"/>
+          <w:tcW w:w="2960" w:type="dxa"/>
           <w:tcBorders>
             <w:top w:val="nil"/>
             <w:start w:val="nil"/>
@@ -33736,7 +34260,7 @@
       </w:tc>
       <w:tc>
         <w:tcPr>
-          <w:tcW w:w="2378" w:type="dxa"/>
+          <w:tcW w:w="2377" w:type="dxa"/>
           <w:tcBorders>
             <w:top w:val="nil"/>
             <w:start w:val="nil"/>
@@ -33771,7 +34295,7 @@
       </w:tc>
       <w:tc>
         <w:tcPr>
-          <w:tcW w:w="2398" w:type="dxa"/>
+          <w:tcW w:w="2399" w:type="dxa"/>
           <w:tcBorders>
             <w:top w:val="nil"/>
             <w:start w:val="nil"/>
@@ -33836,10 +34360,10 @@
       <w:tblLook w:noHBand="0" w:noVBand="1" w:firstColumn="1" w:lastRow="0" w:lastColumn="0" w:firstRow="1" w:val="04a0"/>
     </w:tblPr>
     <w:tblGrid>
-      <w:gridCol w:w="2014"/>
-      <w:gridCol w:w="2958"/>
-      <w:gridCol w:w="2378"/>
-      <w:gridCol w:w="2398"/>
+      <w:gridCol w:w="2012"/>
+      <w:gridCol w:w="2960"/>
+      <w:gridCol w:w="2377"/>
+      <w:gridCol w:w="2399"/>
     </w:tblGrid>
     <w:tr>
       <w:trPr>
@@ -33847,7 +34371,7 @@
       </w:trPr>
       <w:tc>
         <w:tcPr>
-          <w:tcW w:w="2014" w:type="dxa"/>
+          <w:tcW w:w="2012" w:type="dxa"/>
           <w:vMerge w:val="restart"/>
           <w:tcBorders>
             <w:top w:val="nil"/>
@@ -33915,7 +34439,7 @@
       </w:tc>
       <w:tc>
         <w:tcPr>
-          <w:tcW w:w="2958" w:type="dxa"/>
+          <w:tcW w:w="2960" w:type="dxa"/>
           <w:tcBorders>
             <w:top w:val="nil"/>
             <w:start w:val="nil"/>
@@ -33950,7 +34474,7 @@
       </w:tc>
       <w:tc>
         <w:tcPr>
-          <w:tcW w:w="2378" w:type="dxa"/>
+          <w:tcW w:w="2377" w:type="dxa"/>
           <w:tcBorders>
             <w:top w:val="nil"/>
             <w:start w:val="nil"/>
@@ -33985,7 +34509,7 @@
       </w:tc>
       <w:tc>
         <w:tcPr>
-          <w:tcW w:w="2398" w:type="dxa"/>
+          <w:tcW w:w="2399" w:type="dxa"/>
           <w:tcBorders>
             <w:top w:val="nil"/>
             <w:start w:val="nil"/>
@@ -34025,7 +34549,7 @@
       </w:trPr>
       <w:tc>
         <w:tcPr>
-          <w:tcW w:w="2014" w:type="dxa"/>
+          <w:tcW w:w="2012" w:type="dxa"/>
           <w:vMerge w:val="continue"/>
           <w:tcBorders>
             <w:top w:val="nil"/>
@@ -34056,7 +34580,7 @@
       </w:tc>
       <w:tc>
         <w:tcPr>
-          <w:tcW w:w="7734" w:type="dxa"/>
+          <w:tcW w:w="7736" w:type="dxa"/>
           <w:gridSpan w:val="3"/>
           <w:tcBorders>
             <w:top w:val="single" w:sz="4" w:space="0" w:color="BFBFBF"/>
@@ -34127,7 +34651,7 @@
       </w:trPr>
       <w:tc>
         <w:tcPr>
-          <w:tcW w:w="2014" w:type="dxa"/>
+          <w:tcW w:w="2012" w:type="dxa"/>
           <w:vMerge w:val="continue"/>
           <w:tcBorders>
             <w:top w:val="nil"/>
@@ -34158,7 +34682,7 @@
       </w:tc>
       <w:tc>
         <w:tcPr>
-          <w:tcW w:w="7734" w:type="dxa"/>
+          <w:tcW w:w="7736" w:type="dxa"/>
           <w:gridSpan w:val="3"/>
           <w:tcBorders>
             <w:top w:val="single" w:sz="18" w:space="0" w:color="BFBFBF"/>
@@ -34198,7 +34722,7 @@
       </w:trPr>
       <w:tc>
         <w:tcPr>
-          <w:tcW w:w="2014" w:type="dxa"/>
+          <w:tcW w:w="2012" w:type="dxa"/>
           <w:vMerge w:val="continue"/>
           <w:tcBorders>
             <w:top w:val="nil"/>
@@ -34229,7 +34753,7 @@
       </w:tc>
       <w:tc>
         <w:tcPr>
-          <w:tcW w:w="2958" w:type="dxa"/>
+          <w:tcW w:w="2960" w:type="dxa"/>
           <w:tcBorders>
             <w:top w:val="nil"/>
             <w:start w:val="nil"/>
@@ -34264,7 +34788,7 @@
       </w:tc>
       <w:tc>
         <w:tcPr>
-          <w:tcW w:w="2378" w:type="dxa"/>
+          <w:tcW w:w="2377" w:type="dxa"/>
           <w:tcBorders>
             <w:top w:val="nil"/>
             <w:start w:val="nil"/>
@@ -34299,7 +34823,7 @@
       </w:tc>
       <w:tc>
         <w:tcPr>
-          <w:tcW w:w="2398" w:type="dxa"/>
+          <w:tcW w:w="2399" w:type="dxa"/>
           <w:tcBorders>
             <w:top w:val="nil"/>
             <w:start w:val="nil"/>
@@ -34343,7 +34867,7 @@
       </w:trPr>
       <w:tc>
         <w:tcPr>
-          <w:tcW w:w="2014" w:type="dxa"/>
+          <w:tcW w:w="2012" w:type="dxa"/>
           <w:vMerge w:val="continue"/>
           <w:tcBorders>
             <w:top w:val="nil"/>
@@ -34379,7 +34903,7 @@
       </w:tc>
       <w:tc>
         <w:tcPr>
-          <w:tcW w:w="2958" w:type="dxa"/>
+          <w:tcW w:w="2960" w:type="dxa"/>
           <w:tcBorders>
             <w:top w:val="nil"/>
             <w:start w:val="nil"/>
@@ -34414,7 +34938,7 @@
       </w:tc>
       <w:tc>
         <w:tcPr>
-          <w:tcW w:w="2378" w:type="dxa"/>
+          <w:tcW w:w="2377" w:type="dxa"/>
           <w:tcBorders>
             <w:top w:val="nil"/>
             <w:start w:val="nil"/>
@@ -34449,7 +34973,7 @@
       </w:tc>
       <w:tc>
         <w:tcPr>
-          <w:tcW w:w="2398" w:type="dxa"/>
+          <w:tcW w:w="2399" w:type="dxa"/>
           <w:tcBorders>
             <w:top w:val="nil"/>
             <w:start w:val="nil"/>
@@ -34529,8 +35053,8 @@
     </w:tblPr>
     <w:tblGrid>
       <w:gridCol w:w="2976"/>
-      <w:gridCol w:w="2403"/>
-      <w:gridCol w:w="4369"/>
+      <w:gridCol w:w="2401"/>
+      <w:gridCol w:w="4371"/>
     </w:tblGrid>
     <w:tr>
       <w:trPr>
@@ -34573,7 +35097,7 @@
       </w:tc>
       <w:tc>
         <w:tcPr>
-          <w:tcW w:w="2403" w:type="dxa"/>
+          <w:tcW w:w="2401" w:type="dxa"/>
           <w:tcBorders>
             <w:top w:val="nil"/>
             <w:start w:val="nil"/>
@@ -34608,7 +35132,7 @@
       </w:tc>
       <w:tc>
         <w:tcPr>
-          <w:tcW w:w="4369" w:type="dxa"/>
+          <w:tcW w:w="4371" w:type="dxa"/>
           <w:tcBorders>
             <w:top w:val="nil"/>
             <w:start w:val="nil"/>
@@ -34794,7 +35318,7 @@
       </w:tc>
       <w:tc>
         <w:tcPr>
-          <w:tcW w:w="2403" w:type="dxa"/>
+          <w:tcW w:w="2401" w:type="dxa"/>
           <w:tcBorders>
             <w:top w:val="nil"/>
             <w:start w:val="nil"/>
@@ -34829,7 +35353,7 @@
       </w:tc>
       <w:tc>
         <w:tcPr>
-          <w:tcW w:w="4369" w:type="dxa"/>
+          <w:tcW w:w="4371" w:type="dxa"/>
           <w:tcBorders>
             <w:top w:val="nil"/>
             <w:start w:val="nil"/>
@@ -34908,7 +35432,7 @@
       </w:tc>
       <w:tc>
         <w:tcPr>
-          <w:tcW w:w="2403" w:type="dxa"/>
+          <w:tcW w:w="2401" w:type="dxa"/>
           <w:tcBorders>
             <w:top w:val="nil"/>
             <w:start w:val="nil"/>
@@ -34943,7 +35467,7 @@
       </w:tc>
       <w:tc>
         <w:tcPr>
-          <w:tcW w:w="4369" w:type="dxa"/>
+          <w:tcW w:w="4371" w:type="dxa"/>
           <w:tcBorders>
             <w:top w:val="nil"/>
             <w:start w:val="nil"/>
@@ -35009,8 +35533,8 @@
     </w:tblPr>
     <w:tblGrid>
       <w:gridCol w:w="2976"/>
-      <w:gridCol w:w="2403"/>
-      <w:gridCol w:w="4369"/>
+      <w:gridCol w:w="2401"/>
+      <w:gridCol w:w="4371"/>
     </w:tblGrid>
     <w:tr>
       <w:trPr>
@@ -35053,7 +35577,7 @@
       </w:tc>
       <w:tc>
         <w:tcPr>
-          <w:tcW w:w="2403" w:type="dxa"/>
+          <w:tcW w:w="2401" w:type="dxa"/>
           <w:tcBorders>
             <w:top w:val="nil"/>
             <w:start w:val="nil"/>
@@ -35088,7 +35612,7 @@
       </w:tc>
       <w:tc>
         <w:tcPr>
-          <w:tcW w:w="4369" w:type="dxa"/>
+          <w:tcW w:w="4371" w:type="dxa"/>
           <w:tcBorders>
             <w:top w:val="nil"/>
             <w:start w:val="nil"/>
@@ -35274,7 +35798,7 @@
       </w:tc>
       <w:tc>
         <w:tcPr>
-          <w:tcW w:w="2403" w:type="dxa"/>
+          <w:tcW w:w="2401" w:type="dxa"/>
           <w:tcBorders>
             <w:top w:val="nil"/>
             <w:start w:val="nil"/>
@@ -35309,7 +35833,7 @@
       </w:tc>
       <w:tc>
         <w:tcPr>
-          <w:tcW w:w="4369" w:type="dxa"/>
+          <w:tcW w:w="4371" w:type="dxa"/>
           <w:tcBorders>
             <w:top w:val="nil"/>
             <w:start w:val="nil"/>
@@ -35388,7 +35912,7 @@
       </w:tc>
       <w:tc>
         <w:tcPr>
-          <w:tcW w:w="2403" w:type="dxa"/>
+          <w:tcW w:w="2401" w:type="dxa"/>
           <w:tcBorders>
             <w:top w:val="nil"/>
             <w:start w:val="nil"/>
@@ -35423,7 +35947,7 @@
       </w:tc>
       <w:tc>
         <w:tcPr>
-          <w:tcW w:w="4369" w:type="dxa"/>
+          <w:tcW w:w="4371" w:type="dxa"/>
           <w:tcBorders>
             <w:top w:val="nil"/>
             <w:start w:val="nil"/>
@@ -35503,8 +36027,8 @@
     </w:tblPr>
     <w:tblGrid>
       <w:gridCol w:w="2976"/>
-      <w:gridCol w:w="2403"/>
-      <w:gridCol w:w="4369"/>
+      <w:gridCol w:w="2401"/>
+      <w:gridCol w:w="4371"/>
     </w:tblGrid>
     <w:tr>
       <w:trPr>
@@ -35547,7 +36071,7 @@
       </w:tc>
       <w:tc>
         <w:tcPr>
-          <w:tcW w:w="2403" w:type="dxa"/>
+          <w:tcW w:w="2401" w:type="dxa"/>
           <w:tcBorders>
             <w:top w:val="nil"/>
             <w:start w:val="nil"/>
@@ -35582,7 +36106,7 @@
       </w:tc>
       <w:tc>
         <w:tcPr>
-          <w:tcW w:w="4369" w:type="dxa"/>
+          <w:tcW w:w="4371" w:type="dxa"/>
           <w:tcBorders>
             <w:top w:val="nil"/>
             <w:start w:val="nil"/>
@@ -35768,7 +36292,7 @@
       </w:tc>
       <w:tc>
         <w:tcPr>
-          <w:tcW w:w="2403" w:type="dxa"/>
+          <w:tcW w:w="2401" w:type="dxa"/>
           <w:tcBorders>
             <w:top w:val="nil"/>
             <w:start w:val="nil"/>
@@ -35803,7 +36327,7 @@
       </w:tc>
       <w:tc>
         <w:tcPr>
-          <w:tcW w:w="4369" w:type="dxa"/>
+          <w:tcW w:w="4371" w:type="dxa"/>
           <w:tcBorders>
             <w:top w:val="nil"/>
             <w:start w:val="nil"/>
@@ -35882,7 +36406,7 @@
       </w:tc>
       <w:tc>
         <w:tcPr>
-          <w:tcW w:w="2403" w:type="dxa"/>
+          <w:tcW w:w="2401" w:type="dxa"/>
           <w:tcBorders>
             <w:top w:val="nil"/>
             <w:start w:val="nil"/>
@@ -35917,7 +36441,7 @@
       </w:tc>
       <w:tc>
         <w:tcPr>
-          <w:tcW w:w="4369" w:type="dxa"/>
+          <w:tcW w:w="4371" w:type="dxa"/>
           <w:tcBorders>
             <w:top w:val="nil"/>
             <w:start w:val="nil"/>
@@ -35983,8 +36507,8 @@
     </w:tblPr>
     <w:tblGrid>
       <w:gridCol w:w="2976"/>
-      <w:gridCol w:w="2403"/>
-      <w:gridCol w:w="4369"/>
+      <w:gridCol w:w="2401"/>
+      <w:gridCol w:w="4371"/>
     </w:tblGrid>
     <w:tr>
       <w:trPr>
@@ -36027,7 +36551,7 @@
       </w:tc>
       <w:tc>
         <w:tcPr>
-          <w:tcW w:w="2403" w:type="dxa"/>
+          <w:tcW w:w="2401" w:type="dxa"/>
           <w:tcBorders>
             <w:top w:val="nil"/>
             <w:start w:val="nil"/>
@@ -36062,7 +36586,7 @@
       </w:tc>
       <w:tc>
         <w:tcPr>
-          <w:tcW w:w="4369" w:type="dxa"/>
+          <w:tcW w:w="4371" w:type="dxa"/>
           <w:tcBorders>
             <w:top w:val="nil"/>
             <w:start w:val="nil"/>
@@ -36248,7 +36772,7 @@
       </w:tc>
       <w:tc>
         <w:tcPr>
-          <w:tcW w:w="2403" w:type="dxa"/>
+          <w:tcW w:w="2401" w:type="dxa"/>
           <w:tcBorders>
             <w:top w:val="nil"/>
             <w:start w:val="nil"/>
@@ -36283,7 +36807,7 @@
       </w:tc>
       <w:tc>
         <w:tcPr>
-          <w:tcW w:w="4369" w:type="dxa"/>
+          <w:tcW w:w="4371" w:type="dxa"/>
           <w:tcBorders>
             <w:top w:val="nil"/>
             <w:start w:val="nil"/>
@@ -36362,7 +36886,7 @@
       </w:tc>
       <w:tc>
         <w:tcPr>
-          <w:tcW w:w="2403" w:type="dxa"/>
+          <w:tcW w:w="2401" w:type="dxa"/>
           <w:tcBorders>
             <w:top w:val="nil"/>
             <w:start w:val="nil"/>
@@ -36397,7 +36921,7 @@
       </w:tc>
       <w:tc>
         <w:tcPr>
-          <w:tcW w:w="4369" w:type="dxa"/>
+          <w:tcW w:w="4371" w:type="dxa"/>
           <w:tcBorders>
             <w:top w:val="nil"/>
             <w:start w:val="nil"/>
@@ -38511,6 +39035,23 @@
       <w:sz w:val="22"/>
       <w:szCs w:val="22"/>
       <w:lang w:val="fr-FR" w:eastAsia="en-US" w:bidi="ar-SA"/>
+    </w:rPr>
+  </w:style>
+  <w:style w:type="paragraph" w:styleId="Heading1">
+    <w:name w:val="heading 1"/>
+    <w:basedOn w:val="Heading"/>
+    <w:next w:val="BodyText"/>
+    <w:qFormat/>
+    <w:pPr>
+      <w:spacing w:before="240" w:after="120"/>
+      <w:outlineLvl w:val="0"/>
+    </w:pPr>
+    <w:rPr>
+      <w:rFonts w:ascii="Liberation Serif" w:hAnsi="Liberation Serif" w:eastAsia="DejaVu Sans" w:cs="Noto Sans Arabic"/>
+      <w:b/>
+      <w:bCs/>
+      <w:sz w:val="48"/>
+      <w:szCs w:val="48"/>
     </w:rPr>
   </w:style>
   <w:style w:type="character" w:styleId="DefaultParagraphFont" w:default="1">

</xml_diff>

<commit_message>
docs(dp): clarify Social Network = Konekt (school project name vs team name)
Co-Authored-By: Claude Sonnet 4.6 <noreply@anthropic.com>
</commit_message>
<xml_diff>
--- a/dossier-certification/Dossier Professionnel - Lecart Christophe.docx
+++ b/dossier-certification/Dossier Professionnel - Lecart Christophe.docx
@@ -4884,7 +4884,7 @@
                 <w:shd w:fill="FFFFFF" w:val="clear"/>
                 <w:lang w:val="fr-FR" w:eastAsia="en-US" w:bidi="ar-SA"/>
               </w:rPr>
-              <w:t>Dans le cadre du projet Social Network développé à Zone01, j'ai pris en charge l'intégralité du système d'authentification. La contrainte principale était l'hébergement sur Vercel (infrastructure serverless) : pas de serveur persistant, donc pas de session côté serveur classique — toute la sécurité devait reposer sur des mécanismes compatibles Edge Runtime.</w:t>
+              <w:t>Dans le cadre du projet Social Network (baptisé Konekt par l'équipe) développé à Zone01, j'ai pris en charge l'intégralité du système d'authentification. La contrainte principale était l'hébergement sur Vercel (infrastructure serverless) : pas de serveur persistant, donc pas de session côté serveur classique — toute la sécurité devait reposer sur des mécanismes compatibles Edge Runtime.</w:t>
             </w:r>
           </w:p>
           <w:p>
@@ -14585,7 +14585,7 @@
                 <w:szCs w:val="22"/>
                 <w:shd w:fill="FFFFFF" w:val="clear"/>
               </w:rPr>
-              <w:t>J'ai défini l'identité visuelle du projet Social Network et développé le composant de création de posts multi-médias, utilisé par toute l'équipe comme base pour les features groupes et événements.</w:t>
+              <w:t>J'ai défini l'identité visuelle du projet Social Network (Konekt) et développé le composant de création de posts multi-médias, utilisé par toute l'équipe comme base pour les features groupes et événements.</w:t>
             </w:r>
           </w:p>
           <w:p>
@@ -20006,7 +20006,7 @@
                 <w:sz w:val="22"/>
                 <w:szCs w:val="22"/>
               </w:rPr>
-              <w:t>J'ai défini et documenté la stratégie d'observabilité et les procédures opérationnelles du projet Social Network, afin que n'importe quel membre de l'équipe puisse gérer un déploiement ou diagnostiquer un incident sans dépendance à une seule personne.</w:t>
+              <w:t>J'ai défini et documenté la stratégie d'observabilité et les procédures opérationnelles du projet Social Network (Konekt), afin que n'importe quel membre de l'équipe puisse gérer un déploiement ou diagnostiquer un incident sans dépendance à une seule personne.</w:t>
             </w:r>
           </w:p>
           <w:p>

</xml_diff>

<commit_message>
docs: fix sprint/i18n/GitHub Actions in DP docx and PPTX
DP docx:
- Table 3 row 11: pipeline CI/CD GitHub Actions → déploiement Vercel (intégration Git native)

PPTX:
- Slide 5: sprint → phase (planification, démo, user stories, review)
- Slides 30 & 31: i18n EN/FR → (roadmap) + next-intl → non implémenté
- Slide 59: sprints + user stories → phases + user stories

Co-Authored-By: Claude Sonnet 4.6 <noreply@anthropic.com>
</commit_message>
<xml_diff>
--- a/dossier-certification/Dossier Professionnel - Lecart Christophe.docx
+++ b/dossier-certification/Dossier Professionnel - Lecart Christophe.docx
@@ -1040,10 +1040,10 @@
         <w:tblLook w:noHBand="0" w:noVBand="1" w:firstColumn="1" w:lastRow="0" w:lastColumn="0" w:firstRow="1" w:val="04a0"/>
       </w:tblPr>
       <w:tblGrid>
-        <w:gridCol w:w="417"/>
-        <w:gridCol w:w="2844"/>
-        <w:gridCol w:w="6120"/>
-        <w:gridCol w:w="401"/>
+        <w:gridCol w:w="416"/>
+        <w:gridCol w:w="2845"/>
+        <w:gridCol w:w="6119"/>
+        <w:gridCol w:w="402"/>
       </w:tblGrid>
       <w:tr>
         <w:trPr/>
@@ -1215,7 +1215,7 @@
         <w:trPr/>
         <w:tc>
           <w:tcPr>
-            <w:tcW w:w="417" w:type="dxa"/>
+            <w:tcW w:w="416" w:type="dxa"/>
             <w:tcBorders>
               <w:top w:val="nil"/>
               <w:start w:val="single" w:sz="4" w:space="0" w:color="D9D9D9"/>
@@ -1392,7 +1392,7 @@
         </w:tc>
         <w:tc>
           <w:tcPr>
-            <w:tcW w:w="401" w:type="dxa"/>
+            <w:tcW w:w="402" w:type="dxa"/>
             <w:tcBorders>
               <w:top w:val="nil"/>
               <w:start w:val="nil"/>
@@ -2215,8 +2215,8 @@
         <w:tblLook w:noHBand="0" w:noVBand="1" w:firstColumn="1" w:lastRow="0" w:lastColumn="0" w:firstRow="1" w:val="04a0"/>
       </w:tblPr>
       <w:tblGrid>
-        <w:gridCol w:w="275"/>
-        <w:gridCol w:w="8833"/>
+        <w:gridCol w:w="274"/>
+        <w:gridCol w:w="8834"/>
         <w:gridCol w:w="674"/>
       </w:tblGrid>
       <w:tr>
@@ -2439,7 +2439,7 @@
         <w:trPr/>
         <w:tc>
           <w:tcPr>
-            <w:tcW w:w="275" w:type="dxa"/>
+            <w:tcW w:w="274" w:type="dxa"/>
             <w:tcBorders>
               <w:top w:val="single" w:sz="4" w:space="0" w:color="FFFFFF"/>
               <w:start w:val="nil"/>
@@ -2472,7 +2472,7 @@
         </w:tc>
         <w:tc>
           <w:tcPr>
-            <w:tcW w:w="8833" w:type="dxa"/>
+            <w:tcW w:w="8834" w:type="dxa"/>
             <w:tcBorders>
               <w:top w:val="nil"/>
               <w:start w:val="single" w:sz="8" w:space="0" w:color="F2F2F2"/>
@@ -2568,7 +2568,7 @@
         <w:trPr/>
         <w:tc>
           <w:tcPr>
-            <w:tcW w:w="275" w:type="dxa"/>
+            <w:tcW w:w="274" w:type="dxa"/>
             <w:tcBorders>
               <w:top w:val="nil"/>
               <w:start w:val="nil"/>
@@ -2601,7 +2601,7 @@
         </w:tc>
         <w:tc>
           <w:tcPr>
-            <w:tcW w:w="8833" w:type="dxa"/>
+            <w:tcW w:w="8834" w:type="dxa"/>
             <w:tcBorders>
               <w:top w:val="nil"/>
               <w:start w:val="single" w:sz="8" w:space="0" w:color="F2F2F2"/>
@@ -2715,7 +2715,7 @@
         <w:trPr/>
         <w:tc>
           <w:tcPr>
-            <w:tcW w:w="275" w:type="dxa"/>
+            <w:tcW w:w="274" w:type="dxa"/>
             <w:tcBorders>
               <w:top w:val="nil"/>
               <w:start w:val="nil"/>
@@ -2748,7 +2748,7 @@
         </w:tc>
         <w:tc>
           <w:tcPr>
-            <w:tcW w:w="8833" w:type="dxa"/>
+            <w:tcW w:w="8834" w:type="dxa"/>
             <w:tcBorders>
               <w:top w:val="nil"/>
               <w:start w:val="single" w:sz="8" w:space="0" w:color="F2F2F2"/>
@@ -2939,7 +2939,7 @@
         <w:trPr/>
         <w:tc>
           <w:tcPr>
-            <w:tcW w:w="275" w:type="dxa"/>
+            <w:tcW w:w="274" w:type="dxa"/>
             <w:tcBorders>
               <w:top w:val="single" w:sz="4" w:space="0" w:color="FFFFFF"/>
               <w:start w:val="nil"/>
@@ -2972,7 +2972,7 @@
         </w:tc>
         <w:tc>
           <w:tcPr>
-            <w:tcW w:w="8833" w:type="dxa"/>
+            <w:tcW w:w="8834" w:type="dxa"/>
             <w:tcBorders>
               <w:top w:val="nil"/>
               <w:start w:val="single" w:sz="8" w:space="0" w:color="F2F2F2"/>
@@ -3071,7 +3071,7 @@
         <w:trPr/>
         <w:tc>
           <w:tcPr>
-            <w:tcW w:w="275" w:type="dxa"/>
+            <w:tcW w:w="274" w:type="dxa"/>
             <w:tcBorders>
               <w:top w:val="nil"/>
               <w:start w:val="nil"/>
@@ -3104,7 +3104,7 @@
         </w:tc>
         <w:tc>
           <w:tcPr>
-            <w:tcW w:w="8833" w:type="dxa"/>
+            <w:tcW w:w="8834" w:type="dxa"/>
             <w:tcBorders>
               <w:top w:val="nil"/>
               <w:start w:val="single" w:sz="8" w:space="0" w:color="F2F2F2"/>
@@ -3203,7 +3203,7 @@
         <w:trPr/>
         <w:tc>
           <w:tcPr>
-            <w:tcW w:w="275" w:type="dxa"/>
+            <w:tcW w:w="274" w:type="dxa"/>
             <w:tcBorders>
               <w:top w:val="nil"/>
               <w:start w:val="nil"/>
@@ -3236,7 +3236,7 @@
         </w:tc>
         <w:tc>
           <w:tcPr>
-            <w:tcW w:w="8833" w:type="dxa"/>
+            <w:tcW w:w="8834" w:type="dxa"/>
             <w:tcBorders>
               <w:top w:val="nil"/>
               <w:start w:val="single" w:sz="8" w:space="0" w:color="F2F2F2"/>
@@ -3425,7 +3425,7 @@
         <w:trPr/>
         <w:tc>
           <w:tcPr>
-            <w:tcW w:w="275" w:type="dxa"/>
+            <w:tcW w:w="274" w:type="dxa"/>
             <w:tcBorders>
               <w:top w:val="nil"/>
               <w:start w:val="nil"/>
@@ -3464,7 +3464,7 @@
         </w:tc>
         <w:tc>
           <w:tcPr>
-            <w:tcW w:w="8833" w:type="dxa"/>
+            <w:tcW w:w="8834" w:type="dxa"/>
             <w:tcBorders>
               <w:top w:val="nil"/>
               <w:start w:val="single" w:sz="8" w:space="0" w:color="F2F2F2"/>
@@ -3520,7 +3520,7 @@
                 <w:szCs w:val="22"/>
                 <w:shd w:fill="FFFFFF" w:val="clear"/>
               </w:rPr>
-              <w:t>Containerisation Docker multi-stage et pipeline CI/CD GitHub Actions</w:t>
+              <w:t>Containerisation Docker multi-stage et déploiement Vercel (intégration Git native)</w:t>
             </w:r>
           </w:p>
         </w:tc>
@@ -3567,7 +3567,7 @@
         <w:trPr/>
         <w:tc>
           <w:tcPr>
-            <w:tcW w:w="275" w:type="dxa"/>
+            <w:tcW w:w="274" w:type="dxa"/>
             <w:tcBorders>
               <w:top w:val="nil"/>
               <w:start w:val="nil"/>
@@ -3606,7 +3606,7 @@
         </w:tc>
         <w:tc>
           <w:tcPr>
-            <w:tcW w:w="8833" w:type="dxa"/>
+            <w:tcW w:w="8834" w:type="dxa"/>
             <w:tcBorders>
               <w:top w:val="nil"/>
               <w:start w:val="single" w:sz="8" w:space="0" w:color="F2F2F2"/>
@@ -3703,7 +3703,7 @@
         <w:trPr/>
         <w:tc>
           <w:tcPr>
-            <w:tcW w:w="275" w:type="dxa"/>
+            <w:tcW w:w="274" w:type="dxa"/>
             <w:tcBorders>
               <w:top w:val="nil"/>
               <w:start w:val="nil"/>
@@ -3742,7 +3742,7 @@
         </w:tc>
         <w:tc>
           <w:tcPr>
-            <w:tcW w:w="8833" w:type="dxa"/>
+            <w:tcW w:w="8834" w:type="dxa"/>
             <w:tcBorders>
               <w:top w:val="nil"/>
               <w:start w:val="single" w:sz="8" w:space="0" w:color="F2F2F2"/>
@@ -4428,12 +4428,12 @@
       <w:tblGrid>
         <w:gridCol w:w="2411"/>
         <w:gridCol w:w="142"/>
-        <w:gridCol w:w="368"/>
+        <w:gridCol w:w="367"/>
         <w:gridCol w:w="48"/>
-        <w:gridCol w:w="528"/>
-        <w:gridCol w:w="1173"/>
+        <w:gridCol w:w="529"/>
+        <w:gridCol w:w="1172"/>
         <w:gridCol w:w="142"/>
-        <w:gridCol w:w="572"/>
+        <w:gridCol w:w="573"/>
         <w:gridCol w:w="4398"/>
       </w:tblGrid>
       <w:tr>
@@ -4484,7 +4484,7 @@
         </w:tc>
         <w:tc>
           <w:tcPr>
-            <w:tcW w:w="558" w:type="dxa"/>
+            <w:tcW w:w="557" w:type="dxa"/>
             <w:gridSpan w:val="3"/>
             <w:tcBorders>
               <w:top w:val="nil"/>
@@ -4537,7 +4537,7 @@
         </w:tc>
         <w:tc>
           <w:tcPr>
-            <w:tcW w:w="6813" w:type="dxa"/>
+            <w:tcW w:w="6814" w:type="dxa"/>
             <w:gridSpan w:val="5"/>
             <w:tcBorders>
               <w:top w:val="nil"/>
@@ -4612,7 +4612,7 @@
         </w:trPr>
         <w:tc>
           <w:tcPr>
-            <w:tcW w:w="2969" w:type="dxa"/>
+            <w:tcW w:w="2968" w:type="dxa"/>
             <w:gridSpan w:val="4"/>
             <w:tcBorders>
               <w:top w:val="nil"/>
@@ -4682,7 +4682,7 @@
         </w:tc>
         <w:tc>
           <w:tcPr>
-            <w:tcW w:w="6813" w:type="dxa"/>
+            <w:tcW w:w="6814" w:type="dxa"/>
             <w:gridSpan w:val="5"/>
             <w:tcBorders>
               <w:top w:val="nil"/>
@@ -4732,7 +4732,7 @@
         </w:trPr>
         <w:tc>
           <w:tcPr>
-            <w:tcW w:w="2969" w:type="dxa"/>
+            <w:tcW w:w="2968" w:type="dxa"/>
             <w:gridSpan w:val="4"/>
             <w:tcBorders>
               <w:top w:val="thinThickMediumGap" w:sz="24" w:space="0" w:color="D60093"/>
@@ -4765,7 +4765,7 @@
         </w:tc>
         <w:tc>
           <w:tcPr>
-            <w:tcW w:w="6813" w:type="dxa"/>
+            <w:tcW w:w="6814" w:type="dxa"/>
             <w:gridSpan w:val="5"/>
             <w:tcBorders>
               <w:top w:val="thinThickMediumGap" w:sz="24" w:space="0" w:color="D60093"/>
@@ -5028,7 +5028,7 @@
                 <w:shd w:fill="FFFFFF" w:val="clear"/>
               </w:rPr>
               <w:drawing>
-                <wp:anchor distT="0" distB="0" distL="0" distR="0" simplePos="0" relativeHeight="112" behindDoc="0" locked="0" layoutInCell="0" allowOverlap="1">
+                <wp:anchor distT="0" distB="0" distL="0" distR="0" simplePos="0" relativeHeight="28" behindDoc="0" locked="0" layoutInCell="0" allowOverlap="1">
                   <wp:simplePos x="0" y="0"/>
                   <wp:positionH relativeFrom="margin">
                     <wp:posOffset>461645</wp:posOffset>
@@ -5909,7 +5909,7 @@
         </w:trPr>
         <w:tc>
           <w:tcPr>
-            <w:tcW w:w="4670" w:type="dxa"/>
+            <w:tcW w:w="4669" w:type="dxa"/>
             <w:gridSpan w:val="6"/>
             <w:tcBorders>
               <w:top w:val="single" w:sz="8" w:space="0" w:color="D60093"/>
@@ -5946,7 +5946,7 @@
         </w:tc>
         <w:tc>
           <w:tcPr>
-            <w:tcW w:w="5112" w:type="dxa"/>
+            <w:tcW w:w="5113" w:type="dxa"/>
             <w:gridSpan w:val="3"/>
             <w:tcBorders>
               <w:top w:val="single" w:sz="8" w:space="0" w:color="D60093"/>
@@ -5990,7 +5990,7 @@
         </w:trPr>
         <w:tc>
           <w:tcPr>
-            <w:tcW w:w="4670" w:type="dxa"/>
+            <w:tcW w:w="4669" w:type="dxa"/>
             <w:gridSpan w:val="6"/>
             <w:tcBorders>
               <w:top w:val="nil"/>
@@ -6041,7 +6041,7 @@
         </w:tc>
         <w:tc>
           <w:tcPr>
-            <w:tcW w:w="5112" w:type="dxa"/>
+            <w:tcW w:w="5113" w:type="dxa"/>
             <w:gridSpan w:val="3"/>
             <w:tcBorders>
               <w:top w:val="nil"/>
@@ -6205,7 +6205,7 @@
         </w:tc>
         <w:tc>
           <w:tcPr>
-            <w:tcW w:w="368" w:type="dxa"/>
+            <w:tcW w:w="367" w:type="dxa"/>
             <w:tcBorders>
               <w:top w:val="nil"/>
               <w:start w:val="single" w:sz="8" w:space="0" w:color="F2F2F2"/>
@@ -6241,7 +6241,7 @@
         </w:tc>
         <w:tc>
           <w:tcPr>
-            <w:tcW w:w="6861" w:type="dxa"/>
+            <w:tcW w:w="6862" w:type="dxa"/>
             <w:gridSpan w:val="6"/>
             <w:tcBorders>
               <w:top w:val="nil"/>
@@ -6329,7 +6329,7 @@
         </w:tc>
         <w:tc>
           <w:tcPr>
-            <w:tcW w:w="368" w:type="dxa"/>
+            <w:tcW w:w="367" w:type="dxa"/>
             <w:tcBorders>
               <w:top w:val="nil"/>
               <w:start w:val="single" w:sz="8" w:space="0" w:color="F2F2F2"/>
@@ -6365,7 +6365,7 @@
         </w:tc>
         <w:tc>
           <w:tcPr>
-            <w:tcW w:w="576" w:type="dxa"/>
+            <w:tcW w:w="577" w:type="dxa"/>
             <w:gridSpan w:val="2"/>
             <w:tcBorders>
               <w:top w:val="nil"/>
@@ -6403,7 +6403,7 @@
         </w:tc>
         <w:tc>
           <w:tcPr>
-            <w:tcW w:w="1315" w:type="dxa"/>
+            <w:tcW w:w="1314" w:type="dxa"/>
             <w:gridSpan w:val="2"/>
             <w:tcBorders>
               <w:top w:val="nil"/>
@@ -6473,7 +6473,7 @@
         </w:tc>
         <w:tc>
           <w:tcPr>
-            <w:tcW w:w="572" w:type="dxa"/>
+            <w:tcW w:w="573" w:type="dxa"/>
             <w:tcBorders>
               <w:top w:val="nil"/>
               <w:start w:val="nil"/>
@@ -6771,12 +6771,12 @@
       <w:tblGrid>
         <w:gridCol w:w="2411"/>
         <w:gridCol w:w="142"/>
-        <w:gridCol w:w="368"/>
+        <w:gridCol w:w="367"/>
         <w:gridCol w:w="48"/>
-        <w:gridCol w:w="528"/>
-        <w:gridCol w:w="1173"/>
+        <w:gridCol w:w="529"/>
+        <w:gridCol w:w="1172"/>
         <w:gridCol w:w="142"/>
-        <w:gridCol w:w="572"/>
+        <w:gridCol w:w="573"/>
         <w:gridCol w:w="4398"/>
       </w:tblGrid>
       <w:tr>
@@ -6827,7 +6827,7 @@
         </w:tc>
         <w:tc>
           <w:tcPr>
-            <w:tcW w:w="558" w:type="dxa"/>
+            <w:tcW w:w="557" w:type="dxa"/>
             <w:gridSpan w:val="3"/>
             <w:tcBorders>
               <w:top w:val="nil"/>
@@ -6880,7 +6880,7 @@
         </w:tc>
         <w:tc>
           <w:tcPr>
-            <w:tcW w:w="6813" w:type="dxa"/>
+            <w:tcW w:w="6814" w:type="dxa"/>
             <w:gridSpan w:val="5"/>
             <w:tcBorders>
               <w:top w:val="nil"/>
@@ -6955,7 +6955,7 @@
         </w:trPr>
         <w:tc>
           <w:tcPr>
-            <w:tcW w:w="2969" w:type="dxa"/>
+            <w:tcW w:w="2968" w:type="dxa"/>
             <w:gridSpan w:val="4"/>
             <w:tcBorders>
               <w:top w:val="nil"/>
@@ -7025,7 +7025,7 @@
         </w:tc>
         <w:tc>
           <w:tcPr>
-            <w:tcW w:w="6813" w:type="dxa"/>
+            <w:tcW w:w="6814" w:type="dxa"/>
             <w:gridSpan w:val="5"/>
             <w:tcBorders>
               <w:top w:val="nil"/>
@@ -7076,7 +7076,7 @@
         </w:trPr>
         <w:tc>
           <w:tcPr>
-            <w:tcW w:w="2969" w:type="dxa"/>
+            <w:tcW w:w="2968" w:type="dxa"/>
             <w:gridSpan w:val="4"/>
             <w:tcBorders>
               <w:top w:val="thinThickMediumGap" w:sz="24" w:space="0" w:color="D60093"/>
@@ -7109,7 +7109,7 @@
         </w:tc>
         <w:tc>
           <w:tcPr>
-            <w:tcW w:w="6813" w:type="dxa"/>
+            <w:tcW w:w="6814" w:type="dxa"/>
             <w:gridSpan w:val="5"/>
             <w:tcBorders>
               <w:top w:val="thinThickMediumGap" w:sz="24" w:space="0" w:color="D60093"/>
@@ -7677,7 +7677,7 @@
         </w:trPr>
         <w:tc>
           <w:tcPr>
-            <w:tcW w:w="4670" w:type="dxa"/>
+            <w:tcW w:w="4669" w:type="dxa"/>
             <w:gridSpan w:val="6"/>
             <w:tcBorders>
               <w:top w:val="single" w:sz="8" w:space="0" w:color="D60093"/>
@@ -7714,7 +7714,7 @@
         </w:tc>
         <w:tc>
           <w:tcPr>
-            <w:tcW w:w="5112" w:type="dxa"/>
+            <w:tcW w:w="5113" w:type="dxa"/>
             <w:gridSpan w:val="3"/>
             <w:tcBorders>
               <w:top w:val="single" w:sz="8" w:space="0" w:color="D60093"/>
@@ -7758,7 +7758,7 @@
         </w:trPr>
         <w:tc>
           <w:tcPr>
-            <w:tcW w:w="4670" w:type="dxa"/>
+            <w:tcW w:w="4669" w:type="dxa"/>
             <w:gridSpan w:val="6"/>
             <w:tcBorders>
               <w:top w:val="nil"/>
@@ -7809,7 +7809,7 @@
         </w:tc>
         <w:tc>
           <w:tcPr>
-            <w:tcW w:w="5112" w:type="dxa"/>
+            <w:tcW w:w="5113" w:type="dxa"/>
             <w:gridSpan w:val="3"/>
             <w:tcBorders>
               <w:top w:val="nil"/>
@@ -8008,7 +8008,7 @@
         </w:tc>
         <w:tc>
           <w:tcPr>
-            <w:tcW w:w="368" w:type="dxa"/>
+            <w:tcW w:w="367" w:type="dxa"/>
             <w:tcBorders>
               <w:top w:val="nil"/>
               <w:start w:val="single" w:sz="8" w:space="0" w:color="F2F2F2"/>
@@ -8044,7 +8044,7 @@
         </w:tc>
         <w:tc>
           <w:tcPr>
-            <w:tcW w:w="6861" w:type="dxa"/>
+            <w:tcW w:w="6862" w:type="dxa"/>
             <w:gridSpan w:val="6"/>
             <w:tcBorders>
               <w:top w:val="nil"/>
@@ -8132,7 +8132,7 @@
         </w:tc>
         <w:tc>
           <w:tcPr>
-            <w:tcW w:w="368" w:type="dxa"/>
+            <w:tcW w:w="367" w:type="dxa"/>
             <w:tcBorders>
               <w:top w:val="nil"/>
               <w:start w:val="single" w:sz="8" w:space="0" w:color="F2F2F2"/>
@@ -8168,7 +8168,7 @@
         </w:tc>
         <w:tc>
           <w:tcPr>
-            <w:tcW w:w="576" w:type="dxa"/>
+            <w:tcW w:w="577" w:type="dxa"/>
             <w:gridSpan w:val="2"/>
             <w:tcBorders>
               <w:top w:val="nil"/>
@@ -8206,7 +8206,7 @@
         </w:tc>
         <w:tc>
           <w:tcPr>
-            <w:tcW w:w="1315" w:type="dxa"/>
+            <w:tcW w:w="1314" w:type="dxa"/>
             <w:gridSpan w:val="2"/>
             <w:tcBorders>
               <w:top w:val="nil"/>
@@ -8266,7 +8266,7 @@
         </w:tc>
         <w:tc>
           <w:tcPr>
-            <w:tcW w:w="572" w:type="dxa"/>
+            <w:tcW w:w="573" w:type="dxa"/>
             <w:tcBorders>
               <w:top w:val="nil"/>
               <w:start w:val="nil"/>
@@ -8571,7 +8571,7 @@
         </w:tc>
         <w:tc>
           <w:tcPr>
-            <w:tcW w:w="558" w:type="dxa"/>
+            <w:tcW w:w="557" w:type="dxa"/>
             <w:gridSpan w:val="3"/>
             <w:tcBorders>
               <w:top w:val="nil"/>
@@ -8624,7 +8624,7 @@
         </w:tc>
         <w:tc>
           <w:tcPr>
-            <w:tcW w:w="6813" w:type="dxa"/>
+            <w:tcW w:w="6814" w:type="dxa"/>
             <w:gridSpan w:val="5"/>
             <w:tcBorders>
               <w:top w:val="nil"/>
@@ -8699,7 +8699,7 @@
         </w:trPr>
         <w:tc>
           <w:tcPr>
-            <w:tcW w:w="2969" w:type="dxa"/>
+            <w:tcW w:w="2968" w:type="dxa"/>
             <w:gridSpan w:val="4"/>
             <w:tcBorders>
               <w:top w:val="nil"/>
@@ -8756,7 +8756,7 @@
         </w:tc>
         <w:tc>
           <w:tcPr>
-            <w:tcW w:w="6813" w:type="dxa"/>
+            <w:tcW w:w="6814" w:type="dxa"/>
             <w:gridSpan w:val="5"/>
             <w:tcBorders>
               <w:top w:val="nil"/>
@@ -8817,7 +8817,7 @@
         </w:trPr>
         <w:tc>
           <w:tcPr>
-            <w:tcW w:w="2969" w:type="dxa"/>
+            <w:tcW w:w="2968" w:type="dxa"/>
             <w:gridSpan w:val="4"/>
             <w:tcBorders>
               <w:top w:val="thinThickMediumGap" w:sz="24" w:space="0" w:color="D60093"/>
@@ -8850,7 +8850,7 @@
         </w:tc>
         <w:tc>
           <w:tcPr>
-            <w:tcW w:w="6813" w:type="dxa"/>
+            <w:tcW w:w="6814" w:type="dxa"/>
             <w:gridSpan w:val="5"/>
             <w:tcBorders>
               <w:top w:val="thinThickMediumGap" w:sz="24" w:space="0" w:color="D60093"/>
@@ -9513,7 +9513,7 @@
         </w:trPr>
         <w:tc>
           <w:tcPr>
-            <w:tcW w:w="4670" w:type="dxa"/>
+            <w:tcW w:w="4669" w:type="dxa"/>
             <w:gridSpan w:val="6"/>
             <w:tcBorders>
               <w:top w:val="single" w:sz="8" w:space="0" w:color="D60093"/>
@@ -9550,7 +9550,7 @@
         </w:tc>
         <w:tc>
           <w:tcPr>
-            <w:tcW w:w="5112" w:type="dxa"/>
+            <w:tcW w:w="5113" w:type="dxa"/>
             <w:gridSpan w:val="3"/>
             <w:tcBorders>
               <w:top w:val="single" w:sz="8" w:space="0" w:color="D60093"/>
@@ -9594,7 +9594,7 @@
         </w:trPr>
         <w:tc>
           <w:tcPr>
-            <w:tcW w:w="4670" w:type="dxa"/>
+            <w:tcW w:w="4669" w:type="dxa"/>
             <w:gridSpan w:val="6"/>
             <w:tcBorders>
               <w:top w:val="nil"/>
@@ -9645,7 +9645,7 @@
         </w:tc>
         <w:tc>
           <w:tcPr>
-            <w:tcW w:w="5112" w:type="dxa"/>
+            <w:tcW w:w="5113" w:type="dxa"/>
             <w:gridSpan w:val="3"/>
             <w:tcBorders>
               <w:top w:val="nil"/>
@@ -9844,7 +9844,7 @@
         </w:tc>
         <w:tc>
           <w:tcPr>
-            <w:tcW w:w="368" w:type="dxa"/>
+            <w:tcW w:w="367" w:type="dxa"/>
             <w:tcBorders>
               <w:top w:val="nil"/>
               <w:start w:val="single" w:sz="8" w:space="0" w:color="F2F2F2"/>
@@ -9880,7 +9880,7 @@
         </w:tc>
         <w:tc>
           <w:tcPr>
-            <w:tcW w:w="6861" w:type="dxa"/>
+            <w:tcW w:w="6862" w:type="dxa"/>
             <w:gridSpan w:val="6"/>
             <w:tcBorders>
               <w:top w:val="nil"/>
@@ -9968,7 +9968,7 @@
         </w:tc>
         <w:tc>
           <w:tcPr>
-            <w:tcW w:w="368" w:type="dxa"/>
+            <w:tcW w:w="367" w:type="dxa"/>
             <w:tcBorders>
               <w:top w:val="nil"/>
               <w:start w:val="single" w:sz="8" w:space="0" w:color="F2F2F2"/>
@@ -10004,7 +10004,7 @@
         </w:tc>
         <w:tc>
           <w:tcPr>
-            <w:tcW w:w="576" w:type="dxa"/>
+            <w:tcW w:w="577" w:type="dxa"/>
             <w:gridSpan w:val="2"/>
             <w:tcBorders>
               <w:top w:val="nil"/>
@@ -10042,7 +10042,7 @@
         </w:tc>
         <w:tc>
           <w:tcPr>
-            <w:tcW w:w="1315" w:type="dxa"/>
+            <w:tcW w:w="1314" w:type="dxa"/>
             <w:gridSpan w:val="2"/>
             <w:tcBorders>
               <w:top w:val="nil"/>
@@ -10112,7 +10112,7 @@
         </w:tc>
         <w:tc>
           <w:tcPr>
-            <w:tcW w:w="572" w:type="dxa"/>
+            <w:tcW w:w="573" w:type="dxa"/>
             <w:tcBorders>
               <w:top w:val="nil"/>
               <w:start w:val="nil"/>
@@ -10499,7 +10499,7 @@
         </w:tc>
         <w:tc>
           <w:tcPr>
-            <w:tcW w:w="558" w:type="dxa"/>
+            <w:tcW w:w="557" w:type="dxa"/>
             <w:gridSpan w:val="3"/>
             <w:tcBorders>
               <w:top w:val="nil"/>
@@ -10551,7 +10551,7 @@
         </w:tc>
         <w:tc>
           <w:tcPr>
-            <w:tcW w:w="6813" w:type="dxa"/>
+            <w:tcW w:w="6814" w:type="dxa"/>
             <w:gridSpan w:val="5"/>
             <w:tcBorders>
               <w:top w:val="nil"/>
@@ -10626,7 +10626,7 @@
         </w:trPr>
         <w:tc>
           <w:tcPr>
-            <w:tcW w:w="2969" w:type="dxa"/>
+            <w:tcW w:w="2968" w:type="dxa"/>
             <w:gridSpan w:val="4"/>
             <w:tcBorders>
               <w:top w:val="nil"/>
@@ -10696,7 +10696,7 @@
         </w:tc>
         <w:tc>
           <w:tcPr>
-            <w:tcW w:w="6813" w:type="dxa"/>
+            <w:tcW w:w="6814" w:type="dxa"/>
             <w:gridSpan w:val="5"/>
             <w:tcBorders>
               <w:top w:val="nil"/>
@@ -10750,7 +10750,7 @@
         </w:trPr>
         <w:tc>
           <w:tcPr>
-            <w:tcW w:w="2969" w:type="dxa"/>
+            <w:tcW w:w="2968" w:type="dxa"/>
             <w:gridSpan w:val="4"/>
             <w:tcBorders>
               <w:top w:val="thinThickMediumGap" w:sz="24" w:space="0" w:color="D60093"/>
@@ -10783,7 +10783,7 @@
         </w:tc>
         <w:tc>
           <w:tcPr>
-            <w:tcW w:w="6813" w:type="dxa"/>
+            <w:tcW w:w="6814" w:type="dxa"/>
             <w:gridSpan w:val="5"/>
             <w:tcBorders>
               <w:top w:val="thinThickMediumGap" w:sz="24" w:space="0" w:color="D60093"/>
@@ -11414,7 +11414,7 @@
         </w:trPr>
         <w:tc>
           <w:tcPr>
-            <w:tcW w:w="4670" w:type="dxa"/>
+            <w:tcW w:w="4669" w:type="dxa"/>
             <w:gridSpan w:val="6"/>
             <w:tcBorders>
               <w:top w:val="single" w:sz="8" w:space="0" w:color="D60093"/>
@@ -11451,7 +11451,7 @@
         </w:tc>
         <w:tc>
           <w:tcPr>
-            <w:tcW w:w="5112" w:type="dxa"/>
+            <w:tcW w:w="5113" w:type="dxa"/>
             <w:gridSpan w:val="3"/>
             <w:tcBorders>
               <w:top w:val="single" w:sz="8" w:space="0" w:color="D60093"/>
@@ -11495,7 +11495,7 @@
         </w:trPr>
         <w:tc>
           <w:tcPr>
-            <w:tcW w:w="4670" w:type="dxa"/>
+            <w:tcW w:w="4669" w:type="dxa"/>
             <w:gridSpan w:val="6"/>
             <w:tcBorders>
               <w:top w:val="nil"/>
@@ -11546,7 +11546,7 @@
         </w:tc>
         <w:tc>
           <w:tcPr>
-            <w:tcW w:w="5112" w:type="dxa"/>
+            <w:tcW w:w="5113" w:type="dxa"/>
             <w:gridSpan w:val="3"/>
             <w:tcBorders>
               <w:top w:val="nil"/>
@@ -11745,7 +11745,7 @@
         </w:tc>
         <w:tc>
           <w:tcPr>
-            <w:tcW w:w="368" w:type="dxa"/>
+            <w:tcW w:w="367" w:type="dxa"/>
             <w:tcBorders>
               <w:top w:val="nil"/>
               <w:start w:val="single" w:sz="8" w:space="0" w:color="F2F2F2"/>
@@ -11777,7 +11777,7 @@
         </w:tc>
         <w:tc>
           <w:tcPr>
-            <w:tcW w:w="6861" w:type="dxa"/>
+            <w:tcW w:w="6862" w:type="dxa"/>
             <w:gridSpan w:val="6"/>
             <w:tcBorders>
               <w:top w:val="nil"/>
@@ -11867,7 +11867,7 @@
         </w:tc>
         <w:tc>
           <w:tcPr>
-            <w:tcW w:w="368" w:type="dxa"/>
+            <w:tcW w:w="367" w:type="dxa"/>
             <w:tcBorders>
               <w:top w:val="nil"/>
               <w:start w:val="single" w:sz="8" w:space="0" w:color="F2F2F2"/>
@@ -11903,7 +11903,7 @@
         </w:tc>
         <w:tc>
           <w:tcPr>
-            <w:tcW w:w="576" w:type="dxa"/>
+            <w:tcW w:w="577" w:type="dxa"/>
             <w:gridSpan w:val="2"/>
             <w:tcBorders>
               <w:top w:val="nil"/>
@@ -11941,7 +11941,7 @@
         </w:tc>
         <w:tc>
           <w:tcPr>
-            <w:tcW w:w="1315" w:type="dxa"/>
+            <w:tcW w:w="1314" w:type="dxa"/>
             <w:gridSpan w:val="2"/>
             <w:tcBorders>
               <w:top w:val="nil"/>
@@ -12001,7 +12001,7 @@
         </w:tc>
         <w:tc>
           <w:tcPr>
-            <w:tcW w:w="572" w:type="dxa"/>
+            <w:tcW w:w="573" w:type="dxa"/>
             <w:tcBorders>
               <w:top w:val="nil"/>
               <w:start w:val="nil"/>
@@ -12316,7 +12316,7 @@
         </w:tc>
         <w:tc>
           <w:tcPr>
-            <w:tcW w:w="558" w:type="dxa"/>
+            <w:tcW w:w="557" w:type="dxa"/>
             <w:gridSpan w:val="3"/>
             <w:tcBorders>
               <w:top w:val="nil"/>
@@ -12368,7 +12368,7 @@
         </w:tc>
         <w:tc>
           <w:tcPr>
-            <w:tcW w:w="6813" w:type="dxa"/>
+            <w:tcW w:w="6814" w:type="dxa"/>
             <w:gridSpan w:val="5"/>
             <w:tcBorders>
               <w:top w:val="nil"/>
@@ -12443,7 +12443,7 @@
         </w:trPr>
         <w:tc>
           <w:tcPr>
-            <w:tcW w:w="2969" w:type="dxa"/>
+            <w:tcW w:w="2968" w:type="dxa"/>
             <w:gridSpan w:val="4"/>
             <w:tcBorders>
               <w:top w:val="nil"/>
@@ -12513,7 +12513,7 @@
         </w:tc>
         <w:tc>
           <w:tcPr>
-            <w:tcW w:w="6813" w:type="dxa"/>
+            <w:tcW w:w="6814" w:type="dxa"/>
             <w:gridSpan w:val="5"/>
             <w:tcBorders>
               <w:top w:val="nil"/>
@@ -12567,7 +12567,7 @@
         </w:trPr>
         <w:tc>
           <w:tcPr>
-            <w:tcW w:w="2969" w:type="dxa"/>
+            <w:tcW w:w="2968" w:type="dxa"/>
             <w:gridSpan w:val="4"/>
             <w:tcBorders>
               <w:top w:val="thinThickMediumGap" w:sz="24" w:space="0" w:color="D60093"/>
@@ -12600,7 +12600,7 @@
         </w:tc>
         <w:tc>
           <w:tcPr>
-            <w:tcW w:w="6813" w:type="dxa"/>
+            <w:tcW w:w="6814" w:type="dxa"/>
             <w:gridSpan w:val="5"/>
             <w:tcBorders>
               <w:top w:val="thinThickMediumGap" w:sz="24" w:space="0" w:color="D60093"/>
@@ -13275,7 +13275,7 @@
         </w:trPr>
         <w:tc>
           <w:tcPr>
-            <w:tcW w:w="4670" w:type="dxa"/>
+            <w:tcW w:w="4669" w:type="dxa"/>
             <w:gridSpan w:val="6"/>
             <w:tcBorders>
               <w:top w:val="single" w:sz="8" w:space="0" w:color="D60093"/>
@@ -13312,7 +13312,7 @@
         </w:tc>
         <w:tc>
           <w:tcPr>
-            <w:tcW w:w="5112" w:type="dxa"/>
+            <w:tcW w:w="5113" w:type="dxa"/>
             <w:gridSpan w:val="3"/>
             <w:tcBorders>
               <w:top w:val="single" w:sz="8" w:space="0" w:color="D60093"/>
@@ -13356,7 +13356,7 @@
         </w:trPr>
         <w:tc>
           <w:tcPr>
-            <w:tcW w:w="4670" w:type="dxa"/>
+            <w:tcW w:w="4669" w:type="dxa"/>
             <w:gridSpan w:val="6"/>
             <w:tcBorders>
               <w:top w:val="nil"/>
@@ -13407,7 +13407,7 @@
         </w:tc>
         <w:tc>
           <w:tcPr>
-            <w:tcW w:w="5112" w:type="dxa"/>
+            <w:tcW w:w="5113" w:type="dxa"/>
             <w:gridSpan w:val="3"/>
             <w:tcBorders>
               <w:top w:val="nil"/>
@@ -13606,7 +13606,7 @@
         </w:tc>
         <w:tc>
           <w:tcPr>
-            <w:tcW w:w="368" w:type="dxa"/>
+            <w:tcW w:w="367" w:type="dxa"/>
             <w:tcBorders>
               <w:top w:val="nil"/>
               <w:start w:val="single" w:sz="8" w:space="0" w:color="F2F2F2"/>
@@ -13638,7 +13638,7 @@
         </w:tc>
         <w:tc>
           <w:tcPr>
-            <w:tcW w:w="6861" w:type="dxa"/>
+            <w:tcW w:w="6862" w:type="dxa"/>
             <w:gridSpan w:val="6"/>
             <w:tcBorders>
               <w:top w:val="nil"/>
@@ -13726,7 +13726,7 @@
         </w:tc>
         <w:tc>
           <w:tcPr>
-            <w:tcW w:w="368" w:type="dxa"/>
+            <w:tcW w:w="367" w:type="dxa"/>
             <w:tcBorders>
               <w:top w:val="nil"/>
               <w:start w:val="single" w:sz="8" w:space="0" w:color="F2F2F2"/>
@@ -13762,7 +13762,7 @@
         </w:tc>
         <w:tc>
           <w:tcPr>
-            <w:tcW w:w="576" w:type="dxa"/>
+            <w:tcW w:w="577" w:type="dxa"/>
             <w:gridSpan w:val="2"/>
             <w:tcBorders>
               <w:top w:val="nil"/>
@@ -13800,7 +13800,7 @@
         </w:tc>
         <w:tc>
           <w:tcPr>
-            <w:tcW w:w="1315" w:type="dxa"/>
+            <w:tcW w:w="1314" w:type="dxa"/>
             <w:gridSpan w:val="2"/>
             <w:tcBorders>
               <w:top w:val="nil"/>
@@ -13860,7 +13860,7 @@
         </w:tc>
         <w:tc>
           <w:tcPr>
-            <w:tcW w:w="572" w:type="dxa"/>
+            <w:tcW w:w="573" w:type="dxa"/>
             <w:tcBorders>
               <w:top w:val="nil"/>
               <w:start w:val="nil"/>
@@ -14183,7 +14183,7 @@
         </w:tc>
         <w:tc>
           <w:tcPr>
-            <w:tcW w:w="558" w:type="dxa"/>
+            <w:tcW w:w="557" w:type="dxa"/>
             <w:gridSpan w:val="3"/>
             <w:tcBorders>
               <w:top w:val="nil"/>
@@ -14235,7 +14235,7 @@
         </w:tc>
         <w:tc>
           <w:tcPr>
-            <w:tcW w:w="6813" w:type="dxa"/>
+            <w:tcW w:w="6814" w:type="dxa"/>
             <w:gridSpan w:val="5"/>
             <w:tcBorders>
               <w:top w:val="nil"/>
@@ -14310,7 +14310,7 @@
         </w:trPr>
         <w:tc>
           <w:tcPr>
-            <w:tcW w:w="2969" w:type="dxa"/>
+            <w:tcW w:w="2968" w:type="dxa"/>
             <w:gridSpan w:val="4"/>
             <w:tcBorders>
               <w:top w:val="nil"/>
@@ -14380,7 +14380,7 @@
         </w:tc>
         <w:tc>
           <w:tcPr>
-            <w:tcW w:w="6813" w:type="dxa"/>
+            <w:tcW w:w="6814" w:type="dxa"/>
             <w:gridSpan w:val="5"/>
             <w:tcBorders>
               <w:top w:val="nil"/>
@@ -14434,7 +14434,7 @@
         </w:trPr>
         <w:tc>
           <w:tcPr>
-            <w:tcW w:w="2969" w:type="dxa"/>
+            <w:tcW w:w="2968" w:type="dxa"/>
             <w:gridSpan w:val="4"/>
             <w:tcBorders>
               <w:top w:val="thinThickMediumGap" w:sz="24" w:space="0" w:color="D60093"/>
@@ -14467,7 +14467,7 @@
         </w:tc>
         <w:tc>
           <w:tcPr>
-            <w:tcW w:w="6813" w:type="dxa"/>
+            <w:tcW w:w="6814" w:type="dxa"/>
             <w:gridSpan w:val="5"/>
             <w:tcBorders>
               <w:top w:val="thinThickMediumGap" w:sz="24" w:space="0" w:color="D60093"/>
@@ -15138,7 +15138,7 @@
         </w:trPr>
         <w:tc>
           <w:tcPr>
-            <w:tcW w:w="4670" w:type="dxa"/>
+            <w:tcW w:w="4669" w:type="dxa"/>
             <w:gridSpan w:val="6"/>
             <w:tcBorders>
               <w:top w:val="single" w:sz="8" w:space="0" w:color="D60093"/>
@@ -15175,7 +15175,7 @@
         </w:tc>
         <w:tc>
           <w:tcPr>
-            <w:tcW w:w="5112" w:type="dxa"/>
+            <w:tcW w:w="5113" w:type="dxa"/>
             <w:gridSpan w:val="3"/>
             <w:tcBorders>
               <w:top w:val="single" w:sz="8" w:space="0" w:color="D60093"/>
@@ -15219,7 +15219,7 @@
         </w:trPr>
         <w:tc>
           <w:tcPr>
-            <w:tcW w:w="4670" w:type="dxa"/>
+            <w:tcW w:w="4669" w:type="dxa"/>
             <w:gridSpan w:val="6"/>
             <w:tcBorders>
               <w:top w:val="nil"/>
@@ -15270,7 +15270,7 @@
         </w:tc>
         <w:tc>
           <w:tcPr>
-            <w:tcW w:w="5112" w:type="dxa"/>
+            <w:tcW w:w="5113" w:type="dxa"/>
             <w:gridSpan w:val="3"/>
             <w:tcBorders>
               <w:top w:val="nil"/>
@@ -15469,7 +15469,7 @@
         </w:tc>
         <w:tc>
           <w:tcPr>
-            <w:tcW w:w="368" w:type="dxa"/>
+            <w:tcW w:w="367" w:type="dxa"/>
             <w:tcBorders>
               <w:top w:val="nil"/>
               <w:start w:val="single" w:sz="8" w:space="0" w:color="F2F2F2"/>
@@ -15501,7 +15501,7 @@
         </w:tc>
         <w:tc>
           <w:tcPr>
-            <w:tcW w:w="6861" w:type="dxa"/>
+            <w:tcW w:w="6862" w:type="dxa"/>
             <w:gridSpan w:val="6"/>
             <w:tcBorders>
               <w:top w:val="nil"/>
@@ -15591,7 +15591,7 @@
         </w:tc>
         <w:tc>
           <w:tcPr>
-            <w:tcW w:w="368" w:type="dxa"/>
+            <w:tcW w:w="367" w:type="dxa"/>
             <w:tcBorders>
               <w:top w:val="nil"/>
               <w:start w:val="single" w:sz="8" w:space="0" w:color="F2F2F2"/>
@@ -15627,7 +15627,7 @@
         </w:tc>
         <w:tc>
           <w:tcPr>
-            <w:tcW w:w="576" w:type="dxa"/>
+            <w:tcW w:w="577" w:type="dxa"/>
             <w:gridSpan w:val="2"/>
             <w:tcBorders>
               <w:top w:val="nil"/>
@@ -15665,7 +15665,7 @@
         </w:tc>
         <w:tc>
           <w:tcPr>
-            <w:tcW w:w="1315" w:type="dxa"/>
+            <w:tcW w:w="1314" w:type="dxa"/>
             <w:gridSpan w:val="2"/>
             <w:tcBorders>
               <w:top w:val="nil"/>
@@ -15725,7 +15725,7 @@
         </w:tc>
         <w:tc>
           <w:tcPr>
-            <w:tcW w:w="572" w:type="dxa"/>
+            <w:tcW w:w="573" w:type="dxa"/>
             <w:tcBorders>
               <w:top w:val="nil"/>
               <w:start w:val="nil"/>
@@ -16068,7 +16068,7 @@
         </w:tc>
         <w:tc>
           <w:tcPr>
-            <w:tcW w:w="558" w:type="dxa"/>
+            <w:tcW w:w="557" w:type="dxa"/>
             <w:gridSpan w:val="3"/>
             <w:tcBorders>
               <w:top w:val="nil"/>
@@ -16120,7 +16120,7 @@
         </w:tc>
         <w:tc>
           <w:tcPr>
-            <w:tcW w:w="6813" w:type="dxa"/>
+            <w:tcW w:w="6814" w:type="dxa"/>
             <w:gridSpan w:val="5"/>
             <w:tcBorders>
               <w:top w:val="nil"/>
@@ -16195,7 +16195,7 @@
         </w:trPr>
         <w:tc>
           <w:tcPr>
-            <w:tcW w:w="2969" w:type="dxa"/>
+            <w:tcW w:w="2968" w:type="dxa"/>
             <w:gridSpan w:val="4"/>
             <w:tcBorders>
               <w:top w:val="nil"/>
@@ -16252,7 +16252,7 @@
         </w:tc>
         <w:tc>
           <w:tcPr>
-            <w:tcW w:w="6813" w:type="dxa"/>
+            <w:tcW w:w="6814" w:type="dxa"/>
             <w:gridSpan w:val="5"/>
             <w:tcBorders>
               <w:top w:val="nil"/>
@@ -16297,7 +16297,7 @@
         </w:trPr>
         <w:tc>
           <w:tcPr>
-            <w:tcW w:w="2969" w:type="dxa"/>
+            <w:tcW w:w="2968" w:type="dxa"/>
             <w:gridSpan w:val="4"/>
             <w:tcBorders>
               <w:top w:val="thinThickMediumGap" w:sz="24" w:space="0" w:color="D60093"/>
@@ -16330,7 +16330,7 @@
         </w:tc>
         <w:tc>
           <w:tcPr>
-            <w:tcW w:w="6813" w:type="dxa"/>
+            <w:tcW w:w="6814" w:type="dxa"/>
             <w:gridSpan w:val="5"/>
             <w:tcBorders>
               <w:top w:val="thinThickMediumGap" w:sz="24" w:space="0" w:color="D60093"/>
@@ -16420,7 +16420,7 @@
           </w:tcPr>
           <w:p>
             <w:pPr>
-              <w:pStyle w:val="BlockQuotationuser"/>
+              <w:pStyle w:val="BlockQuotation"/>
               <w:widowControl/>
               <w:suppressAutoHyphens w:val="true"/>
               <w:spacing w:lineRule="auto" w:line="240" w:before="120" w:after="0"/>
@@ -16964,7 +16964,7 @@
         </w:trPr>
         <w:tc>
           <w:tcPr>
-            <w:tcW w:w="4670" w:type="dxa"/>
+            <w:tcW w:w="4669" w:type="dxa"/>
             <w:gridSpan w:val="6"/>
             <w:tcBorders>
               <w:top w:val="single" w:sz="8" w:space="0" w:color="D60093"/>
@@ -17001,7 +17001,7 @@
         </w:tc>
         <w:tc>
           <w:tcPr>
-            <w:tcW w:w="5112" w:type="dxa"/>
+            <w:tcW w:w="5113" w:type="dxa"/>
             <w:gridSpan w:val="3"/>
             <w:tcBorders>
               <w:top w:val="single" w:sz="8" w:space="0" w:color="D60093"/>
@@ -17045,7 +17045,7 @@
         </w:trPr>
         <w:tc>
           <w:tcPr>
-            <w:tcW w:w="4670" w:type="dxa"/>
+            <w:tcW w:w="4669" w:type="dxa"/>
             <w:gridSpan w:val="6"/>
             <w:tcBorders>
               <w:top w:val="nil"/>
@@ -17096,7 +17096,7 @@
         </w:tc>
         <w:tc>
           <w:tcPr>
-            <w:tcW w:w="5112" w:type="dxa"/>
+            <w:tcW w:w="5113" w:type="dxa"/>
             <w:gridSpan w:val="3"/>
             <w:tcBorders>
               <w:top w:val="nil"/>
@@ -17295,7 +17295,7 @@
         </w:tc>
         <w:tc>
           <w:tcPr>
-            <w:tcW w:w="368" w:type="dxa"/>
+            <w:tcW w:w="367" w:type="dxa"/>
             <w:tcBorders>
               <w:top w:val="nil"/>
               <w:start w:val="single" w:sz="8" w:space="0" w:color="F2F2F2"/>
@@ -17331,7 +17331,7 @@
         </w:tc>
         <w:tc>
           <w:tcPr>
-            <w:tcW w:w="6861" w:type="dxa"/>
+            <w:tcW w:w="6862" w:type="dxa"/>
             <w:gridSpan w:val="6"/>
             <w:tcBorders>
               <w:top w:val="nil"/>
@@ -17421,7 +17421,7 @@
         </w:tc>
         <w:tc>
           <w:tcPr>
-            <w:tcW w:w="368" w:type="dxa"/>
+            <w:tcW w:w="367" w:type="dxa"/>
             <w:tcBorders>
               <w:top w:val="nil"/>
               <w:start w:val="single" w:sz="8" w:space="0" w:color="F2F2F2"/>
@@ -17457,7 +17457,7 @@
         </w:tc>
         <w:tc>
           <w:tcPr>
-            <w:tcW w:w="576" w:type="dxa"/>
+            <w:tcW w:w="577" w:type="dxa"/>
             <w:gridSpan w:val="2"/>
             <w:tcBorders>
               <w:top w:val="nil"/>
@@ -17495,7 +17495,7 @@
         </w:tc>
         <w:tc>
           <w:tcPr>
-            <w:tcW w:w="1315" w:type="dxa"/>
+            <w:tcW w:w="1314" w:type="dxa"/>
             <w:gridSpan w:val="2"/>
             <w:tcBorders>
               <w:top w:val="nil"/>
@@ -17565,7 +17565,7 @@
         </w:tc>
         <w:tc>
           <w:tcPr>
-            <w:tcW w:w="572" w:type="dxa"/>
+            <w:tcW w:w="573" w:type="dxa"/>
             <w:tcBorders>
               <w:top w:val="nil"/>
               <w:start w:val="nil"/>
@@ -17886,7 +17886,7 @@
         </w:tc>
         <w:tc>
           <w:tcPr>
-            <w:tcW w:w="558" w:type="dxa"/>
+            <w:tcW w:w="557" w:type="dxa"/>
             <w:gridSpan w:val="3"/>
             <w:tcBorders>
               <w:top w:val="nil"/>
@@ -17938,7 +17938,7 @@
         </w:tc>
         <w:tc>
           <w:tcPr>
-            <w:tcW w:w="6813" w:type="dxa"/>
+            <w:tcW w:w="6814" w:type="dxa"/>
             <w:gridSpan w:val="5"/>
             <w:tcBorders>
               <w:top w:val="nil"/>
@@ -18013,7 +18013,7 @@
         </w:trPr>
         <w:tc>
           <w:tcPr>
-            <w:tcW w:w="2969" w:type="dxa"/>
+            <w:tcW w:w="2968" w:type="dxa"/>
             <w:gridSpan w:val="4"/>
             <w:tcBorders>
               <w:top w:val="nil"/>
@@ -18070,7 +18070,7 @@
         </w:tc>
         <w:tc>
           <w:tcPr>
-            <w:tcW w:w="6813" w:type="dxa"/>
+            <w:tcW w:w="6814" w:type="dxa"/>
             <w:gridSpan w:val="5"/>
             <w:tcBorders>
               <w:top w:val="nil"/>
@@ -18123,7 +18123,7 @@
         </w:trPr>
         <w:tc>
           <w:tcPr>
-            <w:tcW w:w="2969" w:type="dxa"/>
+            <w:tcW w:w="2968" w:type="dxa"/>
             <w:gridSpan w:val="4"/>
             <w:tcBorders>
               <w:top w:val="thinThickMediumGap" w:sz="24" w:space="0" w:color="D60093"/>
@@ -18156,7 +18156,7 @@
         </w:tc>
         <w:tc>
           <w:tcPr>
-            <w:tcW w:w="6813" w:type="dxa"/>
+            <w:tcW w:w="6814" w:type="dxa"/>
             <w:gridSpan w:val="5"/>
             <w:tcBorders>
               <w:top w:val="thinThickMediumGap" w:sz="24" w:space="0" w:color="D60093"/>
@@ -18726,7 +18726,7 @@
         </w:trPr>
         <w:tc>
           <w:tcPr>
-            <w:tcW w:w="4670" w:type="dxa"/>
+            <w:tcW w:w="4669" w:type="dxa"/>
             <w:gridSpan w:val="6"/>
             <w:tcBorders>
               <w:top w:val="single" w:sz="8" w:space="0" w:color="D60093"/>
@@ -18763,7 +18763,7 @@
         </w:tc>
         <w:tc>
           <w:tcPr>
-            <w:tcW w:w="5112" w:type="dxa"/>
+            <w:tcW w:w="5113" w:type="dxa"/>
             <w:gridSpan w:val="3"/>
             <w:tcBorders>
               <w:top w:val="single" w:sz="8" w:space="0" w:color="D60093"/>
@@ -18807,7 +18807,7 @@
         </w:trPr>
         <w:tc>
           <w:tcPr>
-            <w:tcW w:w="4670" w:type="dxa"/>
+            <w:tcW w:w="4669" w:type="dxa"/>
             <w:gridSpan w:val="6"/>
             <w:tcBorders>
               <w:top w:val="nil"/>
@@ -18858,7 +18858,7 @@
         </w:tc>
         <w:tc>
           <w:tcPr>
-            <w:tcW w:w="5112" w:type="dxa"/>
+            <w:tcW w:w="5113" w:type="dxa"/>
             <w:gridSpan w:val="3"/>
             <w:tcBorders>
               <w:top w:val="nil"/>
@@ -19057,7 +19057,7 @@
         </w:tc>
         <w:tc>
           <w:tcPr>
-            <w:tcW w:w="368" w:type="dxa"/>
+            <w:tcW w:w="367" w:type="dxa"/>
             <w:tcBorders>
               <w:top w:val="nil"/>
               <w:start w:val="single" w:sz="8" w:space="0" w:color="F2F2F2"/>
@@ -19093,7 +19093,7 @@
         </w:tc>
         <w:tc>
           <w:tcPr>
-            <w:tcW w:w="6861" w:type="dxa"/>
+            <w:tcW w:w="6862" w:type="dxa"/>
             <w:gridSpan w:val="6"/>
             <w:tcBorders>
               <w:top w:val="nil"/>
@@ -19183,7 +19183,7 @@
         </w:tc>
         <w:tc>
           <w:tcPr>
-            <w:tcW w:w="368" w:type="dxa"/>
+            <w:tcW w:w="367" w:type="dxa"/>
             <w:tcBorders>
               <w:top w:val="nil"/>
               <w:start w:val="single" w:sz="8" w:space="0" w:color="F2F2F2"/>
@@ -19219,7 +19219,7 @@
         </w:tc>
         <w:tc>
           <w:tcPr>
-            <w:tcW w:w="576" w:type="dxa"/>
+            <w:tcW w:w="577" w:type="dxa"/>
             <w:gridSpan w:val="2"/>
             <w:tcBorders>
               <w:top w:val="nil"/>
@@ -19257,7 +19257,7 @@
         </w:tc>
         <w:tc>
           <w:tcPr>
-            <w:tcW w:w="1315" w:type="dxa"/>
+            <w:tcW w:w="1314" w:type="dxa"/>
             <w:gridSpan w:val="2"/>
             <w:tcBorders>
               <w:top w:val="nil"/>
@@ -19327,7 +19327,7 @@
         </w:tc>
         <w:tc>
           <w:tcPr>
-            <w:tcW w:w="572" w:type="dxa"/>
+            <w:tcW w:w="573" w:type="dxa"/>
             <w:tcBorders>
               <w:top w:val="nil"/>
               <w:start w:val="nil"/>
@@ -19617,7 +19617,7 @@
         </w:tc>
         <w:tc>
           <w:tcPr>
-            <w:tcW w:w="558" w:type="dxa"/>
+            <w:tcW w:w="557" w:type="dxa"/>
             <w:gridSpan w:val="3"/>
             <w:tcBorders>
               <w:top w:val="nil"/>
@@ -19669,7 +19669,7 @@
         </w:tc>
         <w:tc>
           <w:tcPr>
-            <w:tcW w:w="6813" w:type="dxa"/>
+            <w:tcW w:w="6814" w:type="dxa"/>
             <w:gridSpan w:val="5"/>
             <w:tcBorders>
               <w:top w:val="nil"/>
@@ -19744,7 +19744,7 @@
         </w:trPr>
         <w:tc>
           <w:tcPr>
-            <w:tcW w:w="2969" w:type="dxa"/>
+            <w:tcW w:w="2968" w:type="dxa"/>
             <w:gridSpan w:val="4"/>
             <w:tcBorders>
               <w:top w:val="nil"/>
@@ -19801,7 +19801,7 @@
         </w:tc>
         <w:tc>
           <w:tcPr>
-            <w:tcW w:w="6813" w:type="dxa"/>
+            <w:tcW w:w="6814" w:type="dxa"/>
             <w:gridSpan w:val="5"/>
             <w:tcBorders>
               <w:top w:val="nil"/>
@@ -19858,7 +19858,7 @@
         </w:trPr>
         <w:tc>
           <w:tcPr>
-            <w:tcW w:w="2969" w:type="dxa"/>
+            <w:tcW w:w="2968" w:type="dxa"/>
             <w:gridSpan w:val="4"/>
             <w:tcBorders>
               <w:top w:val="thinThickMediumGap" w:sz="24" w:space="0" w:color="D60093"/>
@@ -19891,7 +19891,7 @@
         </w:tc>
         <w:tc>
           <w:tcPr>
-            <w:tcW w:w="6813" w:type="dxa"/>
+            <w:tcW w:w="6814" w:type="dxa"/>
             <w:gridSpan w:val="5"/>
             <w:tcBorders>
               <w:top w:val="thinThickMediumGap" w:sz="24" w:space="0" w:color="D60093"/>
@@ -20459,7 +20459,7 @@
         </w:trPr>
         <w:tc>
           <w:tcPr>
-            <w:tcW w:w="4670" w:type="dxa"/>
+            <w:tcW w:w="4669" w:type="dxa"/>
             <w:gridSpan w:val="6"/>
             <w:tcBorders>
               <w:top w:val="single" w:sz="8" w:space="0" w:color="D60093"/>
@@ -20496,7 +20496,7 @@
         </w:tc>
         <w:tc>
           <w:tcPr>
-            <w:tcW w:w="5112" w:type="dxa"/>
+            <w:tcW w:w="5113" w:type="dxa"/>
             <w:gridSpan w:val="3"/>
             <w:tcBorders>
               <w:top w:val="single" w:sz="8" w:space="0" w:color="D60093"/>
@@ -20540,7 +20540,7 @@
         </w:trPr>
         <w:tc>
           <w:tcPr>
-            <w:tcW w:w="4670" w:type="dxa"/>
+            <w:tcW w:w="4669" w:type="dxa"/>
             <w:gridSpan w:val="6"/>
             <w:tcBorders>
               <w:top w:val="nil"/>
@@ -20591,7 +20591,7 @@
         </w:tc>
         <w:tc>
           <w:tcPr>
-            <w:tcW w:w="5112" w:type="dxa"/>
+            <w:tcW w:w="5113" w:type="dxa"/>
             <w:gridSpan w:val="3"/>
             <w:tcBorders>
               <w:top w:val="nil"/>
@@ -20790,7 +20790,7 @@
         </w:tc>
         <w:tc>
           <w:tcPr>
-            <w:tcW w:w="368" w:type="dxa"/>
+            <w:tcW w:w="367" w:type="dxa"/>
             <w:tcBorders>
               <w:top w:val="nil"/>
               <w:start w:val="single" w:sz="8" w:space="0" w:color="F2F2F2"/>
@@ -20826,7 +20826,7 @@
         </w:tc>
         <w:tc>
           <w:tcPr>
-            <w:tcW w:w="6861" w:type="dxa"/>
+            <w:tcW w:w="6862" w:type="dxa"/>
             <w:gridSpan w:val="6"/>
             <w:tcBorders>
               <w:top w:val="nil"/>
@@ -20916,7 +20916,7 @@
         </w:tc>
         <w:tc>
           <w:tcPr>
-            <w:tcW w:w="368" w:type="dxa"/>
+            <w:tcW w:w="367" w:type="dxa"/>
             <w:tcBorders>
               <w:top w:val="nil"/>
               <w:start w:val="single" w:sz="8" w:space="0" w:color="F2F2F2"/>
@@ -20952,7 +20952,7 @@
         </w:tc>
         <w:tc>
           <w:tcPr>
-            <w:tcW w:w="576" w:type="dxa"/>
+            <w:tcW w:w="577" w:type="dxa"/>
             <w:gridSpan w:val="2"/>
             <w:tcBorders>
               <w:top w:val="nil"/>
@@ -20990,7 +20990,7 @@
         </w:tc>
         <w:tc>
           <w:tcPr>
-            <w:tcW w:w="1315" w:type="dxa"/>
+            <w:tcW w:w="1314" w:type="dxa"/>
             <w:gridSpan w:val="2"/>
             <w:tcBorders>
               <w:top w:val="nil"/>
@@ -21060,7 +21060,7 @@
         </w:tc>
         <w:tc>
           <w:tcPr>
-            <w:tcW w:w="572" w:type="dxa"/>
+            <w:tcW w:w="573" w:type="dxa"/>
             <w:tcBorders>
               <w:top w:val="nil"/>
               <w:start w:val="nil"/>
@@ -22682,7 +22682,7 @@
         <mc:AlternateContent>
           <mc:Choice Requires="wps">
             <w:drawing>
-              <wp:anchor distT="0" distB="0" distL="0" distR="0" simplePos="0" relativeHeight="109" behindDoc="0" locked="0" layoutInCell="1" allowOverlap="1" wp14:anchorId="37EC57A2">
+              <wp:anchor distT="0" distB="0" distL="0" distR="0" simplePos="0" relativeHeight="25" behindDoc="0" locked="0" layoutInCell="1" allowOverlap="1" wp14:anchorId="37EC57A2">
                 <wp:simplePos x="0" y="0"/>
                 <wp:positionH relativeFrom="column">
                   <wp:posOffset>2010410</wp:posOffset>
@@ -22721,7 +22721,7 @@
                         <w:txbxContent>
                           <w:p>
                             <w:pPr>
-                              <w:pStyle w:val="FrameContents"/>
+                              <w:pStyle w:val="FrameContentsuser"/>
                               <w:spacing w:before="0" w:after="200"/>
                               <w:rPr/>
                             </w:pPr>
@@ -22758,7 +22758,7 @@
                   <w:txbxContent>
                     <w:p>
                       <w:pPr>
-                        <w:pStyle w:val="FrameContents"/>
+                        <w:pStyle w:val="FrameContentsuser"/>
                         <w:spacing w:before="0" w:after="200"/>
                         <w:rPr/>
                       </w:pPr>
@@ -22889,7 +22889,7 @@
         <mc:AlternateContent>
           <mc:Choice Requires="wps">
             <w:drawing>
-              <wp:anchor distT="0" distB="0" distL="0" distR="0" simplePos="0" relativeHeight="12" behindDoc="0" locked="0" layoutInCell="1" allowOverlap="1" wp14:anchorId="62C6C4CD">
+              <wp:anchor distT="0" distB="0" distL="0" distR="0" simplePos="0" relativeHeight="10" behindDoc="0" locked="0" layoutInCell="1" allowOverlap="1" wp14:anchorId="62C6C4CD">
                 <wp:simplePos x="0" y="0"/>
                 <wp:positionH relativeFrom="column">
                   <wp:posOffset>3526155</wp:posOffset>
@@ -22928,7 +22928,7 @@
                         <w:txbxContent>
                           <w:p>
                             <w:pPr>
-                              <w:pStyle w:val="FrameContents"/>
+                              <w:pStyle w:val="FrameContentsuser"/>
                               <w:spacing w:before="0" w:after="200"/>
                               <w:rPr/>
                             </w:pPr>
@@ -22990,7 +22990,7 @@
                   <w:txbxContent>
                     <w:p>
                       <w:pPr>
-                        <w:pStyle w:val="FrameContents"/>
+                        <w:pStyle w:val="FrameContentsuser"/>
                         <w:spacing w:before="0" w:after="200"/>
                         <w:rPr/>
                       </w:pPr>
@@ -23039,7 +23039,7 @@
         <mc:AlternateContent>
           <mc:Choice Requires="wps">
             <w:drawing>
-              <wp:anchor distT="0" distB="0" distL="0" distR="0" simplePos="0" relativeHeight="104" behindDoc="0" locked="0" layoutInCell="1" allowOverlap="1" wp14:anchorId="4543E899">
+              <wp:anchor distT="0" distB="0" distL="0" distR="0" simplePos="0" relativeHeight="12" behindDoc="0" locked="0" layoutInCell="1" allowOverlap="1" wp14:anchorId="4543E899">
                 <wp:simplePos x="0" y="0"/>
                 <wp:positionH relativeFrom="column">
                   <wp:posOffset>361950</wp:posOffset>
@@ -23078,7 +23078,7 @@
                         <w:txbxContent>
                           <w:p>
                             <w:pPr>
-                              <w:pStyle w:val="FrameContents"/>
+                              <w:pStyle w:val="FrameContentsuser"/>
                               <w:spacing w:before="0" w:after="200"/>
                               <w:rPr>
                                 <w:i/>
@@ -23134,7 +23134,7 @@
                   <w:txbxContent>
                     <w:p>
                       <w:pPr>
-                        <w:pStyle w:val="FrameContents"/>
+                        <w:pStyle w:val="FrameContentsuser"/>
                         <w:spacing w:before="0" w:after="200"/>
                         <w:rPr>
                           <w:i/>
@@ -23320,7 +23320,7 @@
           <w:szCs w:val="24"/>
         </w:rPr>
         <w:drawing>
-          <wp:anchor distT="0" distB="0" distL="0" distR="0" simplePos="0" relativeHeight="111" behindDoc="0" locked="0" layoutInCell="0" allowOverlap="1">
+          <wp:anchor distT="0" distB="0" distL="0" distR="0" simplePos="0" relativeHeight="27" behindDoc="0" locked="0" layoutInCell="0" allowOverlap="1">
             <wp:simplePos x="0" y="0"/>
             <wp:positionH relativeFrom="column">
               <wp:posOffset>22225</wp:posOffset>
@@ -24300,43 +24300,7 @@
                 <w:u w:val="none" w:color="000000"/>
                 <w:lang w:val="fr-FR" w:eastAsia="en-US" w:bidi="ar-SA"/>
               </w:rPr>
-              <w:t>Commit — auth login/register/middlewa</w:t>
-            </w:r>
-            <w:r>
-              <w:rPr>
-                <w:rStyle w:val="PlaceholderText"/>
-                <w:rFonts w:eastAsia="Calibri" w:cs="" w:ascii="Carlito" w:hAnsi="Carlito"/>
-                <w:b w:val="false"/>
-                <w:i w:val="false"/>
-                <w:caps w:val="false"/>
-                <w:smallCaps w:val="false"/>
-                <w:color w:val="000000"/>
-                <w:spacing w:val="0"/>
-                <w:kern w:val="0"/>
-                <w:sz w:val="20"/>
-                <w:szCs w:val="22"/>
-                <w:u w:val="none" w:color="000000"/>
-                <w:lang w:val="fr-FR" w:eastAsia="en-US" w:bidi="ar-SA"/>
-              </w:rPr>
-              <w:t>r</w:t>
-            </w:r>
-            <w:r>
-              <w:rPr>
-                <w:rStyle w:val="PlaceholderText"/>
-                <w:rFonts w:eastAsia="Calibri" w:cs="" w:ascii="Carlito" w:hAnsi="Carlito"/>
-                <w:b w:val="false"/>
-                <w:i w:val="false"/>
-                <w:caps w:val="false"/>
-                <w:smallCaps w:val="false"/>
-                <w:color w:val="000000"/>
-                <w:spacing w:val="0"/>
-                <w:kern w:val="0"/>
-                <w:sz w:val="20"/>
-                <w:szCs w:val="22"/>
-                <w:u w:val="none" w:color="000000"/>
-                <w:lang w:val="fr-FR" w:eastAsia="en-US" w:bidi="ar-SA"/>
-              </w:rPr>
-              <w:t>e:</w:t>
+              <w:t>Commit — auth login/register/middleware:</w:t>
               <w:br/>
             </w:r>
             <w:hyperlink r:id="rId30" w:tgtFrame="_blank">
@@ -24769,7 +24733,14 @@
         </w:rPr>
       </w:pPr>
       <w:r>
-        <w:rPr/>
+        <w:rPr>
+          <w:rFonts w:cs="Calibri" w:cstheme="minorHAnsi"/>
+          <w:b/>
+          <w:smallCaps/>
+          <w:color w:themeColor="text1" w:themeTint="bf" w:val="404040"/>
+          <w:sz w:val="28"/>
+          <w:szCs w:val="28"/>
+        </w:rPr>
       </w:r>
     </w:p>
     <w:tbl>
@@ -24925,7 +24896,7 @@
                 <w:lang w:val="fr-FR" w:eastAsia="en-US" w:bidi="ar-SA"/>
               </w:rPr>
               <w:drawing>
-                <wp:anchor distT="0" distB="0" distL="0" distR="0" simplePos="0" relativeHeight="115" behindDoc="0" locked="0" layoutInCell="0" allowOverlap="1">
+                <wp:anchor distT="0" distB="0" distL="0" distR="0" simplePos="0" relativeHeight="120" behindDoc="0" locked="0" layoutInCell="0" allowOverlap="1">
                   <wp:simplePos x="0" y="0"/>
                   <wp:positionH relativeFrom="margin">
                     <wp:posOffset>843915</wp:posOffset>
@@ -25474,7 +25445,7 @@
             <w:r>
               <w:rPr/>
               <w:drawing>
-                <wp:anchor distT="0" distB="0" distL="0" distR="0" simplePos="0" relativeHeight="113" behindDoc="0" locked="0" layoutInCell="0" allowOverlap="1">
+                <wp:anchor distT="0" distB="0" distL="0" distR="0" simplePos="0" relativeHeight="29" behindDoc="0" locked="0" layoutInCell="0" allowOverlap="1">
                   <wp:simplePos x="0" y="0"/>
                   <wp:positionH relativeFrom="margin">
                     <wp:posOffset>852170</wp:posOffset>
@@ -26196,7 +26167,14 @@
               </w:rPr>
             </w:pPr>
             <w:r>
-              <w:rPr/>
+              <w:rPr>
+                <w:rFonts w:eastAsia="Calibri" w:cs="" w:ascii="Carlito" w:hAnsi="Carlito"/>
+                <w:color w:val="000000"/>
+                <w:kern w:val="0"/>
+                <w:sz w:val="22"/>
+                <w:szCs w:val="22"/>
+                <w:lang w:val="fr-FR" w:eastAsia="en-US" w:bidi="ar-SA"/>
+              </w:rPr>
             </w:r>
           </w:p>
           <w:p>
@@ -26222,7 +26200,14 @@
               </w:rPr>
             </w:pPr>
             <w:r>
-              <w:rPr/>
+              <w:rPr>
+                <w:rFonts w:eastAsia="Calibri" w:cs="" w:ascii="Carlito" w:hAnsi="Carlito"/>
+                <w:color w:val="000000"/>
+                <w:kern w:val="0"/>
+                <w:sz w:val="22"/>
+                <w:szCs w:val="22"/>
+                <w:lang w:val="fr-FR" w:eastAsia="en-US" w:bidi="ar-SA"/>
+              </w:rPr>
             </w:r>
           </w:p>
           <w:p>
@@ -26248,7 +26233,14 @@
               </w:rPr>
             </w:pPr>
             <w:r>
-              <w:rPr/>
+              <w:rPr>
+                <w:rFonts w:eastAsia="Calibri" w:cs="" w:ascii="Carlito" w:hAnsi="Carlito"/>
+                <w:color w:val="000000"/>
+                <w:kern w:val="0"/>
+                <w:sz w:val="22"/>
+                <w:szCs w:val="22"/>
+                <w:lang w:val="fr-FR" w:eastAsia="en-US" w:bidi="ar-SA"/>
+              </w:rPr>
             </w:r>
           </w:p>
           <w:p>
@@ -26440,7 +26432,7 @@
                 <w:lang w:val="fr-FR" w:eastAsia="en-US" w:bidi="ar-SA"/>
               </w:rPr>
               <w:drawing>
-                <wp:anchor distT="0" distB="0" distL="0" distR="0" simplePos="0" relativeHeight="127" behindDoc="0" locked="0" layoutInCell="0" allowOverlap="1">
+                <wp:anchor distT="0" distB="0" distL="0" distR="0" simplePos="0" relativeHeight="124" behindDoc="0" locked="0" layoutInCell="0" allowOverlap="1">
                   <wp:simplePos x="0" y="0"/>
                   <wp:positionH relativeFrom="margin">
                     <wp:align>center</wp:align>
@@ -26621,19 +26613,8 @@
               <w:t>MLD (Modèle Logique de Données)</w:t>
             </w:r>
             <w:r>
-              <w:rPr>
-                <w:rStyle w:val="PlaceholderText"/>
-                <w:rFonts w:eastAsia="Calibri" w:cs="" w:ascii="Carlito" w:hAnsi="Carlito"/>
-                <w:b/>
-                <w:bCs/>
-                <w:color w:val="000000"/>
-                <w:kern w:val="0"/>
-                <w:sz w:val="19"/>
-                <w:szCs w:val="19"/>
-                <w:lang w:val="fr-FR" w:eastAsia="en-US" w:bidi="ar-SA"/>
-              </w:rPr>
               <w:drawing>
-                <wp:anchor distT="0" distB="0" distL="0" distR="0" simplePos="0" relativeHeight="116" behindDoc="0" locked="0" layoutInCell="0" allowOverlap="1">
+                <wp:anchor distT="0" distB="0" distL="0" distR="0" simplePos="0" relativeHeight="121" behindDoc="0" locked="0" layoutInCell="0" allowOverlap="1">
                   <wp:simplePos x="0" y="0"/>
                   <wp:positionH relativeFrom="margin">
                     <wp:posOffset>55880</wp:posOffset>
@@ -26717,7 +26698,14 @@
               </w:rPr>
             </w:pPr>
             <w:r>
-              <w:rPr/>
+              <w:rPr>
+                <w:rFonts w:eastAsia="Calibri" w:cs="" w:ascii="Carlito" w:hAnsi="Carlito"/>
+                <w:color w:val="000000"/>
+                <w:kern w:val="0"/>
+                <w:sz w:val="22"/>
+                <w:szCs w:val="22"/>
+                <w:lang w:val="fr-FR" w:eastAsia="en-US" w:bidi="ar-SA"/>
+              </w:rPr>
             </w:r>
           </w:p>
           <w:p>
@@ -26743,7 +26731,14 @@
               </w:rPr>
             </w:pPr>
             <w:r>
-              <w:rPr/>
+              <w:rPr>
+                <w:rFonts w:eastAsia="Calibri" w:cs="" w:ascii="Carlito" w:hAnsi="Carlito"/>
+                <w:color w:val="000000"/>
+                <w:kern w:val="0"/>
+                <w:sz w:val="22"/>
+                <w:szCs w:val="22"/>
+                <w:lang w:val="fr-FR" w:eastAsia="en-US" w:bidi="ar-SA"/>
+              </w:rPr>
             </w:r>
           </w:p>
           <w:p>
@@ -26769,7 +26764,14 @@
               </w:rPr>
             </w:pPr>
             <w:r>
-              <w:rPr/>
+              <w:rPr>
+                <w:rFonts w:eastAsia="Calibri" w:cs="" w:ascii="Carlito" w:hAnsi="Carlito"/>
+                <w:color w:val="000000"/>
+                <w:kern w:val="0"/>
+                <w:sz w:val="22"/>
+                <w:szCs w:val="22"/>
+                <w:lang w:val="fr-FR" w:eastAsia="en-US" w:bidi="ar-SA"/>
+              </w:rPr>
             </w:r>
           </w:p>
           <w:p>
@@ -26795,7 +26797,14 @@
               </w:rPr>
             </w:pPr>
             <w:r>
-              <w:rPr/>
+              <w:rPr>
+                <w:rFonts w:eastAsia="Calibri" w:cs="" w:ascii="Carlito" w:hAnsi="Carlito"/>
+                <w:color w:val="000000"/>
+                <w:kern w:val="0"/>
+                <w:sz w:val="22"/>
+                <w:szCs w:val="22"/>
+                <w:lang w:val="fr-FR" w:eastAsia="en-US" w:bidi="ar-SA"/>
+              </w:rPr>
             </w:r>
           </w:p>
           <w:p>
@@ -26821,7 +26830,14 @@
               </w:rPr>
             </w:pPr>
             <w:r>
-              <w:rPr/>
+              <w:rPr>
+                <w:rFonts w:eastAsia="Calibri" w:cs="" w:ascii="Carlito" w:hAnsi="Carlito"/>
+                <w:color w:val="000000"/>
+                <w:kern w:val="0"/>
+                <w:sz w:val="22"/>
+                <w:szCs w:val="22"/>
+                <w:lang w:val="fr-FR" w:eastAsia="en-US" w:bidi="ar-SA"/>
+              </w:rPr>
             </w:r>
           </w:p>
           <w:p>
@@ -26847,7 +26863,14 @@
               </w:rPr>
             </w:pPr>
             <w:r>
-              <w:rPr/>
+              <w:rPr>
+                <w:rFonts w:eastAsia="Calibri" w:cs="" w:ascii="Carlito" w:hAnsi="Carlito"/>
+                <w:color w:val="000000"/>
+                <w:kern w:val="0"/>
+                <w:sz w:val="22"/>
+                <w:szCs w:val="22"/>
+                <w:lang w:val="fr-FR" w:eastAsia="en-US" w:bidi="ar-SA"/>
+              </w:rPr>
             </w:r>
           </w:p>
           <w:p>
@@ -26873,7 +26896,14 @@
               </w:rPr>
             </w:pPr>
             <w:r>
-              <w:rPr/>
+              <w:rPr>
+                <w:rFonts w:eastAsia="Calibri" w:cs="" w:ascii="Carlito" w:hAnsi="Carlito"/>
+                <w:color w:val="000000"/>
+                <w:kern w:val="0"/>
+                <w:sz w:val="22"/>
+                <w:szCs w:val="22"/>
+                <w:lang w:val="fr-FR" w:eastAsia="en-US" w:bidi="ar-SA"/>
+              </w:rPr>
             </w:r>
           </w:p>
           <w:p>
@@ -26899,7 +26929,14 @@
               </w:rPr>
             </w:pPr>
             <w:r>
-              <w:rPr/>
+              <w:rPr>
+                <w:rFonts w:eastAsia="Calibri" w:cs="" w:ascii="Carlito" w:hAnsi="Carlito"/>
+                <w:color w:val="000000"/>
+                <w:kern w:val="0"/>
+                <w:sz w:val="22"/>
+                <w:szCs w:val="22"/>
+                <w:lang w:val="fr-FR" w:eastAsia="en-US" w:bidi="ar-SA"/>
+              </w:rPr>
             </w:r>
           </w:p>
           <w:p>
@@ -26925,7 +26962,14 @@
               </w:rPr>
             </w:pPr>
             <w:r>
-              <w:rPr/>
+              <w:rPr>
+                <w:rFonts w:eastAsia="Calibri" w:cs="" w:ascii="Carlito" w:hAnsi="Carlito"/>
+                <w:color w:val="000000"/>
+                <w:kern w:val="0"/>
+                <w:sz w:val="22"/>
+                <w:szCs w:val="22"/>
+                <w:lang w:val="fr-FR" w:eastAsia="en-US" w:bidi="ar-SA"/>
+              </w:rPr>
             </w:r>
           </w:p>
           <w:p>
@@ -26951,7 +26995,14 @@
               </w:rPr>
             </w:pPr>
             <w:r>
-              <w:rPr/>
+              <w:rPr>
+                <w:rFonts w:eastAsia="Calibri" w:cs="" w:ascii="Carlito" w:hAnsi="Carlito"/>
+                <w:color w:val="000000"/>
+                <w:kern w:val="0"/>
+                <w:sz w:val="22"/>
+                <w:szCs w:val="22"/>
+                <w:lang w:val="fr-FR" w:eastAsia="en-US" w:bidi="ar-SA"/>
+              </w:rPr>
             </w:r>
           </w:p>
           <w:p>
@@ -26977,7 +27028,14 @@
               </w:rPr>
             </w:pPr>
             <w:r>
-              <w:rPr/>
+              <w:rPr>
+                <w:rFonts w:eastAsia="Calibri" w:cs="" w:ascii="Carlito" w:hAnsi="Carlito"/>
+                <w:color w:val="000000"/>
+                <w:kern w:val="0"/>
+                <w:sz w:val="22"/>
+                <w:szCs w:val="22"/>
+                <w:lang w:val="fr-FR" w:eastAsia="en-US" w:bidi="ar-SA"/>
+              </w:rPr>
             </w:r>
           </w:p>
           <w:p>
@@ -27003,7 +27061,14 @@
               </w:rPr>
             </w:pPr>
             <w:r>
-              <w:rPr/>
+              <w:rPr>
+                <w:rFonts w:eastAsia="Calibri" w:cs="" w:ascii="Carlito" w:hAnsi="Carlito"/>
+                <w:color w:val="000000"/>
+                <w:kern w:val="0"/>
+                <w:sz w:val="22"/>
+                <w:szCs w:val="22"/>
+                <w:lang w:val="fr-FR" w:eastAsia="en-US" w:bidi="ar-SA"/>
+              </w:rPr>
             </w:r>
           </w:p>
           <w:p>
@@ -27029,7 +27094,14 @@
               </w:rPr>
             </w:pPr>
             <w:r>
-              <w:rPr/>
+              <w:rPr>
+                <w:rFonts w:eastAsia="Calibri" w:cs="" w:ascii="Carlito" w:hAnsi="Carlito"/>
+                <w:color w:val="000000"/>
+                <w:kern w:val="0"/>
+                <w:sz w:val="22"/>
+                <w:szCs w:val="22"/>
+                <w:lang w:val="fr-FR" w:eastAsia="en-US" w:bidi="ar-SA"/>
+              </w:rPr>
             </w:r>
           </w:p>
           <w:p>
@@ -27055,7 +27127,14 @@
               </w:rPr>
             </w:pPr>
             <w:r>
-              <w:rPr/>
+              <w:rPr>
+                <w:rFonts w:eastAsia="Calibri" w:cs="" w:ascii="Carlito" w:hAnsi="Carlito"/>
+                <w:color w:val="000000"/>
+                <w:kern w:val="0"/>
+                <w:sz w:val="22"/>
+                <w:szCs w:val="22"/>
+                <w:lang w:val="fr-FR" w:eastAsia="en-US" w:bidi="ar-SA"/>
+              </w:rPr>
             </w:r>
           </w:p>
           <w:p>
@@ -27081,7 +27160,14 @@
               </w:rPr>
             </w:pPr>
             <w:r>
-              <w:rPr/>
+              <w:rPr>
+                <w:rFonts w:eastAsia="Calibri" w:cs="" w:ascii="Carlito" w:hAnsi="Carlito"/>
+                <w:color w:val="000000"/>
+                <w:kern w:val="0"/>
+                <w:sz w:val="22"/>
+                <w:szCs w:val="22"/>
+                <w:lang w:val="fr-FR" w:eastAsia="en-US" w:bidi="ar-SA"/>
+              </w:rPr>
             </w:r>
           </w:p>
           <w:p>
@@ -27107,7 +27193,14 @@
               </w:rPr>
             </w:pPr>
             <w:r>
-              <w:rPr/>
+              <w:rPr>
+                <w:rFonts w:eastAsia="Calibri" w:cs="" w:ascii="Carlito" w:hAnsi="Carlito"/>
+                <w:color w:val="000000"/>
+                <w:kern w:val="0"/>
+                <w:sz w:val="22"/>
+                <w:szCs w:val="22"/>
+                <w:lang w:val="fr-FR" w:eastAsia="en-US" w:bidi="ar-SA"/>
+              </w:rPr>
             </w:r>
           </w:p>
           <w:p>
@@ -27133,7 +27226,14 @@
               </w:rPr>
             </w:pPr>
             <w:r>
-              <w:rPr/>
+              <w:rPr>
+                <w:rFonts w:eastAsia="Calibri" w:cs="" w:ascii="Carlito" w:hAnsi="Carlito"/>
+                <w:color w:val="000000"/>
+                <w:kern w:val="0"/>
+                <w:sz w:val="22"/>
+                <w:szCs w:val="22"/>
+                <w:lang w:val="fr-FR" w:eastAsia="en-US" w:bidi="ar-SA"/>
+              </w:rPr>
             </w:r>
           </w:p>
           <w:p>
@@ -27159,7 +27259,14 @@
               </w:rPr>
             </w:pPr>
             <w:r>
-              <w:rPr/>
+              <w:rPr>
+                <w:rFonts w:eastAsia="Calibri" w:cs="" w:ascii="Carlito" w:hAnsi="Carlito"/>
+                <w:color w:val="000000"/>
+                <w:kern w:val="0"/>
+                <w:sz w:val="22"/>
+                <w:szCs w:val="22"/>
+                <w:lang w:val="fr-FR" w:eastAsia="en-US" w:bidi="ar-SA"/>
+              </w:rPr>
             </w:r>
           </w:p>
           <w:p>
@@ -27185,7 +27292,14 @@
               </w:rPr>
             </w:pPr>
             <w:r>
-              <w:rPr/>
+              <w:rPr>
+                <w:rFonts w:eastAsia="Calibri" w:cs="" w:ascii="Carlito" w:hAnsi="Carlito"/>
+                <w:color w:val="000000"/>
+                <w:kern w:val="0"/>
+                <w:sz w:val="22"/>
+                <w:szCs w:val="22"/>
+                <w:lang w:val="fr-FR" w:eastAsia="en-US" w:bidi="ar-SA"/>
+              </w:rPr>
             </w:r>
           </w:p>
           <w:p>
@@ -27211,7 +27325,14 @@
               </w:rPr>
             </w:pPr>
             <w:r>
-              <w:rPr/>
+              <w:rPr>
+                <w:rFonts w:eastAsia="Calibri" w:cs="" w:ascii="Carlito" w:hAnsi="Carlito"/>
+                <w:color w:val="000000"/>
+                <w:kern w:val="0"/>
+                <w:sz w:val="22"/>
+                <w:szCs w:val="22"/>
+                <w:lang w:val="fr-FR" w:eastAsia="en-US" w:bidi="ar-SA"/>
+              </w:rPr>
             </w:r>
           </w:p>
           <w:p>
@@ -27237,7 +27358,14 @@
               </w:rPr>
             </w:pPr>
             <w:r>
-              <w:rPr/>
+              <w:rPr>
+                <w:rFonts w:eastAsia="Calibri" w:cs="" w:ascii="Carlito" w:hAnsi="Carlito"/>
+                <w:color w:val="000000"/>
+                <w:kern w:val="0"/>
+                <w:sz w:val="22"/>
+                <w:szCs w:val="22"/>
+                <w:lang w:val="fr-FR" w:eastAsia="en-US" w:bidi="ar-SA"/>
+              </w:rPr>
             </w:r>
           </w:p>
           <w:p>
@@ -27263,7 +27391,14 @@
               </w:rPr>
             </w:pPr>
             <w:r>
-              <w:rPr/>
+              <w:rPr>
+                <w:rFonts w:eastAsia="Calibri" w:cs="" w:ascii="Carlito" w:hAnsi="Carlito"/>
+                <w:color w:val="000000"/>
+                <w:kern w:val="0"/>
+                <w:sz w:val="22"/>
+                <w:szCs w:val="22"/>
+                <w:lang w:val="fr-FR" w:eastAsia="en-US" w:bidi="ar-SA"/>
+              </w:rPr>
             </w:r>
           </w:p>
           <w:p>
@@ -27289,7 +27424,14 @@
               </w:rPr>
             </w:pPr>
             <w:r>
-              <w:rPr/>
+              <w:rPr>
+                <w:rFonts w:eastAsia="Calibri" w:cs="" w:ascii="Carlito" w:hAnsi="Carlito"/>
+                <w:color w:val="000000"/>
+                <w:kern w:val="0"/>
+                <w:sz w:val="22"/>
+                <w:szCs w:val="22"/>
+                <w:lang w:val="fr-FR" w:eastAsia="en-US" w:bidi="ar-SA"/>
+              </w:rPr>
             </w:r>
           </w:p>
           <w:p>
@@ -27315,7 +27457,14 @@
               </w:rPr>
             </w:pPr>
             <w:r>
-              <w:rPr/>
+              <w:rPr>
+                <w:rFonts w:eastAsia="Calibri" w:cs="" w:ascii="Carlito" w:hAnsi="Carlito"/>
+                <w:color w:val="000000"/>
+                <w:kern w:val="0"/>
+                <w:sz w:val="22"/>
+                <w:szCs w:val="22"/>
+                <w:lang w:val="fr-FR" w:eastAsia="en-US" w:bidi="ar-SA"/>
+              </w:rPr>
             </w:r>
           </w:p>
           <w:p>
@@ -27341,7 +27490,14 @@
               </w:rPr>
             </w:pPr>
             <w:r>
-              <w:rPr/>
+              <w:rPr>
+                <w:rFonts w:eastAsia="Calibri" w:cs="" w:ascii="Carlito" w:hAnsi="Carlito"/>
+                <w:color w:val="000000"/>
+                <w:kern w:val="0"/>
+                <w:sz w:val="22"/>
+                <w:szCs w:val="22"/>
+                <w:lang w:val="fr-FR" w:eastAsia="en-US" w:bidi="ar-SA"/>
+              </w:rPr>
             </w:r>
           </w:p>
           <w:p>
@@ -27367,7 +27523,14 @@
               </w:rPr>
             </w:pPr>
             <w:r>
-              <w:rPr/>
+              <w:rPr>
+                <w:rFonts w:eastAsia="Calibri" w:cs="" w:ascii="Carlito" w:hAnsi="Carlito"/>
+                <w:color w:val="000000"/>
+                <w:kern w:val="0"/>
+                <w:sz w:val="22"/>
+                <w:szCs w:val="22"/>
+                <w:lang w:val="fr-FR" w:eastAsia="en-US" w:bidi="ar-SA"/>
+              </w:rPr>
             </w:r>
           </w:p>
           <w:p>
@@ -27393,7 +27556,14 @@
               </w:rPr>
             </w:pPr>
             <w:r>
-              <w:rPr/>
+              <w:rPr>
+                <w:rFonts w:eastAsia="Calibri" w:cs="" w:ascii="Carlito" w:hAnsi="Carlito"/>
+                <w:color w:val="000000"/>
+                <w:kern w:val="0"/>
+                <w:sz w:val="22"/>
+                <w:szCs w:val="22"/>
+                <w:lang w:val="fr-FR" w:eastAsia="en-US" w:bidi="ar-SA"/>
+              </w:rPr>
             </w:r>
           </w:p>
           <w:p>
@@ -27574,14 +27744,146 @@
                 <w:szCs w:val="22"/>
                 <w:lang w:val="fr-FR" w:eastAsia="en-US" w:bidi="ar-SA"/>
               </w:rPr>
+            </w:r>
+          </w:p>
+          <w:p>
+            <w:pPr>
+              <w:pStyle w:val="BodyText"/>
+              <w:widowControl/>
+              <w:tabs>
+                <w:tab w:val="clear" w:pos="709"/>
+                <w:tab w:val="left" w:pos="850" w:leader="none"/>
+              </w:tabs>
+              <w:suppressAutoHyphens w:val="true"/>
+              <w:spacing w:lineRule="auto" w:line="240" w:before="0" w:after="0"/>
+              <w:ind w:end="175"/>
+              <w:jc w:val="start"/>
+              <w:rPr>
+                <w:rStyle w:val="PlaceholderText"/>
+                <w:rFonts w:ascii="Carlito" w:hAnsi="Carlito" w:eastAsia="Calibri" w:cs=""/>
+                <w:color w:val="000000"/>
+                <w:kern w:val="0"/>
+                <w:sz w:val="22"/>
+                <w:szCs w:val="22"/>
+                <w:lang w:val="fr-FR" w:eastAsia="en-US" w:bidi="ar-SA"/>
+              </w:rPr>
+            </w:pPr>
+            <w:r>
+              <w:rPr>
+                <w:rFonts w:eastAsia="Calibri" w:cs="" w:ascii="Carlito" w:hAnsi="Carlito"/>
+                <w:color w:val="000000"/>
+                <w:kern w:val="0"/>
+                <w:sz w:val="22"/>
+                <w:szCs w:val="22"/>
+                <w:lang w:val="fr-FR" w:eastAsia="en-US" w:bidi="ar-SA"/>
+              </w:rPr>
+            </w:r>
+          </w:p>
+          <w:p>
+            <w:pPr>
+              <w:pStyle w:val="BodyText"/>
+              <w:widowControl/>
+              <w:tabs>
+                <w:tab w:val="clear" w:pos="709"/>
+                <w:tab w:val="left" w:pos="850" w:leader="none"/>
+              </w:tabs>
+              <w:suppressAutoHyphens w:val="true"/>
+              <w:spacing w:lineRule="auto" w:line="240" w:before="0" w:after="0"/>
+              <w:ind w:end="175"/>
+              <w:jc w:val="start"/>
+              <w:rPr>
+                <w:rStyle w:val="PlaceholderText"/>
+                <w:rFonts w:ascii="Carlito" w:hAnsi="Carlito" w:eastAsia="Calibri" w:cs=""/>
+                <w:color w:val="000000"/>
+                <w:kern w:val="0"/>
+                <w:sz w:val="22"/>
+                <w:szCs w:val="22"/>
+                <w:lang w:val="fr-FR" w:eastAsia="en-US" w:bidi="ar-SA"/>
+              </w:rPr>
+            </w:pPr>
+            <w:r>
+              <w:rPr>
+                <w:rFonts w:eastAsia="Calibri" w:cs="" w:ascii="Carlito" w:hAnsi="Carlito"/>
+                <w:color w:val="000000"/>
+                <w:kern w:val="0"/>
+                <w:sz w:val="22"/>
+                <w:szCs w:val="22"/>
+                <w:lang w:val="fr-FR" w:eastAsia="en-US" w:bidi="ar-SA"/>
+              </w:rPr>
+            </w:r>
+          </w:p>
+          <w:p>
+            <w:pPr>
+              <w:pStyle w:val="BodyText"/>
+              <w:widowControl/>
+              <w:tabs>
+                <w:tab w:val="clear" w:pos="709"/>
+                <w:tab w:val="left" w:pos="850" w:leader="none"/>
+              </w:tabs>
+              <w:suppressAutoHyphens w:val="true"/>
+              <w:spacing w:lineRule="auto" w:line="240" w:before="0" w:after="0"/>
+              <w:ind w:end="175"/>
+              <w:jc w:val="start"/>
+              <w:rPr>
+                <w:rStyle w:val="PlaceholderText"/>
+                <w:rFonts w:ascii="Carlito" w:hAnsi="Carlito" w:eastAsia="Calibri" w:cs=""/>
+                <w:color w:val="000000"/>
+                <w:kern w:val="0"/>
+                <w:sz w:val="22"/>
+                <w:szCs w:val="22"/>
+                <w:lang w:val="fr-FR" w:eastAsia="en-US" w:bidi="ar-SA"/>
+              </w:rPr>
+            </w:pPr>
+            <w:r>
+              <w:rPr>
+                <w:rFonts w:eastAsia="Calibri" w:cs="" w:ascii="Carlito" w:hAnsi="Carlito"/>
+                <w:color w:val="000000"/>
+                <w:kern w:val="0"/>
+                <w:sz w:val="22"/>
+                <w:szCs w:val="22"/>
+                <w:lang w:val="fr-FR" w:eastAsia="en-US" w:bidi="ar-SA"/>
+              </w:rPr>
+            </w:r>
+          </w:p>
+          <w:p>
+            <w:pPr>
+              <w:pStyle w:val="BodyText"/>
+              <w:widowControl/>
+              <w:tabs>
+                <w:tab w:val="clear" w:pos="709"/>
+                <w:tab w:val="left" w:pos="850" w:leader="none"/>
+              </w:tabs>
+              <w:suppressAutoHyphens w:val="true"/>
+              <w:spacing w:lineRule="auto" w:line="240" w:before="0" w:after="0"/>
+              <w:ind w:end="175"/>
+              <w:jc w:val="start"/>
+              <w:rPr>
+                <w:rStyle w:val="PlaceholderText"/>
+                <w:rFonts w:ascii="Carlito" w:hAnsi="Carlito" w:eastAsia="Calibri" w:cs=""/>
+                <w:color w:val="000000"/>
+                <w:kern w:val="0"/>
+                <w:sz w:val="22"/>
+                <w:szCs w:val="22"/>
+                <w:lang w:val="fr-FR" w:eastAsia="en-US" w:bidi="ar-SA"/>
+              </w:rPr>
+            </w:pPr>
+            <w:r>
+              <w:rPr>
+                <w:rFonts w:eastAsia="Calibri" w:cs="" w:ascii="Carlito" w:hAnsi="Carlito"/>
+                <w:color w:val="000000"/>
+                <w:kern w:val="0"/>
+                <w:sz w:val="22"/>
+                <w:szCs w:val="22"/>
+                <w:lang w:val="fr-FR" w:eastAsia="en-US" w:bidi="ar-SA"/>
+              </w:rPr>
               <w:drawing>
-                <wp:anchor distT="0" distB="0" distL="0" distR="0" simplePos="0" relativeHeight="114" behindDoc="0" locked="0" layoutInCell="0" allowOverlap="1">
+                <wp:anchor distT="0" distB="0" distL="0" distR="0" simplePos="0" relativeHeight="119" behindDoc="0" locked="0" layoutInCell="0" allowOverlap="1">
                   <wp:simplePos x="0" y="0"/>
-                  <wp:positionH relativeFrom="margin">
-                    <wp:posOffset>55880</wp:posOffset>
+                  <wp:positionH relativeFrom="column">
+                    <wp:posOffset>97155</wp:posOffset>
                   </wp:positionH>
                   <wp:positionV relativeFrom="paragraph">
-                    <wp:posOffset>181610</wp:posOffset>
+                    <wp:posOffset>535940</wp:posOffset>
                   </wp:positionV>
                   <wp:extent cx="5963285" cy="7068820"/>
                   <wp:effectExtent l="0" t="0" r="0" b="0"/>
@@ -27620,138 +27922,6 @@
                   </a:graphic>
                 </wp:anchor>
               </w:drawing>
-            </w:r>
-          </w:p>
-          <w:p>
-            <w:pPr>
-              <w:pStyle w:val="BodyText"/>
-              <w:widowControl/>
-              <w:tabs>
-                <w:tab w:val="clear" w:pos="709"/>
-                <w:tab w:val="left" w:pos="850" w:leader="none"/>
-              </w:tabs>
-              <w:suppressAutoHyphens w:val="true"/>
-              <w:spacing w:lineRule="auto" w:line="240" w:before="0" w:after="0"/>
-              <w:ind w:end="175"/>
-              <w:jc w:val="start"/>
-              <w:rPr>
-                <w:rStyle w:val="PlaceholderText"/>
-                <w:rFonts w:ascii="Carlito" w:hAnsi="Carlito" w:eastAsia="Calibri" w:cs=""/>
-                <w:color w:val="000000"/>
-                <w:kern w:val="0"/>
-                <w:sz w:val="22"/>
-                <w:szCs w:val="22"/>
-                <w:lang w:val="fr-FR" w:eastAsia="en-US" w:bidi="ar-SA"/>
-              </w:rPr>
-            </w:pPr>
-            <w:r>
-              <w:rPr>
-                <w:rFonts w:eastAsia="Calibri" w:cs="" w:ascii="Carlito" w:hAnsi="Carlito"/>
-                <w:color w:val="000000"/>
-                <w:kern w:val="0"/>
-                <w:sz w:val="22"/>
-                <w:szCs w:val="22"/>
-                <w:lang w:val="fr-FR" w:eastAsia="en-US" w:bidi="ar-SA"/>
-              </w:rPr>
-            </w:r>
-          </w:p>
-          <w:p>
-            <w:pPr>
-              <w:pStyle w:val="BodyText"/>
-              <w:widowControl/>
-              <w:tabs>
-                <w:tab w:val="clear" w:pos="709"/>
-                <w:tab w:val="left" w:pos="850" w:leader="none"/>
-              </w:tabs>
-              <w:suppressAutoHyphens w:val="true"/>
-              <w:spacing w:lineRule="auto" w:line="240" w:before="0" w:after="0"/>
-              <w:ind w:end="175"/>
-              <w:jc w:val="start"/>
-              <w:rPr>
-                <w:rStyle w:val="PlaceholderText"/>
-                <w:rFonts w:ascii="Carlito" w:hAnsi="Carlito" w:eastAsia="Calibri" w:cs=""/>
-                <w:color w:val="000000"/>
-                <w:kern w:val="0"/>
-                <w:sz w:val="22"/>
-                <w:szCs w:val="22"/>
-                <w:lang w:val="fr-FR" w:eastAsia="en-US" w:bidi="ar-SA"/>
-              </w:rPr>
-            </w:pPr>
-            <w:r>
-              <w:rPr>
-                <w:rFonts w:eastAsia="Calibri" w:cs="" w:ascii="Carlito" w:hAnsi="Carlito"/>
-                <w:color w:val="000000"/>
-                <w:kern w:val="0"/>
-                <w:sz w:val="22"/>
-                <w:szCs w:val="22"/>
-                <w:lang w:val="fr-FR" w:eastAsia="en-US" w:bidi="ar-SA"/>
-              </w:rPr>
-            </w:r>
-          </w:p>
-          <w:p>
-            <w:pPr>
-              <w:pStyle w:val="BodyText"/>
-              <w:widowControl/>
-              <w:tabs>
-                <w:tab w:val="clear" w:pos="709"/>
-                <w:tab w:val="left" w:pos="850" w:leader="none"/>
-              </w:tabs>
-              <w:suppressAutoHyphens w:val="true"/>
-              <w:spacing w:lineRule="auto" w:line="240" w:before="0" w:after="0"/>
-              <w:ind w:end="175"/>
-              <w:jc w:val="start"/>
-              <w:rPr>
-                <w:rStyle w:val="PlaceholderText"/>
-                <w:rFonts w:ascii="Carlito" w:hAnsi="Carlito" w:eastAsia="Calibri" w:cs=""/>
-                <w:color w:val="000000"/>
-                <w:kern w:val="0"/>
-                <w:sz w:val="22"/>
-                <w:szCs w:val="22"/>
-                <w:lang w:val="fr-FR" w:eastAsia="en-US" w:bidi="ar-SA"/>
-              </w:rPr>
-            </w:pPr>
-            <w:r>
-              <w:rPr>
-                <w:rFonts w:eastAsia="Calibri" w:cs="" w:ascii="Carlito" w:hAnsi="Carlito"/>
-                <w:color w:val="000000"/>
-                <w:kern w:val="0"/>
-                <w:sz w:val="22"/>
-                <w:szCs w:val="22"/>
-                <w:lang w:val="fr-FR" w:eastAsia="en-US" w:bidi="ar-SA"/>
-              </w:rPr>
-            </w:r>
-          </w:p>
-          <w:p>
-            <w:pPr>
-              <w:pStyle w:val="BodyText"/>
-              <w:widowControl/>
-              <w:tabs>
-                <w:tab w:val="clear" w:pos="709"/>
-                <w:tab w:val="left" w:pos="850" w:leader="none"/>
-              </w:tabs>
-              <w:suppressAutoHyphens w:val="true"/>
-              <w:spacing w:lineRule="auto" w:line="240" w:before="0" w:after="0"/>
-              <w:ind w:end="175"/>
-              <w:jc w:val="start"/>
-              <w:rPr>
-                <w:rStyle w:val="PlaceholderText"/>
-                <w:rFonts w:ascii="Carlito" w:hAnsi="Carlito" w:eastAsia="Calibri" w:cs=""/>
-                <w:color w:val="000000"/>
-                <w:kern w:val="0"/>
-                <w:sz w:val="22"/>
-                <w:szCs w:val="22"/>
-                <w:lang w:val="fr-FR" w:eastAsia="en-US" w:bidi="ar-SA"/>
-              </w:rPr>
-            </w:pPr>
-            <w:r>
-              <w:rPr>
-                <w:rFonts w:eastAsia="Calibri" w:cs="" w:ascii="Carlito" w:hAnsi="Carlito"/>
-                <w:color w:val="000000"/>
-                <w:kern w:val="0"/>
-                <w:sz w:val="22"/>
-                <w:szCs w:val="22"/>
-                <w:lang w:val="fr-FR" w:eastAsia="en-US" w:bidi="ar-SA"/>
-              </w:rPr>
             </w:r>
           </w:p>
           <w:p>
@@ -28482,13 +28652,13 @@
         <mc:AlternateContent>
           <mc:Choice Requires="wps">
             <w:drawing>
-              <wp:anchor distT="0" distB="0" distL="0" distR="0" simplePos="0" relativeHeight="6" behindDoc="0" locked="0" layoutInCell="0" allowOverlap="1" wp14:anchorId="7C090976">
+              <wp:anchor distT="0" distB="0" distL="0" distR="0" simplePos="0" relativeHeight="7" behindDoc="0" locked="0" layoutInCell="0" allowOverlap="1" wp14:anchorId="7C090976">
                 <wp:simplePos x="0" y="0"/>
                 <wp:positionH relativeFrom="margin">
-                  <wp:posOffset>5344795</wp:posOffset>
+                  <wp:posOffset>5344160</wp:posOffset>
                 </wp:positionH>
                 <wp:positionV relativeFrom="page">
-                  <wp:posOffset>9928860</wp:posOffset>
+                  <wp:posOffset>9929495</wp:posOffset>
                 </wp:positionV>
                 <wp:extent cx="473710" cy="376555"/>
                 <wp:effectExtent l="0" t="0" r="0" b="0"/>
@@ -28523,7 +28693,7 @@
                         <w:txbxContent>
                           <w:p>
                             <w:pPr>
-                              <w:pStyle w:val="FrameContents"/>
+                              <w:pStyle w:val="FrameContentsuser"/>
                               <w:spacing w:lineRule="auto" w:line="288" w:before="0" w:after="0"/>
                               <w:ind w:end="-58"/>
                               <w:jc w:val="center"/>
@@ -28544,7 +28714,7 @@
                           </w:p>
                         </w:txbxContent>
                       </wps:txbx>
-                      <wps:bodyPr lIns="45720" tIns="91440" rIns="45720" bIns="91440" anchor="ctr" vert="vert" upright="1">
+                      <wps:bodyPr anchor="ctr" vert="vert" upright="1">
                         <a:noAutofit/>
                       </wps:bodyPr>
                     </wps:wsp>
@@ -28555,14 +28725,14 @@
           </mc:Choice>
           <mc:Fallback>
             <w:pict>
-              <v:shape id="shape_0" stroked="f" o:allowincell="f" style="position:absolute;margin-left:420.85pt;margin-top:781.75pt;width:37.25pt;height:29.6pt;mso-wrap-style:none;v-text-anchor:middle;rotation:90;mso-position-horizontal-relative:margin;mso-position-vertical-relative:page" wp14:anchorId="7C090976" type="_x0000_t186" path="l-2147483642,-2147483642l-2147483623,-2147483622l-2147483642,-2147483634l-2147483642,-2147483642l-2147483621,-2147483620l-2147483642,-2147483642l-2147483619,-2147483618l-2147483642,-2147483642l-2147483642,-2147483642l-2147483617,-2147483616l-2147483639,0l-2147483642,-2147483642l-2147483615,-2147483614xel-2147483642,-2147483642l-2147483613,-2147483612l-2147483642,-2147483642l-2147483611,-2147483610l-2147483638,-2147483633l-2147483642,-2147483642l-2147483640,-2147483625l-2147483642,-2147483642l-2147483607,-2147483606l-2147483642,-2147483634l-2147483642,-2147483642l-2147483605,-2147483604e">
+              <v:shape id="shape_0" stroked="f" o:allowincell="f" style="position:absolute;margin-left:420.8pt;margin-top:781.8pt;width:37.25pt;height:29.6pt;mso-wrap-style:none;v-text-anchor:middle;rotation:90;mso-position-horizontal-relative:margin;mso-position-vertical-relative:page" wp14:anchorId="7C090976" type="_x0000_t186" path="l-2147483642,-2147483642l-2147483623,-2147483622l-2147483642,-2147483634l-2147483642,-2147483642l-2147483621,-2147483620l-2147483642,-2147483642l-2147483619,-2147483618l-2147483642,-2147483642l-2147483642,-2147483642l-2147483617,-2147483616l-2147483639,0l-2147483642,-2147483642l-2147483615,-2147483614xel-2147483642,-2147483642l-2147483613,-2147483612l-2147483642,-2147483642l-2147483611,-2147483610l-2147483638,-2147483633l-2147483642,-2147483642l-2147483640,-2147483625l-2147483642,-2147483642l-2147483607,-2147483606l-2147483642,-2147483634l-2147483642,-2147483642l-2147483605,-2147483604e">
                 <v:fill o:detectmouseclick="t" on="false"/>
                 <v:stroke color="#3465a4" joinstyle="round" endcap="flat"/>
                 <v:textbox>
                   <w:txbxContent>
                     <w:p>
                       <w:pPr>
-                        <w:pStyle w:val="FrameContents"/>
+                        <w:pStyle w:val="FrameContentsuser"/>
                         <w:spacing w:lineRule="auto" w:line="288" w:before="0" w:after="0"/>
                         <w:ind w:end="-58"/>
                         <w:jc w:val="center"/>
@@ -28657,13 +28827,13 @@
       <mc:AlternateContent>
         <mc:Choice Requires="wps">
           <w:drawing>
-            <wp:anchor distT="1270" distB="1270" distL="1270" distR="1270" simplePos="0" relativeHeight="54" behindDoc="1" locked="0" layoutInCell="0" allowOverlap="1" wp14:anchorId="7E31E2B7">
+            <wp:anchor distT="1270" distB="1270" distL="1270" distR="1270" simplePos="0" relativeHeight="72" behindDoc="1" locked="0" layoutInCell="0" allowOverlap="1" wp14:anchorId="7E31E2B7">
               <wp:simplePos x="0" y="0"/>
               <wp:positionH relativeFrom="margin">
-                <wp:posOffset>5240020</wp:posOffset>
+                <wp:posOffset>5239385</wp:posOffset>
               </wp:positionH>
               <wp:positionV relativeFrom="page">
-                <wp:posOffset>9819005</wp:posOffset>
+                <wp:posOffset>9819640</wp:posOffset>
               </wp:positionV>
               <wp:extent cx="355600" cy="600075"/>
               <wp:effectExtent l="1270" t="1270" r="1270" b="1270"/>
@@ -28700,7 +28870,7 @@
                       <w:txbxContent>
                         <w:p>
                           <w:pPr>
-                            <w:pStyle w:val="FrameContents"/>
+                            <w:pStyle w:val="FrameContentsuser"/>
                             <w:spacing w:lineRule="auto" w:line="288" w:before="0" w:after="0"/>
                             <w:ind w:end="-57"/>
                             <w:jc w:val="end"/>
@@ -28726,7 +28896,7 @@
                         </w:p>
                       </w:txbxContent>
                     </wps:txbx>
-                    <wps:bodyPr lIns="45720" tIns="91440" rIns="45720" bIns="91440" anchor="ctr" vert="vert" upright="1">
+                    <wps:bodyPr anchor="ctr" vert="vert" upright="1">
                       <a:noAutofit/>
                     </wps:bodyPr>
                   </wps:wsp>
@@ -28737,14 +28907,14 @@
         </mc:Choice>
         <mc:Fallback>
           <w:pict>
-            <v:shape id="shape_0" stroked="t" o:allowincell="f" style="position:absolute;margin-left:412.55pt;margin-top:773.15pt;width:27.95pt;height:47.2pt;mso-wrap-style:none;v-text-anchor:middle;rotation:90;mso-position-horizontal-relative:margin;mso-position-vertical-relative:page" wp14:anchorId="7E31E2B7" type="_x0000_t186" path="l-2147483642,-2147483642l-2147483623,-2147483622l-2147483642,-2147483634l-2147483642,-2147483642l-2147483621,-2147483620l-2147483642,-2147483642l-2147483619,-2147483618l-2147483642,-2147483642l-2147483642,-2147483642l-2147483617,-2147483616l-2147483639,0l-2147483642,-2147483642l-2147483615,-2147483614xel-2147483642,-2147483642l-2147483613,-2147483612l-2147483642,-2147483642l-2147483611,-2147483610l-2147483638,-2147483633l-2147483642,-2147483642l-2147483640,-2147483625l-2147483642,-2147483642l-2147483607,-2147483606l-2147483642,-2147483634l-2147483642,-2147483642l-2147483605,-2147483604e">
+            <v:shape id="shape_0" stroked="t" o:allowincell="f" style="position:absolute;margin-left:412.5pt;margin-top:773.2pt;width:27.95pt;height:47.2pt;mso-wrap-style:none;v-text-anchor:middle;rotation:90;mso-position-horizontal-relative:margin;mso-position-vertical-relative:page" wp14:anchorId="7E31E2B7" type="_x0000_t186" path="l-2147483642,-2147483642l-2147483623,-2147483622l-2147483642,-2147483634l-2147483642,-2147483642l-2147483621,-2147483620l-2147483642,-2147483642l-2147483619,-2147483618l-2147483642,-2147483642l-2147483642,-2147483642l-2147483617,-2147483616l-2147483639,0l-2147483642,-2147483642l-2147483615,-2147483614xel-2147483642,-2147483642l-2147483613,-2147483612l-2147483642,-2147483642l-2147483611,-2147483610l-2147483638,-2147483633l-2147483642,-2147483642l-2147483640,-2147483625l-2147483642,-2147483642l-2147483607,-2147483606l-2147483642,-2147483634l-2147483642,-2147483642l-2147483605,-2147483604e">
               <v:fill o:detectmouseclick="t" on="false"/>
               <v:stroke color="#d9d9d9" joinstyle="round" endcap="flat"/>
               <v:textbox>
                 <w:txbxContent>
                   <w:p>
                     <w:pPr>
-                      <w:pStyle w:val="FrameContents"/>
+                      <w:pStyle w:val="FrameContentsuser"/>
                       <w:spacing w:lineRule="auto" w:line="288" w:before="0" w:after="0"/>
                       <w:ind w:end="-57"/>
                       <w:jc w:val="end"/>
@@ -28778,13 +28948,13 @@
       <mc:AlternateContent>
         <mc:Choice Requires="wps">
           <w:drawing>
-            <wp:anchor distT="0" distB="0" distL="97790" distR="114300" simplePos="0" relativeHeight="101" behindDoc="1" locked="0" layoutInCell="0" allowOverlap="1" wp14:anchorId="1A5B76DB">
+            <wp:anchor distT="0" distB="0" distL="95885" distR="114300" simplePos="0" relativeHeight="116" behindDoc="1" locked="0" layoutInCell="0" allowOverlap="1" wp14:anchorId="1A5B76DB">
               <wp:simplePos x="0" y="0"/>
               <wp:positionH relativeFrom="margin">
-                <wp:posOffset>5330190</wp:posOffset>
+                <wp:posOffset>5329555</wp:posOffset>
               </wp:positionH>
               <wp:positionV relativeFrom="page">
-                <wp:posOffset>9917430</wp:posOffset>
+                <wp:posOffset>9918065</wp:posOffset>
               </wp:positionV>
               <wp:extent cx="473710" cy="376555"/>
               <wp:effectExtent l="0" t="0" r="0" b="0"/>
@@ -28819,7 +28989,7 @@
                       <w:txbxContent>
                         <w:p>
                           <w:pPr>
-                            <w:pStyle w:val="FrameContents"/>
+                            <w:pStyle w:val="FrameContentsuser"/>
                             <w:spacing w:lineRule="auto" w:line="288" w:before="0" w:after="0"/>
                             <w:ind w:end="-58"/>
                             <w:jc w:val="center"/>
@@ -28874,7 +29044,7 @@
                               <w:sz w:val="28"/>
                               <w:szCs w:val="28"/>
                             </w:rPr>
-                            <w:t>23</w:t>
+                            <w:t>24</w:t>
                           </w:r>
                           <w:r>
                             <w:rPr>
@@ -28890,7 +29060,7 @@
                         </w:p>
                       </w:txbxContent>
                     </wps:txbx>
-                    <wps:bodyPr lIns="45720" tIns="91440" rIns="45720" bIns="91440" anchor="ctr" vert="vert" upright="1">
+                    <wps:bodyPr anchor="ctr" vert="vert" upright="1">
                       <a:noAutofit/>
                     </wps:bodyPr>
                   </wps:wsp>
@@ -28901,14 +29071,14 @@
         </mc:Choice>
         <mc:Fallback>
           <w:pict>
-            <v:shape id="shape_0" stroked="f" o:allowincell="f" style="position:absolute;margin-left:419.7pt;margin-top:780.85pt;width:37.25pt;height:29.6pt;mso-wrap-style:square;v-text-anchor:middle;rotation:90;mso-position-horizontal-relative:margin;mso-position-vertical-relative:page" wp14:anchorId="1A5B76DB" type="_x0000_t186" path="l-2147483642,-2147483642l-2147483623,-2147483622l-2147483642,-2147483634l-2147483642,-2147483642l-2147483621,-2147483620l-2147483642,-2147483642l-2147483619,-2147483618l-2147483642,-2147483642l-2147483642,-2147483642l-2147483617,-2147483616l-2147483639,0l-2147483642,-2147483642l-2147483615,-2147483614xel-2147483642,-2147483642l-2147483613,-2147483612l-2147483642,-2147483642l-2147483611,-2147483610l-2147483638,-2147483633l-2147483642,-2147483642l-2147483640,-2147483625l-2147483642,-2147483642l-2147483607,-2147483606l-2147483642,-2147483634l-2147483642,-2147483642l-2147483605,-2147483604e">
+            <v:shape id="shape_0" stroked="f" o:allowincell="f" style="position:absolute;margin-left:419.65pt;margin-top:780.9pt;width:37.25pt;height:29.6pt;mso-wrap-style:square;v-text-anchor:middle;rotation:90;mso-position-horizontal-relative:margin;mso-position-vertical-relative:page" wp14:anchorId="1A5B76DB" type="_x0000_t186" path="l-2147483642,-2147483642l-2147483623,-2147483622l-2147483642,-2147483634l-2147483642,-2147483642l-2147483621,-2147483620l-2147483642,-2147483642l-2147483619,-2147483618l-2147483642,-2147483642l-2147483642,-2147483642l-2147483617,-2147483616l-2147483639,0l-2147483642,-2147483642l-2147483615,-2147483614xel-2147483642,-2147483642l-2147483613,-2147483612l-2147483642,-2147483642l-2147483611,-2147483610l-2147483638,-2147483633l-2147483642,-2147483642l-2147483640,-2147483625l-2147483642,-2147483642l-2147483607,-2147483606l-2147483642,-2147483634l-2147483642,-2147483642l-2147483605,-2147483604e">
               <v:fill o:detectmouseclick="t" on="false"/>
               <v:stroke color="#3465a4" joinstyle="round" endcap="flat"/>
               <v:textbox>
                 <w:txbxContent>
                   <w:p>
                     <w:pPr>
-                      <w:pStyle w:val="FrameContents"/>
+                      <w:pStyle w:val="FrameContentsuser"/>
                       <w:spacing w:lineRule="auto" w:line="288" w:before="0" w:after="0"/>
                       <w:ind w:end="-58"/>
                       <w:jc w:val="center"/>
@@ -28963,7 +29133,7 @@
                         <w:sz w:val="28"/>
                         <w:szCs w:val="28"/>
                       </w:rPr>
-                      <w:t>23</w:t>
+                      <w:t>24</w:t>
                     </w:r>
                     <w:r>
                       <w:rPr>
@@ -29051,13 +29221,13 @@
       <mc:AlternateContent>
         <mc:Choice Requires="wps">
           <w:drawing>
-            <wp:anchor distT="1270" distB="1270" distL="1270" distR="1270" simplePos="0" relativeHeight="54" behindDoc="1" locked="0" layoutInCell="0" allowOverlap="1" wp14:anchorId="7E31E2B7">
+            <wp:anchor distT="1270" distB="1270" distL="1270" distR="1270" simplePos="0" relativeHeight="72" behindDoc="1" locked="0" layoutInCell="0" allowOverlap="1" wp14:anchorId="7E31E2B7">
               <wp:simplePos x="0" y="0"/>
               <wp:positionH relativeFrom="margin">
-                <wp:posOffset>5240020</wp:posOffset>
+                <wp:posOffset>5239385</wp:posOffset>
               </wp:positionH>
               <wp:positionV relativeFrom="page">
-                <wp:posOffset>9819005</wp:posOffset>
+                <wp:posOffset>9819640</wp:posOffset>
               </wp:positionV>
               <wp:extent cx="355600" cy="600075"/>
               <wp:effectExtent l="1270" t="1270" r="1270" b="1270"/>
@@ -29094,7 +29264,7 @@
                       <w:txbxContent>
                         <w:p>
                           <w:pPr>
-                            <w:pStyle w:val="FrameContents"/>
+                            <w:pStyle w:val="FrameContentsuser"/>
                             <w:spacing w:lineRule="auto" w:line="288" w:before="0" w:after="0"/>
                             <w:ind w:end="-57"/>
                             <w:jc w:val="end"/>
@@ -29120,7 +29290,7 @@
                         </w:p>
                       </w:txbxContent>
                     </wps:txbx>
-                    <wps:bodyPr lIns="45720" tIns="91440" rIns="45720" bIns="91440" anchor="ctr" vert="vert" upright="1">
+                    <wps:bodyPr anchor="ctr" vert="vert" upright="1">
                       <a:noAutofit/>
                     </wps:bodyPr>
                   </wps:wsp>
@@ -29131,14 +29301,14 @@
         </mc:Choice>
         <mc:Fallback>
           <w:pict>
-            <v:shape id="shape_0" stroked="t" o:allowincell="f" style="position:absolute;margin-left:412.55pt;margin-top:773.15pt;width:27.95pt;height:47.2pt;mso-wrap-style:none;v-text-anchor:middle;rotation:90;mso-position-horizontal-relative:margin;mso-position-vertical-relative:page" wp14:anchorId="7E31E2B7" type="_x0000_t186" path="l-2147483642,-2147483642l-2147483623,-2147483622l-2147483642,-2147483634l-2147483642,-2147483642l-2147483621,-2147483620l-2147483642,-2147483642l-2147483619,-2147483618l-2147483642,-2147483642l-2147483642,-2147483642l-2147483617,-2147483616l-2147483639,0l-2147483642,-2147483642l-2147483615,-2147483614xel-2147483642,-2147483642l-2147483613,-2147483612l-2147483642,-2147483642l-2147483611,-2147483610l-2147483638,-2147483633l-2147483642,-2147483642l-2147483640,-2147483625l-2147483642,-2147483642l-2147483607,-2147483606l-2147483642,-2147483634l-2147483642,-2147483642l-2147483605,-2147483604e">
+            <v:shape id="shape_0" stroked="t" o:allowincell="f" style="position:absolute;margin-left:412.5pt;margin-top:773.2pt;width:27.95pt;height:47.2pt;mso-wrap-style:none;v-text-anchor:middle;rotation:90;mso-position-horizontal-relative:margin;mso-position-vertical-relative:page" wp14:anchorId="7E31E2B7" type="_x0000_t186" path="l-2147483642,-2147483642l-2147483623,-2147483622l-2147483642,-2147483634l-2147483642,-2147483642l-2147483621,-2147483620l-2147483642,-2147483642l-2147483619,-2147483618l-2147483642,-2147483642l-2147483642,-2147483642l-2147483617,-2147483616l-2147483639,0l-2147483642,-2147483642l-2147483615,-2147483614xel-2147483642,-2147483642l-2147483613,-2147483612l-2147483642,-2147483642l-2147483611,-2147483610l-2147483638,-2147483633l-2147483642,-2147483642l-2147483640,-2147483625l-2147483642,-2147483642l-2147483607,-2147483606l-2147483642,-2147483634l-2147483642,-2147483642l-2147483605,-2147483604e">
               <v:fill o:detectmouseclick="t" on="false"/>
               <v:stroke color="#d9d9d9" joinstyle="round" endcap="flat"/>
               <v:textbox>
                 <w:txbxContent>
                   <w:p>
                     <w:pPr>
-                      <w:pStyle w:val="FrameContents"/>
+                      <w:pStyle w:val="FrameContentsuser"/>
                       <w:spacing w:lineRule="auto" w:line="288" w:before="0" w:after="0"/>
                       <w:ind w:end="-57"/>
                       <w:jc w:val="end"/>
@@ -29172,13 +29342,13 @@
       <mc:AlternateContent>
         <mc:Choice Requires="wps">
           <w:drawing>
-            <wp:anchor distT="0" distB="0" distL="97790" distR="114300" simplePos="0" relativeHeight="101" behindDoc="1" locked="0" layoutInCell="0" allowOverlap="1" wp14:anchorId="1A5B76DB">
+            <wp:anchor distT="0" distB="0" distL="95885" distR="114300" simplePos="0" relativeHeight="116" behindDoc="1" locked="0" layoutInCell="0" allowOverlap="1" wp14:anchorId="1A5B76DB">
               <wp:simplePos x="0" y="0"/>
               <wp:positionH relativeFrom="margin">
-                <wp:posOffset>5330190</wp:posOffset>
+                <wp:posOffset>5329555</wp:posOffset>
               </wp:positionH>
               <wp:positionV relativeFrom="page">
-                <wp:posOffset>9917430</wp:posOffset>
+                <wp:posOffset>9918065</wp:posOffset>
               </wp:positionV>
               <wp:extent cx="473710" cy="376555"/>
               <wp:effectExtent l="0" t="0" r="0" b="0"/>
@@ -29213,7 +29383,7 @@
                       <w:txbxContent>
                         <w:p>
                           <w:pPr>
-                            <w:pStyle w:val="FrameContents"/>
+                            <w:pStyle w:val="FrameContentsuser"/>
                             <w:spacing w:lineRule="auto" w:line="288" w:before="0" w:after="0"/>
                             <w:ind w:end="-58"/>
                             <w:jc w:val="center"/>
@@ -29268,7 +29438,7 @@
                               <w:sz w:val="28"/>
                               <w:szCs w:val="28"/>
                             </w:rPr>
-                            <w:t>23</w:t>
+                            <w:t>24</w:t>
                           </w:r>
                           <w:r>
                             <w:rPr>
@@ -29284,7 +29454,7 @@
                         </w:p>
                       </w:txbxContent>
                     </wps:txbx>
-                    <wps:bodyPr lIns="45720" tIns="91440" rIns="45720" bIns="91440" anchor="ctr" vert="vert" upright="1">
+                    <wps:bodyPr anchor="ctr" vert="vert" upright="1">
                       <a:noAutofit/>
                     </wps:bodyPr>
                   </wps:wsp>
@@ -29295,14 +29465,14 @@
         </mc:Choice>
         <mc:Fallback>
           <w:pict>
-            <v:shape id="shape_0" stroked="f" o:allowincell="f" style="position:absolute;margin-left:419.7pt;margin-top:780.85pt;width:37.25pt;height:29.6pt;mso-wrap-style:square;v-text-anchor:middle;rotation:90;mso-position-horizontal-relative:margin;mso-position-vertical-relative:page" wp14:anchorId="1A5B76DB" type="_x0000_t186" path="l-2147483642,-2147483642l-2147483623,-2147483622l-2147483642,-2147483634l-2147483642,-2147483642l-2147483621,-2147483620l-2147483642,-2147483642l-2147483619,-2147483618l-2147483642,-2147483642l-2147483642,-2147483642l-2147483617,-2147483616l-2147483639,0l-2147483642,-2147483642l-2147483615,-2147483614xel-2147483642,-2147483642l-2147483613,-2147483612l-2147483642,-2147483642l-2147483611,-2147483610l-2147483638,-2147483633l-2147483642,-2147483642l-2147483640,-2147483625l-2147483642,-2147483642l-2147483607,-2147483606l-2147483642,-2147483634l-2147483642,-2147483642l-2147483605,-2147483604e">
+            <v:shape id="shape_0" stroked="f" o:allowincell="f" style="position:absolute;margin-left:419.65pt;margin-top:780.9pt;width:37.25pt;height:29.6pt;mso-wrap-style:square;v-text-anchor:middle;rotation:90;mso-position-horizontal-relative:margin;mso-position-vertical-relative:page" wp14:anchorId="1A5B76DB" type="_x0000_t186" path="l-2147483642,-2147483642l-2147483623,-2147483622l-2147483642,-2147483634l-2147483642,-2147483642l-2147483621,-2147483620l-2147483642,-2147483642l-2147483619,-2147483618l-2147483642,-2147483642l-2147483642,-2147483642l-2147483617,-2147483616l-2147483639,0l-2147483642,-2147483642l-2147483615,-2147483614xel-2147483642,-2147483642l-2147483613,-2147483612l-2147483642,-2147483642l-2147483611,-2147483610l-2147483638,-2147483633l-2147483642,-2147483642l-2147483640,-2147483625l-2147483642,-2147483642l-2147483607,-2147483606l-2147483642,-2147483634l-2147483642,-2147483642l-2147483605,-2147483604e">
               <v:fill o:detectmouseclick="t" on="false"/>
               <v:stroke color="#3465a4" joinstyle="round" endcap="flat"/>
               <v:textbox>
                 <w:txbxContent>
                   <w:p>
                     <w:pPr>
-                      <w:pStyle w:val="FrameContents"/>
+                      <w:pStyle w:val="FrameContentsuser"/>
                       <w:spacing w:lineRule="auto" w:line="288" w:before="0" w:after="0"/>
                       <w:ind w:end="-58"/>
                       <w:jc w:val="center"/>
@@ -29357,7 +29527,7 @@
                         <w:sz w:val="28"/>
                         <w:szCs w:val="28"/>
                       </w:rPr>
-                      <w:t>23</w:t>
+                      <w:t>24</w:t>
                     </w:r>
                     <w:r>
                       <w:rPr>
@@ -29459,13 +29629,13 @@
       <mc:AlternateContent>
         <mc:Choice Requires="wps">
           <w:drawing>
-            <wp:anchor distT="1270" distB="1270" distL="1270" distR="1270" simplePos="0" relativeHeight="56" behindDoc="1" locked="0" layoutInCell="0" allowOverlap="1" wp14:anchorId="7E31E2B7">
+            <wp:anchor distT="1270" distB="1270" distL="1270" distR="1270" simplePos="0" relativeHeight="20" behindDoc="1" locked="0" layoutInCell="0" allowOverlap="1" wp14:anchorId="7E31E2B7">
               <wp:simplePos x="0" y="0"/>
               <wp:positionH relativeFrom="margin">
-                <wp:posOffset>5240020</wp:posOffset>
+                <wp:posOffset>5239385</wp:posOffset>
               </wp:positionH>
               <wp:positionV relativeFrom="page">
-                <wp:posOffset>9819005</wp:posOffset>
+                <wp:posOffset>9819640</wp:posOffset>
               </wp:positionV>
               <wp:extent cx="355600" cy="600075"/>
               <wp:effectExtent l="1270" t="1270" r="1270" b="1270"/>
@@ -29502,7 +29672,7 @@
                       <w:txbxContent>
                         <w:p>
                           <w:pPr>
-                            <w:pStyle w:val="FrameContents"/>
+                            <w:pStyle w:val="FrameContentsuser"/>
                             <w:spacing w:lineRule="auto" w:line="288" w:before="0" w:after="0"/>
                             <w:ind w:end="-57"/>
                             <w:jc w:val="end"/>
@@ -29528,7 +29698,7 @@
                         </w:p>
                       </w:txbxContent>
                     </wps:txbx>
-                    <wps:bodyPr lIns="45720" tIns="91440" rIns="45720" bIns="91440" anchor="ctr" vert="vert" upright="1">
+                    <wps:bodyPr anchor="ctr" vert="vert" upright="1">
                       <a:noAutofit/>
                     </wps:bodyPr>
                   </wps:wsp>
@@ -29539,14 +29709,14 @@
         </mc:Choice>
         <mc:Fallback>
           <w:pict>
-            <v:shape id="shape_0" stroked="t" o:allowincell="f" style="position:absolute;margin-left:412.55pt;margin-top:773.15pt;width:27.95pt;height:47.2pt;mso-wrap-style:none;v-text-anchor:middle;rotation:90;mso-position-horizontal-relative:margin;mso-position-vertical-relative:page" wp14:anchorId="7E31E2B7" type="_x0000_t186" path="l-2147483642,-2147483642l-2147483623,-2147483622l-2147483642,-2147483634l-2147483642,-2147483642l-2147483621,-2147483620l-2147483642,-2147483642l-2147483619,-2147483618l-2147483642,-2147483642l-2147483642,-2147483642l-2147483617,-2147483616l-2147483639,0l-2147483642,-2147483642l-2147483615,-2147483614xel-2147483642,-2147483642l-2147483613,-2147483612l-2147483642,-2147483642l-2147483611,-2147483610l-2147483638,-2147483633l-2147483642,-2147483642l-2147483640,-2147483625l-2147483642,-2147483642l-2147483607,-2147483606l-2147483642,-2147483634l-2147483642,-2147483642l-2147483605,-2147483604e">
+            <v:shape id="shape_0" stroked="t" o:allowincell="f" style="position:absolute;margin-left:412.5pt;margin-top:773.2pt;width:27.95pt;height:47.2pt;mso-wrap-style:none;v-text-anchor:middle;rotation:90;mso-position-horizontal-relative:margin;mso-position-vertical-relative:page" wp14:anchorId="7E31E2B7" type="_x0000_t186" path="l-2147483642,-2147483642l-2147483623,-2147483622l-2147483642,-2147483634l-2147483642,-2147483642l-2147483621,-2147483620l-2147483642,-2147483642l-2147483619,-2147483618l-2147483642,-2147483642l-2147483642,-2147483642l-2147483617,-2147483616l-2147483639,0l-2147483642,-2147483642l-2147483615,-2147483614xel-2147483642,-2147483642l-2147483613,-2147483612l-2147483642,-2147483642l-2147483611,-2147483610l-2147483638,-2147483633l-2147483642,-2147483642l-2147483640,-2147483625l-2147483642,-2147483642l-2147483607,-2147483606l-2147483642,-2147483634l-2147483642,-2147483642l-2147483605,-2147483604e">
               <v:fill o:detectmouseclick="t" on="false"/>
               <v:stroke color="#d9d9d9" joinstyle="round" endcap="flat"/>
               <v:textbox>
                 <w:txbxContent>
                   <w:p>
                     <w:pPr>
-                      <w:pStyle w:val="FrameContents"/>
+                      <w:pStyle w:val="FrameContentsuser"/>
                       <w:spacing w:lineRule="auto" w:line="288" w:before="0" w:after="0"/>
                       <w:ind w:end="-57"/>
                       <w:jc w:val="end"/>
@@ -29580,13 +29750,13 @@
       <mc:AlternateContent>
         <mc:Choice Requires="wps">
           <w:drawing>
-            <wp:anchor distT="0" distB="0" distL="97790" distR="114300" simplePos="0" relativeHeight="58" behindDoc="1" locked="0" layoutInCell="0" allowOverlap="1" wp14:anchorId="1A5B76DB">
+            <wp:anchor distT="0" distB="0" distL="95885" distR="114300" simplePos="0" relativeHeight="22" behindDoc="1" locked="0" layoutInCell="0" allowOverlap="1" wp14:anchorId="1A5B76DB">
               <wp:simplePos x="0" y="0"/>
               <wp:positionH relativeFrom="margin">
-                <wp:posOffset>5330190</wp:posOffset>
+                <wp:posOffset>5329555</wp:posOffset>
               </wp:positionH>
               <wp:positionV relativeFrom="page">
-                <wp:posOffset>9917430</wp:posOffset>
+                <wp:posOffset>9918065</wp:posOffset>
               </wp:positionV>
               <wp:extent cx="473710" cy="376555"/>
               <wp:effectExtent l="0" t="0" r="0" b="0"/>
@@ -29621,7 +29791,7 @@
                       <w:txbxContent>
                         <w:p>
                           <w:pPr>
-                            <w:pStyle w:val="FrameContents"/>
+                            <w:pStyle w:val="FrameContentsuser"/>
                             <w:spacing w:lineRule="auto" w:line="288" w:before="0" w:after="0"/>
                             <w:ind w:end="-58"/>
                             <w:jc w:val="center"/>
@@ -29676,7 +29846,7 @@
                               <w:sz w:val="28"/>
                               <w:szCs w:val="28"/>
                             </w:rPr>
-                            <w:t>25</w:t>
+                            <w:t>26</w:t>
                           </w:r>
                           <w:r>
                             <w:rPr>
@@ -29692,7 +29862,7 @@
                         </w:p>
                       </w:txbxContent>
                     </wps:txbx>
-                    <wps:bodyPr lIns="45720" tIns="91440" rIns="45720" bIns="91440" anchor="ctr" vert="vert" upright="1">
+                    <wps:bodyPr anchor="ctr" vert="vert" upright="1">
                       <a:noAutofit/>
                     </wps:bodyPr>
                   </wps:wsp>
@@ -29703,14 +29873,14 @@
         </mc:Choice>
         <mc:Fallback>
           <w:pict>
-            <v:shape id="shape_0" stroked="f" o:allowincell="f" style="position:absolute;margin-left:419.7pt;margin-top:780.85pt;width:37.25pt;height:29.6pt;mso-wrap-style:square;v-text-anchor:middle;rotation:90;mso-position-horizontal-relative:margin;mso-position-vertical-relative:page" wp14:anchorId="1A5B76DB" type="_x0000_t186" path="l-2147483642,-2147483642l-2147483623,-2147483622l-2147483642,-2147483634l-2147483642,-2147483642l-2147483621,-2147483620l-2147483642,-2147483642l-2147483619,-2147483618l-2147483642,-2147483642l-2147483642,-2147483642l-2147483617,-2147483616l-2147483639,0l-2147483642,-2147483642l-2147483615,-2147483614xel-2147483642,-2147483642l-2147483613,-2147483612l-2147483642,-2147483642l-2147483611,-2147483610l-2147483638,-2147483633l-2147483642,-2147483642l-2147483640,-2147483625l-2147483642,-2147483642l-2147483607,-2147483606l-2147483642,-2147483634l-2147483642,-2147483642l-2147483605,-2147483604e">
+            <v:shape id="shape_0" stroked="f" o:allowincell="f" style="position:absolute;margin-left:419.65pt;margin-top:780.9pt;width:37.25pt;height:29.6pt;mso-wrap-style:square;v-text-anchor:middle;rotation:90;mso-position-horizontal-relative:margin;mso-position-vertical-relative:page" wp14:anchorId="1A5B76DB" type="_x0000_t186" path="l-2147483642,-2147483642l-2147483623,-2147483622l-2147483642,-2147483634l-2147483642,-2147483642l-2147483621,-2147483620l-2147483642,-2147483642l-2147483619,-2147483618l-2147483642,-2147483642l-2147483642,-2147483642l-2147483617,-2147483616l-2147483639,0l-2147483642,-2147483642l-2147483615,-2147483614xel-2147483642,-2147483642l-2147483613,-2147483612l-2147483642,-2147483642l-2147483611,-2147483610l-2147483638,-2147483633l-2147483642,-2147483642l-2147483640,-2147483625l-2147483642,-2147483642l-2147483607,-2147483606l-2147483642,-2147483634l-2147483642,-2147483642l-2147483605,-2147483604e">
               <v:fill o:detectmouseclick="t" on="false"/>
               <v:stroke color="#3465a4" joinstyle="round" endcap="flat"/>
               <v:textbox>
                 <w:txbxContent>
                   <w:p>
                     <w:pPr>
-                      <w:pStyle w:val="FrameContents"/>
+                      <w:pStyle w:val="FrameContentsuser"/>
                       <w:spacing w:lineRule="auto" w:line="288" w:before="0" w:after="0"/>
                       <w:ind w:end="-58"/>
                       <w:jc w:val="center"/>
@@ -29765,7 +29935,7 @@
                         <w:sz w:val="28"/>
                         <w:szCs w:val="28"/>
                       </w:rPr>
-                      <w:t>25</w:t>
+                      <w:t>26</w:t>
                     </w:r>
                     <w:r>
                       <w:rPr>
@@ -29853,13 +30023,13 @@
       <mc:AlternateContent>
         <mc:Choice Requires="wps">
           <w:drawing>
-            <wp:anchor distT="1270" distB="1270" distL="1270" distR="1270" simplePos="0" relativeHeight="56" behindDoc="1" locked="0" layoutInCell="0" allowOverlap="1" wp14:anchorId="7E31E2B7">
+            <wp:anchor distT="1270" distB="1270" distL="1270" distR="1270" simplePos="0" relativeHeight="20" behindDoc="1" locked="0" layoutInCell="0" allowOverlap="1" wp14:anchorId="7E31E2B7">
               <wp:simplePos x="0" y="0"/>
               <wp:positionH relativeFrom="margin">
-                <wp:posOffset>5240020</wp:posOffset>
+                <wp:posOffset>5239385</wp:posOffset>
               </wp:positionH>
               <wp:positionV relativeFrom="page">
-                <wp:posOffset>9819005</wp:posOffset>
+                <wp:posOffset>9819640</wp:posOffset>
               </wp:positionV>
               <wp:extent cx="355600" cy="600075"/>
               <wp:effectExtent l="1270" t="1270" r="1270" b="1270"/>
@@ -29896,7 +30066,7 @@
                       <w:txbxContent>
                         <w:p>
                           <w:pPr>
-                            <w:pStyle w:val="FrameContents"/>
+                            <w:pStyle w:val="FrameContentsuser"/>
                             <w:spacing w:lineRule="auto" w:line="288" w:before="0" w:after="0"/>
                             <w:ind w:end="-57"/>
                             <w:jc w:val="end"/>
@@ -29922,7 +30092,7 @@
                         </w:p>
                       </w:txbxContent>
                     </wps:txbx>
-                    <wps:bodyPr lIns="45720" tIns="91440" rIns="45720" bIns="91440" anchor="ctr" vert="vert" upright="1">
+                    <wps:bodyPr anchor="ctr" vert="vert" upright="1">
                       <a:noAutofit/>
                     </wps:bodyPr>
                   </wps:wsp>
@@ -29933,14 +30103,14 @@
         </mc:Choice>
         <mc:Fallback>
           <w:pict>
-            <v:shape id="shape_0" stroked="t" o:allowincell="f" style="position:absolute;margin-left:412.55pt;margin-top:773.15pt;width:27.95pt;height:47.2pt;mso-wrap-style:none;v-text-anchor:middle;rotation:90;mso-position-horizontal-relative:margin;mso-position-vertical-relative:page" wp14:anchorId="7E31E2B7" type="_x0000_t186" path="l-2147483642,-2147483642l-2147483623,-2147483622l-2147483642,-2147483634l-2147483642,-2147483642l-2147483621,-2147483620l-2147483642,-2147483642l-2147483619,-2147483618l-2147483642,-2147483642l-2147483642,-2147483642l-2147483617,-2147483616l-2147483639,0l-2147483642,-2147483642l-2147483615,-2147483614xel-2147483642,-2147483642l-2147483613,-2147483612l-2147483642,-2147483642l-2147483611,-2147483610l-2147483638,-2147483633l-2147483642,-2147483642l-2147483640,-2147483625l-2147483642,-2147483642l-2147483607,-2147483606l-2147483642,-2147483634l-2147483642,-2147483642l-2147483605,-2147483604e">
+            <v:shape id="shape_0" stroked="t" o:allowincell="f" style="position:absolute;margin-left:412.5pt;margin-top:773.2pt;width:27.95pt;height:47.2pt;mso-wrap-style:none;v-text-anchor:middle;rotation:90;mso-position-horizontal-relative:margin;mso-position-vertical-relative:page" wp14:anchorId="7E31E2B7" type="_x0000_t186" path="l-2147483642,-2147483642l-2147483623,-2147483622l-2147483642,-2147483634l-2147483642,-2147483642l-2147483621,-2147483620l-2147483642,-2147483642l-2147483619,-2147483618l-2147483642,-2147483642l-2147483642,-2147483642l-2147483617,-2147483616l-2147483639,0l-2147483642,-2147483642l-2147483615,-2147483614xel-2147483642,-2147483642l-2147483613,-2147483612l-2147483642,-2147483642l-2147483611,-2147483610l-2147483638,-2147483633l-2147483642,-2147483642l-2147483640,-2147483625l-2147483642,-2147483642l-2147483607,-2147483606l-2147483642,-2147483634l-2147483642,-2147483642l-2147483605,-2147483604e">
               <v:fill o:detectmouseclick="t" on="false"/>
               <v:stroke color="#d9d9d9" joinstyle="round" endcap="flat"/>
               <v:textbox>
                 <w:txbxContent>
                   <w:p>
                     <w:pPr>
-                      <w:pStyle w:val="FrameContents"/>
+                      <w:pStyle w:val="FrameContentsuser"/>
                       <w:spacing w:lineRule="auto" w:line="288" w:before="0" w:after="0"/>
                       <w:ind w:end="-57"/>
                       <w:jc w:val="end"/>
@@ -29974,13 +30144,13 @@
       <mc:AlternateContent>
         <mc:Choice Requires="wps">
           <w:drawing>
-            <wp:anchor distT="0" distB="0" distL="97790" distR="114300" simplePos="0" relativeHeight="58" behindDoc="1" locked="0" layoutInCell="0" allowOverlap="1" wp14:anchorId="1A5B76DB">
+            <wp:anchor distT="0" distB="0" distL="95885" distR="114300" simplePos="0" relativeHeight="22" behindDoc="1" locked="0" layoutInCell="0" allowOverlap="1" wp14:anchorId="1A5B76DB">
               <wp:simplePos x="0" y="0"/>
               <wp:positionH relativeFrom="margin">
-                <wp:posOffset>5330190</wp:posOffset>
+                <wp:posOffset>5329555</wp:posOffset>
               </wp:positionH>
               <wp:positionV relativeFrom="page">
-                <wp:posOffset>9917430</wp:posOffset>
+                <wp:posOffset>9918065</wp:posOffset>
               </wp:positionV>
               <wp:extent cx="473710" cy="376555"/>
               <wp:effectExtent l="0" t="0" r="0" b="0"/>
@@ -30015,7 +30185,7 @@
                       <w:txbxContent>
                         <w:p>
                           <w:pPr>
-                            <w:pStyle w:val="FrameContents"/>
+                            <w:pStyle w:val="FrameContentsuser"/>
                             <w:spacing w:lineRule="auto" w:line="288" w:before="0" w:after="0"/>
                             <w:ind w:end="-58"/>
                             <w:jc w:val="center"/>
@@ -30070,7 +30240,7 @@
                               <w:sz w:val="28"/>
                               <w:szCs w:val="28"/>
                             </w:rPr>
-                            <w:t>25</w:t>
+                            <w:t>26</w:t>
                           </w:r>
                           <w:r>
                             <w:rPr>
@@ -30086,7 +30256,7 @@
                         </w:p>
                       </w:txbxContent>
                     </wps:txbx>
-                    <wps:bodyPr lIns="45720" tIns="91440" rIns="45720" bIns="91440" anchor="ctr" vert="vert" upright="1">
+                    <wps:bodyPr anchor="ctr" vert="vert" upright="1">
                       <a:noAutofit/>
                     </wps:bodyPr>
                   </wps:wsp>
@@ -30097,14 +30267,14 @@
         </mc:Choice>
         <mc:Fallback>
           <w:pict>
-            <v:shape id="shape_0" stroked="f" o:allowincell="f" style="position:absolute;margin-left:419.7pt;margin-top:780.85pt;width:37.25pt;height:29.6pt;mso-wrap-style:square;v-text-anchor:middle;rotation:90;mso-position-horizontal-relative:margin;mso-position-vertical-relative:page" wp14:anchorId="1A5B76DB" type="_x0000_t186" path="l-2147483642,-2147483642l-2147483623,-2147483622l-2147483642,-2147483634l-2147483642,-2147483642l-2147483621,-2147483620l-2147483642,-2147483642l-2147483619,-2147483618l-2147483642,-2147483642l-2147483642,-2147483642l-2147483617,-2147483616l-2147483639,0l-2147483642,-2147483642l-2147483615,-2147483614xel-2147483642,-2147483642l-2147483613,-2147483612l-2147483642,-2147483642l-2147483611,-2147483610l-2147483638,-2147483633l-2147483642,-2147483642l-2147483640,-2147483625l-2147483642,-2147483642l-2147483607,-2147483606l-2147483642,-2147483634l-2147483642,-2147483642l-2147483605,-2147483604e">
+            <v:shape id="shape_0" stroked="f" o:allowincell="f" style="position:absolute;margin-left:419.65pt;margin-top:780.9pt;width:37.25pt;height:29.6pt;mso-wrap-style:square;v-text-anchor:middle;rotation:90;mso-position-horizontal-relative:margin;mso-position-vertical-relative:page" wp14:anchorId="1A5B76DB" type="_x0000_t186" path="l-2147483642,-2147483642l-2147483623,-2147483622l-2147483642,-2147483634l-2147483642,-2147483642l-2147483621,-2147483620l-2147483642,-2147483642l-2147483619,-2147483618l-2147483642,-2147483642l-2147483642,-2147483642l-2147483617,-2147483616l-2147483639,0l-2147483642,-2147483642l-2147483615,-2147483614xel-2147483642,-2147483642l-2147483613,-2147483612l-2147483642,-2147483642l-2147483611,-2147483610l-2147483638,-2147483633l-2147483642,-2147483642l-2147483640,-2147483625l-2147483642,-2147483642l-2147483607,-2147483606l-2147483642,-2147483634l-2147483642,-2147483642l-2147483605,-2147483604e">
               <v:fill o:detectmouseclick="t" on="false"/>
               <v:stroke color="#3465a4" joinstyle="round" endcap="flat"/>
               <v:textbox>
                 <w:txbxContent>
                   <w:p>
                     <w:pPr>
-                      <w:pStyle w:val="FrameContents"/>
+                      <w:pStyle w:val="FrameContentsuser"/>
                       <w:spacing w:lineRule="auto" w:line="288" w:before="0" w:after="0"/>
                       <w:ind w:end="-58"/>
                       <w:jc w:val="center"/>
@@ -30159,7 +30329,7 @@
                         <w:sz w:val="28"/>
                         <w:szCs w:val="28"/>
                       </w:rPr>
-                      <w:t>25</w:t>
+                      <w:t>26</w:t>
                     </w:r>
                     <w:r>
                       <w:rPr>
@@ -30250,10 +30420,10 @@
             <wp:anchor distT="1270" distB="1270" distL="1270" distR="1270" simplePos="0" relativeHeight="3" behindDoc="1" locked="0" layoutInCell="0" allowOverlap="1" wp14:anchorId="7E31E2B7">
               <wp:simplePos x="0" y="0"/>
               <wp:positionH relativeFrom="margin">
-                <wp:posOffset>5240020</wp:posOffset>
+                <wp:posOffset>5239385</wp:posOffset>
               </wp:positionH>
               <wp:positionV relativeFrom="page">
-                <wp:posOffset>9819005</wp:posOffset>
+                <wp:posOffset>9819640</wp:posOffset>
               </wp:positionV>
               <wp:extent cx="355600" cy="600075"/>
               <wp:effectExtent l="1270" t="1270" r="1270" b="1270"/>
@@ -30290,7 +30460,7 @@
                       <w:txbxContent>
                         <w:p>
                           <w:pPr>
-                            <w:pStyle w:val="FrameContents"/>
+                            <w:pStyle w:val="FrameContentsuser"/>
                             <w:spacing w:lineRule="auto" w:line="288" w:before="0" w:after="0"/>
                             <w:ind w:end="-57"/>
                             <w:jc w:val="end"/>
@@ -30316,7 +30486,7 @@
                         </w:p>
                       </w:txbxContent>
                     </wps:txbx>
-                    <wps:bodyPr lIns="45720" tIns="91440" rIns="45720" bIns="91440" anchor="ctr" vert="vert" upright="1">
+                    <wps:bodyPr anchor="ctr" vert="vert" upright="1">
                       <a:noAutofit/>
                     </wps:bodyPr>
                   </wps:wsp>
@@ -30362,14 +30532,14 @@
                 <v:h position="0,@0"/>
               </v:handles>
             </v:shapetype>
-            <v:shape id="shape_0" stroked="t" o:allowincell="f" style="position:absolute;margin-left:412.55pt;margin-top:773.15pt;width:27.95pt;height:47.2pt;mso-wrap-style:none;v-text-anchor:middle;rotation:90;mso-position-horizontal-relative:margin;mso-position-vertical-relative:page" wp14:anchorId="7E31E2B7" type="_x0000_t186" path="l-2147483642,-2147483642l-2147483623,-2147483622l-2147483642,-2147483634l-2147483642,-2147483642l-2147483621,-2147483620l-2147483642,-2147483642l-2147483619,-2147483618l-2147483642,-2147483642l-2147483642,-2147483642l-2147483617,-2147483616l-2147483639,0l-2147483642,-2147483642l-2147483615,-2147483614xel-2147483642,-2147483642l-2147483613,-2147483612l-2147483642,-2147483642l-2147483611,-2147483610l-2147483638,-2147483633l-2147483642,-2147483642l-2147483640,-2147483625l-2147483642,-2147483642l-2147483607,-2147483606l-2147483642,-2147483634l-2147483642,-2147483642l-2147483605,-2147483604e">
+            <v:shape id="shape_0" stroked="t" o:allowincell="f" style="position:absolute;margin-left:412.5pt;margin-top:773.2pt;width:27.95pt;height:47.2pt;mso-wrap-style:none;v-text-anchor:middle;rotation:90;mso-position-horizontal-relative:margin;mso-position-vertical-relative:page" wp14:anchorId="7E31E2B7" type="_x0000_t186" path="l-2147483642,-2147483642l-2147483623,-2147483622l-2147483642,-2147483634l-2147483642,-2147483642l-2147483621,-2147483620l-2147483642,-2147483642l-2147483619,-2147483618l-2147483642,-2147483642l-2147483642,-2147483642l-2147483617,-2147483616l-2147483639,0l-2147483642,-2147483642l-2147483615,-2147483614xel-2147483642,-2147483642l-2147483613,-2147483612l-2147483642,-2147483642l-2147483611,-2147483610l-2147483638,-2147483633l-2147483642,-2147483642l-2147483640,-2147483625l-2147483642,-2147483642l-2147483607,-2147483606l-2147483642,-2147483634l-2147483642,-2147483642l-2147483605,-2147483604e">
               <v:fill o:detectmouseclick="t" on="false"/>
               <v:stroke color="#d9d9d9" joinstyle="round" endcap="flat"/>
               <v:textbox>
                 <w:txbxContent>
                   <w:p>
                     <w:pPr>
-                      <w:pStyle w:val="FrameContents"/>
+                      <w:pStyle w:val="FrameContentsuser"/>
                       <w:spacing w:lineRule="auto" w:line="288" w:before="0" w:after="0"/>
                       <w:ind w:end="-57"/>
                       <w:jc w:val="end"/>
@@ -30403,13 +30573,13 @@
       <mc:AlternateContent>
         <mc:Choice Requires="wps">
           <w:drawing>
-            <wp:anchor distT="0" distB="0" distL="97790" distR="114300" simplePos="0" relativeHeight="119" behindDoc="1" locked="0" layoutInCell="0" allowOverlap="1" wp14:anchorId="1A5B76DB">
+            <wp:anchor distT="0" distB="0" distL="95885" distR="114300" simplePos="0" relativeHeight="15" behindDoc="1" locked="0" layoutInCell="0" allowOverlap="1" wp14:anchorId="1A5B76DB">
               <wp:simplePos x="0" y="0"/>
               <wp:positionH relativeFrom="margin">
-                <wp:posOffset>5330190</wp:posOffset>
+                <wp:posOffset>5329555</wp:posOffset>
               </wp:positionH>
               <wp:positionV relativeFrom="page">
-                <wp:posOffset>9917430</wp:posOffset>
+                <wp:posOffset>9918065</wp:posOffset>
               </wp:positionV>
               <wp:extent cx="473710" cy="376555"/>
               <wp:effectExtent l="0" t="0" r="0" b="0"/>
@@ -30444,7 +30614,7 @@
                       <w:txbxContent>
                         <w:p>
                           <w:pPr>
-                            <w:pStyle w:val="FrameContents"/>
+                            <w:pStyle w:val="FrameContentsuser"/>
                             <w:spacing w:lineRule="auto" w:line="288" w:before="0" w:after="0"/>
                             <w:ind w:end="-58"/>
                             <w:jc w:val="center"/>
@@ -30515,7 +30685,7 @@
                         </w:p>
                       </w:txbxContent>
                     </wps:txbx>
-                    <wps:bodyPr lIns="45720" tIns="91440" rIns="45720" bIns="91440" anchor="ctr" vert="vert" upright="1">
+                    <wps:bodyPr anchor="ctr" vert="vert" upright="1">
                       <a:noAutofit/>
                     </wps:bodyPr>
                   </wps:wsp>
@@ -30526,14 +30696,14 @@
         </mc:Choice>
         <mc:Fallback>
           <w:pict>
-            <v:shape id="shape_0" stroked="f" o:allowincell="f" style="position:absolute;margin-left:419.7pt;margin-top:780.85pt;width:37.25pt;height:29.6pt;mso-wrap-style:square;v-text-anchor:middle;rotation:90;mso-position-horizontal-relative:margin;mso-position-vertical-relative:page" wp14:anchorId="1A5B76DB" type="_x0000_t186" path="l-2147483642,-2147483642l-2147483623,-2147483622l-2147483642,-2147483634l-2147483642,-2147483642l-2147483621,-2147483620l-2147483642,-2147483642l-2147483619,-2147483618l-2147483642,-2147483642l-2147483642,-2147483642l-2147483617,-2147483616l-2147483639,0l-2147483642,-2147483642l-2147483615,-2147483614xel-2147483642,-2147483642l-2147483613,-2147483612l-2147483642,-2147483642l-2147483611,-2147483610l-2147483638,-2147483633l-2147483642,-2147483642l-2147483640,-2147483625l-2147483642,-2147483642l-2147483607,-2147483606l-2147483642,-2147483634l-2147483642,-2147483642l-2147483605,-2147483604e">
+            <v:shape id="shape_0" stroked="f" o:allowincell="f" style="position:absolute;margin-left:419.65pt;margin-top:780.9pt;width:37.25pt;height:29.6pt;mso-wrap-style:square;v-text-anchor:middle;rotation:90;mso-position-horizontal-relative:margin;mso-position-vertical-relative:page" wp14:anchorId="1A5B76DB" type="_x0000_t186" path="l-2147483642,-2147483642l-2147483623,-2147483622l-2147483642,-2147483634l-2147483642,-2147483642l-2147483621,-2147483620l-2147483642,-2147483642l-2147483619,-2147483618l-2147483642,-2147483642l-2147483642,-2147483642l-2147483617,-2147483616l-2147483639,0l-2147483642,-2147483642l-2147483615,-2147483614xel-2147483642,-2147483642l-2147483613,-2147483612l-2147483642,-2147483642l-2147483611,-2147483610l-2147483638,-2147483633l-2147483642,-2147483642l-2147483640,-2147483625l-2147483642,-2147483642l-2147483607,-2147483606l-2147483642,-2147483634l-2147483642,-2147483642l-2147483605,-2147483604e">
               <v:fill o:detectmouseclick="t" on="false"/>
               <v:stroke color="#3465a4" joinstyle="round" endcap="flat"/>
               <v:textbox>
                 <w:txbxContent>
                   <w:p>
                     <w:pPr>
-                      <w:pStyle w:val="FrameContents"/>
+                      <w:pStyle w:val="FrameContentsuser"/>
                       <w:spacing w:lineRule="auto" w:line="288" w:before="0" w:after="0"/>
                       <w:ind w:end="-58"/>
                       <w:jc w:val="center"/>
@@ -30679,10 +30849,10 @@
             <wp:anchor distT="1270" distB="1270" distL="1270" distR="1270" simplePos="0" relativeHeight="3" behindDoc="1" locked="0" layoutInCell="0" allowOverlap="1" wp14:anchorId="7E31E2B7">
               <wp:simplePos x="0" y="0"/>
               <wp:positionH relativeFrom="margin">
-                <wp:posOffset>5240020</wp:posOffset>
+                <wp:posOffset>5239385</wp:posOffset>
               </wp:positionH>
               <wp:positionV relativeFrom="page">
-                <wp:posOffset>9819005</wp:posOffset>
+                <wp:posOffset>9819640</wp:posOffset>
               </wp:positionV>
               <wp:extent cx="355600" cy="600075"/>
               <wp:effectExtent l="1270" t="1270" r="1270" b="1270"/>
@@ -30719,7 +30889,7 @@
                       <w:txbxContent>
                         <w:p>
                           <w:pPr>
-                            <w:pStyle w:val="FrameContents"/>
+                            <w:pStyle w:val="FrameContentsuser"/>
                             <w:spacing w:lineRule="auto" w:line="288" w:before="0" w:after="0"/>
                             <w:ind w:end="-57"/>
                             <w:jc w:val="end"/>
@@ -30745,7 +30915,7 @@
                         </w:p>
                       </w:txbxContent>
                     </wps:txbx>
-                    <wps:bodyPr lIns="45720" tIns="91440" rIns="45720" bIns="91440" anchor="ctr" vert="vert" upright="1">
+                    <wps:bodyPr anchor="ctr" vert="vert" upright="1">
                       <a:noAutofit/>
                     </wps:bodyPr>
                   </wps:wsp>
@@ -30756,14 +30926,14 @@
         </mc:Choice>
         <mc:Fallback>
           <w:pict>
-            <v:shape id="shape_0" stroked="t" o:allowincell="f" style="position:absolute;margin-left:412.55pt;margin-top:773.15pt;width:27.95pt;height:47.2pt;mso-wrap-style:none;v-text-anchor:middle;rotation:90;mso-position-horizontal-relative:margin;mso-position-vertical-relative:page" wp14:anchorId="7E31E2B7" type="_x0000_t186" path="l-2147483642,-2147483642l-2147483623,-2147483622l-2147483642,-2147483634l-2147483642,-2147483642l-2147483621,-2147483620l-2147483642,-2147483642l-2147483619,-2147483618l-2147483642,-2147483642l-2147483642,-2147483642l-2147483617,-2147483616l-2147483639,0l-2147483642,-2147483642l-2147483615,-2147483614xel-2147483642,-2147483642l-2147483613,-2147483612l-2147483642,-2147483642l-2147483611,-2147483610l-2147483638,-2147483633l-2147483642,-2147483642l-2147483640,-2147483625l-2147483642,-2147483642l-2147483607,-2147483606l-2147483642,-2147483634l-2147483642,-2147483642l-2147483605,-2147483604e">
+            <v:shape id="shape_0" stroked="t" o:allowincell="f" style="position:absolute;margin-left:412.5pt;margin-top:773.2pt;width:27.95pt;height:47.2pt;mso-wrap-style:none;v-text-anchor:middle;rotation:90;mso-position-horizontal-relative:margin;mso-position-vertical-relative:page" wp14:anchorId="7E31E2B7" type="_x0000_t186" path="l-2147483642,-2147483642l-2147483623,-2147483622l-2147483642,-2147483634l-2147483642,-2147483642l-2147483621,-2147483620l-2147483642,-2147483642l-2147483619,-2147483618l-2147483642,-2147483642l-2147483642,-2147483642l-2147483617,-2147483616l-2147483639,0l-2147483642,-2147483642l-2147483615,-2147483614xel-2147483642,-2147483642l-2147483613,-2147483612l-2147483642,-2147483642l-2147483611,-2147483610l-2147483638,-2147483633l-2147483642,-2147483642l-2147483640,-2147483625l-2147483642,-2147483642l-2147483607,-2147483606l-2147483642,-2147483634l-2147483642,-2147483642l-2147483605,-2147483604e">
               <v:fill o:detectmouseclick="t" on="false"/>
               <v:stroke color="#d9d9d9" joinstyle="round" endcap="flat"/>
               <v:textbox>
                 <w:txbxContent>
                   <w:p>
                     <w:pPr>
-                      <w:pStyle w:val="FrameContents"/>
+                      <w:pStyle w:val="FrameContentsuser"/>
                       <w:spacing w:lineRule="auto" w:line="288" w:before="0" w:after="0"/>
                       <w:ind w:end="-57"/>
                       <w:jc w:val="end"/>
@@ -30797,13 +30967,13 @@
       <mc:AlternateContent>
         <mc:Choice Requires="wps">
           <w:drawing>
-            <wp:anchor distT="0" distB="0" distL="97790" distR="114300" simplePos="0" relativeHeight="119" behindDoc="1" locked="0" layoutInCell="0" allowOverlap="1" wp14:anchorId="1A5B76DB">
+            <wp:anchor distT="0" distB="0" distL="95885" distR="114300" simplePos="0" relativeHeight="15" behindDoc="1" locked="0" layoutInCell="0" allowOverlap="1" wp14:anchorId="1A5B76DB">
               <wp:simplePos x="0" y="0"/>
               <wp:positionH relativeFrom="margin">
-                <wp:posOffset>5330190</wp:posOffset>
+                <wp:posOffset>5329555</wp:posOffset>
               </wp:positionH>
               <wp:positionV relativeFrom="page">
-                <wp:posOffset>9917430</wp:posOffset>
+                <wp:posOffset>9918065</wp:posOffset>
               </wp:positionV>
               <wp:extent cx="473710" cy="376555"/>
               <wp:effectExtent l="0" t="0" r="0" b="0"/>
@@ -30838,7 +31008,7 @@
                       <w:txbxContent>
                         <w:p>
                           <w:pPr>
-                            <w:pStyle w:val="FrameContents"/>
+                            <w:pStyle w:val="FrameContentsuser"/>
                             <w:spacing w:lineRule="auto" w:line="288" w:before="0" w:after="0"/>
                             <w:ind w:end="-58"/>
                             <w:jc w:val="center"/>
@@ -30909,7 +31079,7 @@
                         </w:p>
                       </w:txbxContent>
                     </wps:txbx>
-                    <wps:bodyPr lIns="45720" tIns="91440" rIns="45720" bIns="91440" anchor="ctr" vert="vert" upright="1">
+                    <wps:bodyPr anchor="ctr" vert="vert" upright="1">
                       <a:noAutofit/>
                     </wps:bodyPr>
                   </wps:wsp>
@@ -30920,14 +31090,14 @@
         </mc:Choice>
         <mc:Fallback>
           <w:pict>
-            <v:shape id="shape_0" stroked="f" o:allowincell="f" style="position:absolute;margin-left:419.7pt;margin-top:780.85pt;width:37.25pt;height:29.6pt;mso-wrap-style:square;v-text-anchor:middle;rotation:90;mso-position-horizontal-relative:margin;mso-position-vertical-relative:page" wp14:anchorId="1A5B76DB" type="_x0000_t186" path="l-2147483642,-2147483642l-2147483623,-2147483622l-2147483642,-2147483634l-2147483642,-2147483642l-2147483621,-2147483620l-2147483642,-2147483642l-2147483619,-2147483618l-2147483642,-2147483642l-2147483642,-2147483642l-2147483617,-2147483616l-2147483639,0l-2147483642,-2147483642l-2147483615,-2147483614xel-2147483642,-2147483642l-2147483613,-2147483612l-2147483642,-2147483642l-2147483611,-2147483610l-2147483638,-2147483633l-2147483642,-2147483642l-2147483640,-2147483625l-2147483642,-2147483642l-2147483607,-2147483606l-2147483642,-2147483634l-2147483642,-2147483642l-2147483605,-2147483604e">
+            <v:shape id="shape_0" stroked="f" o:allowincell="f" style="position:absolute;margin-left:419.65pt;margin-top:780.9pt;width:37.25pt;height:29.6pt;mso-wrap-style:square;v-text-anchor:middle;rotation:90;mso-position-horizontal-relative:margin;mso-position-vertical-relative:page" wp14:anchorId="1A5B76DB" type="_x0000_t186" path="l-2147483642,-2147483642l-2147483623,-2147483622l-2147483642,-2147483634l-2147483642,-2147483642l-2147483621,-2147483620l-2147483642,-2147483642l-2147483619,-2147483618l-2147483642,-2147483642l-2147483642,-2147483642l-2147483617,-2147483616l-2147483639,0l-2147483642,-2147483642l-2147483615,-2147483614xel-2147483642,-2147483642l-2147483613,-2147483612l-2147483642,-2147483642l-2147483611,-2147483610l-2147483638,-2147483633l-2147483642,-2147483642l-2147483640,-2147483625l-2147483642,-2147483642l-2147483607,-2147483606l-2147483642,-2147483634l-2147483642,-2147483642l-2147483605,-2147483604e">
               <v:fill o:detectmouseclick="t" on="false"/>
               <v:stroke color="#3465a4" joinstyle="round" endcap="flat"/>
               <v:textbox>
                 <w:txbxContent>
                   <w:p>
                     <w:pPr>
-                      <w:pStyle w:val="FrameContents"/>
+                      <w:pStyle w:val="FrameContentsuser"/>
                       <w:spacing w:lineRule="auto" w:line="288" w:before="0" w:after="0"/>
                       <w:ind w:end="-58"/>
                       <w:jc w:val="center"/>
@@ -31084,139 +31254,18 @@
       <mc:AlternateContent>
         <mc:Choice Requires="wps">
           <w:drawing>
-            <wp:anchor distT="1270" distB="1270" distL="1270" distR="1270" simplePos="0" relativeHeight="122" behindDoc="1" locked="0" layoutInCell="0" allowOverlap="1" wp14:anchorId="7E31E2B7">
+            <wp:anchor distT="0" distB="0" distL="95885" distR="114300" simplePos="0" relativeHeight="127" behindDoc="1" locked="0" layoutInCell="0" allowOverlap="1" wp14:anchorId="1A5B76DB">
               <wp:simplePos x="0" y="0"/>
               <wp:positionH relativeFrom="margin">
-                <wp:posOffset>5240020</wp:posOffset>
+                <wp:posOffset>5329555</wp:posOffset>
               </wp:positionH>
               <wp:positionV relativeFrom="page">
-                <wp:posOffset>9819005</wp:posOffset>
-              </wp:positionV>
-              <wp:extent cx="355600" cy="600075"/>
-              <wp:effectExtent l="1270" t="1270" r="1270" b="1270"/>
-              <wp:wrapNone/>
-              <wp:docPr id="7" name="Forme automatique 1"/>
-              <a:graphic xmlns:a="http://schemas.openxmlformats.org/drawingml/2006/main">
-                <a:graphicData uri="http://schemas.microsoft.com/office/word/2010/wordprocessingShape">
-                  <wps:wsp>
-                    <wps:cNvSpPr/>
-                    <wps:spPr>
-                      <a:xfrm rot="5400000">
-                        <a:off x="0" y="0"/>
-                        <a:ext cx="355680" cy="600120"/>
-                      </a:xfrm>
-                      <a:prstGeom prst="bracePair">
-                        <a:avLst>
-                          <a:gd name="adj" fmla="val 8333"/>
-                        </a:avLst>
-                      </a:prstGeom>
-                      <a:noFill/>
-                      <a:ln w="0">
-                        <a:solidFill>
-                          <a:srgbClr val="D9D9D9"/>
-                        </a:solidFill>
-                      </a:ln>
-                    </wps:spPr>
-                    <wps:style>
-                      <a:lnRef idx="0"/>
-                      <a:fillRef idx="0"/>
-                      <a:effectRef idx="0"/>
-                      <a:fontRef idx="minor"/>
-                    </wps:style>
-                    <wps:txbx>
-                      <w:txbxContent>
-                        <w:p>
-                          <w:pPr>
-                            <w:pStyle w:val="FrameContents"/>
-                            <w:spacing w:lineRule="auto" w:line="288" w:before="0" w:after="0"/>
-                            <w:ind w:end="-57"/>
-                            <w:jc w:val="end"/>
-                            <w:rPr>
-                              <w:rFonts w:ascii="Cambria" w:hAnsi="Cambria" w:eastAsia="" w:cs="" w:asciiTheme="majorHAnsi" w:cstheme="majorBidi" w:eastAsiaTheme="majorEastAsia" w:hAnsiTheme="majorHAnsi"/>
-                              <w:b/>
-                              <w:iCs/>
-                              <w:color w:themeColor="text1" w:themeTint="bf" w:val="404040"/>
-                              <w:sz w:val="28"/>
-                              <w:szCs w:val="28"/>
-                            </w:rPr>
-                          </w:pPr>
-                          <w:r>
-                            <w:rPr>
-                              <w:rFonts w:eastAsia="" w:cs="" w:cstheme="majorBidi" w:eastAsiaTheme="majorEastAsia" w:ascii="Cambria" w:hAnsi="Cambria"/>
-                              <w:b/>
-                              <w:iCs/>
-                              <w:color w:themeColor="text1" w:themeTint="bf" w:val="404040"/>
-                              <w:sz w:val="28"/>
-                              <w:szCs w:val="28"/>
-                            </w:rPr>
-                          </w:r>
-                        </w:p>
-                      </w:txbxContent>
-                    </wps:txbx>
-                    <wps:bodyPr lIns="45720" tIns="91440" rIns="45720" bIns="91440" anchor="ctr" vert="vert" upright="1">
-                      <a:noAutofit/>
-                    </wps:bodyPr>
-                  </wps:wsp>
-                </a:graphicData>
-              </a:graphic>
-            </wp:anchor>
-          </w:drawing>
-        </mc:Choice>
-        <mc:Fallback>
-          <w:pict>
-            <v:shape id="shape_0" stroked="t" o:allowincell="f" style="position:absolute;margin-left:412.55pt;margin-top:773.15pt;width:27.95pt;height:47.2pt;mso-wrap-style:none;v-text-anchor:middle;rotation:90;mso-position-horizontal-relative:margin;mso-position-vertical-relative:page" wp14:anchorId="7E31E2B7" type="_x0000_t186" path="l-2147483642,-2147483642l-2147483623,-2147483622l-2147483642,-2147483634l-2147483642,-2147483642l-2147483621,-2147483620l-2147483642,-2147483642l-2147483619,-2147483618l-2147483642,-2147483642l-2147483642,-2147483642l-2147483617,-2147483616l-2147483639,0l-2147483642,-2147483642l-2147483615,-2147483614xel-2147483642,-2147483642l-2147483613,-2147483612l-2147483642,-2147483642l-2147483611,-2147483610l-2147483638,-2147483633l-2147483642,-2147483642l-2147483640,-2147483625l-2147483642,-2147483642l-2147483607,-2147483606l-2147483642,-2147483634l-2147483642,-2147483642l-2147483605,-2147483604e">
-              <v:fill o:detectmouseclick="t" on="false"/>
-              <v:stroke color="#d9d9d9" joinstyle="round" endcap="flat"/>
-              <v:textbox>
-                <w:txbxContent>
-                  <w:p>
-                    <w:pPr>
-                      <w:pStyle w:val="FrameContents"/>
-                      <w:spacing w:lineRule="auto" w:line="288" w:before="0" w:after="0"/>
-                      <w:ind w:end="-57"/>
-                      <w:jc w:val="end"/>
-                      <w:rPr>
-                        <w:rFonts w:ascii="Cambria" w:hAnsi="Cambria" w:eastAsia="" w:cs="" w:asciiTheme="majorHAnsi" w:cstheme="majorBidi" w:eastAsiaTheme="majorEastAsia" w:hAnsiTheme="majorHAnsi"/>
-                        <w:b/>
-                        <w:iCs/>
-                        <w:color w:themeColor="text1" w:themeTint="bf" w:val="404040"/>
-                        <w:sz w:val="28"/>
-                        <w:szCs w:val="28"/>
-                      </w:rPr>
-                    </w:pPr>
-                    <w:r>
-                      <w:rPr>
-                        <w:rFonts w:eastAsia="" w:cs="" w:cstheme="majorBidi" w:eastAsiaTheme="majorEastAsia" w:ascii="Cambria" w:hAnsi="Cambria"/>
-                        <w:b/>
-                        <w:iCs/>
-                        <w:color w:themeColor="text1" w:themeTint="bf" w:val="404040"/>
-                        <w:sz w:val="28"/>
-                        <w:szCs w:val="28"/>
-                      </w:rPr>
-                    </w:r>
-                  </w:p>
-                </w:txbxContent>
-              </v:textbox>
-              <w10:wrap type="none"/>
-            </v:shape>
-          </w:pict>
-        </mc:Fallback>
-      </mc:AlternateContent>
-      <mc:AlternateContent>
-        <mc:Choice Requires="wps">
-          <w:drawing>
-            <wp:anchor distT="0" distB="0" distL="97790" distR="114300" simplePos="0" relativeHeight="124" behindDoc="1" locked="0" layoutInCell="0" allowOverlap="1" wp14:anchorId="1A5B76DB">
-              <wp:simplePos x="0" y="0"/>
-              <wp:positionH relativeFrom="margin">
-                <wp:posOffset>5330190</wp:posOffset>
-              </wp:positionH>
-              <wp:positionV relativeFrom="page">
-                <wp:posOffset>9917430</wp:posOffset>
+                <wp:posOffset>9918065</wp:posOffset>
               </wp:positionV>
               <wp:extent cx="473710" cy="376555"/>
               <wp:effectExtent l="0" t="0" r="0" b="0"/>
               <wp:wrapSquare wrapText="bothSides"/>
-              <wp:docPr id="8" name="Forme automatique 3"/>
+              <wp:docPr id="7" name="Forme automatique 3"/>
               <a:graphic xmlns:a="http://schemas.openxmlformats.org/drawingml/2006/main">
                 <a:graphicData uri="http://schemas.microsoft.com/office/word/2010/wordprocessingShape">
                   <wps:wsp>
@@ -31246,7 +31295,7 @@
                       <w:txbxContent>
                         <w:p>
                           <w:pPr>
-                            <w:pStyle w:val="FrameContents"/>
+                            <w:pStyle w:val="FrameContentsuser"/>
                             <w:spacing w:lineRule="auto" w:line="288" w:before="0" w:after="0"/>
                             <w:ind w:end="-58"/>
                             <w:jc w:val="center"/>
@@ -31310,7 +31359,7 @@
                         </w:p>
                       </w:txbxContent>
                     </wps:txbx>
-                    <wps:bodyPr lIns="45720" tIns="91440" rIns="45720" bIns="91440" anchor="ctr" vert="vert" upright="1">
+                    <wps:bodyPr anchor="ctr" vert="vert" upright="1">
                       <a:noAutofit/>
                     </wps:bodyPr>
                   </wps:wsp>
@@ -31321,14 +31370,14 @@
         </mc:Choice>
         <mc:Fallback>
           <w:pict>
-            <v:shape id="shape_0" stroked="f" o:allowincell="f" style="position:absolute;margin-left:419.7pt;margin-top:780.85pt;width:37.25pt;height:29.6pt;mso-wrap-style:square;v-text-anchor:middle;rotation:90;mso-position-horizontal-relative:margin;mso-position-vertical-relative:page" wp14:anchorId="1A5B76DB" type="_x0000_t186" path="l-2147483642,-2147483642l-2147483623,-2147483622l-2147483642,-2147483634l-2147483642,-2147483642l-2147483621,-2147483620l-2147483642,-2147483642l-2147483619,-2147483618l-2147483642,-2147483642l-2147483642,-2147483642l-2147483617,-2147483616l-2147483639,0l-2147483642,-2147483642l-2147483615,-2147483614xel-2147483642,-2147483642l-2147483613,-2147483612l-2147483642,-2147483642l-2147483611,-2147483610l-2147483638,-2147483633l-2147483642,-2147483642l-2147483640,-2147483625l-2147483642,-2147483642l-2147483607,-2147483606l-2147483642,-2147483634l-2147483642,-2147483642l-2147483605,-2147483604e">
+            <v:shape id="shape_0" stroked="f" o:allowincell="f" style="position:absolute;margin-left:419.65pt;margin-top:780.9pt;width:37.25pt;height:29.6pt;mso-wrap-style:square;v-text-anchor:middle;rotation:90;mso-position-horizontal-relative:margin;mso-position-vertical-relative:page" wp14:anchorId="1A5B76DB" type="_x0000_t186" path="l-2147483642,-2147483642l-2147483623,-2147483622l-2147483642,-2147483634l-2147483642,-2147483642l-2147483621,-2147483620l-2147483642,-2147483642l-2147483619,-2147483618l-2147483642,-2147483642l-2147483642,-2147483642l-2147483617,-2147483616l-2147483639,0l-2147483642,-2147483642l-2147483615,-2147483614xel-2147483642,-2147483642l-2147483613,-2147483612l-2147483642,-2147483642l-2147483611,-2147483610l-2147483638,-2147483633l-2147483642,-2147483642l-2147483640,-2147483625l-2147483642,-2147483642l-2147483607,-2147483606l-2147483642,-2147483634l-2147483642,-2147483642l-2147483605,-2147483604e">
               <v:fill o:detectmouseclick="t" on="false"/>
               <v:stroke color="#3465a4" joinstyle="round" endcap="flat"/>
               <v:textbox>
                 <w:txbxContent>
                   <w:p>
                     <w:pPr>
-                      <w:pStyle w:val="FrameContents"/>
+                      <w:pStyle w:val="FrameContentsuser"/>
                       <w:spacing w:lineRule="auto" w:line="288" w:before="0" w:after="0"/>
                       <w:ind w:end="-58"/>
                       <w:jc w:val="center"/>
@@ -31393,6 +31442,127 @@
                 </w:txbxContent>
               </v:textbox>
               <w10:wrap type="square"/>
+            </v:shape>
+          </w:pict>
+        </mc:Fallback>
+      </mc:AlternateContent>
+      <mc:AlternateContent>
+        <mc:Choice Requires="wps">
+          <w:drawing>
+            <wp:anchor distT="1270" distB="1270" distL="1270" distR="1270" simplePos="0" relativeHeight="129" behindDoc="1" locked="0" layoutInCell="0" allowOverlap="1" wp14:anchorId="7E31E2B7">
+              <wp:simplePos x="0" y="0"/>
+              <wp:positionH relativeFrom="margin">
+                <wp:posOffset>5239385</wp:posOffset>
+              </wp:positionH>
+              <wp:positionV relativeFrom="page">
+                <wp:posOffset>9819640</wp:posOffset>
+              </wp:positionV>
+              <wp:extent cx="355600" cy="600075"/>
+              <wp:effectExtent l="1270" t="1270" r="1270" b="1270"/>
+              <wp:wrapNone/>
+              <wp:docPr id="8" name="Forme automatique 1"/>
+              <a:graphic xmlns:a="http://schemas.openxmlformats.org/drawingml/2006/main">
+                <a:graphicData uri="http://schemas.microsoft.com/office/word/2010/wordprocessingShape">
+                  <wps:wsp>
+                    <wps:cNvSpPr/>
+                    <wps:spPr>
+                      <a:xfrm rot="5400000">
+                        <a:off x="0" y="0"/>
+                        <a:ext cx="355680" cy="600120"/>
+                      </a:xfrm>
+                      <a:prstGeom prst="bracePair">
+                        <a:avLst>
+                          <a:gd name="adj" fmla="val 8333"/>
+                        </a:avLst>
+                      </a:prstGeom>
+                      <a:noFill/>
+                      <a:ln w="0">
+                        <a:solidFill>
+                          <a:srgbClr val="D9D9D9"/>
+                        </a:solidFill>
+                      </a:ln>
+                    </wps:spPr>
+                    <wps:style>
+                      <a:lnRef idx="0"/>
+                      <a:fillRef idx="0"/>
+                      <a:effectRef idx="0"/>
+                      <a:fontRef idx="minor"/>
+                    </wps:style>
+                    <wps:txbx>
+                      <w:txbxContent>
+                        <w:p>
+                          <w:pPr>
+                            <w:pStyle w:val="FrameContentsuser"/>
+                            <w:spacing w:lineRule="auto" w:line="288" w:before="0" w:after="0"/>
+                            <w:ind w:end="-57"/>
+                            <w:jc w:val="end"/>
+                            <w:rPr>
+                              <w:rFonts w:ascii="Cambria" w:hAnsi="Cambria" w:eastAsia="" w:cs="" w:asciiTheme="majorHAnsi" w:cstheme="majorBidi" w:eastAsiaTheme="majorEastAsia" w:hAnsiTheme="majorHAnsi"/>
+                              <w:b/>
+                              <w:iCs/>
+                              <w:color w:themeColor="text1" w:themeTint="bf" w:val="404040"/>
+                              <w:sz w:val="28"/>
+                              <w:szCs w:val="28"/>
+                            </w:rPr>
+                          </w:pPr>
+                          <w:r>
+                            <w:rPr>
+                              <w:rFonts w:eastAsia="" w:cs="" w:cstheme="majorBidi" w:eastAsiaTheme="majorEastAsia" w:ascii="Cambria" w:hAnsi="Cambria"/>
+                              <w:b/>
+                              <w:iCs/>
+                              <w:color w:themeColor="text1" w:themeTint="bf" w:val="404040"/>
+                              <w:sz w:val="28"/>
+                              <w:szCs w:val="28"/>
+                            </w:rPr>
+                          </w:r>
+                        </w:p>
+                      </w:txbxContent>
+                    </wps:txbx>
+                    <wps:bodyPr anchor="ctr" vert="vert" upright="1">
+                      <a:noAutofit/>
+                    </wps:bodyPr>
+                  </wps:wsp>
+                </a:graphicData>
+              </a:graphic>
+            </wp:anchor>
+          </w:drawing>
+        </mc:Choice>
+        <mc:Fallback>
+          <w:pict>
+            <v:shape id="shape_0" stroked="t" o:allowincell="f" style="position:absolute;margin-left:412.5pt;margin-top:773.2pt;width:27.95pt;height:47.2pt;mso-wrap-style:none;v-text-anchor:middle;rotation:90;mso-position-horizontal-relative:margin;mso-position-vertical-relative:page" wp14:anchorId="7E31E2B7" type="_x0000_t186" path="l-2147483642,-2147483642l-2147483623,-2147483622l-2147483642,-2147483634l-2147483642,-2147483642l-2147483621,-2147483620l-2147483642,-2147483642l-2147483619,-2147483618l-2147483642,-2147483642l-2147483642,-2147483642l-2147483617,-2147483616l-2147483639,0l-2147483642,-2147483642l-2147483615,-2147483614xel-2147483642,-2147483642l-2147483613,-2147483612l-2147483642,-2147483642l-2147483611,-2147483610l-2147483638,-2147483633l-2147483642,-2147483642l-2147483640,-2147483625l-2147483642,-2147483642l-2147483607,-2147483606l-2147483642,-2147483634l-2147483642,-2147483642l-2147483605,-2147483604e">
+              <v:fill o:detectmouseclick="t" on="false"/>
+              <v:stroke color="#d9d9d9" joinstyle="round" endcap="flat"/>
+              <v:textbox>
+                <w:txbxContent>
+                  <w:p>
+                    <w:pPr>
+                      <w:pStyle w:val="FrameContentsuser"/>
+                      <w:spacing w:lineRule="auto" w:line="288" w:before="0" w:after="0"/>
+                      <w:ind w:end="-57"/>
+                      <w:jc w:val="end"/>
+                      <w:rPr>
+                        <w:rFonts w:ascii="Cambria" w:hAnsi="Cambria" w:eastAsia="" w:cs="" w:asciiTheme="majorHAnsi" w:cstheme="majorBidi" w:eastAsiaTheme="majorEastAsia" w:hAnsiTheme="majorHAnsi"/>
+                        <w:b/>
+                        <w:iCs/>
+                        <w:color w:themeColor="text1" w:themeTint="bf" w:val="404040"/>
+                        <w:sz w:val="28"/>
+                        <w:szCs w:val="28"/>
+                      </w:rPr>
+                    </w:pPr>
+                    <w:r>
+                      <w:rPr>
+                        <w:rFonts w:eastAsia="" w:cs="" w:cstheme="majorBidi" w:eastAsiaTheme="majorEastAsia" w:ascii="Cambria" w:hAnsi="Cambria"/>
+                        <w:b/>
+                        <w:iCs/>
+                        <w:color w:themeColor="text1" w:themeTint="bf" w:val="404040"/>
+                        <w:sz w:val="28"/>
+                        <w:szCs w:val="28"/>
+                      </w:rPr>
+                    </w:r>
+                  </w:p>
+                </w:txbxContent>
+              </v:textbox>
+              <w10:wrap type="none"/>
             </v:shape>
           </w:pict>
         </mc:Fallback>
@@ -31464,139 +31634,18 @@
       <mc:AlternateContent>
         <mc:Choice Requires="wps">
           <w:drawing>
-            <wp:anchor distT="1270" distB="1270" distL="1270" distR="1270" simplePos="0" relativeHeight="122" behindDoc="1" locked="0" layoutInCell="0" allowOverlap="1" wp14:anchorId="7E31E2B7">
+            <wp:anchor distT="0" distB="0" distL="95885" distR="114300" simplePos="0" relativeHeight="127" behindDoc="1" locked="0" layoutInCell="0" allowOverlap="1" wp14:anchorId="1A5B76DB">
               <wp:simplePos x="0" y="0"/>
               <wp:positionH relativeFrom="margin">
-                <wp:posOffset>5240020</wp:posOffset>
+                <wp:posOffset>5329555</wp:posOffset>
               </wp:positionH>
               <wp:positionV relativeFrom="page">
-                <wp:posOffset>9819005</wp:posOffset>
-              </wp:positionV>
-              <wp:extent cx="355600" cy="600075"/>
-              <wp:effectExtent l="1270" t="1270" r="1270" b="1270"/>
-              <wp:wrapNone/>
-              <wp:docPr id="9" name="Forme automatique 1"/>
-              <a:graphic xmlns:a="http://schemas.openxmlformats.org/drawingml/2006/main">
-                <a:graphicData uri="http://schemas.microsoft.com/office/word/2010/wordprocessingShape">
-                  <wps:wsp>
-                    <wps:cNvSpPr/>
-                    <wps:spPr>
-                      <a:xfrm rot="5400000">
-                        <a:off x="0" y="0"/>
-                        <a:ext cx="355680" cy="600120"/>
-                      </a:xfrm>
-                      <a:prstGeom prst="bracePair">
-                        <a:avLst>
-                          <a:gd name="adj" fmla="val 8333"/>
-                        </a:avLst>
-                      </a:prstGeom>
-                      <a:noFill/>
-                      <a:ln w="0">
-                        <a:solidFill>
-                          <a:srgbClr val="D9D9D9"/>
-                        </a:solidFill>
-                      </a:ln>
-                    </wps:spPr>
-                    <wps:style>
-                      <a:lnRef idx="0"/>
-                      <a:fillRef idx="0"/>
-                      <a:effectRef idx="0"/>
-                      <a:fontRef idx="minor"/>
-                    </wps:style>
-                    <wps:txbx>
-                      <w:txbxContent>
-                        <w:p>
-                          <w:pPr>
-                            <w:pStyle w:val="FrameContents"/>
-                            <w:spacing w:lineRule="auto" w:line="288" w:before="0" w:after="0"/>
-                            <w:ind w:end="-57"/>
-                            <w:jc w:val="end"/>
-                            <w:rPr>
-                              <w:rFonts w:ascii="Cambria" w:hAnsi="Cambria" w:eastAsia="" w:cs="" w:asciiTheme="majorHAnsi" w:cstheme="majorBidi" w:eastAsiaTheme="majorEastAsia" w:hAnsiTheme="majorHAnsi"/>
-                              <w:b/>
-                              <w:iCs/>
-                              <w:color w:themeColor="text1" w:themeTint="bf" w:val="404040"/>
-                              <w:sz w:val="28"/>
-                              <w:szCs w:val="28"/>
-                            </w:rPr>
-                          </w:pPr>
-                          <w:r>
-                            <w:rPr>
-                              <w:rFonts w:eastAsia="" w:cs="" w:cstheme="majorBidi" w:eastAsiaTheme="majorEastAsia" w:ascii="Cambria" w:hAnsi="Cambria"/>
-                              <w:b/>
-                              <w:iCs/>
-                              <w:color w:themeColor="text1" w:themeTint="bf" w:val="404040"/>
-                              <w:sz w:val="28"/>
-                              <w:szCs w:val="28"/>
-                            </w:rPr>
-                          </w:r>
-                        </w:p>
-                      </w:txbxContent>
-                    </wps:txbx>
-                    <wps:bodyPr lIns="45720" tIns="91440" rIns="45720" bIns="91440" anchor="ctr" vert="vert" upright="1">
-                      <a:noAutofit/>
-                    </wps:bodyPr>
-                  </wps:wsp>
-                </a:graphicData>
-              </a:graphic>
-            </wp:anchor>
-          </w:drawing>
-        </mc:Choice>
-        <mc:Fallback>
-          <w:pict>
-            <v:shape id="shape_0" stroked="t" o:allowincell="f" style="position:absolute;margin-left:412.55pt;margin-top:773.15pt;width:27.95pt;height:47.2pt;mso-wrap-style:none;v-text-anchor:middle;rotation:90;mso-position-horizontal-relative:margin;mso-position-vertical-relative:page" wp14:anchorId="7E31E2B7" type="_x0000_t186" path="l-2147483642,-2147483642l-2147483623,-2147483622l-2147483642,-2147483634l-2147483642,-2147483642l-2147483621,-2147483620l-2147483642,-2147483642l-2147483619,-2147483618l-2147483642,-2147483642l-2147483642,-2147483642l-2147483617,-2147483616l-2147483639,0l-2147483642,-2147483642l-2147483615,-2147483614xel-2147483642,-2147483642l-2147483613,-2147483612l-2147483642,-2147483642l-2147483611,-2147483610l-2147483638,-2147483633l-2147483642,-2147483642l-2147483640,-2147483625l-2147483642,-2147483642l-2147483607,-2147483606l-2147483642,-2147483634l-2147483642,-2147483642l-2147483605,-2147483604e">
-              <v:fill o:detectmouseclick="t" on="false"/>
-              <v:stroke color="#d9d9d9" joinstyle="round" endcap="flat"/>
-              <v:textbox>
-                <w:txbxContent>
-                  <w:p>
-                    <w:pPr>
-                      <w:pStyle w:val="FrameContents"/>
-                      <w:spacing w:lineRule="auto" w:line="288" w:before="0" w:after="0"/>
-                      <w:ind w:end="-57"/>
-                      <w:jc w:val="end"/>
-                      <w:rPr>
-                        <w:rFonts w:ascii="Cambria" w:hAnsi="Cambria" w:eastAsia="" w:cs="" w:asciiTheme="majorHAnsi" w:cstheme="majorBidi" w:eastAsiaTheme="majorEastAsia" w:hAnsiTheme="majorHAnsi"/>
-                        <w:b/>
-                        <w:iCs/>
-                        <w:color w:themeColor="text1" w:themeTint="bf" w:val="404040"/>
-                        <w:sz w:val="28"/>
-                        <w:szCs w:val="28"/>
-                      </w:rPr>
-                    </w:pPr>
-                    <w:r>
-                      <w:rPr>
-                        <w:rFonts w:eastAsia="" w:cs="" w:cstheme="majorBidi" w:eastAsiaTheme="majorEastAsia" w:ascii="Cambria" w:hAnsi="Cambria"/>
-                        <w:b/>
-                        <w:iCs/>
-                        <w:color w:themeColor="text1" w:themeTint="bf" w:val="404040"/>
-                        <w:sz w:val="28"/>
-                        <w:szCs w:val="28"/>
-                      </w:rPr>
-                    </w:r>
-                  </w:p>
-                </w:txbxContent>
-              </v:textbox>
-              <w10:wrap type="none"/>
-            </v:shape>
-          </w:pict>
-        </mc:Fallback>
-      </mc:AlternateContent>
-      <mc:AlternateContent>
-        <mc:Choice Requires="wps">
-          <w:drawing>
-            <wp:anchor distT="0" distB="0" distL="97790" distR="114300" simplePos="0" relativeHeight="124" behindDoc="1" locked="0" layoutInCell="0" allowOverlap="1" wp14:anchorId="1A5B76DB">
-              <wp:simplePos x="0" y="0"/>
-              <wp:positionH relativeFrom="margin">
-                <wp:posOffset>5330190</wp:posOffset>
-              </wp:positionH>
-              <wp:positionV relativeFrom="page">
-                <wp:posOffset>9917430</wp:posOffset>
+                <wp:posOffset>9918065</wp:posOffset>
               </wp:positionV>
               <wp:extent cx="473710" cy="376555"/>
               <wp:effectExtent l="0" t="0" r="0" b="0"/>
               <wp:wrapSquare wrapText="bothSides"/>
-              <wp:docPr id="10" name="Forme automatique 3"/>
+              <wp:docPr id="9" name="Forme automatique 3"/>
               <a:graphic xmlns:a="http://schemas.openxmlformats.org/drawingml/2006/main">
                 <a:graphicData uri="http://schemas.microsoft.com/office/word/2010/wordprocessingShape">
                   <wps:wsp>
@@ -31626,7 +31675,7 @@
                       <w:txbxContent>
                         <w:p>
                           <w:pPr>
-                            <w:pStyle w:val="FrameContents"/>
+                            <w:pStyle w:val="FrameContentsuser"/>
                             <w:spacing w:lineRule="auto" w:line="288" w:before="0" w:after="0"/>
                             <w:ind w:end="-58"/>
                             <w:jc w:val="center"/>
@@ -31690,7 +31739,7 @@
                         </w:p>
                       </w:txbxContent>
                     </wps:txbx>
-                    <wps:bodyPr lIns="45720" tIns="91440" rIns="45720" bIns="91440" anchor="ctr" vert="vert" upright="1">
+                    <wps:bodyPr anchor="ctr" vert="vert" upright="1">
                       <a:noAutofit/>
                     </wps:bodyPr>
                   </wps:wsp>
@@ -31701,14 +31750,14 @@
         </mc:Choice>
         <mc:Fallback>
           <w:pict>
-            <v:shape id="shape_0" stroked="f" o:allowincell="f" style="position:absolute;margin-left:419.7pt;margin-top:780.85pt;width:37.25pt;height:29.6pt;mso-wrap-style:square;v-text-anchor:middle;rotation:90;mso-position-horizontal-relative:margin;mso-position-vertical-relative:page" wp14:anchorId="1A5B76DB" type="_x0000_t186" path="l-2147483642,-2147483642l-2147483623,-2147483622l-2147483642,-2147483634l-2147483642,-2147483642l-2147483621,-2147483620l-2147483642,-2147483642l-2147483619,-2147483618l-2147483642,-2147483642l-2147483642,-2147483642l-2147483617,-2147483616l-2147483639,0l-2147483642,-2147483642l-2147483615,-2147483614xel-2147483642,-2147483642l-2147483613,-2147483612l-2147483642,-2147483642l-2147483611,-2147483610l-2147483638,-2147483633l-2147483642,-2147483642l-2147483640,-2147483625l-2147483642,-2147483642l-2147483607,-2147483606l-2147483642,-2147483634l-2147483642,-2147483642l-2147483605,-2147483604e">
+            <v:shape id="shape_0" stroked="f" o:allowincell="f" style="position:absolute;margin-left:419.65pt;margin-top:780.9pt;width:37.25pt;height:29.6pt;mso-wrap-style:square;v-text-anchor:middle;rotation:90;mso-position-horizontal-relative:margin;mso-position-vertical-relative:page" wp14:anchorId="1A5B76DB" type="_x0000_t186" path="l-2147483642,-2147483642l-2147483623,-2147483622l-2147483642,-2147483634l-2147483642,-2147483642l-2147483621,-2147483620l-2147483642,-2147483642l-2147483619,-2147483618l-2147483642,-2147483642l-2147483642,-2147483642l-2147483617,-2147483616l-2147483639,0l-2147483642,-2147483642l-2147483615,-2147483614xel-2147483642,-2147483642l-2147483613,-2147483612l-2147483642,-2147483642l-2147483611,-2147483610l-2147483638,-2147483633l-2147483642,-2147483642l-2147483640,-2147483625l-2147483642,-2147483642l-2147483607,-2147483606l-2147483642,-2147483634l-2147483642,-2147483642l-2147483605,-2147483604e">
               <v:fill o:detectmouseclick="t" on="false"/>
               <v:stroke color="#3465a4" joinstyle="round" endcap="flat"/>
               <v:textbox>
                 <w:txbxContent>
                   <w:p>
                     <w:pPr>
-                      <w:pStyle w:val="FrameContents"/>
+                      <w:pStyle w:val="FrameContentsuser"/>
                       <w:spacing w:lineRule="auto" w:line="288" w:before="0" w:after="0"/>
                       <w:ind w:end="-58"/>
                       <w:jc w:val="center"/>
@@ -31773,6 +31822,127 @@
                 </w:txbxContent>
               </v:textbox>
               <w10:wrap type="square"/>
+            </v:shape>
+          </w:pict>
+        </mc:Fallback>
+      </mc:AlternateContent>
+      <mc:AlternateContent>
+        <mc:Choice Requires="wps">
+          <w:drawing>
+            <wp:anchor distT="1270" distB="1270" distL="1270" distR="1270" simplePos="0" relativeHeight="129" behindDoc="1" locked="0" layoutInCell="0" allowOverlap="1" wp14:anchorId="7E31E2B7">
+              <wp:simplePos x="0" y="0"/>
+              <wp:positionH relativeFrom="margin">
+                <wp:posOffset>5239385</wp:posOffset>
+              </wp:positionH>
+              <wp:positionV relativeFrom="page">
+                <wp:posOffset>9819640</wp:posOffset>
+              </wp:positionV>
+              <wp:extent cx="355600" cy="600075"/>
+              <wp:effectExtent l="1270" t="1270" r="1270" b="1270"/>
+              <wp:wrapNone/>
+              <wp:docPr id="10" name="Forme automatique 1"/>
+              <a:graphic xmlns:a="http://schemas.openxmlformats.org/drawingml/2006/main">
+                <a:graphicData uri="http://schemas.microsoft.com/office/word/2010/wordprocessingShape">
+                  <wps:wsp>
+                    <wps:cNvSpPr/>
+                    <wps:spPr>
+                      <a:xfrm rot="5400000">
+                        <a:off x="0" y="0"/>
+                        <a:ext cx="355680" cy="600120"/>
+                      </a:xfrm>
+                      <a:prstGeom prst="bracePair">
+                        <a:avLst>
+                          <a:gd name="adj" fmla="val 8333"/>
+                        </a:avLst>
+                      </a:prstGeom>
+                      <a:noFill/>
+                      <a:ln w="0">
+                        <a:solidFill>
+                          <a:srgbClr val="D9D9D9"/>
+                        </a:solidFill>
+                      </a:ln>
+                    </wps:spPr>
+                    <wps:style>
+                      <a:lnRef idx="0"/>
+                      <a:fillRef idx="0"/>
+                      <a:effectRef idx="0"/>
+                      <a:fontRef idx="minor"/>
+                    </wps:style>
+                    <wps:txbx>
+                      <w:txbxContent>
+                        <w:p>
+                          <w:pPr>
+                            <w:pStyle w:val="FrameContentsuser"/>
+                            <w:spacing w:lineRule="auto" w:line="288" w:before="0" w:after="0"/>
+                            <w:ind w:end="-57"/>
+                            <w:jc w:val="end"/>
+                            <w:rPr>
+                              <w:rFonts w:ascii="Cambria" w:hAnsi="Cambria" w:eastAsia="" w:cs="" w:asciiTheme="majorHAnsi" w:cstheme="majorBidi" w:eastAsiaTheme="majorEastAsia" w:hAnsiTheme="majorHAnsi"/>
+                              <w:b/>
+                              <w:iCs/>
+                              <w:color w:themeColor="text1" w:themeTint="bf" w:val="404040"/>
+                              <w:sz w:val="28"/>
+                              <w:szCs w:val="28"/>
+                            </w:rPr>
+                          </w:pPr>
+                          <w:r>
+                            <w:rPr>
+                              <w:rFonts w:eastAsia="" w:cs="" w:cstheme="majorBidi" w:eastAsiaTheme="majorEastAsia" w:ascii="Cambria" w:hAnsi="Cambria"/>
+                              <w:b/>
+                              <w:iCs/>
+                              <w:color w:themeColor="text1" w:themeTint="bf" w:val="404040"/>
+                              <w:sz w:val="28"/>
+                              <w:szCs w:val="28"/>
+                            </w:rPr>
+                          </w:r>
+                        </w:p>
+                      </w:txbxContent>
+                    </wps:txbx>
+                    <wps:bodyPr anchor="ctr" vert="vert" upright="1">
+                      <a:noAutofit/>
+                    </wps:bodyPr>
+                  </wps:wsp>
+                </a:graphicData>
+              </a:graphic>
+            </wp:anchor>
+          </w:drawing>
+        </mc:Choice>
+        <mc:Fallback>
+          <w:pict>
+            <v:shape id="shape_0" stroked="t" o:allowincell="f" style="position:absolute;margin-left:412.5pt;margin-top:773.2pt;width:27.95pt;height:47.2pt;mso-wrap-style:none;v-text-anchor:middle;rotation:90;mso-position-horizontal-relative:margin;mso-position-vertical-relative:page" wp14:anchorId="7E31E2B7" type="_x0000_t186" path="l-2147483642,-2147483642l-2147483623,-2147483622l-2147483642,-2147483634l-2147483642,-2147483642l-2147483621,-2147483620l-2147483642,-2147483642l-2147483619,-2147483618l-2147483642,-2147483642l-2147483642,-2147483642l-2147483617,-2147483616l-2147483639,0l-2147483642,-2147483642l-2147483615,-2147483614xel-2147483642,-2147483642l-2147483613,-2147483612l-2147483642,-2147483642l-2147483611,-2147483610l-2147483638,-2147483633l-2147483642,-2147483642l-2147483640,-2147483625l-2147483642,-2147483642l-2147483607,-2147483606l-2147483642,-2147483634l-2147483642,-2147483642l-2147483605,-2147483604e">
+              <v:fill o:detectmouseclick="t" on="false"/>
+              <v:stroke color="#d9d9d9" joinstyle="round" endcap="flat"/>
+              <v:textbox>
+                <w:txbxContent>
+                  <w:p>
+                    <w:pPr>
+                      <w:pStyle w:val="FrameContentsuser"/>
+                      <w:spacing w:lineRule="auto" w:line="288" w:before="0" w:after="0"/>
+                      <w:ind w:end="-57"/>
+                      <w:jc w:val="end"/>
+                      <w:rPr>
+                        <w:rFonts w:ascii="Cambria" w:hAnsi="Cambria" w:eastAsia="" w:cs="" w:asciiTheme="majorHAnsi" w:cstheme="majorBidi" w:eastAsiaTheme="majorEastAsia" w:hAnsiTheme="majorHAnsi"/>
+                        <w:b/>
+                        <w:iCs/>
+                        <w:color w:themeColor="text1" w:themeTint="bf" w:val="404040"/>
+                        <w:sz w:val="28"/>
+                        <w:szCs w:val="28"/>
+                      </w:rPr>
+                    </w:pPr>
+                    <w:r>
+                      <w:rPr>
+                        <w:rFonts w:eastAsia="" w:cs="" w:cstheme="majorBidi" w:eastAsiaTheme="majorEastAsia" w:ascii="Cambria" w:hAnsi="Cambria"/>
+                        <w:b/>
+                        <w:iCs/>
+                        <w:color w:themeColor="text1" w:themeTint="bf" w:val="404040"/>
+                        <w:sz w:val="28"/>
+                        <w:szCs w:val="28"/>
+                      </w:rPr>
+                    </w:r>
+                  </w:p>
+                </w:txbxContent>
+              </v:textbox>
+              <w10:wrap type="none"/>
             </v:shape>
           </w:pict>
         </mc:Fallback>
@@ -31858,13 +32028,13 @@
       <mc:AlternateContent>
         <mc:Choice Requires="wps">
           <w:drawing>
-            <wp:anchor distT="0" distB="0" distL="97790" distR="114300" simplePos="0" relativeHeight="8" behindDoc="1" locked="0" layoutInCell="0" allowOverlap="1" wp14:anchorId="1A5B76DB">
+            <wp:anchor distT="0" distB="0" distL="95885" distR="114300" simplePos="0" relativeHeight="17" behindDoc="1" locked="0" layoutInCell="0" allowOverlap="1" wp14:anchorId="1A5B76DB">
               <wp:simplePos x="0" y="0"/>
               <wp:positionH relativeFrom="margin">
-                <wp:posOffset>5330190</wp:posOffset>
+                <wp:posOffset>5329555</wp:posOffset>
               </wp:positionH>
               <wp:positionV relativeFrom="page">
-                <wp:posOffset>9917430</wp:posOffset>
+                <wp:posOffset>9918065</wp:posOffset>
               </wp:positionV>
               <wp:extent cx="473710" cy="376555"/>
               <wp:effectExtent l="0" t="0" r="0" b="0"/>
@@ -31899,7 +32069,7 @@
                       <w:txbxContent>
                         <w:p>
                           <w:pPr>
-                            <w:pStyle w:val="FrameContents"/>
+                            <w:pStyle w:val="FrameContentsuser"/>
                             <w:spacing w:lineRule="auto" w:line="288" w:before="0" w:after="0"/>
                             <w:ind w:end="-58"/>
                             <w:jc w:val="center"/>
@@ -31970,7 +32140,7 @@
                         </w:p>
                       </w:txbxContent>
                     </wps:txbx>
-                    <wps:bodyPr lIns="45720" tIns="91440" rIns="45720" bIns="91440" anchor="ctr" vert="vert" upright="1">
+                    <wps:bodyPr anchor="ctr" vert="vert" upright="1">
                       <a:noAutofit/>
                     </wps:bodyPr>
                   </wps:wsp>
@@ -31981,14 +32151,14 @@
         </mc:Choice>
         <mc:Fallback>
           <w:pict>
-            <v:shape id="shape_0" stroked="f" o:allowincell="f" style="position:absolute;margin-left:419.7pt;margin-top:780.85pt;width:37.25pt;height:29.6pt;mso-wrap-style:square;v-text-anchor:middle;rotation:90;mso-position-horizontal-relative:margin;mso-position-vertical-relative:page" wp14:anchorId="1A5B76DB" type="_x0000_t186" path="l-2147483642,-2147483642l-2147483623,-2147483622l-2147483642,-2147483634l-2147483642,-2147483642l-2147483621,-2147483620l-2147483642,-2147483642l-2147483619,-2147483618l-2147483642,-2147483642l-2147483642,-2147483642l-2147483617,-2147483616l-2147483639,0l-2147483642,-2147483642l-2147483615,-2147483614xel-2147483642,-2147483642l-2147483613,-2147483612l-2147483642,-2147483642l-2147483611,-2147483610l-2147483638,-2147483633l-2147483642,-2147483642l-2147483640,-2147483625l-2147483642,-2147483642l-2147483607,-2147483606l-2147483642,-2147483634l-2147483642,-2147483642l-2147483605,-2147483604e">
+            <v:shape id="shape_0" stroked="f" o:allowincell="f" style="position:absolute;margin-left:419.65pt;margin-top:780.9pt;width:37.25pt;height:29.6pt;mso-wrap-style:square;v-text-anchor:middle;rotation:90;mso-position-horizontal-relative:margin;mso-position-vertical-relative:page" wp14:anchorId="1A5B76DB" type="_x0000_t186" path="l-2147483642,-2147483642l-2147483623,-2147483622l-2147483642,-2147483634l-2147483642,-2147483642l-2147483621,-2147483620l-2147483642,-2147483642l-2147483619,-2147483618l-2147483642,-2147483642l-2147483642,-2147483642l-2147483617,-2147483616l-2147483639,0l-2147483642,-2147483642l-2147483615,-2147483614xel-2147483642,-2147483642l-2147483613,-2147483612l-2147483642,-2147483642l-2147483611,-2147483610l-2147483638,-2147483633l-2147483642,-2147483642l-2147483640,-2147483625l-2147483642,-2147483642l-2147483607,-2147483606l-2147483642,-2147483634l-2147483642,-2147483642l-2147483605,-2147483604e">
               <v:fill o:detectmouseclick="t" on="false"/>
               <v:stroke color="#3465a4" joinstyle="round" endcap="flat"/>
               <v:textbox>
                 <w:txbxContent>
                   <w:p>
                     <w:pPr>
-                      <w:pStyle w:val="FrameContents"/>
+                      <w:pStyle w:val="FrameContentsuser"/>
                       <w:spacing w:lineRule="auto" w:line="288" w:before="0" w:after="0"/>
                       <w:ind w:end="-58"/>
                       <w:jc w:val="center"/>
@@ -32067,13 +32237,13 @@
       <mc:AlternateContent>
         <mc:Choice Requires="wps">
           <w:drawing>
-            <wp:anchor distT="1270" distB="1270" distL="1270" distR="1270" simplePos="0" relativeHeight="106" behindDoc="1" locked="0" layoutInCell="0" allowOverlap="1" wp14:anchorId="7E31E2B7">
+            <wp:anchor distT="1270" distB="1270" distL="1270" distR="1270" simplePos="0" relativeHeight="122" behindDoc="1" locked="0" layoutInCell="0" allowOverlap="1" wp14:anchorId="7E31E2B7">
               <wp:simplePos x="0" y="0"/>
               <wp:positionH relativeFrom="margin">
-                <wp:posOffset>5240020</wp:posOffset>
+                <wp:posOffset>5239385</wp:posOffset>
               </wp:positionH>
               <wp:positionV relativeFrom="page">
-                <wp:posOffset>9819005</wp:posOffset>
+                <wp:posOffset>9819640</wp:posOffset>
               </wp:positionV>
               <wp:extent cx="355600" cy="600075"/>
               <wp:effectExtent l="1270" t="1270" r="1270" b="1270"/>
@@ -32110,7 +32280,7 @@
                       <w:txbxContent>
                         <w:p>
                           <w:pPr>
-                            <w:pStyle w:val="FrameContents"/>
+                            <w:pStyle w:val="FrameContentsuser"/>
                             <w:spacing w:lineRule="auto" w:line="288" w:before="0" w:after="0"/>
                             <w:ind w:end="-57"/>
                             <w:jc w:val="end"/>
@@ -32136,7 +32306,7 @@
                         </w:p>
                       </w:txbxContent>
                     </wps:txbx>
-                    <wps:bodyPr lIns="45720" tIns="91440" rIns="45720" bIns="91440" anchor="ctr" vert="vert" upright="1">
+                    <wps:bodyPr anchor="ctr" vert="vert" upright="1">
                       <a:noAutofit/>
                     </wps:bodyPr>
                   </wps:wsp>
@@ -32147,14 +32317,14 @@
         </mc:Choice>
         <mc:Fallback>
           <w:pict>
-            <v:shape id="shape_0" stroked="t" o:allowincell="f" style="position:absolute;margin-left:412.55pt;margin-top:773.15pt;width:27.95pt;height:47.2pt;mso-wrap-style:none;v-text-anchor:middle;rotation:90;mso-position-horizontal-relative:margin;mso-position-vertical-relative:page" wp14:anchorId="7E31E2B7" type="_x0000_t186" path="l-2147483642,-2147483642l-2147483623,-2147483622l-2147483642,-2147483634l-2147483642,-2147483642l-2147483621,-2147483620l-2147483642,-2147483642l-2147483619,-2147483618l-2147483642,-2147483642l-2147483642,-2147483642l-2147483617,-2147483616l-2147483639,0l-2147483642,-2147483642l-2147483615,-2147483614xel-2147483642,-2147483642l-2147483613,-2147483612l-2147483642,-2147483642l-2147483611,-2147483610l-2147483638,-2147483633l-2147483642,-2147483642l-2147483640,-2147483625l-2147483642,-2147483642l-2147483607,-2147483606l-2147483642,-2147483634l-2147483642,-2147483642l-2147483605,-2147483604e">
+            <v:shape id="shape_0" stroked="t" o:allowincell="f" style="position:absolute;margin-left:412.5pt;margin-top:773.2pt;width:27.95pt;height:47.2pt;mso-wrap-style:none;v-text-anchor:middle;rotation:90;mso-position-horizontal-relative:margin;mso-position-vertical-relative:page" wp14:anchorId="7E31E2B7" type="_x0000_t186" path="l-2147483642,-2147483642l-2147483623,-2147483622l-2147483642,-2147483634l-2147483642,-2147483642l-2147483621,-2147483620l-2147483642,-2147483642l-2147483619,-2147483618l-2147483642,-2147483642l-2147483642,-2147483642l-2147483617,-2147483616l-2147483639,0l-2147483642,-2147483642l-2147483615,-2147483614xel-2147483642,-2147483642l-2147483613,-2147483612l-2147483642,-2147483642l-2147483611,-2147483610l-2147483638,-2147483633l-2147483642,-2147483642l-2147483640,-2147483625l-2147483642,-2147483642l-2147483607,-2147483606l-2147483642,-2147483634l-2147483642,-2147483642l-2147483605,-2147483604e">
               <v:fill o:detectmouseclick="t" on="false"/>
               <v:stroke color="#d9d9d9" joinstyle="round" endcap="flat"/>
               <v:textbox>
                 <w:txbxContent>
                   <w:p>
                     <w:pPr>
-                      <w:pStyle w:val="FrameContents"/>
+                      <w:pStyle w:val="FrameContentsuser"/>
                       <w:spacing w:lineRule="auto" w:line="288" w:before="0" w:after="0"/>
                       <w:ind w:end="-57"/>
                       <w:jc w:val="end"/>
@@ -32252,13 +32422,13 @@
       <mc:AlternateContent>
         <mc:Choice Requires="wps">
           <w:drawing>
-            <wp:anchor distT="0" distB="0" distL="97790" distR="114300" simplePos="0" relativeHeight="8" behindDoc="1" locked="0" layoutInCell="0" allowOverlap="1" wp14:anchorId="1A5B76DB">
+            <wp:anchor distT="0" distB="0" distL="95885" distR="114300" simplePos="0" relativeHeight="17" behindDoc="1" locked="0" layoutInCell="0" allowOverlap="1" wp14:anchorId="1A5B76DB">
               <wp:simplePos x="0" y="0"/>
               <wp:positionH relativeFrom="margin">
-                <wp:posOffset>5330190</wp:posOffset>
+                <wp:posOffset>5329555</wp:posOffset>
               </wp:positionH>
               <wp:positionV relativeFrom="page">
-                <wp:posOffset>9917430</wp:posOffset>
+                <wp:posOffset>9918065</wp:posOffset>
               </wp:positionV>
               <wp:extent cx="473710" cy="376555"/>
               <wp:effectExtent l="0" t="0" r="0" b="0"/>
@@ -32293,7 +32463,7 @@
                       <w:txbxContent>
                         <w:p>
                           <w:pPr>
-                            <w:pStyle w:val="FrameContents"/>
+                            <w:pStyle w:val="FrameContentsuser"/>
                             <w:spacing w:lineRule="auto" w:line="288" w:before="0" w:after="0"/>
                             <w:ind w:end="-58"/>
                             <w:jc w:val="center"/>
@@ -32364,7 +32534,7 @@
                         </w:p>
                       </w:txbxContent>
                     </wps:txbx>
-                    <wps:bodyPr lIns="45720" tIns="91440" rIns="45720" bIns="91440" anchor="ctr" vert="vert" upright="1">
+                    <wps:bodyPr anchor="ctr" vert="vert" upright="1">
                       <a:noAutofit/>
                     </wps:bodyPr>
                   </wps:wsp>
@@ -32375,14 +32545,14 @@
         </mc:Choice>
         <mc:Fallback>
           <w:pict>
-            <v:shape id="shape_0" stroked="f" o:allowincell="f" style="position:absolute;margin-left:419.7pt;margin-top:780.85pt;width:37.25pt;height:29.6pt;mso-wrap-style:square;v-text-anchor:middle;rotation:90;mso-position-horizontal-relative:margin;mso-position-vertical-relative:page" wp14:anchorId="1A5B76DB" type="_x0000_t186" path="l-2147483642,-2147483642l-2147483623,-2147483622l-2147483642,-2147483634l-2147483642,-2147483642l-2147483621,-2147483620l-2147483642,-2147483642l-2147483619,-2147483618l-2147483642,-2147483642l-2147483642,-2147483642l-2147483617,-2147483616l-2147483639,0l-2147483642,-2147483642l-2147483615,-2147483614xel-2147483642,-2147483642l-2147483613,-2147483612l-2147483642,-2147483642l-2147483611,-2147483610l-2147483638,-2147483633l-2147483642,-2147483642l-2147483640,-2147483625l-2147483642,-2147483642l-2147483607,-2147483606l-2147483642,-2147483634l-2147483642,-2147483642l-2147483605,-2147483604e">
+            <v:shape id="shape_0" stroked="f" o:allowincell="f" style="position:absolute;margin-left:419.65pt;margin-top:780.9pt;width:37.25pt;height:29.6pt;mso-wrap-style:square;v-text-anchor:middle;rotation:90;mso-position-horizontal-relative:margin;mso-position-vertical-relative:page" wp14:anchorId="1A5B76DB" type="_x0000_t186" path="l-2147483642,-2147483642l-2147483623,-2147483622l-2147483642,-2147483634l-2147483642,-2147483642l-2147483621,-2147483620l-2147483642,-2147483642l-2147483619,-2147483618l-2147483642,-2147483642l-2147483642,-2147483642l-2147483617,-2147483616l-2147483639,0l-2147483642,-2147483642l-2147483615,-2147483614xel-2147483642,-2147483642l-2147483613,-2147483612l-2147483642,-2147483642l-2147483611,-2147483610l-2147483638,-2147483633l-2147483642,-2147483642l-2147483640,-2147483625l-2147483642,-2147483642l-2147483607,-2147483606l-2147483642,-2147483634l-2147483642,-2147483642l-2147483605,-2147483604e">
               <v:fill o:detectmouseclick="t" on="false"/>
               <v:stroke color="#3465a4" joinstyle="round" endcap="flat"/>
               <v:textbox>
                 <w:txbxContent>
                   <w:p>
                     <w:pPr>
-                      <w:pStyle w:val="FrameContents"/>
+                      <w:pStyle w:val="FrameContentsuser"/>
                       <w:spacing w:lineRule="auto" w:line="288" w:before="0" w:after="0"/>
                       <w:ind w:end="-58"/>
                       <w:jc w:val="center"/>
@@ -32461,13 +32631,13 @@
       <mc:AlternateContent>
         <mc:Choice Requires="wps">
           <w:drawing>
-            <wp:anchor distT="1270" distB="1270" distL="1270" distR="1270" simplePos="0" relativeHeight="106" behindDoc="1" locked="0" layoutInCell="0" allowOverlap="1" wp14:anchorId="7E31E2B7">
+            <wp:anchor distT="1270" distB="1270" distL="1270" distR="1270" simplePos="0" relativeHeight="122" behindDoc="1" locked="0" layoutInCell="0" allowOverlap="1" wp14:anchorId="7E31E2B7">
               <wp:simplePos x="0" y="0"/>
               <wp:positionH relativeFrom="margin">
-                <wp:posOffset>5240020</wp:posOffset>
+                <wp:posOffset>5239385</wp:posOffset>
               </wp:positionH>
               <wp:positionV relativeFrom="page">
-                <wp:posOffset>9819005</wp:posOffset>
+                <wp:posOffset>9819640</wp:posOffset>
               </wp:positionV>
               <wp:extent cx="355600" cy="600075"/>
               <wp:effectExtent l="1270" t="1270" r="1270" b="1270"/>
@@ -32504,7 +32674,7 @@
                       <w:txbxContent>
                         <w:p>
                           <w:pPr>
-                            <w:pStyle w:val="FrameContents"/>
+                            <w:pStyle w:val="FrameContentsuser"/>
                             <w:spacing w:lineRule="auto" w:line="288" w:before="0" w:after="0"/>
                             <w:ind w:end="-57"/>
                             <w:jc w:val="end"/>
@@ -32530,7 +32700,7 @@
                         </w:p>
                       </w:txbxContent>
                     </wps:txbx>
-                    <wps:bodyPr lIns="45720" tIns="91440" rIns="45720" bIns="91440" anchor="ctr" vert="vert" upright="1">
+                    <wps:bodyPr anchor="ctr" vert="vert" upright="1">
                       <a:noAutofit/>
                     </wps:bodyPr>
                   </wps:wsp>
@@ -32541,14 +32711,14 @@
         </mc:Choice>
         <mc:Fallback>
           <w:pict>
-            <v:shape id="shape_0" stroked="t" o:allowincell="f" style="position:absolute;margin-left:412.55pt;margin-top:773.15pt;width:27.95pt;height:47.2pt;mso-wrap-style:none;v-text-anchor:middle;rotation:90;mso-position-horizontal-relative:margin;mso-position-vertical-relative:page" wp14:anchorId="7E31E2B7" type="_x0000_t186" path="l-2147483642,-2147483642l-2147483623,-2147483622l-2147483642,-2147483634l-2147483642,-2147483642l-2147483621,-2147483620l-2147483642,-2147483642l-2147483619,-2147483618l-2147483642,-2147483642l-2147483642,-2147483642l-2147483617,-2147483616l-2147483639,0l-2147483642,-2147483642l-2147483615,-2147483614xel-2147483642,-2147483642l-2147483613,-2147483612l-2147483642,-2147483642l-2147483611,-2147483610l-2147483638,-2147483633l-2147483642,-2147483642l-2147483640,-2147483625l-2147483642,-2147483642l-2147483607,-2147483606l-2147483642,-2147483634l-2147483642,-2147483642l-2147483605,-2147483604e">
+            <v:shape id="shape_0" stroked="t" o:allowincell="f" style="position:absolute;margin-left:412.5pt;margin-top:773.2pt;width:27.95pt;height:47.2pt;mso-wrap-style:none;v-text-anchor:middle;rotation:90;mso-position-horizontal-relative:margin;mso-position-vertical-relative:page" wp14:anchorId="7E31E2B7" type="_x0000_t186" path="l-2147483642,-2147483642l-2147483623,-2147483622l-2147483642,-2147483634l-2147483642,-2147483642l-2147483621,-2147483620l-2147483642,-2147483642l-2147483619,-2147483618l-2147483642,-2147483642l-2147483642,-2147483642l-2147483617,-2147483616l-2147483639,0l-2147483642,-2147483642l-2147483615,-2147483614xel-2147483642,-2147483642l-2147483613,-2147483612l-2147483642,-2147483642l-2147483611,-2147483610l-2147483638,-2147483633l-2147483642,-2147483642l-2147483640,-2147483625l-2147483642,-2147483642l-2147483607,-2147483606l-2147483642,-2147483634l-2147483642,-2147483642l-2147483605,-2147483604e">
               <v:fill o:detectmouseclick="t" on="false"/>
               <v:stroke color="#d9d9d9" joinstyle="round" endcap="flat"/>
               <v:textbox>
                 <w:txbxContent>
                   <w:p>
                     <w:pPr>
-                      <w:pStyle w:val="FrameContents"/>
+                      <w:pStyle w:val="FrameContentsuser"/>
                       <w:spacing w:lineRule="auto" w:line="288" w:before="0" w:after="0"/>
                       <w:ind w:end="-57"/>
                       <w:jc w:val="end"/>
@@ -32673,8 +32843,8 @@
     </w:tblPr>
     <w:tblGrid>
       <w:gridCol w:w="2976"/>
-      <w:gridCol w:w="2401"/>
-      <w:gridCol w:w="4371"/>
+      <w:gridCol w:w="2400"/>
+      <w:gridCol w:w="4372"/>
     </w:tblGrid>
     <w:tr>
       <w:trPr>
@@ -32717,7 +32887,7 @@
       </w:tc>
       <w:tc>
         <w:tcPr>
-          <w:tcW w:w="2401" w:type="dxa"/>
+          <w:tcW w:w="2400" w:type="dxa"/>
           <w:tcBorders>
             <w:top w:val="nil"/>
             <w:start w:val="nil"/>
@@ -32752,7 +32922,7 @@
       </w:tc>
       <w:tc>
         <w:tcPr>
-          <w:tcW w:w="4371" w:type="dxa"/>
+          <w:tcW w:w="4372" w:type="dxa"/>
           <w:tcBorders>
             <w:top w:val="nil"/>
             <w:start w:val="nil"/>
@@ -32942,7 +33112,7 @@
       </w:tc>
       <w:tc>
         <w:tcPr>
-          <w:tcW w:w="2401" w:type="dxa"/>
+          <w:tcW w:w="2400" w:type="dxa"/>
           <w:tcBorders>
             <w:top w:val="nil"/>
             <w:start w:val="nil"/>
@@ -32977,7 +33147,7 @@
       </w:tc>
       <w:tc>
         <w:tcPr>
-          <w:tcW w:w="4371" w:type="dxa"/>
+          <w:tcW w:w="4372" w:type="dxa"/>
           <w:tcBorders>
             <w:top w:val="nil"/>
             <w:start w:val="nil"/>
@@ -33056,7 +33226,7 @@
       </w:tc>
       <w:tc>
         <w:tcPr>
-          <w:tcW w:w="2401" w:type="dxa"/>
+          <w:tcW w:w="2400" w:type="dxa"/>
           <w:tcBorders>
             <w:top w:val="nil"/>
             <w:start w:val="nil"/>
@@ -33091,7 +33261,7 @@
       </w:tc>
       <w:tc>
         <w:tcPr>
-          <w:tcW w:w="4371" w:type="dxa"/>
+          <w:tcW w:w="4372" w:type="dxa"/>
           <w:tcBorders>
             <w:top w:val="nil"/>
             <w:start w:val="nil"/>
@@ -33157,8 +33327,8 @@
     </w:tblPr>
     <w:tblGrid>
       <w:gridCol w:w="2976"/>
-      <w:gridCol w:w="2401"/>
-      <w:gridCol w:w="4371"/>
+      <w:gridCol w:w="2400"/>
+      <w:gridCol w:w="4372"/>
     </w:tblGrid>
     <w:tr>
       <w:trPr>
@@ -33201,7 +33371,7 @@
       </w:tc>
       <w:tc>
         <w:tcPr>
-          <w:tcW w:w="2401" w:type="dxa"/>
+          <w:tcW w:w="2400" w:type="dxa"/>
           <w:tcBorders>
             <w:top w:val="nil"/>
             <w:start w:val="nil"/>
@@ -33236,7 +33406,7 @@
       </w:tc>
       <w:tc>
         <w:tcPr>
-          <w:tcW w:w="4371" w:type="dxa"/>
+          <w:tcW w:w="4372" w:type="dxa"/>
           <w:tcBorders>
             <w:top w:val="nil"/>
             <w:start w:val="nil"/>
@@ -33426,7 +33596,7 @@
       </w:tc>
       <w:tc>
         <w:tcPr>
-          <w:tcW w:w="2401" w:type="dxa"/>
+          <w:tcW w:w="2400" w:type="dxa"/>
           <w:tcBorders>
             <w:top w:val="nil"/>
             <w:start w:val="nil"/>
@@ -33461,7 +33631,7 @@
       </w:tc>
       <w:tc>
         <w:tcPr>
-          <w:tcW w:w="4371" w:type="dxa"/>
+          <w:tcW w:w="4372" w:type="dxa"/>
           <w:tcBorders>
             <w:top w:val="nil"/>
             <w:start w:val="nil"/>
@@ -33540,7 +33710,7 @@
       </w:tc>
       <w:tc>
         <w:tcPr>
-          <w:tcW w:w="2401" w:type="dxa"/>
+          <w:tcW w:w="2400" w:type="dxa"/>
           <w:tcBorders>
             <w:top w:val="nil"/>
             <w:start w:val="nil"/>
@@ -33575,7 +33745,7 @@
       </w:tc>
       <w:tc>
         <w:tcPr>
-          <w:tcW w:w="4371" w:type="dxa"/>
+          <w:tcW w:w="4372" w:type="dxa"/>
           <w:tcBorders>
             <w:top w:val="nil"/>
             <w:start w:val="nil"/>
@@ -33682,8 +33852,8 @@
       <w:tblLook w:noHBand="0" w:noVBand="1" w:firstColumn="1" w:lastRow="0" w:lastColumn="0" w:firstRow="1" w:val="04a0"/>
     </w:tblPr>
     <w:tblGrid>
-      <w:gridCol w:w="2012"/>
-      <w:gridCol w:w="2960"/>
+      <w:gridCol w:w="2011"/>
+      <w:gridCol w:w="2961"/>
       <w:gridCol w:w="2377"/>
       <w:gridCol w:w="2399"/>
     </w:tblGrid>
@@ -33693,7 +33863,7 @@
       </w:trPr>
       <w:tc>
         <w:tcPr>
-          <w:tcW w:w="2012" w:type="dxa"/>
+          <w:tcW w:w="2011" w:type="dxa"/>
           <w:vMerge w:val="restart"/>
           <w:tcBorders>
             <w:top w:val="nil"/>
@@ -33761,7 +33931,7 @@
       </w:tc>
       <w:tc>
         <w:tcPr>
-          <w:tcW w:w="2960" w:type="dxa"/>
+          <w:tcW w:w="2961" w:type="dxa"/>
           <w:tcBorders>
             <w:top w:val="nil"/>
             <w:start w:val="nil"/>
@@ -33871,7 +34041,7 @@
       </w:trPr>
       <w:tc>
         <w:tcPr>
-          <w:tcW w:w="2012" w:type="dxa"/>
+          <w:tcW w:w="2011" w:type="dxa"/>
           <w:vMerge w:val="continue"/>
           <w:tcBorders>
             <w:top w:val="nil"/>
@@ -33902,7 +34072,7 @@
       </w:tc>
       <w:tc>
         <w:tcPr>
-          <w:tcW w:w="7736" w:type="dxa"/>
+          <w:tcW w:w="7737" w:type="dxa"/>
           <w:gridSpan w:val="3"/>
           <w:tcBorders>
             <w:top w:val="single" w:sz="4" w:space="0" w:color="BFBFBF"/>
@@ -33973,7 +34143,7 @@
       </w:trPr>
       <w:tc>
         <w:tcPr>
-          <w:tcW w:w="2012" w:type="dxa"/>
+          <w:tcW w:w="2011" w:type="dxa"/>
           <w:vMerge w:val="continue"/>
           <w:tcBorders>
             <w:top w:val="nil"/>
@@ -34004,7 +34174,7 @@
       </w:tc>
       <w:tc>
         <w:tcPr>
-          <w:tcW w:w="7736" w:type="dxa"/>
+          <w:tcW w:w="7737" w:type="dxa"/>
           <w:gridSpan w:val="3"/>
           <w:tcBorders>
             <w:top w:val="single" w:sz="18" w:space="0" w:color="BFBFBF"/>
@@ -34044,7 +34214,7 @@
       </w:trPr>
       <w:tc>
         <w:tcPr>
-          <w:tcW w:w="2012" w:type="dxa"/>
+          <w:tcW w:w="2011" w:type="dxa"/>
           <w:vMerge w:val="continue"/>
           <w:tcBorders>
             <w:top w:val="nil"/>
@@ -34075,7 +34245,7 @@
       </w:tc>
       <w:tc>
         <w:tcPr>
-          <w:tcW w:w="2960" w:type="dxa"/>
+          <w:tcW w:w="2961" w:type="dxa"/>
           <w:tcBorders>
             <w:top w:val="nil"/>
             <w:start w:val="nil"/>
@@ -34189,7 +34359,7 @@
       </w:trPr>
       <w:tc>
         <w:tcPr>
-          <w:tcW w:w="2012" w:type="dxa"/>
+          <w:tcW w:w="2011" w:type="dxa"/>
           <w:vMerge w:val="continue"/>
           <w:tcBorders>
             <w:top w:val="nil"/>
@@ -34225,7 +34395,7 @@
       </w:tc>
       <w:tc>
         <w:tcPr>
-          <w:tcW w:w="2960" w:type="dxa"/>
+          <w:tcW w:w="2961" w:type="dxa"/>
           <w:tcBorders>
             <w:top w:val="nil"/>
             <w:start w:val="nil"/>
@@ -34360,8 +34530,8 @@
       <w:tblLook w:noHBand="0" w:noVBand="1" w:firstColumn="1" w:lastRow="0" w:lastColumn="0" w:firstRow="1" w:val="04a0"/>
     </w:tblPr>
     <w:tblGrid>
-      <w:gridCol w:w="2012"/>
-      <w:gridCol w:w="2960"/>
+      <w:gridCol w:w="2011"/>
+      <w:gridCol w:w="2961"/>
       <w:gridCol w:w="2377"/>
       <w:gridCol w:w="2399"/>
     </w:tblGrid>
@@ -34371,7 +34541,7 @@
       </w:trPr>
       <w:tc>
         <w:tcPr>
-          <w:tcW w:w="2012" w:type="dxa"/>
+          <w:tcW w:w="2011" w:type="dxa"/>
           <w:vMerge w:val="restart"/>
           <w:tcBorders>
             <w:top w:val="nil"/>
@@ -34439,7 +34609,7 @@
       </w:tc>
       <w:tc>
         <w:tcPr>
-          <w:tcW w:w="2960" w:type="dxa"/>
+          <w:tcW w:w="2961" w:type="dxa"/>
           <w:tcBorders>
             <w:top w:val="nil"/>
             <w:start w:val="nil"/>
@@ -34549,7 +34719,7 @@
       </w:trPr>
       <w:tc>
         <w:tcPr>
-          <w:tcW w:w="2012" w:type="dxa"/>
+          <w:tcW w:w="2011" w:type="dxa"/>
           <w:vMerge w:val="continue"/>
           <w:tcBorders>
             <w:top w:val="nil"/>
@@ -34580,7 +34750,7 @@
       </w:tc>
       <w:tc>
         <w:tcPr>
-          <w:tcW w:w="7736" w:type="dxa"/>
+          <w:tcW w:w="7737" w:type="dxa"/>
           <w:gridSpan w:val="3"/>
           <w:tcBorders>
             <w:top w:val="single" w:sz="4" w:space="0" w:color="BFBFBF"/>
@@ -34651,7 +34821,7 @@
       </w:trPr>
       <w:tc>
         <w:tcPr>
-          <w:tcW w:w="2012" w:type="dxa"/>
+          <w:tcW w:w="2011" w:type="dxa"/>
           <w:vMerge w:val="continue"/>
           <w:tcBorders>
             <w:top w:val="nil"/>
@@ -34682,7 +34852,7 @@
       </w:tc>
       <w:tc>
         <w:tcPr>
-          <w:tcW w:w="7736" w:type="dxa"/>
+          <w:tcW w:w="7737" w:type="dxa"/>
           <w:gridSpan w:val="3"/>
           <w:tcBorders>
             <w:top w:val="single" w:sz="18" w:space="0" w:color="BFBFBF"/>
@@ -34722,7 +34892,7 @@
       </w:trPr>
       <w:tc>
         <w:tcPr>
-          <w:tcW w:w="2012" w:type="dxa"/>
+          <w:tcW w:w="2011" w:type="dxa"/>
           <w:vMerge w:val="continue"/>
           <w:tcBorders>
             <w:top w:val="nil"/>
@@ -34753,7 +34923,7 @@
       </w:tc>
       <w:tc>
         <w:tcPr>
-          <w:tcW w:w="2960" w:type="dxa"/>
+          <w:tcW w:w="2961" w:type="dxa"/>
           <w:tcBorders>
             <w:top w:val="nil"/>
             <w:start w:val="nil"/>
@@ -34867,7 +35037,7 @@
       </w:trPr>
       <w:tc>
         <w:tcPr>
-          <w:tcW w:w="2012" w:type="dxa"/>
+          <w:tcW w:w="2011" w:type="dxa"/>
           <w:vMerge w:val="continue"/>
           <w:tcBorders>
             <w:top w:val="nil"/>
@@ -34903,7 +35073,7 @@
       </w:tc>
       <w:tc>
         <w:tcPr>
-          <w:tcW w:w="2960" w:type="dxa"/>
+          <w:tcW w:w="2961" w:type="dxa"/>
           <w:tcBorders>
             <w:top w:val="nil"/>
             <w:start w:val="nil"/>
@@ -35053,8 +35223,8 @@
     </w:tblPr>
     <w:tblGrid>
       <w:gridCol w:w="2976"/>
-      <w:gridCol w:w="2401"/>
-      <w:gridCol w:w="4371"/>
+      <w:gridCol w:w="2400"/>
+      <w:gridCol w:w="4372"/>
     </w:tblGrid>
     <w:tr>
       <w:trPr>
@@ -35097,7 +35267,7 @@
       </w:tc>
       <w:tc>
         <w:tcPr>
-          <w:tcW w:w="2401" w:type="dxa"/>
+          <w:tcW w:w="2400" w:type="dxa"/>
           <w:tcBorders>
             <w:top w:val="nil"/>
             <w:start w:val="nil"/>
@@ -35132,7 +35302,7 @@
       </w:tc>
       <w:tc>
         <w:tcPr>
-          <w:tcW w:w="4371" w:type="dxa"/>
+          <w:tcW w:w="4372" w:type="dxa"/>
           <w:tcBorders>
             <w:top w:val="nil"/>
             <w:start w:val="nil"/>
@@ -35318,7 +35488,7 @@
       </w:tc>
       <w:tc>
         <w:tcPr>
-          <w:tcW w:w="2401" w:type="dxa"/>
+          <w:tcW w:w="2400" w:type="dxa"/>
           <w:tcBorders>
             <w:top w:val="nil"/>
             <w:start w:val="nil"/>
@@ -35353,7 +35523,7 @@
       </w:tc>
       <w:tc>
         <w:tcPr>
-          <w:tcW w:w="4371" w:type="dxa"/>
+          <w:tcW w:w="4372" w:type="dxa"/>
           <w:tcBorders>
             <w:top w:val="nil"/>
             <w:start w:val="nil"/>
@@ -35432,7 +35602,7 @@
       </w:tc>
       <w:tc>
         <w:tcPr>
-          <w:tcW w:w="2401" w:type="dxa"/>
+          <w:tcW w:w="2400" w:type="dxa"/>
           <w:tcBorders>
             <w:top w:val="nil"/>
             <w:start w:val="nil"/>
@@ -35467,7 +35637,7 @@
       </w:tc>
       <w:tc>
         <w:tcPr>
-          <w:tcW w:w="4371" w:type="dxa"/>
+          <w:tcW w:w="4372" w:type="dxa"/>
           <w:tcBorders>
             <w:top w:val="nil"/>
             <w:start w:val="nil"/>
@@ -35533,8 +35703,8 @@
     </w:tblPr>
     <w:tblGrid>
       <w:gridCol w:w="2976"/>
-      <w:gridCol w:w="2401"/>
-      <w:gridCol w:w="4371"/>
+      <w:gridCol w:w="2400"/>
+      <w:gridCol w:w="4372"/>
     </w:tblGrid>
     <w:tr>
       <w:trPr>
@@ -35577,7 +35747,7 @@
       </w:tc>
       <w:tc>
         <w:tcPr>
-          <w:tcW w:w="2401" w:type="dxa"/>
+          <w:tcW w:w="2400" w:type="dxa"/>
           <w:tcBorders>
             <w:top w:val="nil"/>
             <w:start w:val="nil"/>
@@ -35612,7 +35782,7 @@
       </w:tc>
       <w:tc>
         <w:tcPr>
-          <w:tcW w:w="4371" w:type="dxa"/>
+          <w:tcW w:w="4372" w:type="dxa"/>
           <w:tcBorders>
             <w:top w:val="nil"/>
             <w:start w:val="nil"/>
@@ -35798,7 +35968,7 @@
       </w:tc>
       <w:tc>
         <w:tcPr>
-          <w:tcW w:w="2401" w:type="dxa"/>
+          <w:tcW w:w="2400" w:type="dxa"/>
           <w:tcBorders>
             <w:top w:val="nil"/>
             <w:start w:val="nil"/>
@@ -35833,7 +36003,7 @@
       </w:tc>
       <w:tc>
         <w:tcPr>
-          <w:tcW w:w="4371" w:type="dxa"/>
+          <w:tcW w:w="4372" w:type="dxa"/>
           <w:tcBorders>
             <w:top w:val="nil"/>
             <w:start w:val="nil"/>
@@ -35912,7 +36082,7 @@
       </w:tc>
       <w:tc>
         <w:tcPr>
-          <w:tcW w:w="2401" w:type="dxa"/>
+          <w:tcW w:w="2400" w:type="dxa"/>
           <w:tcBorders>
             <w:top w:val="nil"/>
             <w:start w:val="nil"/>
@@ -35947,7 +36117,7 @@
       </w:tc>
       <w:tc>
         <w:tcPr>
-          <w:tcW w:w="4371" w:type="dxa"/>
+          <w:tcW w:w="4372" w:type="dxa"/>
           <w:tcBorders>
             <w:top w:val="nil"/>
             <w:start w:val="nil"/>
@@ -36027,8 +36197,8 @@
     </w:tblPr>
     <w:tblGrid>
       <w:gridCol w:w="2976"/>
-      <w:gridCol w:w="2401"/>
-      <w:gridCol w:w="4371"/>
+      <w:gridCol w:w="2400"/>
+      <w:gridCol w:w="4372"/>
     </w:tblGrid>
     <w:tr>
       <w:trPr>
@@ -36071,7 +36241,7 @@
       </w:tc>
       <w:tc>
         <w:tcPr>
-          <w:tcW w:w="2401" w:type="dxa"/>
+          <w:tcW w:w="2400" w:type="dxa"/>
           <w:tcBorders>
             <w:top w:val="nil"/>
             <w:start w:val="nil"/>
@@ -36106,7 +36276,7 @@
       </w:tc>
       <w:tc>
         <w:tcPr>
-          <w:tcW w:w="4371" w:type="dxa"/>
+          <w:tcW w:w="4372" w:type="dxa"/>
           <w:tcBorders>
             <w:top w:val="nil"/>
             <w:start w:val="nil"/>
@@ -36292,7 +36462,7 @@
       </w:tc>
       <w:tc>
         <w:tcPr>
-          <w:tcW w:w="2401" w:type="dxa"/>
+          <w:tcW w:w="2400" w:type="dxa"/>
           <w:tcBorders>
             <w:top w:val="nil"/>
             <w:start w:val="nil"/>
@@ -36327,7 +36497,7 @@
       </w:tc>
       <w:tc>
         <w:tcPr>
-          <w:tcW w:w="4371" w:type="dxa"/>
+          <w:tcW w:w="4372" w:type="dxa"/>
           <w:tcBorders>
             <w:top w:val="nil"/>
             <w:start w:val="nil"/>
@@ -36406,7 +36576,7 @@
       </w:tc>
       <w:tc>
         <w:tcPr>
-          <w:tcW w:w="2401" w:type="dxa"/>
+          <w:tcW w:w="2400" w:type="dxa"/>
           <w:tcBorders>
             <w:top w:val="nil"/>
             <w:start w:val="nil"/>
@@ -36441,7 +36611,7 @@
       </w:tc>
       <w:tc>
         <w:tcPr>
-          <w:tcW w:w="4371" w:type="dxa"/>
+          <w:tcW w:w="4372" w:type="dxa"/>
           <w:tcBorders>
             <w:top w:val="nil"/>
             <w:start w:val="nil"/>
@@ -36507,8 +36677,8 @@
     </w:tblPr>
     <w:tblGrid>
       <w:gridCol w:w="2976"/>
-      <w:gridCol w:w="2401"/>
-      <w:gridCol w:w="4371"/>
+      <w:gridCol w:w="2400"/>
+      <w:gridCol w:w="4372"/>
     </w:tblGrid>
     <w:tr>
       <w:trPr>
@@ -36551,7 +36721,7 @@
       </w:tc>
       <w:tc>
         <w:tcPr>
-          <w:tcW w:w="2401" w:type="dxa"/>
+          <w:tcW w:w="2400" w:type="dxa"/>
           <w:tcBorders>
             <w:top w:val="nil"/>
             <w:start w:val="nil"/>
@@ -36586,7 +36756,7 @@
       </w:tc>
       <w:tc>
         <w:tcPr>
-          <w:tcW w:w="4371" w:type="dxa"/>
+          <w:tcW w:w="4372" w:type="dxa"/>
           <w:tcBorders>
             <w:top w:val="nil"/>
             <w:start w:val="nil"/>
@@ -36772,7 +36942,7 @@
       </w:tc>
       <w:tc>
         <w:tcPr>
-          <w:tcW w:w="2401" w:type="dxa"/>
+          <w:tcW w:w="2400" w:type="dxa"/>
           <w:tcBorders>
             <w:top w:val="nil"/>
             <w:start w:val="nil"/>
@@ -36807,7 +36977,7 @@
       </w:tc>
       <w:tc>
         <w:tcPr>
-          <w:tcW w:w="4371" w:type="dxa"/>
+          <w:tcW w:w="4372" w:type="dxa"/>
           <w:tcBorders>
             <w:top w:val="nil"/>
             <w:start w:val="nil"/>
@@ -36886,7 +37056,7 @@
       </w:tc>
       <w:tc>
         <w:tcPr>
-          <w:tcW w:w="2401" w:type="dxa"/>
+          <w:tcW w:w="2400" w:type="dxa"/>
           <w:tcBorders>
             <w:top w:val="nil"/>
             <w:start w:val="nil"/>
@@ -36921,7 +37091,7 @@
       </w:tc>
       <w:tc>
         <w:tcPr>
-          <w:tcW w:w="4371" w:type="dxa"/>
+          <w:tcW w:w="4372" w:type="dxa"/>
           <w:tcBorders>
             <w:top w:val="nil"/>
             <w:start w:val="nil"/>
@@ -39164,8 +39334,8 @@
       <w:rFonts w:ascii="Liberation Mono" w:hAnsi="Liberation Mono" w:eastAsia="Liberation Mono" w:cs="Liberation Mono"/>
     </w:rPr>
   </w:style>
-  <w:style w:type="character" w:styleId="Bullets">
-    <w:name w:val="Bullets"/>
+  <w:style w:type="character" w:styleId="Bulletsuser">
+    <w:name w:val="Bullets (user)"/>
     <w:qFormat/>
     <w:rPr>
       <w:rFonts w:ascii="OpenSymbol" w:hAnsi="OpenSymbol" w:eastAsia="OpenSymbol" w:cs="OpenSymbol"/>
@@ -39353,8 +39523,8 @@
       <w:bCs/>
     </w:rPr>
   </w:style>
-  <w:style w:type="paragraph" w:styleId="FrameContents">
-    <w:name w:val="Frame Contents"/>
+  <w:style w:type="paragraph" w:styleId="FrameContentsuser">
+    <w:name w:val="Frame Contents (user)"/>
     <w:basedOn w:val="Normal"/>
     <w:qFormat/>
     <w:pPr/>
@@ -39383,8 +39553,8 @@
       <w:bCs/>
     </w:rPr>
   </w:style>
-  <w:style w:type="paragraph" w:styleId="FrameContentsuser">
-    <w:name w:val="Frame Contents (user)"/>
+  <w:style w:type="paragraph" w:styleId="FrameContents">
+    <w:name w:val="Frame Contents"/>
     <w:basedOn w:val="Normal"/>
     <w:qFormat/>
     <w:pPr/>
@@ -39403,8 +39573,8 @@
       <w:szCs w:val="20"/>
     </w:rPr>
   </w:style>
-  <w:style w:type="paragraph" w:styleId="BlockQuotationuser">
-    <w:name w:val="Block Quotation (user)"/>
+  <w:style w:type="paragraph" w:styleId="BlockQuotation">
+    <w:name w:val="Block Quotation"/>
     <w:basedOn w:val="Normal"/>
     <w:qFormat/>
     <w:pPr>

</xml_diff>